<commit_message>
feat: implementación de password y reset genérico
</commit_message>
<xml_diff>
--- a/dctos/Aqua Code Bases.docx
+++ b/dctos/Aqua Code Bases.docx
@@ -1743,28 +1743,15 @@
       </w:r>
       <w:proofErr w:type="spellEnd"/>
       <w:r>
-        <w:t xml:space="preserve">: </w:t>
-      </w:r>
-      <w:proofErr w:type="gramStart"/>
-      <w:r>
-        <w:t>{ "</w:t>
-      </w:r>
-      <w:proofErr w:type="spellStart"/>
-      <w:proofErr w:type="gramEnd"/>
+        <w:t>: { "</w:t>
+      </w:r>
+      <w:proofErr w:type="spellStart"/>
       <w:r>
         <w:t>Authorization</w:t>
       </w:r>
       <w:proofErr w:type="spellEnd"/>
       <w:r>
-        <w:t>": "Bearer ${token}</w:t>
-      </w:r>
-      <w:proofErr w:type="gramStart"/>
-      <w:r>
-        <w:t>" }</w:t>
-      </w:r>
-      <w:proofErr w:type="gramEnd"/>
-      <w:r>
-        <w:t xml:space="preserve">. Esto es lo que permite que el middleware </w:t>
+        <w:t xml:space="preserve">": "Bearer ${token}" }. Esto es lo que permite que el middleware </w:t>
       </w:r>
       <w:proofErr w:type="spellStart"/>
       <w:r>
@@ -1852,17 +1839,874 @@
         <w:t xml:space="preserve"> dice "OK", cierras el modal y vuelves a ejecutar </w:t>
       </w:r>
       <w:proofErr w:type="spellStart"/>
-      <w:proofErr w:type="gramStart"/>
       <w:r>
         <w:t>fetchTenants</w:t>
       </w:r>
       <w:proofErr w:type="spellEnd"/>
       <w:r>
-        <w:t>(</w:t>
-      </w:r>
-      <w:proofErr w:type="gramEnd"/>
-      <w:r>
-        <w:t>), lo que recarga la tabla instantáneamente para reflejar el cambio.</w:t>
+        <w:t>(), lo que recarga la tabla instantáneamente para reflejar el cambio.</w:t>
+      </w:r>
+    </w:p>
+    <w:p/>
+    <w:p>
+      <w:pPr>
+        <w:pStyle w:val="Subttulo"/>
+      </w:pPr>
+      <w:proofErr w:type="spellStart"/>
+      <w:r>
+        <w:t>Typescript</w:t>
+      </w:r>
+      <w:proofErr w:type="spellEnd"/>
+    </w:p>
+    <w:p>
+      <w:pPr>
+        <w:rPr>
+          <w:b/>
+          <w:bCs/>
+        </w:rPr>
+      </w:pPr>
+      <w:r>
+        <w:rPr>
+          <w:b/>
+          <w:bCs/>
+        </w:rPr>
+        <w:t xml:space="preserve">1. La Configuración Base de </w:t>
+      </w:r>
+      <w:proofErr w:type="spellStart"/>
+      <w:r>
+        <w:rPr>
+          <w:b/>
+          <w:bCs/>
+        </w:rPr>
+        <w:t>TypeScript</w:t>
+      </w:r>
+      <w:proofErr w:type="spellEnd"/>
+      <w:r>
+        <w:rPr>
+          <w:b/>
+          <w:bCs/>
+        </w:rPr>
+        <w:t xml:space="preserve"> (El Guardián)</w:t>
+      </w:r>
+    </w:p>
+    <w:p>
+      <w:pPr>
+        <w:numPr>
+          <w:ilvl w:val="0"/>
+          <w:numId w:val="13"/>
+        </w:numPr>
+      </w:pPr>
+      <w:r>
+        <w:rPr>
+          <w:b/>
+          <w:bCs/>
+        </w:rPr>
+        <w:t>Archivos de configuración:</w:t>
+      </w:r>
+      <w:r>
+        <w:t xml:space="preserve"> Tienes un archivo </w:t>
+      </w:r>
+      <w:proofErr w:type="spellStart"/>
+      <w:r>
+        <w:t>tsconfig.json</w:t>
+      </w:r>
+      <w:proofErr w:type="spellEnd"/>
+      <w:r>
+        <w:t xml:space="preserve"> en tu </w:t>
+      </w:r>
+      <w:proofErr w:type="spellStart"/>
+      <w:r>
+        <w:t>backend</w:t>
+      </w:r>
+      <w:proofErr w:type="spellEnd"/>
+      <w:r>
+        <w:t xml:space="preserve"> (y probablemente otro en el </w:t>
+      </w:r>
+      <w:proofErr w:type="spellStart"/>
+      <w:r>
+        <w:t>frontend</w:t>
+      </w:r>
+      <w:proofErr w:type="spellEnd"/>
+      <w:r>
+        <w:t xml:space="preserve"> generado por Vite) que le dice al compilador cómo leer tu código. En el </w:t>
+      </w:r>
+      <w:proofErr w:type="spellStart"/>
+      <w:r>
+        <w:t>backend</w:t>
+      </w:r>
+      <w:proofErr w:type="spellEnd"/>
+      <w:r>
+        <w:t>, por ejemplo, le indicas que lea la carpeta completa mediante "</w:t>
+      </w:r>
+      <w:proofErr w:type="spellStart"/>
+      <w:r>
+        <w:t>src</w:t>
+      </w:r>
+      <w:proofErr w:type="spellEnd"/>
+      <w:r>
+        <w:t>//*".</w:t>
+      </w:r>
+    </w:p>
+    <w:p>
+      <w:pPr>
+        <w:numPr>
+          <w:ilvl w:val="0"/>
+          <w:numId w:val="13"/>
+        </w:numPr>
+      </w:pPr>
+      <w:r>
+        <w:rPr>
+          <w:b/>
+          <w:bCs/>
+        </w:rPr>
+        <w:t>Tipos Personalizados (</w:t>
+      </w:r>
+      <w:proofErr w:type="spellStart"/>
+      <w:r>
+        <w:rPr>
+          <w:b/>
+          <w:bCs/>
+        </w:rPr>
+        <w:t>src</w:t>
+      </w:r>
+      <w:proofErr w:type="spellEnd"/>
+      <w:r>
+        <w:rPr>
+          <w:b/>
+          <w:bCs/>
+        </w:rPr>
+        <w:t>/</w:t>
+      </w:r>
+      <w:proofErr w:type="spellStart"/>
+      <w:r>
+        <w:rPr>
+          <w:b/>
+          <w:bCs/>
+        </w:rPr>
+        <w:t>types</w:t>
+      </w:r>
+      <w:proofErr w:type="spellEnd"/>
+      <w:r>
+        <w:rPr>
+          <w:b/>
+          <w:bCs/>
+        </w:rPr>
+        <w:t>/</w:t>
+      </w:r>
+      <w:proofErr w:type="spellStart"/>
+      <w:r>
+        <w:rPr>
+          <w:b/>
+          <w:bCs/>
+        </w:rPr>
+        <w:t>express.d.ts</w:t>
+      </w:r>
+      <w:proofErr w:type="spellEnd"/>
+      <w:r>
+        <w:rPr>
+          <w:b/>
+          <w:bCs/>
+        </w:rPr>
+        <w:t>):</w:t>
+      </w:r>
+      <w:r>
+        <w:t xml:space="preserve"> Para evitar usar el peligroso y genérico </w:t>
+      </w:r>
+      <w:proofErr w:type="spellStart"/>
+      <w:r>
+        <w:t>any</w:t>
+      </w:r>
+      <w:proofErr w:type="spellEnd"/>
+      <w:r>
+        <w:t xml:space="preserve">, creamos declaraciones de tipos personalizadas. Esto le enseñó a </w:t>
+      </w:r>
+      <w:proofErr w:type="spellStart"/>
+      <w:r>
+        <w:t>TypeScript</w:t>
+      </w:r>
+      <w:proofErr w:type="spellEnd"/>
+      <w:r>
+        <w:t xml:space="preserve"> (y a tu editor de código) que cuando usas </w:t>
+      </w:r>
+      <w:proofErr w:type="spellStart"/>
+      <w:r>
+        <w:t>req.user</w:t>
+      </w:r>
+      <w:proofErr w:type="spellEnd"/>
+      <w:r>
+        <w:t xml:space="preserve"> dentro de Express, este contiene datos específicos como el ID y el rol, activando el autocompletado seguro.</w:t>
+      </w:r>
+    </w:p>
+    <w:p>
+      <w:r>
+        <w:pict w14:anchorId="20F5E393">
+          <v:rect id="_x0000_i1048" style="width:0;height:1.5pt" o:hralign="center" o:hrstd="t" o:hr="t" fillcolor="#a0a0a0" stroked="f"/>
+        </w:pict>
+      </w:r>
+    </w:p>
+    <w:p>
+      <w:pPr>
+        <w:rPr>
+          <w:b/>
+          <w:bCs/>
+        </w:rPr>
+      </w:pPr>
+      <w:r>
+        <w:rPr>
+          <w:b/>
+          <w:bCs/>
+        </w:rPr>
+        <w:t>2. Base de Datos (La Fuente de la Verdad)</w:t>
+      </w:r>
+    </w:p>
+    <w:p>
+      <w:r>
+        <w:t xml:space="preserve">La lógica de la base de datos está completamente aislada de la lógica web gracias a </w:t>
+      </w:r>
+      <w:r>
+        <w:rPr>
+          <w:b/>
+          <w:bCs/>
+        </w:rPr>
+        <w:t>Prisma</w:t>
+      </w:r>
+      <w:r>
+        <w:t>.</w:t>
+      </w:r>
+    </w:p>
+    <w:p>
+      <w:pPr>
+        <w:numPr>
+          <w:ilvl w:val="0"/>
+          <w:numId w:val="14"/>
+        </w:numPr>
+      </w:pPr>
+      <w:proofErr w:type="spellStart"/>
+      <w:r>
+        <w:rPr>
+          <w:b/>
+          <w:bCs/>
+        </w:rPr>
+        <w:t>schema.prisma</w:t>
+      </w:r>
+      <w:proofErr w:type="spellEnd"/>
+      <w:r>
+        <w:rPr>
+          <w:b/>
+          <w:bCs/>
+        </w:rPr>
+        <w:t>:</w:t>
+      </w:r>
+      <w:r>
+        <w:t xml:space="preserve"> Este es el único archivo donde defines la estructura real de tus tablas (Modelos como Usuario, Tenant, Plan) y tus reglas estrictas (</w:t>
+      </w:r>
+      <w:proofErr w:type="spellStart"/>
+      <w:r>
+        <w:t>Enums</w:t>
+      </w:r>
+      <w:proofErr w:type="spellEnd"/>
+      <w:r>
+        <w:t xml:space="preserve"> como </w:t>
+      </w:r>
+      <w:proofErr w:type="spellStart"/>
+      <w:r>
+        <w:t>TipoPlan</w:t>
+      </w:r>
+      <w:proofErr w:type="spellEnd"/>
+      <w:r>
+        <w:t xml:space="preserve"> o Rol).</w:t>
+      </w:r>
+    </w:p>
+    <w:p>
+      <w:pPr>
+        <w:numPr>
+          <w:ilvl w:val="0"/>
+          <w:numId w:val="14"/>
+        </w:numPr>
+      </w:pPr>
+      <w:r>
+        <w:rPr>
+          <w:b/>
+          <w:bCs/>
+        </w:rPr>
+        <w:t>El cliente tipado:</w:t>
+      </w:r>
+      <w:r>
+        <w:t xml:space="preserve"> A partir de ese archivo, Prisma genera automáticamente tipos de </w:t>
+      </w:r>
+      <w:proofErr w:type="spellStart"/>
+      <w:r>
+        <w:t>TypeScript</w:t>
+      </w:r>
+      <w:proofErr w:type="spellEnd"/>
+      <w:r>
+        <w:t xml:space="preserve">. Si intentas guardar un plan llamado "Premium" pero tu base de datos solo acepta "BASICO", "PROFESIONAL" o "EMPRESARIAL", </w:t>
+      </w:r>
+      <w:proofErr w:type="spellStart"/>
+      <w:r>
+        <w:t>TypeScript</w:t>
+      </w:r>
+      <w:proofErr w:type="spellEnd"/>
+      <w:r>
+        <w:t xml:space="preserve"> te mostrará un error antes de que siquiera ejecutes el código.</w:t>
+      </w:r>
+    </w:p>
+    <w:p>
+      <w:r>
+        <w:pict w14:anchorId="14283FBE">
+          <v:rect id="_x0000_i1049" style="width:0;height:1.5pt" o:hralign="center" o:hrstd="t" o:hr="t" fillcolor="#a0a0a0" stroked="f"/>
+        </w:pict>
+      </w:r>
+    </w:p>
+    <w:p>
+      <w:pPr>
+        <w:rPr>
+          <w:b/>
+          <w:bCs/>
+        </w:rPr>
+      </w:pPr>
+      <w:r>
+        <w:rPr>
+          <w:b/>
+          <w:bCs/>
+        </w:rPr>
+        <w:t xml:space="preserve">3. </w:t>
+      </w:r>
+      <w:proofErr w:type="spellStart"/>
+      <w:r>
+        <w:rPr>
+          <w:b/>
+          <w:bCs/>
+        </w:rPr>
+        <w:t>Backend</w:t>
+      </w:r>
+      <w:proofErr w:type="spellEnd"/>
+      <w:r>
+        <w:rPr>
+          <w:b/>
+          <w:bCs/>
+        </w:rPr>
+        <w:t xml:space="preserve"> (Arquitectura en Capas)</w:t>
+      </w:r>
+    </w:p>
+    <w:p>
+      <w:r>
+        <w:t>En tu servidor de Node.js/Express, la lógica está dividida en un flujo unidireccional y estricto:</w:t>
+      </w:r>
+    </w:p>
+    <w:p>
+      <w:pPr>
+        <w:numPr>
+          <w:ilvl w:val="0"/>
+          <w:numId w:val="15"/>
+        </w:numPr>
+      </w:pPr>
+      <w:r>
+        <w:rPr>
+          <w:b/>
+          <w:bCs/>
+        </w:rPr>
+        <w:lastRenderedPageBreak/>
+        <w:t>Rutas (*.</w:t>
+      </w:r>
+      <w:proofErr w:type="spellStart"/>
+      <w:r>
+        <w:rPr>
+          <w:b/>
+          <w:bCs/>
+        </w:rPr>
+        <w:t>routes.ts</w:t>
+      </w:r>
+      <w:proofErr w:type="spellEnd"/>
+      <w:r>
+        <w:rPr>
+          <w:b/>
+          <w:bCs/>
+        </w:rPr>
+        <w:t>):</w:t>
+      </w:r>
+      <w:r>
+        <w:t xml:space="preserve"> Son los semáforos. Reciben la petición web (ej. POST /api/usuarios/</w:t>
+      </w:r>
+      <w:proofErr w:type="spellStart"/>
+      <w:r>
+        <w:t>admin</w:t>
+      </w:r>
+      <w:proofErr w:type="spellEnd"/>
+      <w:r>
+        <w:t>) y deciden qué funciones deben ejecutarse, aplicando barreras de seguridad (Middlewares) en el proceso.</w:t>
+      </w:r>
+    </w:p>
+    <w:p>
+      <w:pPr>
+        <w:numPr>
+          <w:ilvl w:val="0"/>
+          <w:numId w:val="15"/>
+        </w:numPr>
+      </w:pPr>
+      <w:r>
+        <w:rPr>
+          <w:b/>
+          <w:bCs/>
+        </w:rPr>
+        <w:t>Controladores (*.</w:t>
+      </w:r>
+      <w:proofErr w:type="spellStart"/>
+      <w:r>
+        <w:rPr>
+          <w:b/>
+          <w:bCs/>
+        </w:rPr>
+        <w:t>controller.ts</w:t>
+      </w:r>
+      <w:proofErr w:type="spellEnd"/>
+      <w:r>
+        <w:rPr>
+          <w:b/>
+          <w:bCs/>
+        </w:rPr>
+        <w:t>):</w:t>
+      </w:r>
+      <w:r>
+        <w:t xml:space="preserve"> Son los directores de orquesta. </w:t>
+      </w:r>
+      <w:r>
+        <w:rPr>
+          <w:b/>
+          <w:bCs/>
+        </w:rPr>
+        <w:t>No tocan la base de datos.</w:t>
+      </w:r>
+      <w:r>
+        <w:t xml:space="preserve"> Solo se encargan de validar que los datos de entrada (</w:t>
+      </w:r>
+      <w:proofErr w:type="spellStart"/>
+      <w:r>
+        <w:t>req.body</w:t>
+      </w:r>
+      <w:proofErr w:type="spellEnd"/>
+      <w:r>
+        <w:t xml:space="preserve">) estén completos, y luego emiten respuestas HTTP (ej. 200 OK o 500 Error) o eventos en tiempo real hacia el </w:t>
+      </w:r>
+      <w:proofErr w:type="spellStart"/>
+      <w:r>
+        <w:t>frontend</w:t>
+      </w:r>
+      <w:proofErr w:type="spellEnd"/>
+      <w:r>
+        <w:t xml:space="preserve"> mediante Socket.io.</w:t>
+      </w:r>
+    </w:p>
+    <w:p>
+      <w:pPr>
+        <w:numPr>
+          <w:ilvl w:val="0"/>
+          <w:numId w:val="15"/>
+        </w:numPr>
+      </w:pPr>
+      <w:r>
+        <w:rPr>
+          <w:b/>
+          <w:bCs/>
+        </w:rPr>
+        <w:t>Servicios (*.</w:t>
+      </w:r>
+      <w:proofErr w:type="spellStart"/>
+      <w:r>
+        <w:rPr>
+          <w:b/>
+          <w:bCs/>
+        </w:rPr>
+        <w:t>service.ts</w:t>
+      </w:r>
+      <w:proofErr w:type="spellEnd"/>
+      <w:r>
+        <w:rPr>
+          <w:b/>
+          <w:bCs/>
+        </w:rPr>
+        <w:t>):</w:t>
+      </w:r>
+      <w:r>
+        <w:t xml:space="preserve"> Aquí vive la verdadera </w:t>
+      </w:r>
+      <w:r>
+        <w:rPr>
+          <w:b/>
+          <w:bCs/>
+        </w:rPr>
+        <w:t>lógica de negocio</w:t>
+      </w:r>
+      <w:r>
+        <w:t xml:space="preserve">. Los controladores le delegan el trabajo pesado a estos archivos. Los servicios son los </w:t>
+      </w:r>
+      <w:r>
+        <w:rPr>
+          <w:b/>
+          <w:bCs/>
+        </w:rPr>
+        <w:t>únicos</w:t>
+      </w:r>
+      <w:r>
+        <w:t xml:space="preserve"> que hablan directamente con Prisma (la base de datos) para hacer operaciones o transacciones seguras (ej. </w:t>
+      </w:r>
+      <w:proofErr w:type="spellStart"/>
+      <w:r>
+        <w:t>tenant.service.ts</w:t>
+      </w:r>
+      <w:proofErr w:type="spellEnd"/>
+      <w:r>
+        <w:t xml:space="preserve"> o </w:t>
+      </w:r>
+      <w:proofErr w:type="spellStart"/>
+      <w:r>
+        <w:t>user.service.ts</w:t>
+      </w:r>
+      <w:proofErr w:type="spellEnd"/>
+      <w:r>
+        <w:t>).</w:t>
+      </w:r>
+    </w:p>
+    <w:p>
+      <w:r>
+        <w:pict w14:anchorId="67221E7C">
+          <v:rect id="_x0000_i1050" style="width:0;height:1.5pt" o:hralign="center" o:hrstd="t" o:hr="t" fillcolor="#a0a0a0" stroked="f"/>
+        </w:pict>
+      </w:r>
+    </w:p>
+    <w:p>
+      <w:pPr>
+        <w:rPr>
+          <w:b/>
+          <w:bCs/>
+        </w:rPr>
+      </w:pPr>
+      <w:r>
+        <w:rPr>
+          <w:b/>
+          <w:bCs/>
+        </w:rPr>
+        <w:t xml:space="preserve">4. </w:t>
+      </w:r>
+      <w:proofErr w:type="spellStart"/>
+      <w:r>
+        <w:rPr>
+          <w:b/>
+          <w:bCs/>
+        </w:rPr>
+        <w:t>Frontend</w:t>
+      </w:r>
+      <w:proofErr w:type="spellEnd"/>
+      <w:r>
+        <w:rPr>
+          <w:b/>
+          <w:bCs/>
+        </w:rPr>
+        <w:t xml:space="preserve"> (Arquitectura Limpia con </w:t>
+      </w:r>
+      <w:proofErr w:type="spellStart"/>
+      <w:r>
+        <w:rPr>
+          <w:b/>
+          <w:bCs/>
+        </w:rPr>
+        <w:t>React</w:t>
+      </w:r>
+      <w:proofErr w:type="spellEnd"/>
+      <w:r>
+        <w:rPr>
+          <w:b/>
+          <w:bCs/>
+        </w:rPr>
+        <w:t>)</w:t>
+      </w:r>
+    </w:p>
+    <w:p>
+      <w:r>
+        <w:t xml:space="preserve">Tu interfaz de usuario (Single Page </w:t>
+      </w:r>
+      <w:proofErr w:type="spellStart"/>
+      <w:r>
+        <w:t>Application</w:t>
+      </w:r>
+      <w:proofErr w:type="spellEnd"/>
+      <w:r>
+        <w:t>) también separa la inteligencia gráfica de la inteligencia de datos:</w:t>
+      </w:r>
+    </w:p>
+    <w:p>
+      <w:pPr>
+        <w:numPr>
+          <w:ilvl w:val="0"/>
+          <w:numId w:val="16"/>
+        </w:numPr>
+      </w:pPr>
+      <w:r>
+        <w:rPr>
+          <w:b/>
+          <w:bCs/>
+        </w:rPr>
+        <w:t>Componentes Visuales (*.</w:t>
+      </w:r>
+      <w:proofErr w:type="spellStart"/>
+      <w:r>
+        <w:rPr>
+          <w:b/>
+          <w:bCs/>
+        </w:rPr>
+        <w:t>tsx</w:t>
+      </w:r>
+      <w:proofErr w:type="spellEnd"/>
+      <w:r>
+        <w:rPr>
+          <w:b/>
+          <w:bCs/>
+        </w:rPr>
+        <w:t>):</w:t>
+      </w:r>
+      <w:r>
+        <w:t xml:space="preserve"> Archivos como </w:t>
+      </w:r>
+      <w:proofErr w:type="spellStart"/>
+      <w:r>
+        <w:t>DashboardPage.tsx</w:t>
+      </w:r>
+      <w:proofErr w:type="spellEnd"/>
+      <w:r>
+        <w:t xml:space="preserve"> o </w:t>
+      </w:r>
+      <w:proofErr w:type="spellStart"/>
+      <w:r>
+        <w:t>PlanFormModal.tsx</w:t>
+      </w:r>
+      <w:proofErr w:type="spellEnd"/>
+      <w:r>
+        <w:t xml:space="preserve"> se dedican casi en un 100% a "pintar" la interfaz utilizando </w:t>
+      </w:r>
+      <w:proofErr w:type="spellStart"/>
+      <w:r>
+        <w:t>React</w:t>
+      </w:r>
+      <w:proofErr w:type="spellEnd"/>
+      <w:r>
+        <w:t xml:space="preserve"> y </w:t>
+      </w:r>
+      <w:proofErr w:type="spellStart"/>
+      <w:r>
+        <w:t>Tailwind</w:t>
+      </w:r>
+      <w:proofErr w:type="spellEnd"/>
+      <w:r>
+        <w:t xml:space="preserve"> CSS. Se consideran componentes "tontos" porque no hacen peticiones complejas directamente.</w:t>
+      </w:r>
+    </w:p>
+    <w:p>
+      <w:pPr>
+        <w:numPr>
+          <w:ilvl w:val="0"/>
+          <w:numId w:val="16"/>
+        </w:numPr>
+      </w:pPr>
+      <w:r>
+        <w:rPr>
+          <w:b/>
+          <w:bCs/>
+        </w:rPr>
+        <w:t>Capa de Estado y Negocio (</w:t>
+      </w:r>
+      <w:proofErr w:type="spellStart"/>
+      <w:r>
+        <w:rPr>
+          <w:b/>
+          <w:bCs/>
+        </w:rPr>
+        <w:t>src</w:t>
+      </w:r>
+      <w:proofErr w:type="spellEnd"/>
+      <w:r>
+        <w:rPr>
+          <w:b/>
+          <w:bCs/>
+        </w:rPr>
+        <w:t>/</w:t>
+      </w:r>
+      <w:proofErr w:type="spellStart"/>
+      <w:r>
+        <w:rPr>
+          <w:b/>
+          <w:bCs/>
+        </w:rPr>
+        <w:t>hooks</w:t>
+      </w:r>
+      <w:proofErr w:type="spellEnd"/>
+      <w:r>
+        <w:rPr>
+          <w:b/>
+          <w:bCs/>
+        </w:rPr>
+        <w:t>/*.</w:t>
+      </w:r>
+      <w:proofErr w:type="spellStart"/>
+      <w:r>
+        <w:rPr>
+          <w:b/>
+          <w:bCs/>
+        </w:rPr>
+        <w:t>ts</w:t>
+      </w:r>
+      <w:proofErr w:type="spellEnd"/>
+      <w:r>
+        <w:rPr>
+          <w:b/>
+          <w:bCs/>
+        </w:rPr>
+        <w:t>):</w:t>
+      </w:r>
+      <w:r>
+        <w:t xml:space="preserve"> Extraemos toda la lógica compleja (variables de estado, recolección de datos, y funciones ejecutables) hacia </w:t>
+      </w:r>
+      <w:proofErr w:type="spellStart"/>
+      <w:r>
+        <w:rPr>
+          <w:i/>
+          <w:iCs/>
+        </w:rPr>
+        <w:t>Custom</w:t>
+      </w:r>
+      <w:proofErr w:type="spellEnd"/>
+      <w:r>
+        <w:rPr>
+          <w:i/>
+          <w:iCs/>
+        </w:rPr>
+        <w:t xml:space="preserve"> Hooks</w:t>
+      </w:r>
+      <w:r>
+        <w:t xml:space="preserve">, como </w:t>
+      </w:r>
+      <w:proofErr w:type="spellStart"/>
+      <w:r>
+        <w:t>useTenants.ts</w:t>
+      </w:r>
+      <w:proofErr w:type="spellEnd"/>
+      <w:r>
+        <w:t>. Esto mantiene los archivos visuales increíblemente limpios.</w:t>
+      </w:r>
+    </w:p>
+    <w:p>
+      <w:pPr>
+        <w:numPr>
+          <w:ilvl w:val="0"/>
+          <w:numId w:val="16"/>
+        </w:numPr>
+      </w:pPr>
+      <w:r>
+        <w:rPr>
+          <w:b/>
+          <w:bCs/>
+        </w:rPr>
+        <w:t>Capa de Servicios de API (</w:t>
+      </w:r>
+      <w:proofErr w:type="spellStart"/>
+      <w:r>
+        <w:rPr>
+          <w:b/>
+          <w:bCs/>
+        </w:rPr>
+        <w:t>src</w:t>
+      </w:r>
+      <w:proofErr w:type="spellEnd"/>
+      <w:r>
+        <w:rPr>
+          <w:b/>
+          <w:bCs/>
+        </w:rPr>
+        <w:t>/</w:t>
+      </w:r>
+      <w:proofErr w:type="spellStart"/>
+      <w:r>
+        <w:rPr>
+          <w:b/>
+          <w:bCs/>
+        </w:rPr>
+        <w:t>services</w:t>
+      </w:r>
+      <w:proofErr w:type="spellEnd"/>
+      <w:r>
+        <w:rPr>
+          <w:b/>
+          <w:bCs/>
+        </w:rPr>
+        <w:t>/</w:t>
+      </w:r>
+      <w:proofErr w:type="spellStart"/>
+      <w:r>
+        <w:rPr>
+          <w:b/>
+          <w:bCs/>
+        </w:rPr>
+        <w:t>api.ts</w:t>
+      </w:r>
+      <w:proofErr w:type="spellEnd"/>
+      <w:r>
+        <w:rPr>
+          <w:b/>
+          <w:bCs/>
+        </w:rPr>
+        <w:t>):</w:t>
+      </w:r>
+      <w:r>
+        <w:t xml:space="preserve"> Un archivo único centralizado que funciona como "cliente HTTP". Es el único lugar de todo tu </w:t>
+      </w:r>
+      <w:proofErr w:type="spellStart"/>
+      <w:r>
+        <w:t>frontend</w:t>
+      </w:r>
+      <w:proofErr w:type="spellEnd"/>
+      <w:r>
+        <w:t xml:space="preserve"> que se comunica con tu </w:t>
+      </w:r>
+      <w:proofErr w:type="spellStart"/>
+      <w:r>
+        <w:t>backend</w:t>
+      </w:r>
+      <w:proofErr w:type="spellEnd"/>
+      <w:r>
+        <w:t>, inyectando los tokens de seguridad automáticamente sin repetir código por todas partes.</w:t>
+      </w:r>
+    </w:p>
+    <w:p>
+      <w:pPr>
+        <w:numPr>
+          <w:ilvl w:val="0"/>
+          <w:numId w:val="16"/>
+        </w:numPr>
+      </w:pPr>
+      <w:r>
+        <w:rPr>
+          <w:b/>
+          <w:bCs/>
+        </w:rPr>
+        <w:t>Estado Global (</w:t>
+      </w:r>
+      <w:proofErr w:type="spellStart"/>
+      <w:r>
+        <w:rPr>
+          <w:b/>
+          <w:bCs/>
+        </w:rPr>
+        <w:t>AuthContext.tsx</w:t>
+      </w:r>
+      <w:proofErr w:type="spellEnd"/>
+      <w:r>
+        <w:rPr>
+          <w:b/>
+          <w:bCs/>
+        </w:rPr>
+        <w:t>):</w:t>
+      </w:r>
+      <w:r>
+        <w:t xml:space="preserve"> Mantiene la memoria global de quién inició sesión (rol, ID, token) para que cualquier parte de la aplicación sepa qué mostrar o bloquear.</w:t>
       </w:r>
     </w:p>
     <w:p/>
@@ -2028,6 +2872,304 @@
     </w:lvl>
   </w:abstractNum>
   <w:abstractNum w:abstractNumId="1" w15:restartNumberingAfterBreak="0">
+    <w:nsid w:val="301E2FAD"/>
+    <w:multiLevelType w:val="multilevel"/>
+    <w:tmpl w:val="73502F30"/>
+    <w:lvl w:ilvl="0">
+      <w:start w:val="1"/>
+      <w:numFmt w:val="bullet"/>
+      <w:lvlText w:val=""/>
+      <w:lvlJc w:val="left"/>
+      <w:pPr>
+        <w:tabs>
+          <w:tab w:val="num" w:pos="720"/>
+        </w:tabs>
+        <w:ind w:left="720" w:hanging="360"/>
+      </w:pPr>
+      <w:rPr>
+        <w:rFonts w:ascii="Symbol" w:hAnsi="Symbol" w:hint="default"/>
+        <w:sz w:val="20"/>
+      </w:rPr>
+    </w:lvl>
+    <w:lvl w:ilvl="1" w:tentative="1">
+      <w:start w:val="1"/>
+      <w:numFmt w:val="bullet"/>
+      <w:lvlText w:val="o"/>
+      <w:lvlJc w:val="left"/>
+      <w:pPr>
+        <w:tabs>
+          <w:tab w:val="num" w:pos="1440"/>
+        </w:tabs>
+        <w:ind w:left="1440" w:hanging="360"/>
+      </w:pPr>
+      <w:rPr>
+        <w:rFonts w:ascii="Courier New" w:hAnsi="Courier New" w:hint="default"/>
+        <w:sz w:val="20"/>
+      </w:rPr>
+    </w:lvl>
+    <w:lvl w:ilvl="2" w:tentative="1">
+      <w:start w:val="1"/>
+      <w:numFmt w:val="bullet"/>
+      <w:lvlText w:val=""/>
+      <w:lvlJc w:val="left"/>
+      <w:pPr>
+        <w:tabs>
+          <w:tab w:val="num" w:pos="2160"/>
+        </w:tabs>
+        <w:ind w:left="2160" w:hanging="360"/>
+      </w:pPr>
+      <w:rPr>
+        <w:rFonts w:ascii="Wingdings" w:hAnsi="Wingdings" w:hint="default"/>
+        <w:sz w:val="20"/>
+      </w:rPr>
+    </w:lvl>
+    <w:lvl w:ilvl="3" w:tentative="1">
+      <w:start w:val="1"/>
+      <w:numFmt w:val="bullet"/>
+      <w:lvlText w:val=""/>
+      <w:lvlJc w:val="left"/>
+      <w:pPr>
+        <w:tabs>
+          <w:tab w:val="num" w:pos="2880"/>
+        </w:tabs>
+        <w:ind w:left="2880" w:hanging="360"/>
+      </w:pPr>
+      <w:rPr>
+        <w:rFonts w:ascii="Wingdings" w:hAnsi="Wingdings" w:hint="default"/>
+        <w:sz w:val="20"/>
+      </w:rPr>
+    </w:lvl>
+    <w:lvl w:ilvl="4" w:tentative="1">
+      <w:start w:val="1"/>
+      <w:numFmt w:val="bullet"/>
+      <w:lvlText w:val=""/>
+      <w:lvlJc w:val="left"/>
+      <w:pPr>
+        <w:tabs>
+          <w:tab w:val="num" w:pos="3600"/>
+        </w:tabs>
+        <w:ind w:left="3600" w:hanging="360"/>
+      </w:pPr>
+      <w:rPr>
+        <w:rFonts w:ascii="Wingdings" w:hAnsi="Wingdings" w:hint="default"/>
+        <w:sz w:val="20"/>
+      </w:rPr>
+    </w:lvl>
+    <w:lvl w:ilvl="5" w:tentative="1">
+      <w:start w:val="1"/>
+      <w:numFmt w:val="bullet"/>
+      <w:lvlText w:val=""/>
+      <w:lvlJc w:val="left"/>
+      <w:pPr>
+        <w:tabs>
+          <w:tab w:val="num" w:pos="4320"/>
+        </w:tabs>
+        <w:ind w:left="4320" w:hanging="360"/>
+      </w:pPr>
+      <w:rPr>
+        <w:rFonts w:ascii="Wingdings" w:hAnsi="Wingdings" w:hint="default"/>
+        <w:sz w:val="20"/>
+      </w:rPr>
+    </w:lvl>
+    <w:lvl w:ilvl="6" w:tentative="1">
+      <w:start w:val="1"/>
+      <w:numFmt w:val="bullet"/>
+      <w:lvlText w:val=""/>
+      <w:lvlJc w:val="left"/>
+      <w:pPr>
+        <w:tabs>
+          <w:tab w:val="num" w:pos="5040"/>
+        </w:tabs>
+        <w:ind w:left="5040" w:hanging="360"/>
+      </w:pPr>
+      <w:rPr>
+        <w:rFonts w:ascii="Wingdings" w:hAnsi="Wingdings" w:hint="default"/>
+        <w:sz w:val="20"/>
+      </w:rPr>
+    </w:lvl>
+    <w:lvl w:ilvl="7" w:tentative="1">
+      <w:start w:val="1"/>
+      <w:numFmt w:val="bullet"/>
+      <w:lvlText w:val=""/>
+      <w:lvlJc w:val="left"/>
+      <w:pPr>
+        <w:tabs>
+          <w:tab w:val="num" w:pos="5760"/>
+        </w:tabs>
+        <w:ind w:left="5760" w:hanging="360"/>
+      </w:pPr>
+      <w:rPr>
+        <w:rFonts w:ascii="Wingdings" w:hAnsi="Wingdings" w:hint="default"/>
+        <w:sz w:val="20"/>
+      </w:rPr>
+    </w:lvl>
+    <w:lvl w:ilvl="8" w:tentative="1">
+      <w:start w:val="1"/>
+      <w:numFmt w:val="bullet"/>
+      <w:lvlText w:val=""/>
+      <w:lvlJc w:val="left"/>
+      <w:pPr>
+        <w:tabs>
+          <w:tab w:val="num" w:pos="6480"/>
+        </w:tabs>
+        <w:ind w:left="6480" w:hanging="360"/>
+      </w:pPr>
+      <w:rPr>
+        <w:rFonts w:ascii="Wingdings" w:hAnsi="Wingdings" w:hint="default"/>
+        <w:sz w:val="20"/>
+      </w:rPr>
+    </w:lvl>
+  </w:abstractNum>
+  <w:abstractNum w:abstractNumId="2" w15:restartNumberingAfterBreak="0">
+    <w:nsid w:val="3AB27B83"/>
+    <w:multiLevelType w:val="multilevel"/>
+    <w:tmpl w:val="4748EA76"/>
+    <w:lvl w:ilvl="0">
+      <w:start w:val="1"/>
+      <w:numFmt w:val="bullet"/>
+      <w:lvlText w:val=""/>
+      <w:lvlJc w:val="left"/>
+      <w:pPr>
+        <w:tabs>
+          <w:tab w:val="num" w:pos="720"/>
+        </w:tabs>
+        <w:ind w:left="720" w:hanging="360"/>
+      </w:pPr>
+      <w:rPr>
+        <w:rFonts w:ascii="Symbol" w:hAnsi="Symbol" w:hint="default"/>
+        <w:sz w:val="20"/>
+      </w:rPr>
+    </w:lvl>
+    <w:lvl w:ilvl="1" w:tentative="1">
+      <w:start w:val="1"/>
+      <w:numFmt w:val="bullet"/>
+      <w:lvlText w:val="o"/>
+      <w:lvlJc w:val="left"/>
+      <w:pPr>
+        <w:tabs>
+          <w:tab w:val="num" w:pos="1440"/>
+        </w:tabs>
+        <w:ind w:left="1440" w:hanging="360"/>
+      </w:pPr>
+      <w:rPr>
+        <w:rFonts w:ascii="Courier New" w:hAnsi="Courier New" w:hint="default"/>
+        <w:sz w:val="20"/>
+      </w:rPr>
+    </w:lvl>
+    <w:lvl w:ilvl="2" w:tentative="1">
+      <w:start w:val="1"/>
+      <w:numFmt w:val="bullet"/>
+      <w:lvlText w:val=""/>
+      <w:lvlJc w:val="left"/>
+      <w:pPr>
+        <w:tabs>
+          <w:tab w:val="num" w:pos="2160"/>
+        </w:tabs>
+        <w:ind w:left="2160" w:hanging="360"/>
+      </w:pPr>
+      <w:rPr>
+        <w:rFonts w:ascii="Wingdings" w:hAnsi="Wingdings" w:hint="default"/>
+        <w:sz w:val="20"/>
+      </w:rPr>
+    </w:lvl>
+    <w:lvl w:ilvl="3" w:tentative="1">
+      <w:start w:val="1"/>
+      <w:numFmt w:val="bullet"/>
+      <w:lvlText w:val=""/>
+      <w:lvlJc w:val="left"/>
+      <w:pPr>
+        <w:tabs>
+          <w:tab w:val="num" w:pos="2880"/>
+        </w:tabs>
+        <w:ind w:left="2880" w:hanging="360"/>
+      </w:pPr>
+      <w:rPr>
+        <w:rFonts w:ascii="Wingdings" w:hAnsi="Wingdings" w:hint="default"/>
+        <w:sz w:val="20"/>
+      </w:rPr>
+    </w:lvl>
+    <w:lvl w:ilvl="4" w:tentative="1">
+      <w:start w:val="1"/>
+      <w:numFmt w:val="bullet"/>
+      <w:lvlText w:val=""/>
+      <w:lvlJc w:val="left"/>
+      <w:pPr>
+        <w:tabs>
+          <w:tab w:val="num" w:pos="3600"/>
+        </w:tabs>
+        <w:ind w:left="3600" w:hanging="360"/>
+      </w:pPr>
+      <w:rPr>
+        <w:rFonts w:ascii="Wingdings" w:hAnsi="Wingdings" w:hint="default"/>
+        <w:sz w:val="20"/>
+      </w:rPr>
+    </w:lvl>
+    <w:lvl w:ilvl="5" w:tentative="1">
+      <w:start w:val="1"/>
+      <w:numFmt w:val="bullet"/>
+      <w:lvlText w:val=""/>
+      <w:lvlJc w:val="left"/>
+      <w:pPr>
+        <w:tabs>
+          <w:tab w:val="num" w:pos="4320"/>
+        </w:tabs>
+        <w:ind w:left="4320" w:hanging="360"/>
+      </w:pPr>
+      <w:rPr>
+        <w:rFonts w:ascii="Wingdings" w:hAnsi="Wingdings" w:hint="default"/>
+        <w:sz w:val="20"/>
+      </w:rPr>
+    </w:lvl>
+    <w:lvl w:ilvl="6" w:tentative="1">
+      <w:start w:val="1"/>
+      <w:numFmt w:val="bullet"/>
+      <w:lvlText w:val=""/>
+      <w:lvlJc w:val="left"/>
+      <w:pPr>
+        <w:tabs>
+          <w:tab w:val="num" w:pos="5040"/>
+        </w:tabs>
+        <w:ind w:left="5040" w:hanging="360"/>
+      </w:pPr>
+      <w:rPr>
+        <w:rFonts w:ascii="Wingdings" w:hAnsi="Wingdings" w:hint="default"/>
+        <w:sz w:val="20"/>
+      </w:rPr>
+    </w:lvl>
+    <w:lvl w:ilvl="7" w:tentative="1">
+      <w:start w:val="1"/>
+      <w:numFmt w:val="bullet"/>
+      <w:lvlText w:val=""/>
+      <w:lvlJc w:val="left"/>
+      <w:pPr>
+        <w:tabs>
+          <w:tab w:val="num" w:pos="5760"/>
+        </w:tabs>
+        <w:ind w:left="5760" w:hanging="360"/>
+      </w:pPr>
+      <w:rPr>
+        <w:rFonts w:ascii="Wingdings" w:hAnsi="Wingdings" w:hint="default"/>
+        <w:sz w:val="20"/>
+      </w:rPr>
+    </w:lvl>
+    <w:lvl w:ilvl="8" w:tentative="1">
+      <w:start w:val="1"/>
+      <w:numFmt w:val="bullet"/>
+      <w:lvlText w:val=""/>
+      <w:lvlJc w:val="left"/>
+      <w:pPr>
+        <w:tabs>
+          <w:tab w:val="num" w:pos="6480"/>
+        </w:tabs>
+        <w:ind w:left="6480" w:hanging="360"/>
+      </w:pPr>
+      <w:rPr>
+        <w:rFonts w:ascii="Wingdings" w:hAnsi="Wingdings" w:hint="default"/>
+        <w:sz w:val="20"/>
+      </w:rPr>
+    </w:lvl>
+  </w:abstractNum>
+  <w:abstractNum w:abstractNumId="3" w15:restartNumberingAfterBreak="0">
     <w:nsid w:val="3C821053"/>
     <w:multiLevelType w:val="multilevel"/>
     <w:tmpl w:val="C850357A"/>
@@ -2176,7 +3318,7 @@
       </w:rPr>
     </w:lvl>
   </w:abstractNum>
-  <w:abstractNum w:abstractNumId="2" w15:restartNumberingAfterBreak="0">
+  <w:abstractNum w:abstractNumId="4" w15:restartNumberingAfterBreak="0">
     <w:nsid w:val="44DA1705"/>
     <w:multiLevelType w:val="multilevel"/>
     <w:tmpl w:val="90C45654"/>
@@ -2325,7 +3467,7 @@
       </w:rPr>
     </w:lvl>
   </w:abstractNum>
-  <w:abstractNum w:abstractNumId="3" w15:restartNumberingAfterBreak="0">
+  <w:abstractNum w:abstractNumId="5" w15:restartNumberingAfterBreak="0">
     <w:nsid w:val="46BB3644"/>
     <w:multiLevelType w:val="multilevel"/>
     <w:tmpl w:val="1E8C2F32"/>
@@ -2474,7 +3616,7 @@
       </w:rPr>
     </w:lvl>
   </w:abstractNum>
-  <w:abstractNum w:abstractNumId="4" w15:restartNumberingAfterBreak="0">
+  <w:abstractNum w:abstractNumId="6" w15:restartNumberingAfterBreak="0">
     <w:nsid w:val="504B0431"/>
     <w:multiLevelType w:val="multilevel"/>
     <w:tmpl w:val="E58E17B0"/>
@@ -2623,7 +3765,7 @@
       </w:rPr>
     </w:lvl>
   </w:abstractNum>
-  <w:abstractNum w:abstractNumId="5" w15:restartNumberingAfterBreak="0">
+  <w:abstractNum w:abstractNumId="7" w15:restartNumberingAfterBreak="0">
     <w:nsid w:val="55794DD6"/>
     <w:multiLevelType w:val="multilevel"/>
     <w:tmpl w:val="AEB4B5C4"/>
@@ -2772,7 +3914,7 @@
       </w:rPr>
     </w:lvl>
   </w:abstractNum>
-  <w:abstractNum w:abstractNumId="6" w15:restartNumberingAfterBreak="0">
+  <w:abstractNum w:abstractNumId="8" w15:restartNumberingAfterBreak="0">
     <w:nsid w:val="59666CA0"/>
     <w:multiLevelType w:val="multilevel"/>
     <w:tmpl w:val="16783740"/>
@@ -2921,7 +4063,7 @@
       </w:rPr>
     </w:lvl>
   </w:abstractNum>
-  <w:abstractNum w:abstractNumId="7" w15:restartNumberingAfterBreak="0">
+  <w:abstractNum w:abstractNumId="9" w15:restartNumberingAfterBreak="0">
     <w:nsid w:val="5FB91384"/>
     <w:multiLevelType w:val="multilevel"/>
     <w:tmpl w:val="BE86C038"/>
@@ -3070,7 +4212,305 @@
       </w:rPr>
     </w:lvl>
   </w:abstractNum>
-  <w:abstractNum w:abstractNumId="8" w15:restartNumberingAfterBreak="0">
+  <w:abstractNum w:abstractNumId="10" w15:restartNumberingAfterBreak="0">
+    <w:nsid w:val="6AAC0655"/>
+    <w:multiLevelType w:val="multilevel"/>
+    <w:tmpl w:val="3BE2C5A6"/>
+    <w:lvl w:ilvl="0">
+      <w:start w:val="1"/>
+      <w:numFmt w:val="bullet"/>
+      <w:lvlText w:val=""/>
+      <w:lvlJc w:val="left"/>
+      <w:pPr>
+        <w:tabs>
+          <w:tab w:val="num" w:pos="720"/>
+        </w:tabs>
+        <w:ind w:left="720" w:hanging="360"/>
+      </w:pPr>
+      <w:rPr>
+        <w:rFonts w:ascii="Symbol" w:hAnsi="Symbol" w:hint="default"/>
+        <w:sz w:val="20"/>
+      </w:rPr>
+    </w:lvl>
+    <w:lvl w:ilvl="1" w:tentative="1">
+      <w:start w:val="1"/>
+      <w:numFmt w:val="bullet"/>
+      <w:lvlText w:val="o"/>
+      <w:lvlJc w:val="left"/>
+      <w:pPr>
+        <w:tabs>
+          <w:tab w:val="num" w:pos="1440"/>
+        </w:tabs>
+        <w:ind w:left="1440" w:hanging="360"/>
+      </w:pPr>
+      <w:rPr>
+        <w:rFonts w:ascii="Courier New" w:hAnsi="Courier New" w:hint="default"/>
+        <w:sz w:val="20"/>
+      </w:rPr>
+    </w:lvl>
+    <w:lvl w:ilvl="2" w:tentative="1">
+      <w:start w:val="1"/>
+      <w:numFmt w:val="bullet"/>
+      <w:lvlText w:val=""/>
+      <w:lvlJc w:val="left"/>
+      <w:pPr>
+        <w:tabs>
+          <w:tab w:val="num" w:pos="2160"/>
+        </w:tabs>
+        <w:ind w:left="2160" w:hanging="360"/>
+      </w:pPr>
+      <w:rPr>
+        <w:rFonts w:ascii="Wingdings" w:hAnsi="Wingdings" w:hint="default"/>
+        <w:sz w:val="20"/>
+      </w:rPr>
+    </w:lvl>
+    <w:lvl w:ilvl="3" w:tentative="1">
+      <w:start w:val="1"/>
+      <w:numFmt w:val="bullet"/>
+      <w:lvlText w:val=""/>
+      <w:lvlJc w:val="left"/>
+      <w:pPr>
+        <w:tabs>
+          <w:tab w:val="num" w:pos="2880"/>
+        </w:tabs>
+        <w:ind w:left="2880" w:hanging="360"/>
+      </w:pPr>
+      <w:rPr>
+        <w:rFonts w:ascii="Wingdings" w:hAnsi="Wingdings" w:hint="default"/>
+        <w:sz w:val="20"/>
+      </w:rPr>
+    </w:lvl>
+    <w:lvl w:ilvl="4" w:tentative="1">
+      <w:start w:val="1"/>
+      <w:numFmt w:val="bullet"/>
+      <w:lvlText w:val=""/>
+      <w:lvlJc w:val="left"/>
+      <w:pPr>
+        <w:tabs>
+          <w:tab w:val="num" w:pos="3600"/>
+        </w:tabs>
+        <w:ind w:left="3600" w:hanging="360"/>
+      </w:pPr>
+      <w:rPr>
+        <w:rFonts w:ascii="Wingdings" w:hAnsi="Wingdings" w:hint="default"/>
+        <w:sz w:val="20"/>
+      </w:rPr>
+    </w:lvl>
+    <w:lvl w:ilvl="5" w:tentative="1">
+      <w:start w:val="1"/>
+      <w:numFmt w:val="bullet"/>
+      <w:lvlText w:val=""/>
+      <w:lvlJc w:val="left"/>
+      <w:pPr>
+        <w:tabs>
+          <w:tab w:val="num" w:pos="4320"/>
+        </w:tabs>
+        <w:ind w:left="4320" w:hanging="360"/>
+      </w:pPr>
+      <w:rPr>
+        <w:rFonts w:ascii="Wingdings" w:hAnsi="Wingdings" w:hint="default"/>
+        <w:sz w:val="20"/>
+      </w:rPr>
+    </w:lvl>
+    <w:lvl w:ilvl="6" w:tentative="1">
+      <w:start w:val="1"/>
+      <w:numFmt w:val="bullet"/>
+      <w:lvlText w:val=""/>
+      <w:lvlJc w:val="left"/>
+      <w:pPr>
+        <w:tabs>
+          <w:tab w:val="num" w:pos="5040"/>
+        </w:tabs>
+        <w:ind w:left="5040" w:hanging="360"/>
+      </w:pPr>
+      <w:rPr>
+        <w:rFonts w:ascii="Wingdings" w:hAnsi="Wingdings" w:hint="default"/>
+        <w:sz w:val="20"/>
+      </w:rPr>
+    </w:lvl>
+    <w:lvl w:ilvl="7" w:tentative="1">
+      <w:start w:val="1"/>
+      <w:numFmt w:val="bullet"/>
+      <w:lvlText w:val=""/>
+      <w:lvlJc w:val="left"/>
+      <w:pPr>
+        <w:tabs>
+          <w:tab w:val="num" w:pos="5760"/>
+        </w:tabs>
+        <w:ind w:left="5760" w:hanging="360"/>
+      </w:pPr>
+      <w:rPr>
+        <w:rFonts w:ascii="Wingdings" w:hAnsi="Wingdings" w:hint="default"/>
+        <w:sz w:val="20"/>
+      </w:rPr>
+    </w:lvl>
+    <w:lvl w:ilvl="8" w:tentative="1">
+      <w:start w:val="1"/>
+      <w:numFmt w:val="bullet"/>
+      <w:lvlText w:val=""/>
+      <w:lvlJc w:val="left"/>
+      <w:pPr>
+        <w:tabs>
+          <w:tab w:val="num" w:pos="6480"/>
+        </w:tabs>
+        <w:ind w:left="6480" w:hanging="360"/>
+      </w:pPr>
+      <w:rPr>
+        <w:rFonts w:ascii="Wingdings" w:hAnsi="Wingdings" w:hint="default"/>
+        <w:sz w:val="20"/>
+      </w:rPr>
+    </w:lvl>
+  </w:abstractNum>
+  <w:abstractNum w:abstractNumId="11" w15:restartNumberingAfterBreak="0">
+    <w:nsid w:val="6F711484"/>
+    <w:multiLevelType w:val="multilevel"/>
+    <w:tmpl w:val="5CFC99EA"/>
+    <w:lvl w:ilvl="0">
+      <w:start w:val="1"/>
+      <w:numFmt w:val="bullet"/>
+      <w:lvlText w:val=""/>
+      <w:lvlJc w:val="left"/>
+      <w:pPr>
+        <w:tabs>
+          <w:tab w:val="num" w:pos="720"/>
+        </w:tabs>
+        <w:ind w:left="720" w:hanging="360"/>
+      </w:pPr>
+      <w:rPr>
+        <w:rFonts w:ascii="Symbol" w:hAnsi="Symbol" w:hint="default"/>
+        <w:sz w:val="20"/>
+      </w:rPr>
+    </w:lvl>
+    <w:lvl w:ilvl="1" w:tentative="1">
+      <w:start w:val="1"/>
+      <w:numFmt w:val="bullet"/>
+      <w:lvlText w:val="o"/>
+      <w:lvlJc w:val="left"/>
+      <w:pPr>
+        <w:tabs>
+          <w:tab w:val="num" w:pos="1440"/>
+        </w:tabs>
+        <w:ind w:left="1440" w:hanging="360"/>
+      </w:pPr>
+      <w:rPr>
+        <w:rFonts w:ascii="Courier New" w:hAnsi="Courier New" w:hint="default"/>
+        <w:sz w:val="20"/>
+      </w:rPr>
+    </w:lvl>
+    <w:lvl w:ilvl="2" w:tentative="1">
+      <w:start w:val="1"/>
+      <w:numFmt w:val="bullet"/>
+      <w:lvlText w:val=""/>
+      <w:lvlJc w:val="left"/>
+      <w:pPr>
+        <w:tabs>
+          <w:tab w:val="num" w:pos="2160"/>
+        </w:tabs>
+        <w:ind w:left="2160" w:hanging="360"/>
+      </w:pPr>
+      <w:rPr>
+        <w:rFonts w:ascii="Wingdings" w:hAnsi="Wingdings" w:hint="default"/>
+        <w:sz w:val="20"/>
+      </w:rPr>
+    </w:lvl>
+    <w:lvl w:ilvl="3" w:tentative="1">
+      <w:start w:val="1"/>
+      <w:numFmt w:val="bullet"/>
+      <w:lvlText w:val=""/>
+      <w:lvlJc w:val="left"/>
+      <w:pPr>
+        <w:tabs>
+          <w:tab w:val="num" w:pos="2880"/>
+        </w:tabs>
+        <w:ind w:left="2880" w:hanging="360"/>
+      </w:pPr>
+      <w:rPr>
+        <w:rFonts w:ascii="Wingdings" w:hAnsi="Wingdings" w:hint="default"/>
+        <w:sz w:val="20"/>
+      </w:rPr>
+    </w:lvl>
+    <w:lvl w:ilvl="4" w:tentative="1">
+      <w:start w:val="1"/>
+      <w:numFmt w:val="bullet"/>
+      <w:lvlText w:val=""/>
+      <w:lvlJc w:val="left"/>
+      <w:pPr>
+        <w:tabs>
+          <w:tab w:val="num" w:pos="3600"/>
+        </w:tabs>
+        <w:ind w:left="3600" w:hanging="360"/>
+      </w:pPr>
+      <w:rPr>
+        <w:rFonts w:ascii="Wingdings" w:hAnsi="Wingdings" w:hint="default"/>
+        <w:sz w:val="20"/>
+      </w:rPr>
+    </w:lvl>
+    <w:lvl w:ilvl="5" w:tentative="1">
+      <w:start w:val="1"/>
+      <w:numFmt w:val="bullet"/>
+      <w:lvlText w:val=""/>
+      <w:lvlJc w:val="left"/>
+      <w:pPr>
+        <w:tabs>
+          <w:tab w:val="num" w:pos="4320"/>
+        </w:tabs>
+        <w:ind w:left="4320" w:hanging="360"/>
+      </w:pPr>
+      <w:rPr>
+        <w:rFonts w:ascii="Wingdings" w:hAnsi="Wingdings" w:hint="default"/>
+        <w:sz w:val="20"/>
+      </w:rPr>
+    </w:lvl>
+    <w:lvl w:ilvl="6" w:tentative="1">
+      <w:start w:val="1"/>
+      <w:numFmt w:val="bullet"/>
+      <w:lvlText w:val=""/>
+      <w:lvlJc w:val="left"/>
+      <w:pPr>
+        <w:tabs>
+          <w:tab w:val="num" w:pos="5040"/>
+        </w:tabs>
+        <w:ind w:left="5040" w:hanging="360"/>
+      </w:pPr>
+      <w:rPr>
+        <w:rFonts w:ascii="Wingdings" w:hAnsi="Wingdings" w:hint="default"/>
+        <w:sz w:val="20"/>
+      </w:rPr>
+    </w:lvl>
+    <w:lvl w:ilvl="7" w:tentative="1">
+      <w:start w:val="1"/>
+      <w:numFmt w:val="bullet"/>
+      <w:lvlText w:val=""/>
+      <w:lvlJc w:val="left"/>
+      <w:pPr>
+        <w:tabs>
+          <w:tab w:val="num" w:pos="5760"/>
+        </w:tabs>
+        <w:ind w:left="5760" w:hanging="360"/>
+      </w:pPr>
+      <w:rPr>
+        <w:rFonts w:ascii="Wingdings" w:hAnsi="Wingdings" w:hint="default"/>
+        <w:sz w:val="20"/>
+      </w:rPr>
+    </w:lvl>
+    <w:lvl w:ilvl="8" w:tentative="1">
+      <w:start w:val="1"/>
+      <w:numFmt w:val="bullet"/>
+      <w:lvlText w:val=""/>
+      <w:lvlJc w:val="left"/>
+      <w:pPr>
+        <w:tabs>
+          <w:tab w:val="num" w:pos="6480"/>
+        </w:tabs>
+        <w:ind w:left="6480" w:hanging="360"/>
+      </w:pPr>
+      <w:rPr>
+        <w:rFonts w:ascii="Wingdings" w:hAnsi="Wingdings" w:hint="default"/>
+        <w:sz w:val="20"/>
+      </w:rPr>
+    </w:lvl>
+  </w:abstractNum>
+  <w:abstractNum w:abstractNumId="12" w15:restartNumberingAfterBreak="0">
     <w:nsid w:val="7B397AF2"/>
     <w:multiLevelType w:val="multilevel"/>
     <w:tmpl w:val="E548BD7E"/>
@@ -3219,7 +4659,7 @@
       </w:rPr>
     </w:lvl>
   </w:abstractNum>
-  <w:abstractNum w:abstractNumId="9" w15:restartNumberingAfterBreak="0">
+  <w:abstractNum w:abstractNumId="13" w15:restartNumberingAfterBreak="0">
     <w:nsid w:val="7DEF14AF"/>
     <w:multiLevelType w:val="multilevel"/>
     <w:tmpl w:val="5C6E4EAA"/>
@@ -3368,7 +4808,7 @@
       </w:rPr>
     </w:lvl>
   </w:abstractNum>
-  <w:abstractNum w:abstractNumId="10" w15:restartNumberingAfterBreak="0">
+  <w:abstractNum w:abstractNumId="14" w15:restartNumberingAfterBreak="0">
     <w:nsid w:val="7E2E0E7E"/>
     <w:multiLevelType w:val="multilevel"/>
     <w:tmpl w:val="56E88AB0"/>
@@ -3481,7 +4921,7 @@
       </w:pPr>
     </w:lvl>
   </w:abstractNum>
-  <w:abstractNum w:abstractNumId="11" w15:restartNumberingAfterBreak="0">
+  <w:abstractNum w:abstractNumId="15" w15:restartNumberingAfterBreak="0">
     <w:nsid w:val="7F972423"/>
     <w:multiLevelType w:val="multilevel"/>
     <w:tmpl w:val="0B1C78C0"/>
@@ -3595,40 +5035,52 @@
     </w:lvl>
   </w:abstractNum>
   <w:num w:numId="1" w16cid:durableId="1676029529">
-    <w:abstractNumId w:val="5"/>
+    <w:abstractNumId w:val="7"/>
   </w:num>
   <w:num w:numId="2" w16cid:durableId="1750498978">
-    <w:abstractNumId w:val="1"/>
+    <w:abstractNumId w:val="3"/>
   </w:num>
   <w:num w:numId="3" w16cid:durableId="1314990887">
-    <w:abstractNumId w:val="7"/>
+    <w:abstractNumId w:val="9"/>
   </w:num>
   <w:num w:numId="4" w16cid:durableId="1607300712">
     <w:abstractNumId w:val="0"/>
   </w:num>
   <w:num w:numId="5" w16cid:durableId="1998222103">
-    <w:abstractNumId w:val="3"/>
+    <w:abstractNumId w:val="5"/>
   </w:num>
   <w:num w:numId="6" w16cid:durableId="1824663458">
+    <w:abstractNumId w:val="15"/>
+  </w:num>
+  <w:num w:numId="7" w16cid:durableId="79907861">
+    <w:abstractNumId w:val="8"/>
+  </w:num>
+  <w:num w:numId="8" w16cid:durableId="306588739">
+    <w:abstractNumId w:val="12"/>
+  </w:num>
+  <w:num w:numId="9" w16cid:durableId="315954786">
+    <w:abstractNumId w:val="4"/>
+  </w:num>
+  <w:num w:numId="10" w16cid:durableId="220140427">
+    <w:abstractNumId w:val="6"/>
+  </w:num>
+  <w:num w:numId="11" w16cid:durableId="272130988">
+    <w:abstractNumId w:val="14"/>
+  </w:num>
+  <w:num w:numId="12" w16cid:durableId="656231512">
+    <w:abstractNumId w:val="13"/>
+  </w:num>
+  <w:num w:numId="13" w16cid:durableId="1789156210">
+    <w:abstractNumId w:val="1"/>
+  </w:num>
+  <w:num w:numId="14" w16cid:durableId="473761800">
     <w:abstractNumId w:val="11"/>
   </w:num>
-  <w:num w:numId="7" w16cid:durableId="79907861">
-    <w:abstractNumId w:val="6"/>
-  </w:num>
-  <w:num w:numId="8" w16cid:durableId="306588739">
-    <w:abstractNumId w:val="8"/>
-  </w:num>
-  <w:num w:numId="9" w16cid:durableId="315954786">
+  <w:num w:numId="15" w16cid:durableId="943421026">
     <w:abstractNumId w:val="2"/>
   </w:num>
-  <w:num w:numId="10" w16cid:durableId="220140427">
-    <w:abstractNumId w:val="4"/>
-  </w:num>
-  <w:num w:numId="11" w16cid:durableId="272130988">
+  <w:num w:numId="16" w16cid:durableId="254246183">
     <w:abstractNumId w:val="10"/>
-  </w:num>
-  <w:num w:numId="12" w16cid:durableId="656231512">
-    <w:abstractNumId w:val="9"/>
   </w:num>
 </w:numbering>
 </file>

</xml_diff>

<commit_message>
feat: se implementa supervisorPage básica
</commit_message>
<xml_diff>
--- a/dctos/Aqua Code Bases.docx
+++ b/dctos/Aqua Code Bases.docx
@@ -2040,7 +2040,7 @@
     <w:p>
       <w:r>
         <w:pict w14:anchorId="20F5E393">
-          <v:rect id="_x0000_i1048" style="width:0;height:1.5pt" o:hralign="center" o:hrstd="t" o:hr="t" fillcolor="#a0a0a0" stroked="f"/>
+          <v:rect id="_x0000_i1030" style="width:0;height:1.5pt" o:hralign="center" o:hrstd="t" o:hr="t" fillcolor="#a0a0a0" stroked="f"/>
         </w:pict>
       </w:r>
     </w:p>
@@ -2154,7 +2154,7 @@
     <w:p>
       <w:r>
         <w:pict w14:anchorId="14283FBE">
-          <v:rect id="_x0000_i1049" style="width:0;height:1.5pt" o:hralign="center" o:hrstd="t" o:hr="t" fillcolor="#a0a0a0" stroked="f"/>
+          <v:rect id="_x0000_i1031" style="width:0;height:1.5pt" o:hralign="center" o:hrstd="t" o:hr="t" fillcolor="#a0a0a0" stroked="f"/>
         </w:pict>
       </w:r>
     </w:p>
@@ -2370,7 +2370,7 @@
     <w:p>
       <w:r>
         <w:pict w14:anchorId="67221E7C">
-          <v:rect id="_x0000_i1050" style="width:0;height:1.5pt" o:hralign="center" o:hrstd="t" o:hr="t" fillcolor="#a0a0a0" stroked="f"/>
+          <v:rect id="_x0000_i1032" style="width:0;height:1.5pt" o:hralign="center" o:hrstd="t" o:hr="t" fillcolor="#a0a0a0" stroked="f"/>
         </w:pict>
       </w:r>
     </w:p>
@@ -2707,6 +2707,349 @@
       </w:r>
       <w:r>
         <w:t xml:space="preserve"> Mantiene la memoria global de quién inició sesión (rol, ID, token) para que cualquier parte de la aplicación sepa qué mostrar o bloquear.</w:t>
+      </w:r>
+    </w:p>
+    <w:p/>
+    <w:p/>
+    <w:p>
+      <w:pPr>
+        <w:pStyle w:val="Subttulo"/>
+      </w:pPr>
+      <w:proofErr w:type="spellStart"/>
+      <w:r>
+        <w:lastRenderedPageBreak/>
+        <w:t>AppRoutes.jsx</w:t>
+      </w:r>
+      <w:proofErr w:type="spellEnd"/>
+    </w:p>
+    <w:p>
+      <w:r>
+        <w:rPr>
+          <w:b/>
+          <w:bCs/>
+        </w:rPr>
+        <w:t>1. El orden de las capas (&lt;</w:t>
+      </w:r>
+      <w:proofErr w:type="spellStart"/>
+      <w:r>
+        <w:rPr>
+          <w:b/>
+          <w:bCs/>
+        </w:rPr>
+        <w:t>BrowserRouter</w:t>
+      </w:r>
+      <w:proofErr w:type="spellEnd"/>
+      <w:r>
+        <w:rPr>
+          <w:b/>
+          <w:bCs/>
+        </w:rPr>
+        <w:t>&gt; y &lt;</w:t>
+      </w:r>
+      <w:proofErr w:type="spellStart"/>
+      <w:r>
+        <w:rPr>
+          <w:b/>
+          <w:bCs/>
+        </w:rPr>
+        <w:t>AuthProvider</w:t>
+      </w:r>
+      <w:proofErr w:type="spellEnd"/>
+      <w:r>
+        <w:rPr>
+          <w:b/>
+          <w:bCs/>
+        </w:rPr>
+        <w:t>&gt;)</w:t>
+      </w:r>
+    </w:p>
+    <w:p>
+      <w:pPr>
+        <w:numPr>
+          <w:ilvl w:val="0"/>
+          <w:numId w:val="17"/>
+        </w:numPr>
+      </w:pPr>
+      <w:proofErr w:type="spellStart"/>
+      <w:r>
+        <w:t>BrowserRouter</w:t>
+      </w:r>
+      <w:proofErr w:type="spellEnd"/>
+      <w:r>
+        <w:t xml:space="preserve"> es el motor que lee las </w:t>
+      </w:r>
+      <w:proofErr w:type="spellStart"/>
+      <w:r>
+        <w:t>URLs</w:t>
+      </w:r>
+      <w:proofErr w:type="spellEnd"/>
+      <w:r>
+        <w:t xml:space="preserve"> de tu navegador. Debe ir siempre afuera para que todo lo que esté adentro sepa en qué página estás.</w:t>
+      </w:r>
+    </w:p>
+    <w:p>
+      <w:pPr>
+        <w:numPr>
+          <w:ilvl w:val="0"/>
+          <w:numId w:val="17"/>
+        </w:numPr>
+      </w:pPr>
+      <w:proofErr w:type="spellStart"/>
+      <w:r>
+        <w:t>AuthProvider</w:t>
+      </w:r>
+      <w:proofErr w:type="spellEnd"/>
+      <w:r>
+        <w:t xml:space="preserve"> es la "memoria" global de tu aplicación que sabe quién inició sesión y cuál es su token. Al ponerlo </w:t>
+      </w:r>
+      <w:r>
+        <w:rPr>
+          <w:i/>
+          <w:iCs/>
+        </w:rPr>
+        <w:t>inmediatamente adentro</w:t>
+      </w:r>
+      <w:r>
+        <w:t xml:space="preserve"> del </w:t>
+      </w:r>
+      <w:proofErr w:type="spellStart"/>
+      <w:r>
+        <w:t>router</w:t>
+      </w:r>
+      <w:proofErr w:type="spellEnd"/>
+      <w:r>
+        <w:t xml:space="preserve">, garantizas que cualquier pantalla pueda preguntar "¿quién está </w:t>
+      </w:r>
+      <w:proofErr w:type="spellStart"/>
+      <w:r>
+        <w:t>logueado</w:t>
+      </w:r>
+      <w:proofErr w:type="spellEnd"/>
+      <w:r>
+        <w:t>?" y que tu propio sistema de autenticación pueda redirigir al usuario si es necesario.</w:t>
+      </w:r>
+    </w:p>
+    <w:p>
+      <w:r>
+        <w:rPr>
+          <w:b/>
+          <w:bCs/>
+        </w:rPr>
+        <w:t>2. El "Embudo Infranqueable" de la ruta Privada (/</w:t>
+      </w:r>
+      <w:proofErr w:type="spellStart"/>
+      <w:r>
+        <w:rPr>
+          <w:b/>
+          <w:bCs/>
+        </w:rPr>
+        <w:t>dashboard</w:t>
+      </w:r>
+      <w:proofErr w:type="spellEnd"/>
+      <w:r>
+        <w:rPr>
+          <w:b/>
+          <w:bCs/>
+        </w:rPr>
+        <w:t>)</w:t>
+      </w:r>
+      <w:r>
+        <w:t xml:space="preserve"> En tu código anterior, tenías rutas explícitas separadas (como /</w:t>
+      </w:r>
+      <w:proofErr w:type="spellStart"/>
+      <w:r>
+        <w:t>admin-dashboard</w:t>
+      </w:r>
+      <w:proofErr w:type="spellEnd"/>
+      <w:r>
+        <w:t xml:space="preserve"> o /</w:t>
+      </w:r>
+      <w:proofErr w:type="spellStart"/>
+      <w:r>
+        <w:t>dashboard</w:t>
+      </w:r>
+      <w:proofErr w:type="spellEnd"/>
+      <w:r>
+        <w:t xml:space="preserve"> para el </w:t>
+      </w:r>
+      <w:proofErr w:type="spellStart"/>
+      <w:r>
+        <w:t>SuperAdmin</w:t>
+      </w:r>
+      <w:proofErr w:type="spellEnd"/>
+      <w:r>
+        <w:t>). El problema de eso es el riesgo de navegación manual: un usuario con menos privilegios podría escribir localhost:5173/</w:t>
+      </w:r>
+      <w:proofErr w:type="spellStart"/>
+      <w:r>
+        <w:t>dashboard</w:t>
+      </w:r>
+      <w:proofErr w:type="spellEnd"/>
+      <w:r>
+        <w:t xml:space="preserve"> en la URL de su navegador para intentar forzar la entrada a un panel que no le corresponde.</w:t>
+      </w:r>
+    </w:p>
+    <w:p>
+      <w:r>
+        <w:t>Al usar una única ruta /</w:t>
+      </w:r>
+      <w:proofErr w:type="spellStart"/>
+      <w:r>
+        <w:t>dashboard</w:t>
+      </w:r>
+      <w:proofErr w:type="spellEnd"/>
+      <w:r>
+        <w:t xml:space="preserve"> que apunta al componente &lt;</w:t>
+      </w:r>
+      <w:proofErr w:type="spellStart"/>
+      <w:r>
+        <w:t>RoleBasedDashboard</w:t>
+      </w:r>
+      <w:proofErr w:type="spellEnd"/>
+      <w:r>
+        <w:t xml:space="preserve"> /&gt;, creamos un escudo hermético. Todos los usuarios autenticados van a la misma URL (/</w:t>
+      </w:r>
+      <w:proofErr w:type="spellStart"/>
+      <w:r>
+        <w:t>dashboard</w:t>
+      </w:r>
+      <w:proofErr w:type="spellEnd"/>
+      <w:r>
+        <w:t xml:space="preserve">), pero es </w:t>
+      </w:r>
+      <w:proofErr w:type="spellStart"/>
+      <w:r>
+        <w:t>React</w:t>
+      </w:r>
+      <w:proofErr w:type="spellEnd"/>
+      <w:r>
+        <w:t xml:space="preserve"> quien decide y dibuja una pantalla totalmente distinta dependiendo de quién sea el usuario. </w:t>
+      </w:r>
+      <w:r>
+        <w:rPr>
+          <w:b/>
+          <w:bCs/>
+        </w:rPr>
+        <w:t>Es físicamente imposible que un usuario haga trampa escribiendo otra URL</w:t>
+      </w:r>
+      <w:r>
+        <w:t xml:space="preserve">, porque las otras </w:t>
+      </w:r>
+      <w:proofErr w:type="spellStart"/>
+      <w:r>
+        <w:t>URLs</w:t>
+      </w:r>
+      <w:proofErr w:type="spellEnd"/>
+      <w:r>
+        <w:t xml:space="preserve"> privadas ya ni siquiera existen en el enrutador.</w:t>
+      </w:r>
+    </w:p>
+    <w:p>
+      <w:r>
+        <w:rPr>
+          <w:b/>
+          <w:bCs/>
+        </w:rPr>
+        <w:t>3. Las Rutas Públicas Independientes</w:t>
+      </w:r>
+      <w:r>
+        <w:t xml:space="preserve"> La </w:t>
+      </w:r>
+      <w:proofErr w:type="spellStart"/>
+      <w:r>
+        <w:t>LandingPage</w:t>
+      </w:r>
+      <w:proofErr w:type="spellEnd"/>
+      <w:r>
+        <w:t xml:space="preserve"> (tu propuesta comercial) y el </w:t>
+      </w:r>
+      <w:proofErr w:type="spellStart"/>
+      <w:r>
+        <w:t>LoginPage</w:t>
+      </w:r>
+      <w:proofErr w:type="spellEnd"/>
+      <w:r>
+        <w:t xml:space="preserve"> están sueltas y expuestas porque son públicas. No necesitan verificaciones de token ni de roles.</w:t>
+      </w:r>
+    </w:p>
+    <w:p>
+      <w:r>
+        <w:rPr>
+          <w:b/>
+          <w:bCs/>
+        </w:rPr>
+        <w:t>4. La Red de Seguridad (*)</w:t>
+      </w:r>
+      <w:r>
+        <w:t xml:space="preserve"> La última línea &lt;Route </w:t>
+      </w:r>
+      <w:proofErr w:type="spellStart"/>
+      <w:r>
+        <w:t>path</w:t>
+      </w:r>
+      <w:proofErr w:type="spellEnd"/>
+      <w:r>
+        <w:t xml:space="preserve">="*" </w:t>
+      </w:r>
+      <w:proofErr w:type="spellStart"/>
+      <w:r>
+        <w:t>element</w:t>
+      </w:r>
+      <w:proofErr w:type="spellEnd"/>
+      <w:proofErr w:type="gramStart"/>
+      <w:r>
+        <w:t>={</w:t>
+      </w:r>
+      <w:proofErr w:type="gramEnd"/>
+      <w:r>
+        <w:t>&lt;</w:t>
+      </w:r>
+      <w:proofErr w:type="spellStart"/>
+      <w:r>
+        <w:t>Navigate</w:t>
+      </w:r>
+      <w:proofErr w:type="spellEnd"/>
+      <w:r>
+        <w:t xml:space="preserve"> </w:t>
+      </w:r>
+      <w:proofErr w:type="spellStart"/>
+      <w:r>
+        <w:t>to</w:t>
+      </w:r>
+      <w:proofErr w:type="spellEnd"/>
+      <w:r>
+        <w:t xml:space="preserve">="/" </w:t>
+      </w:r>
+      <w:proofErr w:type="spellStart"/>
+      <w:r>
+        <w:t>replace</w:t>
+      </w:r>
+      <w:proofErr w:type="spellEnd"/>
+      <w:r>
+        <w:t xml:space="preserve"> /&gt;} /&gt; es tu "seguro contra accidentes". Si un usuario (o un cliente curioso) inventa una URL que no existe (por ejemplo, localhost:5173/inventado), en lugar de que tu aplicación se rompa o muestre una pantalla en blanco, el enrutador lo atrapa y lo expulsa silenciosamente de regreso a la página de inicio (/).</w:t>
+      </w:r>
+    </w:p>
+    <w:p>
+      <w:r>
+        <w:t xml:space="preserve">En resumen: Esta estructura convierte a tu aplicación de una simple casa con muchas puertas (que tendrías que proteger una por una) a una </w:t>
+      </w:r>
+      <w:r>
+        <w:rPr>
+          <w:b/>
+          <w:bCs/>
+        </w:rPr>
+        <w:t>fortaleza con una sola puerta de entrada principal</w:t>
+      </w:r>
+      <w:r>
+        <w:t>, donde tu &lt;</w:t>
+      </w:r>
+      <w:proofErr w:type="spellStart"/>
+      <w:r>
+        <w:t>RoleBasedDashboard</w:t>
+      </w:r>
+      <w:proofErr w:type="spellEnd"/>
+      <w:r>
+        <w:t xml:space="preserve"> /&gt; es el guardia de seguridad que revisa la identificación y decide a qué cuarto te deja pasar.</w:t>
       </w:r>
     </w:p>
     <w:p/>
@@ -2872,6 +3215,155 @@
     </w:lvl>
   </w:abstractNum>
   <w:abstractNum w:abstractNumId="1" w15:restartNumberingAfterBreak="0">
+    <w:nsid w:val="2DB7777F"/>
+    <w:multiLevelType w:val="multilevel"/>
+    <w:tmpl w:val="11D22D08"/>
+    <w:lvl w:ilvl="0">
+      <w:start w:val="1"/>
+      <w:numFmt w:val="bullet"/>
+      <w:lvlText w:val=""/>
+      <w:lvlJc w:val="left"/>
+      <w:pPr>
+        <w:tabs>
+          <w:tab w:val="num" w:pos="720"/>
+        </w:tabs>
+        <w:ind w:left="720" w:hanging="360"/>
+      </w:pPr>
+      <w:rPr>
+        <w:rFonts w:ascii="Symbol" w:hAnsi="Symbol" w:hint="default"/>
+        <w:sz w:val="20"/>
+      </w:rPr>
+    </w:lvl>
+    <w:lvl w:ilvl="1" w:tentative="1">
+      <w:start w:val="1"/>
+      <w:numFmt w:val="bullet"/>
+      <w:lvlText w:val="o"/>
+      <w:lvlJc w:val="left"/>
+      <w:pPr>
+        <w:tabs>
+          <w:tab w:val="num" w:pos="1440"/>
+        </w:tabs>
+        <w:ind w:left="1440" w:hanging="360"/>
+      </w:pPr>
+      <w:rPr>
+        <w:rFonts w:ascii="Courier New" w:hAnsi="Courier New" w:hint="default"/>
+        <w:sz w:val="20"/>
+      </w:rPr>
+    </w:lvl>
+    <w:lvl w:ilvl="2" w:tentative="1">
+      <w:start w:val="1"/>
+      <w:numFmt w:val="bullet"/>
+      <w:lvlText w:val=""/>
+      <w:lvlJc w:val="left"/>
+      <w:pPr>
+        <w:tabs>
+          <w:tab w:val="num" w:pos="2160"/>
+        </w:tabs>
+        <w:ind w:left="2160" w:hanging="360"/>
+      </w:pPr>
+      <w:rPr>
+        <w:rFonts w:ascii="Wingdings" w:hAnsi="Wingdings" w:hint="default"/>
+        <w:sz w:val="20"/>
+      </w:rPr>
+    </w:lvl>
+    <w:lvl w:ilvl="3" w:tentative="1">
+      <w:start w:val="1"/>
+      <w:numFmt w:val="bullet"/>
+      <w:lvlText w:val=""/>
+      <w:lvlJc w:val="left"/>
+      <w:pPr>
+        <w:tabs>
+          <w:tab w:val="num" w:pos="2880"/>
+        </w:tabs>
+        <w:ind w:left="2880" w:hanging="360"/>
+      </w:pPr>
+      <w:rPr>
+        <w:rFonts w:ascii="Wingdings" w:hAnsi="Wingdings" w:hint="default"/>
+        <w:sz w:val="20"/>
+      </w:rPr>
+    </w:lvl>
+    <w:lvl w:ilvl="4" w:tentative="1">
+      <w:start w:val="1"/>
+      <w:numFmt w:val="bullet"/>
+      <w:lvlText w:val=""/>
+      <w:lvlJc w:val="left"/>
+      <w:pPr>
+        <w:tabs>
+          <w:tab w:val="num" w:pos="3600"/>
+        </w:tabs>
+        <w:ind w:left="3600" w:hanging="360"/>
+      </w:pPr>
+      <w:rPr>
+        <w:rFonts w:ascii="Wingdings" w:hAnsi="Wingdings" w:hint="default"/>
+        <w:sz w:val="20"/>
+      </w:rPr>
+    </w:lvl>
+    <w:lvl w:ilvl="5" w:tentative="1">
+      <w:start w:val="1"/>
+      <w:numFmt w:val="bullet"/>
+      <w:lvlText w:val=""/>
+      <w:lvlJc w:val="left"/>
+      <w:pPr>
+        <w:tabs>
+          <w:tab w:val="num" w:pos="4320"/>
+        </w:tabs>
+        <w:ind w:left="4320" w:hanging="360"/>
+      </w:pPr>
+      <w:rPr>
+        <w:rFonts w:ascii="Wingdings" w:hAnsi="Wingdings" w:hint="default"/>
+        <w:sz w:val="20"/>
+      </w:rPr>
+    </w:lvl>
+    <w:lvl w:ilvl="6" w:tentative="1">
+      <w:start w:val="1"/>
+      <w:numFmt w:val="bullet"/>
+      <w:lvlText w:val=""/>
+      <w:lvlJc w:val="left"/>
+      <w:pPr>
+        <w:tabs>
+          <w:tab w:val="num" w:pos="5040"/>
+        </w:tabs>
+        <w:ind w:left="5040" w:hanging="360"/>
+      </w:pPr>
+      <w:rPr>
+        <w:rFonts w:ascii="Wingdings" w:hAnsi="Wingdings" w:hint="default"/>
+        <w:sz w:val="20"/>
+      </w:rPr>
+    </w:lvl>
+    <w:lvl w:ilvl="7" w:tentative="1">
+      <w:start w:val="1"/>
+      <w:numFmt w:val="bullet"/>
+      <w:lvlText w:val=""/>
+      <w:lvlJc w:val="left"/>
+      <w:pPr>
+        <w:tabs>
+          <w:tab w:val="num" w:pos="5760"/>
+        </w:tabs>
+        <w:ind w:left="5760" w:hanging="360"/>
+      </w:pPr>
+      <w:rPr>
+        <w:rFonts w:ascii="Wingdings" w:hAnsi="Wingdings" w:hint="default"/>
+        <w:sz w:val="20"/>
+      </w:rPr>
+    </w:lvl>
+    <w:lvl w:ilvl="8" w:tentative="1">
+      <w:start w:val="1"/>
+      <w:numFmt w:val="bullet"/>
+      <w:lvlText w:val=""/>
+      <w:lvlJc w:val="left"/>
+      <w:pPr>
+        <w:tabs>
+          <w:tab w:val="num" w:pos="6480"/>
+        </w:tabs>
+        <w:ind w:left="6480" w:hanging="360"/>
+      </w:pPr>
+      <w:rPr>
+        <w:rFonts w:ascii="Wingdings" w:hAnsi="Wingdings" w:hint="default"/>
+        <w:sz w:val="20"/>
+      </w:rPr>
+    </w:lvl>
+  </w:abstractNum>
+  <w:abstractNum w:abstractNumId="2" w15:restartNumberingAfterBreak="0">
     <w:nsid w:val="301E2FAD"/>
     <w:multiLevelType w:val="multilevel"/>
     <w:tmpl w:val="73502F30"/>
@@ -3020,7 +3512,7 @@
       </w:rPr>
     </w:lvl>
   </w:abstractNum>
-  <w:abstractNum w:abstractNumId="2" w15:restartNumberingAfterBreak="0">
+  <w:abstractNum w:abstractNumId="3" w15:restartNumberingAfterBreak="0">
     <w:nsid w:val="3AB27B83"/>
     <w:multiLevelType w:val="multilevel"/>
     <w:tmpl w:val="4748EA76"/>
@@ -3169,7 +3661,7 @@
       </w:rPr>
     </w:lvl>
   </w:abstractNum>
-  <w:abstractNum w:abstractNumId="3" w15:restartNumberingAfterBreak="0">
+  <w:abstractNum w:abstractNumId="4" w15:restartNumberingAfterBreak="0">
     <w:nsid w:val="3C821053"/>
     <w:multiLevelType w:val="multilevel"/>
     <w:tmpl w:val="C850357A"/>
@@ -3318,7 +3810,7 @@
       </w:rPr>
     </w:lvl>
   </w:abstractNum>
-  <w:abstractNum w:abstractNumId="4" w15:restartNumberingAfterBreak="0">
+  <w:abstractNum w:abstractNumId="5" w15:restartNumberingAfterBreak="0">
     <w:nsid w:val="44DA1705"/>
     <w:multiLevelType w:val="multilevel"/>
     <w:tmpl w:val="90C45654"/>
@@ -3467,7 +3959,7 @@
       </w:rPr>
     </w:lvl>
   </w:abstractNum>
-  <w:abstractNum w:abstractNumId="5" w15:restartNumberingAfterBreak="0">
+  <w:abstractNum w:abstractNumId="6" w15:restartNumberingAfterBreak="0">
     <w:nsid w:val="46BB3644"/>
     <w:multiLevelType w:val="multilevel"/>
     <w:tmpl w:val="1E8C2F32"/>
@@ -3616,7 +4108,7 @@
       </w:rPr>
     </w:lvl>
   </w:abstractNum>
-  <w:abstractNum w:abstractNumId="6" w15:restartNumberingAfterBreak="0">
+  <w:abstractNum w:abstractNumId="7" w15:restartNumberingAfterBreak="0">
     <w:nsid w:val="504B0431"/>
     <w:multiLevelType w:val="multilevel"/>
     <w:tmpl w:val="E58E17B0"/>
@@ -3765,7 +4257,7 @@
       </w:rPr>
     </w:lvl>
   </w:abstractNum>
-  <w:abstractNum w:abstractNumId="7" w15:restartNumberingAfterBreak="0">
+  <w:abstractNum w:abstractNumId="8" w15:restartNumberingAfterBreak="0">
     <w:nsid w:val="55794DD6"/>
     <w:multiLevelType w:val="multilevel"/>
     <w:tmpl w:val="AEB4B5C4"/>
@@ -3914,7 +4406,7 @@
       </w:rPr>
     </w:lvl>
   </w:abstractNum>
-  <w:abstractNum w:abstractNumId="8" w15:restartNumberingAfterBreak="0">
+  <w:abstractNum w:abstractNumId="9" w15:restartNumberingAfterBreak="0">
     <w:nsid w:val="59666CA0"/>
     <w:multiLevelType w:val="multilevel"/>
     <w:tmpl w:val="16783740"/>
@@ -4063,7 +4555,7 @@
       </w:rPr>
     </w:lvl>
   </w:abstractNum>
-  <w:abstractNum w:abstractNumId="9" w15:restartNumberingAfterBreak="0">
+  <w:abstractNum w:abstractNumId="10" w15:restartNumberingAfterBreak="0">
     <w:nsid w:val="5FB91384"/>
     <w:multiLevelType w:val="multilevel"/>
     <w:tmpl w:val="BE86C038"/>
@@ -4212,7 +4704,7 @@
       </w:rPr>
     </w:lvl>
   </w:abstractNum>
-  <w:abstractNum w:abstractNumId="10" w15:restartNumberingAfterBreak="0">
+  <w:abstractNum w:abstractNumId="11" w15:restartNumberingAfterBreak="0">
     <w:nsid w:val="6AAC0655"/>
     <w:multiLevelType w:val="multilevel"/>
     <w:tmpl w:val="3BE2C5A6"/>
@@ -4361,7 +4853,7 @@
       </w:rPr>
     </w:lvl>
   </w:abstractNum>
-  <w:abstractNum w:abstractNumId="11" w15:restartNumberingAfterBreak="0">
+  <w:abstractNum w:abstractNumId="12" w15:restartNumberingAfterBreak="0">
     <w:nsid w:val="6F711484"/>
     <w:multiLevelType w:val="multilevel"/>
     <w:tmpl w:val="5CFC99EA"/>
@@ -4510,7 +5002,7 @@
       </w:rPr>
     </w:lvl>
   </w:abstractNum>
-  <w:abstractNum w:abstractNumId="12" w15:restartNumberingAfterBreak="0">
+  <w:abstractNum w:abstractNumId="13" w15:restartNumberingAfterBreak="0">
     <w:nsid w:val="7B397AF2"/>
     <w:multiLevelType w:val="multilevel"/>
     <w:tmpl w:val="E548BD7E"/>
@@ -4659,7 +5151,7 @@
       </w:rPr>
     </w:lvl>
   </w:abstractNum>
-  <w:abstractNum w:abstractNumId="13" w15:restartNumberingAfterBreak="0">
+  <w:abstractNum w:abstractNumId="14" w15:restartNumberingAfterBreak="0">
     <w:nsid w:val="7DEF14AF"/>
     <w:multiLevelType w:val="multilevel"/>
     <w:tmpl w:val="5C6E4EAA"/>
@@ -4808,7 +5300,7 @@
       </w:rPr>
     </w:lvl>
   </w:abstractNum>
-  <w:abstractNum w:abstractNumId="14" w15:restartNumberingAfterBreak="0">
+  <w:abstractNum w:abstractNumId="15" w15:restartNumberingAfterBreak="0">
     <w:nsid w:val="7E2E0E7E"/>
     <w:multiLevelType w:val="multilevel"/>
     <w:tmpl w:val="56E88AB0"/>
@@ -4921,7 +5413,7 @@
       </w:pPr>
     </w:lvl>
   </w:abstractNum>
-  <w:abstractNum w:abstractNumId="15" w15:restartNumberingAfterBreak="0">
+  <w:abstractNum w:abstractNumId="16" w15:restartNumberingAfterBreak="0">
     <w:nsid w:val="7F972423"/>
     <w:multiLevelType w:val="multilevel"/>
     <w:tmpl w:val="0B1C78C0"/>
@@ -5035,52 +5527,55 @@
     </w:lvl>
   </w:abstractNum>
   <w:num w:numId="1" w16cid:durableId="1676029529">
-    <w:abstractNumId w:val="7"/>
+    <w:abstractNumId w:val="8"/>
   </w:num>
   <w:num w:numId="2" w16cid:durableId="1750498978">
-    <w:abstractNumId w:val="3"/>
+    <w:abstractNumId w:val="4"/>
   </w:num>
   <w:num w:numId="3" w16cid:durableId="1314990887">
-    <w:abstractNumId w:val="9"/>
+    <w:abstractNumId w:val="10"/>
   </w:num>
   <w:num w:numId="4" w16cid:durableId="1607300712">
     <w:abstractNumId w:val="0"/>
   </w:num>
   <w:num w:numId="5" w16cid:durableId="1998222103">
+    <w:abstractNumId w:val="6"/>
+  </w:num>
+  <w:num w:numId="6" w16cid:durableId="1824663458">
+    <w:abstractNumId w:val="16"/>
+  </w:num>
+  <w:num w:numId="7" w16cid:durableId="79907861">
+    <w:abstractNumId w:val="9"/>
+  </w:num>
+  <w:num w:numId="8" w16cid:durableId="306588739">
+    <w:abstractNumId w:val="13"/>
+  </w:num>
+  <w:num w:numId="9" w16cid:durableId="315954786">
     <w:abstractNumId w:val="5"/>
   </w:num>
-  <w:num w:numId="6" w16cid:durableId="1824663458">
+  <w:num w:numId="10" w16cid:durableId="220140427">
+    <w:abstractNumId w:val="7"/>
+  </w:num>
+  <w:num w:numId="11" w16cid:durableId="272130988">
     <w:abstractNumId w:val="15"/>
   </w:num>
-  <w:num w:numId="7" w16cid:durableId="79907861">
-    <w:abstractNumId w:val="8"/>
+  <w:num w:numId="12" w16cid:durableId="656231512">
+    <w:abstractNumId w:val="14"/>
   </w:num>
-  <w:num w:numId="8" w16cid:durableId="306588739">
+  <w:num w:numId="13" w16cid:durableId="1789156210">
+    <w:abstractNumId w:val="2"/>
+  </w:num>
+  <w:num w:numId="14" w16cid:durableId="473761800">
     <w:abstractNumId w:val="12"/>
   </w:num>
-  <w:num w:numId="9" w16cid:durableId="315954786">
-    <w:abstractNumId w:val="4"/>
+  <w:num w:numId="15" w16cid:durableId="943421026">
+    <w:abstractNumId w:val="3"/>
   </w:num>
-  <w:num w:numId="10" w16cid:durableId="220140427">
-    <w:abstractNumId w:val="6"/>
-  </w:num>
-  <w:num w:numId="11" w16cid:durableId="272130988">
-    <w:abstractNumId w:val="14"/>
-  </w:num>
-  <w:num w:numId="12" w16cid:durableId="656231512">
-    <w:abstractNumId w:val="13"/>
-  </w:num>
-  <w:num w:numId="13" w16cid:durableId="1789156210">
-    <w:abstractNumId w:val="1"/>
-  </w:num>
-  <w:num w:numId="14" w16cid:durableId="473761800">
+  <w:num w:numId="16" w16cid:durableId="254246183">
     <w:abstractNumId w:val="11"/>
   </w:num>
-  <w:num w:numId="15" w16cid:durableId="943421026">
-    <w:abstractNumId w:val="2"/>
-  </w:num>
-  <w:num w:numId="16" w16cid:durableId="254246183">
-    <w:abstractNumId w:val="10"/>
+  <w:num w:numId="17" w16cid:durableId="2072119589">
+    <w:abstractNumId w:val="1"/>
   </w:num>
 </w:numbering>
 </file>

</xml_diff>

<commit_message>
feat: migración de la arquitectura web al entorno móvil nativo usando React Native Expo Go
</commit_message>
<xml_diff>
--- a/dctos/Aqua Code Bases.docx
+++ b/dctos/Aqua Code Bases.docx
@@ -25,21 +25,12 @@
         <w:t>1. La Puerta de Entrada: Servidor y Configuración (</w:t>
       </w:r>
       <w:proofErr w:type="spellStart"/>
-      <w:proofErr w:type="gramStart"/>
-      <w:r>
-        <w:rPr>
-          <w:b/>
-          <w:bCs/>
-        </w:rPr>
-        <w:t>server</w:t>
-      </w:r>
-      <w:proofErr w:type="gramEnd"/>
-      <w:r>
-        <w:rPr>
-          <w:b/>
-          <w:bCs/>
-        </w:rPr>
-        <w:t>.ts</w:t>
+      <w:r>
+        <w:rPr>
+          <w:b/>
+          <w:bCs/>
+        </w:rPr>
+        <w:t>server.ts</w:t>
       </w:r>
       <w:proofErr w:type="spellEnd"/>
       <w:r>
@@ -50,21 +41,12 @@
         <w:t xml:space="preserve"> y </w:t>
       </w:r>
       <w:proofErr w:type="spellStart"/>
-      <w:proofErr w:type="gramStart"/>
-      <w:r>
-        <w:rPr>
-          <w:b/>
-          <w:bCs/>
-        </w:rPr>
-        <w:t>app</w:t>
-      </w:r>
-      <w:proofErr w:type="gramEnd"/>
-      <w:r>
-        <w:rPr>
-          <w:b/>
-          <w:bCs/>
-        </w:rPr>
-        <w:t>.ts</w:t>
+      <w:r>
+        <w:rPr>
+          <w:b/>
+          <w:bCs/>
+        </w:rPr>
+        <w:t>app.ts</w:t>
       </w:r>
       <w:proofErr w:type="spellEnd"/>
       <w:r>
@@ -88,21 +70,12 @@
         </w:numPr>
       </w:pPr>
       <w:proofErr w:type="spellStart"/>
-      <w:proofErr w:type="gramStart"/>
-      <w:r>
-        <w:rPr>
-          <w:b/>
-          <w:bCs/>
-        </w:rPr>
-        <w:t>app</w:t>
-      </w:r>
-      <w:proofErr w:type="gramEnd"/>
-      <w:r>
-        <w:rPr>
-          <w:b/>
-          <w:bCs/>
-        </w:rPr>
-        <w:t>.ts</w:t>
+      <w:r>
+        <w:rPr>
+          <w:b/>
+          <w:bCs/>
+        </w:rPr>
+        <w:t>app.ts</w:t>
       </w:r>
       <w:proofErr w:type="spellEnd"/>
       <w:r>
@@ -177,17 +150,12 @@
         <w:t xml:space="preserve"> y lo inyecta dentro de la instancia de Express usando </w:t>
       </w:r>
       <w:proofErr w:type="spellStart"/>
-      <w:proofErr w:type="gramStart"/>
       <w:r>
         <w:t>app.set</w:t>
       </w:r>
       <w:proofErr w:type="spellEnd"/>
       <w:r>
-        <w:t>(</w:t>
-      </w:r>
-      <w:proofErr w:type="gramEnd"/>
-      <w:r>
-        <w:t>"</w:t>
+        <w:t>("</w:t>
       </w:r>
       <w:proofErr w:type="spellStart"/>
       <w:r>
@@ -228,21 +196,12 @@
         <w:t>2. El Escudo Protector: Middlewares (</w:t>
       </w:r>
       <w:proofErr w:type="spellStart"/>
-      <w:proofErr w:type="gramStart"/>
-      <w:r>
-        <w:rPr>
-          <w:b/>
-          <w:bCs/>
-        </w:rPr>
-        <w:t>auth.middleware</w:t>
-      </w:r>
-      <w:proofErr w:type="gramEnd"/>
-      <w:r>
-        <w:rPr>
-          <w:b/>
-          <w:bCs/>
-        </w:rPr>
-        <w:t>.ts</w:t>
+      <w:r>
+        <w:rPr>
+          <w:b/>
+          <w:bCs/>
+        </w:rPr>
+        <w:t>auth.middleware.ts</w:t>
       </w:r>
       <w:proofErr w:type="spellEnd"/>
       <w:r>
@@ -355,31 +314,15 @@
           <w:b/>
           <w:bCs/>
         </w:rPr>
-        <w:t>3. El Mapa de Rutas (</w:t>
-      </w:r>
-      <w:proofErr w:type="gramStart"/>
-      <w:r>
-        <w:rPr>
-          <w:b/>
-          <w:bCs/>
-        </w:rPr>
-        <w:t>*.</w:t>
-      </w:r>
-      <w:proofErr w:type="spellStart"/>
-      <w:r>
-        <w:rPr>
-          <w:b/>
-          <w:bCs/>
-        </w:rPr>
-        <w:t>routes</w:t>
-      </w:r>
-      <w:proofErr w:type="gramEnd"/>
-      <w:r>
-        <w:rPr>
-          <w:b/>
-          <w:bCs/>
-        </w:rPr>
-        <w:t>.ts</w:t>
+        <w:t>3. El Mapa de Rutas (*.</w:t>
+      </w:r>
+      <w:proofErr w:type="spellStart"/>
+      <w:r>
+        <w:rPr>
+          <w:b/>
+          <w:bCs/>
+        </w:rPr>
+        <w:t>routes.ts</w:t>
       </w:r>
       <w:proofErr w:type="spellEnd"/>
       <w:r>
@@ -406,13 +349,8 @@
         <w:t xml:space="preserve">Cada módulo tiene su propio archivo de rutas (ej. </w:t>
       </w:r>
       <w:proofErr w:type="spellStart"/>
-      <w:proofErr w:type="gramStart"/>
-      <w:r>
-        <w:t>tenant.routes</w:t>
-      </w:r>
-      <w:proofErr w:type="gramEnd"/>
-      <w:r>
-        <w:t>.ts</w:t>
+      <w:r>
+        <w:t>tenant.routes.ts</w:t>
       </w:r>
       <w:proofErr w:type="spellEnd"/>
       <w:r>
@@ -438,47 +376,15 @@
           <w:b/>
           <w:bCs/>
         </w:rPr>
-        <w:t xml:space="preserve">4. El </w:t>
-      </w:r>
-      <w:proofErr w:type="gramStart"/>
-      <w:r>
-        <w:rPr>
-          <w:b/>
-          <w:bCs/>
-        </w:rPr>
-        <w:t>Director</w:t>
-      </w:r>
-      <w:proofErr w:type="gramEnd"/>
-      <w:r>
-        <w:rPr>
-          <w:b/>
-          <w:bCs/>
-        </w:rPr>
-        <w:t xml:space="preserve"> de Orquesta: Controladores (</w:t>
-      </w:r>
-      <w:proofErr w:type="gramStart"/>
-      <w:r>
-        <w:rPr>
-          <w:b/>
-          <w:bCs/>
-        </w:rPr>
-        <w:t>*.</w:t>
-      </w:r>
-      <w:proofErr w:type="spellStart"/>
-      <w:r>
-        <w:rPr>
-          <w:b/>
-          <w:bCs/>
-        </w:rPr>
-        <w:t>controller</w:t>
-      </w:r>
-      <w:proofErr w:type="gramEnd"/>
-      <w:r>
-        <w:rPr>
-          <w:b/>
-          <w:bCs/>
-        </w:rPr>
-        <w:t>.ts</w:t>
+        <w:t>4. El Director de Orquesta: Controladores (*.</w:t>
+      </w:r>
+      <w:proofErr w:type="spellStart"/>
+      <w:r>
+        <w:rPr>
+          <w:b/>
+          <w:bCs/>
+        </w:rPr>
+        <w:t>controller.ts</w:t>
       </w:r>
       <w:proofErr w:type="spellEnd"/>
       <w:r>
@@ -495,22 +401,18 @@
         <w:t xml:space="preserve">El controlador es el intermediario. Los controladores solo deben validar los datos de entrada (lo que viene en el </w:t>
       </w:r>
       <w:proofErr w:type="spellStart"/>
-      <w:proofErr w:type="gramStart"/>
       <w:r>
         <w:t>req.body</w:t>
       </w:r>
       <w:proofErr w:type="spellEnd"/>
-      <w:proofErr w:type="gramEnd"/>
       <w:r>
         <w:t xml:space="preserve">) y manejar las respuestas HTTP (como devolver un </w:t>
       </w:r>
       <w:proofErr w:type="spellStart"/>
-      <w:proofErr w:type="gramStart"/>
       <w:r>
         <w:t>res.status</w:t>
       </w:r>
       <w:proofErr w:type="spellEnd"/>
-      <w:proofErr w:type="gramEnd"/>
       <w:r>
         <w:t>(200) o un error 500).</w:t>
       </w:r>
@@ -594,31 +496,15 @@
           <w:b/>
           <w:bCs/>
         </w:rPr>
-        <w:t>5. El Cerebro y la Base de Datos: Servicios (</w:t>
-      </w:r>
-      <w:proofErr w:type="gramStart"/>
-      <w:r>
-        <w:rPr>
-          <w:b/>
-          <w:bCs/>
-        </w:rPr>
-        <w:t>*.</w:t>
-      </w:r>
-      <w:proofErr w:type="spellStart"/>
-      <w:r>
-        <w:rPr>
-          <w:b/>
-          <w:bCs/>
-        </w:rPr>
-        <w:t>service</w:t>
-      </w:r>
-      <w:proofErr w:type="gramEnd"/>
-      <w:r>
-        <w:rPr>
-          <w:b/>
-          <w:bCs/>
-        </w:rPr>
-        <w:t>.ts</w:t>
+        <w:t>5. El Cerebro y la Base de Datos: Servicios (*.</w:t>
+      </w:r>
+      <w:proofErr w:type="spellStart"/>
+      <w:r>
+        <w:rPr>
+          <w:b/>
+          <w:bCs/>
+        </w:rPr>
+        <w:t>service.ts</w:t>
       </w:r>
       <w:proofErr w:type="spellEnd"/>
       <w:r>
@@ -645,13 +531,8 @@
         <w:t xml:space="preserve">El archivo de servicio (ej. </w:t>
       </w:r>
       <w:proofErr w:type="spellStart"/>
-      <w:proofErr w:type="gramStart"/>
-      <w:r>
-        <w:t>tenant.service</w:t>
-      </w:r>
-      <w:proofErr w:type="gramEnd"/>
-      <w:r>
-        <w:t>.ts</w:t>
+      <w:r>
+        <w:t>tenant.service.ts</w:t>
       </w:r>
       <w:proofErr w:type="spellEnd"/>
       <w:r>
@@ -691,28 +572,15 @@
         <w:t>Transacciones Seguras:</w:t>
       </w:r>
       <w:r>
-        <w:t xml:space="preserve"> Para procesos críticos (como cambiar un plan de suscripción), el servicio utiliza el patrón de Transacciones de Prisma (</w:t>
-      </w:r>
-      <w:proofErr w:type="gramStart"/>
-      <w:r>
-        <w:t>prisma.$</w:t>
-      </w:r>
-      <w:proofErr w:type="spellStart"/>
-      <w:proofErr w:type="gramEnd"/>
+        <w:t xml:space="preserve"> Para procesos críticos (como cambiar un plan de suscripción), el servicio utiliza el patrón de Transacciones de Prisma (prisma.$</w:t>
+      </w:r>
+      <w:proofErr w:type="spellStart"/>
       <w:r>
         <w:t>transaction</w:t>
       </w:r>
       <w:proofErr w:type="spellEnd"/>
       <w:r>
-        <w:t xml:space="preserve">). Esto asegura </w:t>
-      </w:r>
-      <w:proofErr w:type="gramStart"/>
-      <w:r>
-        <w:t>que</w:t>
-      </w:r>
-      <w:proofErr w:type="gramEnd"/>
-      <w:r>
-        <w:t xml:space="preserve"> si se actualiza la comunidad, obligatoriamente se crea el registro de auditoría en la tabla </w:t>
+        <w:t xml:space="preserve">). Esto asegura que si se actualiza la comunidad, obligatoriamente se crea el registro de auditoría en la tabla </w:t>
       </w:r>
       <w:proofErr w:type="spellStart"/>
       <w:r>
@@ -720,15 +588,7 @@
       </w:r>
       <w:proofErr w:type="spellEnd"/>
       <w:r>
-        <w:t xml:space="preserve">; si una de </w:t>
-      </w:r>
-      <w:proofErr w:type="gramStart"/>
-      <w:r>
-        <w:t>las dos falla</w:t>
-      </w:r>
-      <w:proofErr w:type="gramEnd"/>
-      <w:r>
-        <w:t>, ninguna se guarda, manteniendo tu base de datos siempre consistente.</w:t>
+        <w:t>; si una de las dos falla, ninguna se guarda, manteniendo tu base de datos siempre consistente.</w:t>
       </w:r>
     </w:p>
     <w:p>
@@ -977,7 +837,6 @@
         <w:t>1. El Motor y los Cimientos (</w:t>
       </w:r>
       <w:proofErr w:type="spellStart"/>
-      <w:proofErr w:type="gramStart"/>
       <w:r>
         <w:rPr>
           <w:b/>
@@ -986,7 +845,6 @@
         <w:t>package.json</w:t>
       </w:r>
       <w:proofErr w:type="spellEnd"/>
-      <w:proofErr w:type="gramEnd"/>
       <w:r>
         <w:rPr>
           <w:b/>
@@ -1301,15 +1159,7 @@
       </w:r>
       <w:proofErr w:type="spellEnd"/>
       <w:r>
-        <w:t xml:space="preserve"> del navegador. Esto asegura </w:t>
-      </w:r>
-      <w:proofErr w:type="gramStart"/>
-      <w:r>
-        <w:t>que</w:t>
-      </w:r>
-      <w:proofErr w:type="gramEnd"/>
-      <w:r>
-        <w:t xml:space="preserve"> si el usuario recarga la página, no pierda su sesión.</w:t>
+        <w:t xml:space="preserve"> del navegador. Esto asegura que si el usuario recarga la página, no pierda su sesión.</w:t>
       </w:r>
     </w:p>
     <w:p>
@@ -1339,17 +1189,12 @@
         <w:t xml:space="preserve"> </w:t>
       </w:r>
       <w:proofErr w:type="spellStart"/>
-      <w:proofErr w:type="gramStart"/>
       <w:r>
         <w:t>useAuth</w:t>
       </w:r>
       <w:proofErr w:type="spellEnd"/>
       <w:r>
-        <w:t>(</w:t>
-      </w:r>
-      <w:proofErr w:type="gramEnd"/>
-      <w:r>
-        <w:t xml:space="preserve">), cualquier componente de tu aplicación (como el </w:t>
+        <w:t xml:space="preserve">(), cualquier componente de tu aplicación (como el </w:t>
       </w:r>
       <w:proofErr w:type="spellStart"/>
       <w:r>
@@ -1612,17 +1457,12 @@
         <w:t xml:space="preserve"> responde que las credenciales son válidas y devuelve el JWT, ejecutas la función </w:t>
       </w:r>
       <w:proofErr w:type="spellStart"/>
-      <w:proofErr w:type="gramStart"/>
       <w:r>
         <w:t>login</w:t>
       </w:r>
       <w:proofErr w:type="spellEnd"/>
       <w:r>
-        <w:t>(</w:t>
-      </w:r>
-      <w:proofErr w:type="gramEnd"/>
-      <w:r>
-        <w:t xml:space="preserve">) de tu </w:t>
+        <w:t xml:space="preserve">() de tu </w:t>
       </w:r>
       <w:proofErr w:type="spellStart"/>
       <w:r>
@@ -2996,13 +2836,8 @@
         <w:t>element</w:t>
       </w:r>
       <w:proofErr w:type="spellEnd"/>
-      <w:proofErr w:type="gramStart"/>
-      <w:r>
-        <w:t>={</w:t>
-      </w:r>
-      <w:proofErr w:type="gramEnd"/>
-      <w:r>
-        <w:t>&lt;</w:t>
+      <w:r>
+        <w:t>={&lt;</w:t>
       </w:r>
       <w:proofErr w:type="spellStart"/>
       <w:r>
@@ -3052,6 +2887,638 @@
         <w:t xml:space="preserve"> /&gt; es el guardia de seguridad que revisa la identificación y decide a qué cuarto te deja pasar.</w:t>
       </w:r>
     </w:p>
+    <w:p/>
+    <w:p>
+      <w:pPr>
+        <w:pStyle w:val="Subttulo"/>
+      </w:pPr>
+      <w:proofErr w:type="spellStart"/>
+      <w:r>
+        <w:lastRenderedPageBreak/>
+        <w:t>React</w:t>
+      </w:r>
+      <w:proofErr w:type="spellEnd"/>
+      <w:r>
+        <w:t xml:space="preserve"> Native Expo </w:t>
+      </w:r>
+      <w:proofErr w:type="spellStart"/>
+      <w:r>
+        <w:t>Go</w:t>
+      </w:r>
+      <w:proofErr w:type="spellEnd"/>
+    </w:p>
+    <w:p>
+      <w:r>
+        <w:t>¡Hola, Aqua! Qué gusto ver el progreso que has hecho. He revisado a fondo la captura de pantalla de VS Code y el código de los archivos que me enviaste. Has logrado una migración impecable de la arquitectura web al entorno móvil nativo usando Expo.</w:t>
+      </w:r>
+    </w:p>
+    <w:p>
+      <w:r>
+        <w:t>Has construido cimientos robustos que separan perfectamente la lógica de datos, la seguridad y la interfaz gráfica. Aquí tienes mi análisis técnico sobre la configuración y el uso de cada capa de tu aplicación móvil.</w:t>
+      </w:r>
+    </w:p>
+    <w:p>
+      <w:pPr>
+        <w:rPr>
+          <w:b/>
+          <w:bCs/>
+        </w:rPr>
+      </w:pPr>
+      <w:r>
+        <w:rPr>
+          <w:b/>
+          <w:bCs/>
+        </w:rPr>
+        <w:t>1. Gestión de Estado Global y Persistencia</w:t>
+      </w:r>
+    </w:p>
+    <w:p>
+      <w:r>
+        <w:t>Has creado un "cerebro" seguro que no depende del navegador, utilizando el almacenamiento encriptado del teléfono.</w:t>
+      </w:r>
+    </w:p>
+    <w:p>
+      <w:pPr>
+        <w:numPr>
+          <w:ilvl w:val="0"/>
+          <w:numId w:val="18"/>
+        </w:numPr>
+      </w:pPr>
+      <w:r>
+        <w:t xml:space="preserve">El archivo </w:t>
+      </w:r>
+      <w:proofErr w:type="spellStart"/>
+      <w:r>
+        <w:t>AuthContext.tsx</w:t>
+      </w:r>
+      <w:proofErr w:type="spellEnd"/>
+      <w:r>
+        <w:t xml:space="preserve"> maneja el estado de la sesión leyendo el token, la información del </w:t>
+      </w:r>
+      <w:proofErr w:type="spellStart"/>
+      <w:r>
+        <w:t>user</w:t>
+      </w:r>
+      <w:proofErr w:type="spellEnd"/>
+      <w:r>
+        <w:t xml:space="preserve"> y la bandera </w:t>
+      </w:r>
+      <w:proofErr w:type="spellStart"/>
+      <w:r>
+        <w:t>requirePasswordChange</w:t>
+      </w:r>
+      <w:proofErr w:type="spellEnd"/>
+      <w:r>
+        <w:t xml:space="preserve"> desde la memoria física del dispositivo usando </w:t>
+      </w:r>
+      <w:proofErr w:type="spellStart"/>
+      <w:r>
+        <w:t>AsyncStorage</w:t>
+      </w:r>
+      <w:proofErr w:type="spellEnd"/>
+      <w:r>
+        <w:t>.</w:t>
+      </w:r>
+    </w:p>
+    <w:p>
+      <w:pPr>
+        <w:numPr>
+          <w:ilvl w:val="0"/>
+          <w:numId w:val="18"/>
+        </w:numPr>
+      </w:pPr>
+      <w:r>
+        <w:t xml:space="preserve">El contexto incluye un estado </w:t>
+      </w:r>
+      <w:proofErr w:type="spellStart"/>
+      <w:r>
+        <w:t>isLoading</w:t>
+      </w:r>
+      <w:proofErr w:type="spellEnd"/>
+      <w:r>
+        <w:t xml:space="preserve"> que mantiene la aplicación en pausa hasta que termina de verificar si existe una sesión guardada previamente.</w:t>
+      </w:r>
+    </w:p>
+    <w:p>
+      <w:pPr>
+        <w:numPr>
+          <w:ilvl w:val="0"/>
+          <w:numId w:val="18"/>
+        </w:numPr>
+      </w:pPr>
+      <w:r>
+        <w:t xml:space="preserve">Las funciones </w:t>
+      </w:r>
+      <w:proofErr w:type="spellStart"/>
+      <w:r>
+        <w:t>login</w:t>
+      </w:r>
+      <w:proofErr w:type="spellEnd"/>
+      <w:r>
+        <w:t xml:space="preserve"> y </w:t>
+      </w:r>
+      <w:proofErr w:type="spellStart"/>
+      <w:r>
+        <w:t>logout</w:t>
+      </w:r>
+      <w:proofErr w:type="spellEnd"/>
+      <w:r>
+        <w:t xml:space="preserve"> sincronizan simultáneamente los estados de </w:t>
+      </w:r>
+      <w:proofErr w:type="spellStart"/>
+      <w:r>
+        <w:t>React</w:t>
+      </w:r>
+      <w:proofErr w:type="spellEnd"/>
+      <w:r>
+        <w:t xml:space="preserve"> y la base de datos de </w:t>
+      </w:r>
+      <w:proofErr w:type="spellStart"/>
+      <w:r>
+        <w:t>AsyncStorage</w:t>
+      </w:r>
+      <w:proofErr w:type="spellEnd"/>
+      <w:r>
+        <w:t xml:space="preserve"> para evitar inconsistencias.</w:t>
+      </w:r>
+    </w:p>
+    <w:p>
+      <w:pPr>
+        <w:numPr>
+          <w:ilvl w:val="0"/>
+          <w:numId w:val="18"/>
+        </w:numPr>
+      </w:pPr>
+      <w:r>
+        <w:t xml:space="preserve">El </w:t>
+      </w:r>
+      <w:proofErr w:type="spellStart"/>
+      <w:r>
+        <w:t>ThemeContext.tsx</w:t>
+      </w:r>
+      <w:proofErr w:type="spellEnd"/>
+      <w:r>
+        <w:t xml:space="preserve"> utiliza </w:t>
+      </w:r>
+      <w:proofErr w:type="spellStart"/>
+      <w:r>
+        <w:t>Appearance.getColorScheme</w:t>
+      </w:r>
+      <w:proofErr w:type="spellEnd"/>
+      <w:r>
+        <w:t>() para detectar nativamente si el teléfono del usuario está en modo claro u oscuro.</w:t>
+      </w:r>
+    </w:p>
+    <w:p>
+      <w:pPr>
+        <w:numPr>
+          <w:ilvl w:val="0"/>
+          <w:numId w:val="18"/>
+        </w:numPr>
+      </w:pPr>
+      <w:r>
+        <w:t xml:space="preserve">Este contexto de tema también guarda la preferencia manual del usuario en </w:t>
+      </w:r>
+      <w:proofErr w:type="spellStart"/>
+      <w:r>
+        <w:t>AsyncStorage</w:t>
+      </w:r>
+      <w:proofErr w:type="spellEnd"/>
+      <w:r>
+        <w:t xml:space="preserve"> bajo la llave </w:t>
+      </w:r>
+      <w:proofErr w:type="spellStart"/>
+      <w:r>
+        <w:t>aqua-ui-theme</w:t>
+      </w:r>
+      <w:proofErr w:type="spellEnd"/>
+      <w:r>
+        <w:t>.</w:t>
+      </w:r>
+    </w:p>
+    <w:p>
+      <w:pPr>
+        <w:rPr>
+          <w:b/>
+          <w:bCs/>
+        </w:rPr>
+      </w:pPr>
+      <w:r>
+        <w:rPr>
+          <w:b/>
+          <w:bCs/>
+        </w:rPr>
+        <w:t>2. El Motor de Red Centralizado</w:t>
+      </w:r>
+    </w:p>
+    <w:p>
+      <w:r>
+        <w:t>La comunicación con tu servidor SCADA está protegida y automatizada.</w:t>
+      </w:r>
+    </w:p>
+    <w:p>
+      <w:pPr>
+        <w:numPr>
+          <w:ilvl w:val="0"/>
+          <w:numId w:val="19"/>
+        </w:numPr>
+      </w:pPr>
+      <w:r>
+        <w:t xml:space="preserve">El archivo </w:t>
+      </w:r>
+      <w:proofErr w:type="spellStart"/>
+      <w:r>
+        <w:t>api.ts</w:t>
+      </w:r>
+      <w:proofErr w:type="spellEnd"/>
+      <w:r>
+        <w:t xml:space="preserve"> actúa como un interceptor global que busca el token de forma asíncrona en el teléfono y lo inyecta en los encabezados </w:t>
+      </w:r>
+      <w:proofErr w:type="spellStart"/>
+      <w:r>
+        <w:t>Authorization</w:t>
+      </w:r>
+      <w:proofErr w:type="spellEnd"/>
+      <w:r>
+        <w:t xml:space="preserve"> de cada solicitud.</w:t>
+      </w:r>
+    </w:p>
+    <w:p>
+      <w:pPr>
+        <w:numPr>
+          <w:ilvl w:val="0"/>
+          <w:numId w:val="19"/>
+        </w:numPr>
+      </w:pPr>
+      <w:r>
+        <w:t xml:space="preserve">Utiliza la variable de entorno EXPO_PUBLIC_API_BASE_URL o un respaldo estático (como la IP local 192.168.1.165) para encontrar el </w:t>
+      </w:r>
+      <w:proofErr w:type="spellStart"/>
+      <w:r>
+        <w:t>backend</w:t>
+      </w:r>
+      <w:proofErr w:type="spellEnd"/>
+      <w:r>
+        <w:t>.</w:t>
+      </w:r>
+    </w:p>
+    <w:p>
+      <w:pPr>
+        <w:numPr>
+          <w:ilvl w:val="0"/>
+          <w:numId w:val="19"/>
+        </w:numPr>
+      </w:pPr>
+      <w:r>
+        <w:t xml:space="preserve">Implementa una barrera de seguridad: si el servidor responde con error 401 o 403, el servicio limpia automáticamente el </w:t>
+      </w:r>
+      <w:proofErr w:type="spellStart"/>
+      <w:r>
+        <w:t>AsyncStorage</w:t>
+      </w:r>
+      <w:proofErr w:type="spellEnd"/>
+      <w:r>
+        <w:t>, destruyendo la sesión inválida.</w:t>
+      </w:r>
+    </w:p>
+    <w:p>
+      <w:pPr>
+        <w:rPr>
+          <w:b/>
+          <w:bCs/>
+        </w:rPr>
+      </w:pPr>
+      <w:r>
+        <w:rPr>
+          <w:b/>
+          <w:bCs/>
+        </w:rPr>
+        <w:lastRenderedPageBreak/>
+        <w:t>3. Enrutamiento y Semáforo Inteligente</w:t>
+      </w:r>
+    </w:p>
+    <w:p>
+      <w:r>
+        <w:t>Has implementado un sistema de navegación que blinda la aplicación, haciendo imposible que un usuario no autenticado vea información privada.</w:t>
+      </w:r>
+    </w:p>
+    <w:p>
+      <w:pPr>
+        <w:numPr>
+          <w:ilvl w:val="0"/>
+          <w:numId w:val="20"/>
+        </w:numPr>
+      </w:pPr>
+      <w:r>
+        <w:t>El _</w:t>
+      </w:r>
+      <w:proofErr w:type="spellStart"/>
+      <w:r>
+        <w:t>layout.tsx</w:t>
+      </w:r>
+      <w:proofErr w:type="spellEnd"/>
+      <w:r>
+        <w:t xml:space="preserve"> envuelve todo tu proyecto con </w:t>
+      </w:r>
+      <w:proofErr w:type="spellStart"/>
+      <w:r>
+        <w:t>ThemeProvider</w:t>
+      </w:r>
+      <w:proofErr w:type="spellEnd"/>
+      <w:r>
+        <w:t xml:space="preserve"> y </w:t>
+      </w:r>
+      <w:proofErr w:type="spellStart"/>
+      <w:r>
+        <w:t>AuthProvider</w:t>
+      </w:r>
+      <w:proofErr w:type="spellEnd"/>
+      <w:r>
+        <w:t xml:space="preserve"> para que cualquier pantalla tenga acceso a esos datos.</w:t>
+      </w:r>
+    </w:p>
+    <w:p>
+      <w:pPr>
+        <w:numPr>
+          <w:ilvl w:val="0"/>
+          <w:numId w:val="20"/>
+        </w:numPr>
+      </w:pPr>
+      <w:r>
+        <w:t xml:space="preserve">El componente </w:t>
+      </w:r>
+      <w:proofErr w:type="spellStart"/>
+      <w:r>
+        <w:t>RootNavigation</w:t>
+      </w:r>
+      <w:proofErr w:type="spellEnd"/>
+      <w:r>
+        <w:t xml:space="preserve"> escucha los cambios del </w:t>
+      </w:r>
+      <w:proofErr w:type="spellStart"/>
+      <w:r>
+        <w:t>AuthContext</w:t>
+      </w:r>
+      <w:proofErr w:type="spellEnd"/>
+      <w:r>
+        <w:t xml:space="preserve"> y utiliza </w:t>
+      </w:r>
+      <w:proofErr w:type="spellStart"/>
+      <w:r>
+        <w:t>useSegments</w:t>
+      </w:r>
+      <w:proofErr w:type="spellEnd"/>
+      <w:r>
+        <w:t xml:space="preserve"> de Expo </w:t>
+      </w:r>
+      <w:proofErr w:type="spellStart"/>
+      <w:r>
+        <w:t>Router</w:t>
+      </w:r>
+      <w:proofErr w:type="spellEnd"/>
+      <w:r>
+        <w:t xml:space="preserve"> para saber en qué carpeta se encuentra el usuario.</w:t>
+      </w:r>
+    </w:p>
+    <w:p>
+      <w:pPr>
+        <w:numPr>
+          <w:ilvl w:val="0"/>
+          <w:numId w:val="20"/>
+        </w:numPr>
+      </w:pPr>
+      <w:r>
+        <w:t>Si no hay token y el usuario no está en el grupo (</w:t>
+      </w:r>
+      <w:proofErr w:type="spellStart"/>
+      <w:r>
+        <w:t>auth</w:t>
+      </w:r>
+      <w:proofErr w:type="spellEnd"/>
+      <w:r>
+        <w:t xml:space="preserve">), utiliza </w:t>
+      </w:r>
+      <w:proofErr w:type="spellStart"/>
+      <w:r>
+        <w:t>router.replace</w:t>
+      </w:r>
+      <w:proofErr w:type="spellEnd"/>
+      <w:r>
+        <w:t xml:space="preserve"> para expulsarlo obligatoriamente a la pantalla de </w:t>
+      </w:r>
+      <w:proofErr w:type="spellStart"/>
+      <w:r>
+        <w:t>login</w:t>
+      </w:r>
+      <w:proofErr w:type="spellEnd"/>
+      <w:r>
+        <w:t>.</w:t>
+      </w:r>
+    </w:p>
+    <w:p>
+      <w:pPr>
+        <w:numPr>
+          <w:ilvl w:val="0"/>
+          <w:numId w:val="20"/>
+        </w:numPr>
+      </w:pPr>
+      <w:r>
+        <w:t>Si hay token y el usuario intenta ir a una pantalla pública, el sistema lo redirige inmediatamente a /(</w:t>
+      </w:r>
+      <w:proofErr w:type="spellStart"/>
+      <w:r>
+        <w:t>dashboard</w:t>
+      </w:r>
+      <w:proofErr w:type="spellEnd"/>
+      <w:r>
+        <w:t>)/home.</w:t>
+      </w:r>
+    </w:p>
+    <w:p>
+      <w:pPr>
+        <w:numPr>
+          <w:ilvl w:val="0"/>
+          <w:numId w:val="20"/>
+        </w:numPr>
+      </w:pPr>
+      <w:r>
+        <w:t xml:space="preserve">El archivo </w:t>
+      </w:r>
+      <w:proofErr w:type="spellStart"/>
+      <w:r>
+        <w:t>index.tsx</w:t>
+      </w:r>
+      <w:proofErr w:type="spellEnd"/>
+      <w:r>
+        <w:t xml:space="preserve"> de la raíz funciona como una pantalla de paso temporal, mostrando un </w:t>
+      </w:r>
+      <w:proofErr w:type="spellStart"/>
+      <w:r>
+        <w:t>ActivityIndicator</w:t>
+      </w:r>
+      <w:proofErr w:type="spellEnd"/>
+      <w:r>
+        <w:t xml:space="preserve"> mientras el _</w:t>
+      </w:r>
+      <w:proofErr w:type="spellStart"/>
+      <w:r>
+        <w:t>layout.tsx</w:t>
+      </w:r>
+      <w:proofErr w:type="spellEnd"/>
+      <w:r>
+        <w:t xml:space="preserve"> decide el destino final del tráfico.</w:t>
+      </w:r>
+    </w:p>
+    <w:p>
+      <w:pPr>
+        <w:rPr>
+          <w:b/>
+          <w:bCs/>
+        </w:rPr>
+      </w:pPr>
+      <w:r>
+        <w:rPr>
+          <w:b/>
+          <w:bCs/>
+        </w:rPr>
+        <w:t>4. Interfaz Visual y Componentes Nativos</w:t>
+      </w:r>
+    </w:p>
+    <w:p>
+      <w:r>
+        <w:t>Tus vistas están aprovechando los componentes específicos de los dispositivos móviles para asegurar una experiencia fluida.</w:t>
+      </w:r>
+    </w:p>
+    <w:p>
+      <w:pPr>
+        <w:numPr>
+          <w:ilvl w:val="0"/>
+          <w:numId w:val="21"/>
+        </w:numPr>
+      </w:pPr>
+      <w:r>
+        <w:t xml:space="preserve">En </w:t>
+      </w:r>
+      <w:proofErr w:type="spellStart"/>
+      <w:r>
+        <w:t>login.tsx</w:t>
+      </w:r>
+      <w:proofErr w:type="spellEnd"/>
+      <w:r>
+        <w:t xml:space="preserve">, utilizas </w:t>
+      </w:r>
+      <w:proofErr w:type="spellStart"/>
+      <w:r>
+        <w:t>KeyboardAvoidingView</w:t>
+      </w:r>
+      <w:proofErr w:type="spellEnd"/>
+      <w:r>
+        <w:t xml:space="preserve"> y </w:t>
+      </w:r>
+      <w:proofErr w:type="spellStart"/>
+      <w:r>
+        <w:t>ScrollView</w:t>
+      </w:r>
+      <w:proofErr w:type="spellEnd"/>
+      <w:r>
+        <w:t xml:space="preserve"> para asegurar que el teclado virtual del teléfono no oculte los campos de correo o contraseña al escribir.</w:t>
+      </w:r>
+    </w:p>
+    <w:p>
+      <w:pPr>
+        <w:numPr>
+          <w:ilvl w:val="0"/>
+          <w:numId w:val="21"/>
+        </w:numPr>
+      </w:pPr>
+      <w:r>
+        <w:t xml:space="preserve">El botón de inicio de sesión desactiva su función y muestra un indicador de carga nativo cuando el estado </w:t>
+      </w:r>
+      <w:proofErr w:type="spellStart"/>
+      <w:r>
+        <w:t>isSubmitting</w:t>
+      </w:r>
+      <w:proofErr w:type="spellEnd"/>
+      <w:r>
+        <w:t xml:space="preserve"> es verdadero.</w:t>
+      </w:r>
+    </w:p>
+    <w:p>
+      <w:pPr>
+        <w:numPr>
+          <w:ilvl w:val="0"/>
+          <w:numId w:val="21"/>
+        </w:numPr>
+      </w:pPr>
+      <w:r>
+        <w:t xml:space="preserve">El </w:t>
+      </w:r>
+      <w:proofErr w:type="spellStart"/>
+      <w:r>
+        <w:t>home.tsx</w:t>
+      </w:r>
+      <w:proofErr w:type="spellEnd"/>
+      <w:r>
+        <w:t xml:space="preserve"> emplea un </w:t>
+      </w:r>
+      <w:proofErr w:type="spellStart"/>
+      <w:r>
+        <w:t>SafeAreaView</w:t>
+      </w:r>
+      <w:proofErr w:type="spellEnd"/>
+      <w:r>
+        <w:t xml:space="preserve"> para asegurar que el contenido del </w:t>
+      </w:r>
+      <w:proofErr w:type="spellStart"/>
+      <w:r>
+        <w:t>Dashboard</w:t>
+      </w:r>
+      <w:proofErr w:type="spellEnd"/>
+      <w:r>
+        <w:t xml:space="preserve"> no se superponga con la barra de estado superior o la muesca de la cámara del dispositivo.</w:t>
+      </w:r>
+    </w:p>
+    <w:p>
+      <w:pPr>
+        <w:numPr>
+          <w:ilvl w:val="0"/>
+          <w:numId w:val="21"/>
+        </w:numPr>
+      </w:pPr>
+      <w:r>
+        <w:t xml:space="preserve">El </w:t>
+      </w:r>
+      <w:proofErr w:type="spellStart"/>
+      <w:r>
+        <w:t>Dashboard</w:t>
+      </w:r>
+      <w:proofErr w:type="spellEnd"/>
+      <w:r>
+        <w:t xml:space="preserve"> personaliza dinámicamente el saludo extrayendo el primer nombre del usuario y el nombre del </w:t>
+      </w:r>
+      <w:proofErr w:type="spellStart"/>
+      <w:r>
+        <w:t>tenant</w:t>
+      </w:r>
+      <w:proofErr w:type="spellEnd"/>
+      <w:r>
+        <w:t xml:space="preserve"> directamente desde el contexto de autenticación.</w:t>
+      </w:r>
+    </w:p>
+    <w:p>
+      <w:r>
+        <w:pict w14:anchorId="7E52D267">
+          <v:rect id="_x0000_i1039" style="width:0;height:1.5pt" o:hralign="center" o:hrstd="t" o:hr="t" fillcolor="#a0a0a0" stroked="f"/>
+        </w:pict>
+      </w:r>
+    </w:p>
+    <w:p>
+      <w:r>
+        <w:lastRenderedPageBreak/>
+        <w:t>Todo el esqueleto nativo está perfectamente interconectado. La lógica fluye exactamente como la diseñamos en tu arquitectura: la red alimenta al contexto, el contexto gobierna al enrutador, y el enrutador decide la pantalla correcta.</w:t>
+      </w:r>
+    </w:p>
+    <w:p/>
     <w:p/>
     <w:sectPr>
       <w:pgSz w:w="12240" w:h="15840"/>
@@ -3066,6 +3533,304 @@
 <file path=word/numbering.xml><?xml version="1.0" encoding="utf-8"?>
 <w:numbering xmlns:wpc="http://schemas.microsoft.com/office/word/2010/wordprocessingCanvas" xmlns:cx="http://schemas.microsoft.com/office/drawing/2014/chartex" xmlns:cx1="http://schemas.microsoft.com/office/drawing/2015/9/8/chartex" xmlns:cx2="http://schemas.microsoft.com/office/drawing/2015/10/21/chartex" xmlns:cx3="http://schemas.microsoft.com/office/drawing/2016/5/9/chartex" xmlns:cx4="http://schemas.microsoft.com/office/drawing/2016/5/10/chartex" xmlns:cx5="http://schemas.microsoft.com/office/drawing/2016/5/11/chartex" xmlns:cx6="http://schemas.microsoft.com/office/drawing/2016/5/12/chartex" xmlns:cx7="http://schemas.microsoft.com/office/drawing/2016/5/13/chartex" xmlns:cx8="http://schemas.microsoft.com/office/drawing/2016/5/14/chartex" xmlns:mc="http://schemas.openxmlformats.org/markup-compatibility/2006" xmlns:aink="http://schemas.microsoft.com/office/drawing/2016/ink" xmlns:am3d="http://schemas.microsoft.com/office/drawing/2017/model3d" xmlns:o="urn:schemas-microsoft-com:office:office" xmlns:oel="http://schemas.microsoft.com/office/2019/extlst" xmlns:r="http://schemas.openxmlformats.org/officeDocument/2006/relationships" xmlns:m="http://schemas.openxmlformats.org/officeDocument/2006/math" xmlns:v="urn:schemas-microsoft-com:vml" xmlns:wp14="http://schemas.microsoft.com/office/word/2010/wordprocessingDrawing" xmlns:wp="http://schemas.openxmlformats.org/drawingml/2006/wordprocessingDrawing" xmlns:w10="urn:schemas-microsoft-com:office:word" xmlns:w="http://schemas.openxmlformats.org/wordprocessingml/2006/main" xmlns:w14="http://schemas.microsoft.com/office/word/2010/wordml" xmlns:w15="http://schemas.microsoft.com/office/word/2012/wordml" xmlns:w16cex="http://schemas.microsoft.com/office/word/2018/wordml/cex" xmlns:w16cid="http://schemas.microsoft.com/office/word/2016/wordml/cid" xmlns:w16="http://schemas.microsoft.com/office/word/2018/wordml" xmlns:w16du="http://schemas.microsoft.com/office/word/2023/wordml/word16du" xmlns:w16sdtdh="http://schemas.microsoft.com/office/word/2020/wordml/sdtdatahash" xmlns:w16sdtfl="http://schemas.microsoft.com/office/word/2024/wordml/sdtformatlock" xmlns:w16se="http://schemas.microsoft.com/office/word/2015/wordml/symex" xmlns:wpg="http://schemas.microsoft.com/office/word/2010/wordprocessingGroup" xmlns:wpi="http://schemas.microsoft.com/office/word/2010/wordprocessingInk" xmlns:wne="http://schemas.microsoft.com/office/word/2006/wordml" xmlns:wps="http://schemas.microsoft.com/office/word/2010/wordprocessingShape" mc:Ignorable="w14 w15 w16se w16cid w16 w16cex w16sdtdh w16sdtfl w16du wp14">
   <w:abstractNum w:abstractNumId="0" w15:restartNumberingAfterBreak="0">
+    <w:nsid w:val="15825025"/>
+    <w:multiLevelType w:val="multilevel"/>
+    <w:tmpl w:val="DF86B558"/>
+    <w:lvl w:ilvl="0">
+      <w:start w:val="1"/>
+      <w:numFmt w:val="bullet"/>
+      <w:lvlText w:val=""/>
+      <w:lvlJc w:val="left"/>
+      <w:pPr>
+        <w:tabs>
+          <w:tab w:val="num" w:pos="720"/>
+        </w:tabs>
+        <w:ind w:left="720" w:hanging="360"/>
+      </w:pPr>
+      <w:rPr>
+        <w:rFonts w:ascii="Symbol" w:hAnsi="Symbol" w:hint="default"/>
+        <w:sz w:val="20"/>
+      </w:rPr>
+    </w:lvl>
+    <w:lvl w:ilvl="1" w:tentative="1">
+      <w:start w:val="1"/>
+      <w:numFmt w:val="bullet"/>
+      <w:lvlText w:val="o"/>
+      <w:lvlJc w:val="left"/>
+      <w:pPr>
+        <w:tabs>
+          <w:tab w:val="num" w:pos="1440"/>
+        </w:tabs>
+        <w:ind w:left="1440" w:hanging="360"/>
+      </w:pPr>
+      <w:rPr>
+        <w:rFonts w:ascii="Courier New" w:hAnsi="Courier New" w:hint="default"/>
+        <w:sz w:val="20"/>
+      </w:rPr>
+    </w:lvl>
+    <w:lvl w:ilvl="2" w:tentative="1">
+      <w:start w:val="1"/>
+      <w:numFmt w:val="bullet"/>
+      <w:lvlText w:val=""/>
+      <w:lvlJc w:val="left"/>
+      <w:pPr>
+        <w:tabs>
+          <w:tab w:val="num" w:pos="2160"/>
+        </w:tabs>
+        <w:ind w:left="2160" w:hanging="360"/>
+      </w:pPr>
+      <w:rPr>
+        <w:rFonts w:ascii="Wingdings" w:hAnsi="Wingdings" w:hint="default"/>
+        <w:sz w:val="20"/>
+      </w:rPr>
+    </w:lvl>
+    <w:lvl w:ilvl="3" w:tentative="1">
+      <w:start w:val="1"/>
+      <w:numFmt w:val="bullet"/>
+      <w:lvlText w:val=""/>
+      <w:lvlJc w:val="left"/>
+      <w:pPr>
+        <w:tabs>
+          <w:tab w:val="num" w:pos="2880"/>
+        </w:tabs>
+        <w:ind w:left="2880" w:hanging="360"/>
+      </w:pPr>
+      <w:rPr>
+        <w:rFonts w:ascii="Wingdings" w:hAnsi="Wingdings" w:hint="default"/>
+        <w:sz w:val="20"/>
+      </w:rPr>
+    </w:lvl>
+    <w:lvl w:ilvl="4" w:tentative="1">
+      <w:start w:val="1"/>
+      <w:numFmt w:val="bullet"/>
+      <w:lvlText w:val=""/>
+      <w:lvlJc w:val="left"/>
+      <w:pPr>
+        <w:tabs>
+          <w:tab w:val="num" w:pos="3600"/>
+        </w:tabs>
+        <w:ind w:left="3600" w:hanging="360"/>
+      </w:pPr>
+      <w:rPr>
+        <w:rFonts w:ascii="Wingdings" w:hAnsi="Wingdings" w:hint="default"/>
+        <w:sz w:val="20"/>
+      </w:rPr>
+    </w:lvl>
+    <w:lvl w:ilvl="5" w:tentative="1">
+      <w:start w:val="1"/>
+      <w:numFmt w:val="bullet"/>
+      <w:lvlText w:val=""/>
+      <w:lvlJc w:val="left"/>
+      <w:pPr>
+        <w:tabs>
+          <w:tab w:val="num" w:pos="4320"/>
+        </w:tabs>
+        <w:ind w:left="4320" w:hanging="360"/>
+      </w:pPr>
+      <w:rPr>
+        <w:rFonts w:ascii="Wingdings" w:hAnsi="Wingdings" w:hint="default"/>
+        <w:sz w:val="20"/>
+      </w:rPr>
+    </w:lvl>
+    <w:lvl w:ilvl="6" w:tentative="1">
+      <w:start w:val="1"/>
+      <w:numFmt w:val="bullet"/>
+      <w:lvlText w:val=""/>
+      <w:lvlJc w:val="left"/>
+      <w:pPr>
+        <w:tabs>
+          <w:tab w:val="num" w:pos="5040"/>
+        </w:tabs>
+        <w:ind w:left="5040" w:hanging="360"/>
+      </w:pPr>
+      <w:rPr>
+        <w:rFonts w:ascii="Wingdings" w:hAnsi="Wingdings" w:hint="default"/>
+        <w:sz w:val="20"/>
+      </w:rPr>
+    </w:lvl>
+    <w:lvl w:ilvl="7" w:tentative="1">
+      <w:start w:val="1"/>
+      <w:numFmt w:val="bullet"/>
+      <w:lvlText w:val=""/>
+      <w:lvlJc w:val="left"/>
+      <w:pPr>
+        <w:tabs>
+          <w:tab w:val="num" w:pos="5760"/>
+        </w:tabs>
+        <w:ind w:left="5760" w:hanging="360"/>
+      </w:pPr>
+      <w:rPr>
+        <w:rFonts w:ascii="Wingdings" w:hAnsi="Wingdings" w:hint="default"/>
+        <w:sz w:val="20"/>
+      </w:rPr>
+    </w:lvl>
+    <w:lvl w:ilvl="8" w:tentative="1">
+      <w:start w:val="1"/>
+      <w:numFmt w:val="bullet"/>
+      <w:lvlText w:val=""/>
+      <w:lvlJc w:val="left"/>
+      <w:pPr>
+        <w:tabs>
+          <w:tab w:val="num" w:pos="6480"/>
+        </w:tabs>
+        <w:ind w:left="6480" w:hanging="360"/>
+      </w:pPr>
+      <w:rPr>
+        <w:rFonts w:ascii="Wingdings" w:hAnsi="Wingdings" w:hint="default"/>
+        <w:sz w:val="20"/>
+      </w:rPr>
+    </w:lvl>
+  </w:abstractNum>
+  <w:abstractNum w:abstractNumId="1" w15:restartNumberingAfterBreak="0">
+    <w:nsid w:val="22F264B4"/>
+    <w:multiLevelType w:val="multilevel"/>
+    <w:tmpl w:val="54C8DD08"/>
+    <w:lvl w:ilvl="0">
+      <w:start w:val="1"/>
+      <w:numFmt w:val="bullet"/>
+      <w:lvlText w:val=""/>
+      <w:lvlJc w:val="left"/>
+      <w:pPr>
+        <w:tabs>
+          <w:tab w:val="num" w:pos="720"/>
+        </w:tabs>
+        <w:ind w:left="720" w:hanging="360"/>
+      </w:pPr>
+      <w:rPr>
+        <w:rFonts w:ascii="Symbol" w:hAnsi="Symbol" w:hint="default"/>
+        <w:sz w:val="20"/>
+      </w:rPr>
+    </w:lvl>
+    <w:lvl w:ilvl="1" w:tentative="1">
+      <w:start w:val="1"/>
+      <w:numFmt w:val="bullet"/>
+      <w:lvlText w:val="o"/>
+      <w:lvlJc w:val="left"/>
+      <w:pPr>
+        <w:tabs>
+          <w:tab w:val="num" w:pos="1440"/>
+        </w:tabs>
+        <w:ind w:left="1440" w:hanging="360"/>
+      </w:pPr>
+      <w:rPr>
+        <w:rFonts w:ascii="Courier New" w:hAnsi="Courier New" w:hint="default"/>
+        <w:sz w:val="20"/>
+      </w:rPr>
+    </w:lvl>
+    <w:lvl w:ilvl="2" w:tentative="1">
+      <w:start w:val="1"/>
+      <w:numFmt w:val="bullet"/>
+      <w:lvlText w:val=""/>
+      <w:lvlJc w:val="left"/>
+      <w:pPr>
+        <w:tabs>
+          <w:tab w:val="num" w:pos="2160"/>
+        </w:tabs>
+        <w:ind w:left="2160" w:hanging="360"/>
+      </w:pPr>
+      <w:rPr>
+        <w:rFonts w:ascii="Wingdings" w:hAnsi="Wingdings" w:hint="default"/>
+        <w:sz w:val="20"/>
+      </w:rPr>
+    </w:lvl>
+    <w:lvl w:ilvl="3" w:tentative="1">
+      <w:start w:val="1"/>
+      <w:numFmt w:val="bullet"/>
+      <w:lvlText w:val=""/>
+      <w:lvlJc w:val="left"/>
+      <w:pPr>
+        <w:tabs>
+          <w:tab w:val="num" w:pos="2880"/>
+        </w:tabs>
+        <w:ind w:left="2880" w:hanging="360"/>
+      </w:pPr>
+      <w:rPr>
+        <w:rFonts w:ascii="Wingdings" w:hAnsi="Wingdings" w:hint="default"/>
+        <w:sz w:val="20"/>
+      </w:rPr>
+    </w:lvl>
+    <w:lvl w:ilvl="4" w:tentative="1">
+      <w:start w:val="1"/>
+      <w:numFmt w:val="bullet"/>
+      <w:lvlText w:val=""/>
+      <w:lvlJc w:val="left"/>
+      <w:pPr>
+        <w:tabs>
+          <w:tab w:val="num" w:pos="3600"/>
+        </w:tabs>
+        <w:ind w:left="3600" w:hanging="360"/>
+      </w:pPr>
+      <w:rPr>
+        <w:rFonts w:ascii="Wingdings" w:hAnsi="Wingdings" w:hint="default"/>
+        <w:sz w:val="20"/>
+      </w:rPr>
+    </w:lvl>
+    <w:lvl w:ilvl="5" w:tentative="1">
+      <w:start w:val="1"/>
+      <w:numFmt w:val="bullet"/>
+      <w:lvlText w:val=""/>
+      <w:lvlJc w:val="left"/>
+      <w:pPr>
+        <w:tabs>
+          <w:tab w:val="num" w:pos="4320"/>
+        </w:tabs>
+        <w:ind w:left="4320" w:hanging="360"/>
+      </w:pPr>
+      <w:rPr>
+        <w:rFonts w:ascii="Wingdings" w:hAnsi="Wingdings" w:hint="default"/>
+        <w:sz w:val="20"/>
+      </w:rPr>
+    </w:lvl>
+    <w:lvl w:ilvl="6" w:tentative="1">
+      <w:start w:val="1"/>
+      <w:numFmt w:val="bullet"/>
+      <w:lvlText w:val=""/>
+      <w:lvlJc w:val="left"/>
+      <w:pPr>
+        <w:tabs>
+          <w:tab w:val="num" w:pos="5040"/>
+        </w:tabs>
+        <w:ind w:left="5040" w:hanging="360"/>
+      </w:pPr>
+      <w:rPr>
+        <w:rFonts w:ascii="Wingdings" w:hAnsi="Wingdings" w:hint="default"/>
+        <w:sz w:val="20"/>
+      </w:rPr>
+    </w:lvl>
+    <w:lvl w:ilvl="7" w:tentative="1">
+      <w:start w:val="1"/>
+      <w:numFmt w:val="bullet"/>
+      <w:lvlText w:val=""/>
+      <w:lvlJc w:val="left"/>
+      <w:pPr>
+        <w:tabs>
+          <w:tab w:val="num" w:pos="5760"/>
+        </w:tabs>
+        <w:ind w:left="5760" w:hanging="360"/>
+      </w:pPr>
+      <w:rPr>
+        <w:rFonts w:ascii="Wingdings" w:hAnsi="Wingdings" w:hint="default"/>
+        <w:sz w:val="20"/>
+      </w:rPr>
+    </w:lvl>
+    <w:lvl w:ilvl="8" w:tentative="1">
+      <w:start w:val="1"/>
+      <w:numFmt w:val="bullet"/>
+      <w:lvlText w:val=""/>
+      <w:lvlJc w:val="left"/>
+      <w:pPr>
+        <w:tabs>
+          <w:tab w:val="num" w:pos="6480"/>
+        </w:tabs>
+        <w:ind w:left="6480" w:hanging="360"/>
+      </w:pPr>
+      <w:rPr>
+        <w:rFonts w:ascii="Wingdings" w:hAnsi="Wingdings" w:hint="default"/>
+        <w:sz w:val="20"/>
+      </w:rPr>
+    </w:lvl>
+  </w:abstractNum>
+  <w:abstractNum w:abstractNumId="2" w15:restartNumberingAfterBreak="0">
     <w:nsid w:val="26FA7ADA"/>
     <w:multiLevelType w:val="multilevel"/>
     <w:tmpl w:val="AA12DEAA"/>
@@ -3214,7 +3979,7 @@
       </w:rPr>
     </w:lvl>
   </w:abstractNum>
-  <w:abstractNum w:abstractNumId="1" w15:restartNumberingAfterBreak="0">
+  <w:abstractNum w:abstractNumId="3" w15:restartNumberingAfterBreak="0">
     <w:nsid w:val="2DB7777F"/>
     <w:multiLevelType w:val="multilevel"/>
     <w:tmpl w:val="11D22D08"/>
@@ -3363,7 +4128,7 @@
       </w:rPr>
     </w:lvl>
   </w:abstractNum>
-  <w:abstractNum w:abstractNumId="2" w15:restartNumberingAfterBreak="0">
+  <w:abstractNum w:abstractNumId="4" w15:restartNumberingAfterBreak="0">
     <w:nsid w:val="301E2FAD"/>
     <w:multiLevelType w:val="multilevel"/>
     <w:tmpl w:val="73502F30"/>
@@ -3512,7 +4277,7 @@
       </w:rPr>
     </w:lvl>
   </w:abstractNum>
-  <w:abstractNum w:abstractNumId="3" w15:restartNumberingAfterBreak="0">
+  <w:abstractNum w:abstractNumId="5" w15:restartNumberingAfterBreak="0">
     <w:nsid w:val="3AB27B83"/>
     <w:multiLevelType w:val="multilevel"/>
     <w:tmpl w:val="4748EA76"/>
@@ -3661,7 +4426,7 @@
       </w:rPr>
     </w:lvl>
   </w:abstractNum>
-  <w:abstractNum w:abstractNumId="4" w15:restartNumberingAfterBreak="0">
+  <w:abstractNum w:abstractNumId="6" w15:restartNumberingAfterBreak="0">
     <w:nsid w:val="3C821053"/>
     <w:multiLevelType w:val="multilevel"/>
     <w:tmpl w:val="C850357A"/>
@@ -3810,7 +4575,7 @@
       </w:rPr>
     </w:lvl>
   </w:abstractNum>
-  <w:abstractNum w:abstractNumId="5" w15:restartNumberingAfterBreak="0">
+  <w:abstractNum w:abstractNumId="7" w15:restartNumberingAfterBreak="0">
     <w:nsid w:val="44DA1705"/>
     <w:multiLevelType w:val="multilevel"/>
     <w:tmpl w:val="90C45654"/>
@@ -3959,7 +4724,7 @@
       </w:rPr>
     </w:lvl>
   </w:abstractNum>
-  <w:abstractNum w:abstractNumId="6" w15:restartNumberingAfterBreak="0">
+  <w:abstractNum w:abstractNumId="8" w15:restartNumberingAfterBreak="0">
     <w:nsid w:val="46BB3644"/>
     <w:multiLevelType w:val="multilevel"/>
     <w:tmpl w:val="1E8C2F32"/>
@@ -4108,7 +4873,7 @@
       </w:rPr>
     </w:lvl>
   </w:abstractNum>
-  <w:abstractNum w:abstractNumId="7" w15:restartNumberingAfterBreak="0">
+  <w:abstractNum w:abstractNumId="9" w15:restartNumberingAfterBreak="0">
     <w:nsid w:val="504B0431"/>
     <w:multiLevelType w:val="multilevel"/>
     <w:tmpl w:val="E58E17B0"/>
@@ -4257,7 +5022,7 @@
       </w:rPr>
     </w:lvl>
   </w:abstractNum>
-  <w:abstractNum w:abstractNumId="8" w15:restartNumberingAfterBreak="0">
+  <w:abstractNum w:abstractNumId="10" w15:restartNumberingAfterBreak="0">
     <w:nsid w:val="55794DD6"/>
     <w:multiLevelType w:val="multilevel"/>
     <w:tmpl w:val="AEB4B5C4"/>
@@ -4406,7 +5171,7 @@
       </w:rPr>
     </w:lvl>
   </w:abstractNum>
-  <w:abstractNum w:abstractNumId="9" w15:restartNumberingAfterBreak="0">
+  <w:abstractNum w:abstractNumId="11" w15:restartNumberingAfterBreak="0">
     <w:nsid w:val="59666CA0"/>
     <w:multiLevelType w:val="multilevel"/>
     <w:tmpl w:val="16783740"/>
@@ -4555,7 +5320,7 @@
       </w:rPr>
     </w:lvl>
   </w:abstractNum>
-  <w:abstractNum w:abstractNumId="10" w15:restartNumberingAfterBreak="0">
+  <w:abstractNum w:abstractNumId="12" w15:restartNumberingAfterBreak="0">
     <w:nsid w:val="5FB91384"/>
     <w:multiLevelType w:val="multilevel"/>
     <w:tmpl w:val="BE86C038"/>
@@ -4704,7 +5469,7 @@
       </w:rPr>
     </w:lvl>
   </w:abstractNum>
-  <w:abstractNum w:abstractNumId="11" w15:restartNumberingAfterBreak="0">
+  <w:abstractNum w:abstractNumId="13" w15:restartNumberingAfterBreak="0">
     <w:nsid w:val="6AAC0655"/>
     <w:multiLevelType w:val="multilevel"/>
     <w:tmpl w:val="3BE2C5A6"/>
@@ -4853,7 +5618,156 @@
       </w:rPr>
     </w:lvl>
   </w:abstractNum>
-  <w:abstractNum w:abstractNumId="12" w15:restartNumberingAfterBreak="0">
+  <w:abstractNum w:abstractNumId="14" w15:restartNumberingAfterBreak="0">
+    <w:nsid w:val="6D714C61"/>
+    <w:multiLevelType w:val="multilevel"/>
+    <w:tmpl w:val="F842A196"/>
+    <w:lvl w:ilvl="0">
+      <w:start w:val="1"/>
+      <w:numFmt w:val="bullet"/>
+      <w:lvlText w:val=""/>
+      <w:lvlJc w:val="left"/>
+      <w:pPr>
+        <w:tabs>
+          <w:tab w:val="num" w:pos="720"/>
+        </w:tabs>
+        <w:ind w:left="720" w:hanging="360"/>
+      </w:pPr>
+      <w:rPr>
+        <w:rFonts w:ascii="Symbol" w:hAnsi="Symbol" w:hint="default"/>
+        <w:sz w:val="20"/>
+      </w:rPr>
+    </w:lvl>
+    <w:lvl w:ilvl="1" w:tentative="1">
+      <w:start w:val="1"/>
+      <w:numFmt w:val="bullet"/>
+      <w:lvlText w:val="o"/>
+      <w:lvlJc w:val="left"/>
+      <w:pPr>
+        <w:tabs>
+          <w:tab w:val="num" w:pos="1440"/>
+        </w:tabs>
+        <w:ind w:left="1440" w:hanging="360"/>
+      </w:pPr>
+      <w:rPr>
+        <w:rFonts w:ascii="Courier New" w:hAnsi="Courier New" w:hint="default"/>
+        <w:sz w:val="20"/>
+      </w:rPr>
+    </w:lvl>
+    <w:lvl w:ilvl="2" w:tentative="1">
+      <w:start w:val="1"/>
+      <w:numFmt w:val="bullet"/>
+      <w:lvlText w:val=""/>
+      <w:lvlJc w:val="left"/>
+      <w:pPr>
+        <w:tabs>
+          <w:tab w:val="num" w:pos="2160"/>
+        </w:tabs>
+        <w:ind w:left="2160" w:hanging="360"/>
+      </w:pPr>
+      <w:rPr>
+        <w:rFonts w:ascii="Wingdings" w:hAnsi="Wingdings" w:hint="default"/>
+        <w:sz w:val="20"/>
+      </w:rPr>
+    </w:lvl>
+    <w:lvl w:ilvl="3" w:tentative="1">
+      <w:start w:val="1"/>
+      <w:numFmt w:val="bullet"/>
+      <w:lvlText w:val=""/>
+      <w:lvlJc w:val="left"/>
+      <w:pPr>
+        <w:tabs>
+          <w:tab w:val="num" w:pos="2880"/>
+        </w:tabs>
+        <w:ind w:left="2880" w:hanging="360"/>
+      </w:pPr>
+      <w:rPr>
+        <w:rFonts w:ascii="Wingdings" w:hAnsi="Wingdings" w:hint="default"/>
+        <w:sz w:val="20"/>
+      </w:rPr>
+    </w:lvl>
+    <w:lvl w:ilvl="4" w:tentative="1">
+      <w:start w:val="1"/>
+      <w:numFmt w:val="bullet"/>
+      <w:lvlText w:val=""/>
+      <w:lvlJc w:val="left"/>
+      <w:pPr>
+        <w:tabs>
+          <w:tab w:val="num" w:pos="3600"/>
+        </w:tabs>
+        <w:ind w:left="3600" w:hanging="360"/>
+      </w:pPr>
+      <w:rPr>
+        <w:rFonts w:ascii="Wingdings" w:hAnsi="Wingdings" w:hint="default"/>
+        <w:sz w:val="20"/>
+      </w:rPr>
+    </w:lvl>
+    <w:lvl w:ilvl="5" w:tentative="1">
+      <w:start w:val="1"/>
+      <w:numFmt w:val="bullet"/>
+      <w:lvlText w:val=""/>
+      <w:lvlJc w:val="left"/>
+      <w:pPr>
+        <w:tabs>
+          <w:tab w:val="num" w:pos="4320"/>
+        </w:tabs>
+        <w:ind w:left="4320" w:hanging="360"/>
+      </w:pPr>
+      <w:rPr>
+        <w:rFonts w:ascii="Wingdings" w:hAnsi="Wingdings" w:hint="default"/>
+        <w:sz w:val="20"/>
+      </w:rPr>
+    </w:lvl>
+    <w:lvl w:ilvl="6" w:tentative="1">
+      <w:start w:val="1"/>
+      <w:numFmt w:val="bullet"/>
+      <w:lvlText w:val=""/>
+      <w:lvlJc w:val="left"/>
+      <w:pPr>
+        <w:tabs>
+          <w:tab w:val="num" w:pos="5040"/>
+        </w:tabs>
+        <w:ind w:left="5040" w:hanging="360"/>
+      </w:pPr>
+      <w:rPr>
+        <w:rFonts w:ascii="Wingdings" w:hAnsi="Wingdings" w:hint="default"/>
+        <w:sz w:val="20"/>
+      </w:rPr>
+    </w:lvl>
+    <w:lvl w:ilvl="7" w:tentative="1">
+      <w:start w:val="1"/>
+      <w:numFmt w:val="bullet"/>
+      <w:lvlText w:val=""/>
+      <w:lvlJc w:val="left"/>
+      <w:pPr>
+        <w:tabs>
+          <w:tab w:val="num" w:pos="5760"/>
+        </w:tabs>
+        <w:ind w:left="5760" w:hanging="360"/>
+      </w:pPr>
+      <w:rPr>
+        <w:rFonts w:ascii="Wingdings" w:hAnsi="Wingdings" w:hint="default"/>
+        <w:sz w:val="20"/>
+      </w:rPr>
+    </w:lvl>
+    <w:lvl w:ilvl="8" w:tentative="1">
+      <w:start w:val="1"/>
+      <w:numFmt w:val="bullet"/>
+      <w:lvlText w:val=""/>
+      <w:lvlJc w:val="left"/>
+      <w:pPr>
+        <w:tabs>
+          <w:tab w:val="num" w:pos="6480"/>
+        </w:tabs>
+        <w:ind w:left="6480" w:hanging="360"/>
+      </w:pPr>
+      <w:rPr>
+        <w:rFonts w:ascii="Wingdings" w:hAnsi="Wingdings" w:hint="default"/>
+        <w:sz w:val="20"/>
+      </w:rPr>
+    </w:lvl>
+  </w:abstractNum>
+  <w:abstractNum w:abstractNumId="15" w15:restartNumberingAfterBreak="0">
     <w:nsid w:val="6F711484"/>
     <w:multiLevelType w:val="multilevel"/>
     <w:tmpl w:val="5CFC99EA"/>
@@ -5002,7 +5916,156 @@
       </w:rPr>
     </w:lvl>
   </w:abstractNum>
-  <w:abstractNum w:abstractNumId="13" w15:restartNumberingAfterBreak="0">
+  <w:abstractNum w:abstractNumId="16" w15:restartNumberingAfterBreak="0">
+    <w:nsid w:val="73BE21D9"/>
+    <w:multiLevelType w:val="multilevel"/>
+    <w:tmpl w:val="86644E40"/>
+    <w:lvl w:ilvl="0">
+      <w:start w:val="1"/>
+      <w:numFmt w:val="bullet"/>
+      <w:lvlText w:val=""/>
+      <w:lvlJc w:val="left"/>
+      <w:pPr>
+        <w:tabs>
+          <w:tab w:val="num" w:pos="720"/>
+        </w:tabs>
+        <w:ind w:left="720" w:hanging="360"/>
+      </w:pPr>
+      <w:rPr>
+        <w:rFonts w:ascii="Symbol" w:hAnsi="Symbol" w:hint="default"/>
+        <w:sz w:val="20"/>
+      </w:rPr>
+    </w:lvl>
+    <w:lvl w:ilvl="1" w:tentative="1">
+      <w:start w:val="1"/>
+      <w:numFmt w:val="bullet"/>
+      <w:lvlText w:val="o"/>
+      <w:lvlJc w:val="left"/>
+      <w:pPr>
+        <w:tabs>
+          <w:tab w:val="num" w:pos="1440"/>
+        </w:tabs>
+        <w:ind w:left="1440" w:hanging="360"/>
+      </w:pPr>
+      <w:rPr>
+        <w:rFonts w:ascii="Courier New" w:hAnsi="Courier New" w:hint="default"/>
+        <w:sz w:val="20"/>
+      </w:rPr>
+    </w:lvl>
+    <w:lvl w:ilvl="2" w:tentative="1">
+      <w:start w:val="1"/>
+      <w:numFmt w:val="bullet"/>
+      <w:lvlText w:val=""/>
+      <w:lvlJc w:val="left"/>
+      <w:pPr>
+        <w:tabs>
+          <w:tab w:val="num" w:pos="2160"/>
+        </w:tabs>
+        <w:ind w:left="2160" w:hanging="360"/>
+      </w:pPr>
+      <w:rPr>
+        <w:rFonts w:ascii="Wingdings" w:hAnsi="Wingdings" w:hint="default"/>
+        <w:sz w:val="20"/>
+      </w:rPr>
+    </w:lvl>
+    <w:lvl w:ilvl="3" w:tentative="1">
+      <w:start w:val="1"/>
+      <w:numFmt w:val="bullet"/>
+      <w:lvlText w:val=""/>
+      <w:lvlJc w:val="left"/>
+      <w:pPr>
+        <w:tabs>
+          <w:tab w:val="num" w:pos="2880"/>
+        </w:tabs>
+        <w:ind w:left="2880" w:hanging="360"/>
+      </w:pPr>
+      <w:rPr>
+        <w:rFonts w:ascii="Wingdings" w:hAnsi="Wingdings" w:hint="default"/>
+        <w:sz w:val="20"/>
+      </w:rPr>
+    </w:lvl>
+    <w:lvl w:ilvl="4" w:tentative="1">
+      <w:start w:val="1"/>
+      <w:numFmt w:val="bullet"/>
+      <w:lvlText w:val=""/>
+      <w:lvlJc w:val="left"/>
+      <w:pPr>
+        <w:tabs>
+          <w:tab w:val="num" w:pos="3600"/>
+        </w:tabs>
+        <w:ind w:left="3600" w:hanging="360"/>
+      </w:pPr>
+      <w:rPr>
+        <w:rFonts w:ascii="Wingdings" w:hAnsi="Wingdings" w:hint="default"/>
+        <w:sz w:val="20"/>
+      </w:rPr>
+    </w:lvl>
+    <w:lvl w:ilvl="5" w:tentative="1">
+      <w:start w:val="1"/>
+      <w:numFmt w:val="bullet"/>
+      <w:lvlText w:val=""/>
+      <w:lvlJc w:val="left"/>
+      <w:pPr>
+        <w:tabs>
+          <w:tab w:val="num" w:pos="4320"/>
+        </w:tabs>
+        <w:ind w:left="4320" w:hanging="360"/>
+      </w:pPr>
+      <w:rPr>
+        <w:rFonts w:ascii="Wingdings" w:hAnsi="Wingdings" w:hint="default"/>
+        <w:sz w:val="20"/>
+      </w:rPr>
+    </w:lvl>
+    <w:lvl w:ilvl="6" w:tentative="1">
+      <w:start w:val="1"/>
+      <w:numFmt w:val="bullet"/>
+      <w:lvlText w:val=""/>
+      <w:lvlJc w:val="left"/>
+      <w:pPr>
+        <w:tabs>
+          <w:tab w:val="num" w:pos="5040"/>
+        </w:tabs>
+        <w:ind w:left="5040" w:hanging="360"/>
+      </w:pPr>
+      <w:rPr>
+        <w:rFonts w:ascii="Wingdings" w:hAnsi="Wingdings" w:hint="default"/>
+        <w:sz w:val="20"/>
+      </w:rPr>
+    </w:lvl>
+    <w:lvl w:ilvl="7" w:tentative="1">
+      <w:start w:val="1"/>
+      <w:numFmt w:val="bullet"/>
+      <w:lvlText w:val=""/>
+      <w:lvlJc w:val="left"/>
+      <w:pPr>
+        <w:tabs>
+          <w:tab w:val="num" w:pos="5760"/>
+        </w:tabs>
+        <w:ind w:left="5760" w:hanging="360"/>
+      </w:pPr>
+      <w:rPr>
+        <w:rFonts w:ascii="Wingdings" w:hAnsi="Wingdings" w:hint="default"/>
+        <w:sz w:val="20"/>
+      </w:rPr>
+    </w:lvl>
+    <w:lvl w:ilvl="8" w:tentative="1">
+      <w:start w:val="1"/>
+      <w:numFmt w:val="bullet"/>
+      <w:lvlText w:val=""/>
+      <w:lvlJc w:val="left"/>
+      <w:pPr>
+        <w:tabs>
+          <w:tab w:val="num" w:pos="6480"/>
+        </w:tabs>
+        <w:ind w:left="6480" w:hanging="360"/>
+      </w:pPr>
+      <w:rPr>
+        <w:rFonts w:ascii="Wingdings" w:hAnsi="Wingdings" w:hint="default"/>
+        <w:sz w:val="20"/>
+      </w:rPr>
+    </w:lvl>
+  </w:abstractNum>
+  <w:abstractNum w:abstractNumId="17" w15:restartNumberingAfterBreak="0">
     <w:nsid w:val="7B397AF2"/>
     <w:multiLevelType w:val="multilevel"/>
     <w:tmpl w:val="E548BD7E"/>
@@ -5151,7 +6214,7 @@
       </w:rPr>
     </w:lvl>
   </w:abstractNum>
-  <w:abstractNum w:abstractNumId="14" w15:restartNumberingAfterBreak="0">
+  <w:abstractNum w:abstractNumId="18" w15:restartNumberingAfterBreak="0">
     <w:nsid w:val="7DEF14AF"/>
     <w:multiLevelType w:val="multilevel"/>
     <w:tmpl w:val="5C6E4EAA"/>
@@ -5300,7 +6363,7 @@
       </w:rPr>
     </w:lvl>
   </w:abstractNum>
-  <w:abstractNum w:abstractNumId="15" w15:restartNumberingAfterBreak="0">
+  <w:abstractNum w:abstractNumId="19" w15:restartNumberingAfterBreak="0">
     <w:nsid w:val="7E2E0E7E"/>
     <w:multiLevelType w:val="multilevel"/>
     <w:tmpl w:val="56E88AB0"/>
@@ -5413,7 +6476,7 @@
       </w:pPr>
     </w:lvl>
   </w:abstractNum>
-  <w:abstractNum w:abstractNumId="16" w15:restartNumberingAfterBreak="0">
+  <w:abstractNum w:abstractNumId="20" w15:restartNumberingAfterBreak="0">
     <w:nsid w:val="7F972423"/>
     <w:multiLevelType w:val="multilevel"/>
     <w:tmpl w:val="0B1C78C0"/>
@@ -5527,55 +6590,67 @@
     </w:lvl>
   </w:abstractNum>
   <w:num w:numId="1" w16cid:durableId="1676029529">
+    <w:abstractNumId w:val="10"/>
+  </w:num>
+  <w:num w:numId="2" w16cid:durableId="1750498978">
+    <w:abstractNumId w:val="6"/>
+  </w:num>
+  <w:num w:numId="3" w16cid:durableId="1314990887">
+    <w:abstractNumId w:val="12"/>
+  </w:num>
+  <w:num w:numId="4" w16cid:durableId="1607300712">
+    <w:abstractNumId w:val="2"/>
+  </w:num>
+  <w:num w:numId="5" w16cid:durableId="1998222103">
     <w:abstractNumId w:val="8"/>
   </w:num>
-  <w:num w:numId="2" w16cid:durableId="1750498978">
+  <w:num w:numId="6" w16cid:durableId="1824663458">
+    <w:abstractNumId w:val="20"/>
+  </w:num>
+  <w:num w:numId="7" w16cid:durableId="79907861">
+    <w:abstractNumId w:val="11"/>
+  </w:num>
+  <w:num w:numId="8" w16cid:durableId="306588739">
+    <w:abstractNumId w:val="17"/>
+  </w:num>
+  <w:num w:numId="9" w16cid:durableId="315954786">
+    <w:abstractNumId w:val="7"/>
+  </w:num>
+  <w:num w:numId="10" w16cid:durableId="220140427">
+    <w:abstractNumId w:val="9"/>
+  </w:num>
+  <w:num w:numId="11" w16cid:durableId="272130988">
+    <w:abstractNumId w:val="19"/>
+  </w:num>
+  <w:num w:numId="12" w16cid:durableId="656231512">
+    <w:abstractNumId w:val="18"/>
+  </w:num>
+  <w:num w:numId="13" w16cid:durableId="1789156210">
     <w:abstractNumId w:val="4"/>
   </w:num>
-  <w:num w:numId="3" w16cid:durableId="1314990887">
-    <w:abstractNumId w:val="10"/>
+  <w:num w:numId="14" w16cid:durableId="473761800">
+    <w:abstractNumId w:val="15"/>
   </w:num>
-  <w:num w:numId="4" w16cid:durableId="1607300712">
-    <w:abstractNumId w:val="0"/>
+  <w:num w:numId="15" w16cid:durableId="943421026">
+    <w:abstractNumId w:val="5"/>
   </w:num>
-  <w:num w:numId="5" w16cid:durableId="1998222103">
-    <w:abstractNumId w:val="6"/>
+  <w:num w:numId="16" w16cid:durableId="254246183">
+    <w:abstractNumId w:val="13"/>
   </w:num>
-  <w:num w:numId="6" w16cid:durableId="1824663458">
+  <w:num w:numId="17" w16cid:durableId="2072119589">
+    <w:abstractNumId w:val="3"/>
+  </w:num>
+  <w:num w:numId="18" w16cid:durableId="669989420">
     <w:abstractNumId w:val="16"/>
   </w:num>
-  <w:num w:numId="7" w16cid:durableId="79907861">
-    <w:abstractNumId w:val="9"/>
-  </w:num>
-  <w:num w:numId="8" w16cid:durableId="306588739">
-    <w:abstractNumId w:val="13"/>
-  </w:num>
-  <w:num w:numId="9" w16cid:durableId="315954786">
-    <w:abstractNumId w:val="5"/>
-  </w:num>
-  <w:num w:numId="10" w16cid:durableId="220140427">
-    <w:abstractNumId w:val="7"/>
-  </w:num>
-  <w:num w:numId="11" w16cid:durableId="272130988">
-    <w:abstractNumId w:val="15"/>
-  </w:num>
-  <w:num w:numId="12" w16cid:durableId="656231512">
+  <w:num w:numId="19" w16cid:durableId="1400595853">
     <w:abstractNumId w:val="14"/>
   </w:num>
-  <w:num w:numId="13" w16cid:durableId="1789156210">
-    <w:abstractNumId w:val="2"/>
+  <w:num w:numId="20" w16cid:durableId="428743925">
+    <w:abstractNumId w:val="1"/>
   </w:num>
-  <w:num w:numId="14" w16cid:durableId="473761800">
-    <w:abstractNumId w:val="12"/>
-  </w:num>
-  <w:num w:numId="15" w16cid:durableId="943421026">
-    <w:abstractNumId w:val="3"/>
-  </w:num>
-  <w:num w:numId="16" w16cid:durableId="254246183">
-    <w:abstractNumId w:val="11"/>
-  </w:num>
-  <w:num w:numId="17" w16cid:durableId="2072119589">
-    <w:abstractNumId w:val="1"/>
+  <w:num w:numId="21" w16cid:durableId="1029718341">
+    <w:abstractNumId w:val="0"/>
   </w:num>
 </w:numbering>
 </file>

</xml_diff>

<commit_message>
fix: manejo de errores de login con mensaje respectivo
</commit_message>
<xml_diff>
--- a/dctos/Aqua Code Bases.docx
+++ b/dctos/Aqua Code Bases.docx
@@ -22,39 +22,7 @@
           <w:b/>
           <w:bCs/>
         </w:rPr>
-        <w:t>1. La Puerta de Entrada: Servidor y Configuración (</w:t>
-      </w:r>
-      <w:proofErr w:type="spellStart"/>
-      <w:r>
-        <w:rPr>
-          <w:b/>
-          <w:bCs/>
-        </w:rPr>
-        <w:t>server.ts</w:t>
-      </w:r>
-      <w:proofErr w:type="spellEnd"/>
-      <w:r>
-        <w:rPr>
-          <w:b/>
-          <w:bCs/>
-        </w:rPr>
-        <w:t xml:space="preserve"> y </w:t>
-      </w:r>
-      <w:proofErr w:type="spellStart"/>
-      <w:r>
-        <w:rPr>
-          <w:b/>
-          <w:bCs/>
-        </w:rPr>
-        <w:t>app.ts</w:t>
-      </w:r>
-      <w:proofErr w:type="spellEnd"/>
-      <w:r>
-        <w:rPr>
-          <w:b/>
-          <w:bCs/>
-        </w:rPr>
-        <w:t>)</w:t>
+        <w:t>1. La Puerta de Entrada: Servidor y Configuración (server.ts y app.ts)</w:t>
       </w:r>
     </w:p>
     <w:p>
@@ -69,48 +37,15 @@
           <w:numId w:val="1"/>
         </w:numPr>
       </w:pPr>
-      <w:proofErr w:type="spellStart"/>
-      <w:r>
-        <w:rPr>
-          <w:b/>
-          <w:bCs/>
-        </w:rPr>
-        <w:t>app.ts</w:t>
-      </w:r>
-      <w:proofErr w:type="spellEnd"/>
-      <w:r>
-        <w:rPr>
-          <w:b/>
-          <w:bCs/>
-        </w:rPr>
-        <w:t>:</w:t>
-      </w:r>
-      <w:r>
-        <w:t xml:space="preserve"> Es el núcleo de tu aplicación Express. Aquí configuras las reglas básicas (como CORS para permitir peticiones desde el </w:t>
-      </w:r>
-      <w:proofErr w:type="spellStart"/>
-      <w:r>
-        <w:t>frontend</w:t>
-      </w:r>
-      <w:proofErr w:type="spellEnd"/>
-      <w:r>
-        <w:t>) y declaras tus módulos principales (ej. /api/</w:t>
-      </w:r>
-      <w:proofErr w:type="spellStart"/>
-      <w:r>
-        <w:t>auth</w:t>
-      </w:r>
-      <w:proofErr w:type="spellEnd"/>
-      <w:r>
-        <w:t xml:space="preserve"> y /api/</w:t>
-      </w:r>
-      <w:proofErr w:type="spellStart"/>
-      <w:r>
-        <w:t>tenants</w:t>
-      </w:r>
-      <w:proofErr w:type="spellEnd"/>
-      <w:r>
-        <w:t>).</w:t>
+      <w:r>
+        <w:rPr>
+          <w:b/>
+          <w:bCs/>
+        </w:rPr>
+        <w:t>app.ts:</w:t>
+      </w:r>
+      <w:r>
+        <w:t xml:space="preserve"> Es el núcleo de tu aplicación Express. Aquí configuras las reglas básicas (como CORS para permitir peticiones desde el frontend) y declaras tus módulos principales (ej. /api/auth y /api/tenants).</w:t>
       </w:r>
     </w:p>
     <w:p>
@@ -120,21 +55,12 @@
           <w:numId w:val="1"/>
         </w:numPr>
       </w:pPr>
-      <w:proofErr w:type="spellStart"/>
-      <w:r>
-        <w:rPr>
-          <w:b/>
-          <w:bCs/>
-        </w:rPr>
-        <w:t>server.ts</w:t>
-      </w:r>
-      <w:proofErr w:type="spellEnd"/>
-      <w:r>
-        <w:rPr>
-          <w:b/>
-          <w:bCs/>
-        </w:rPr>
-        <w:t>:</w:t>
+      <w:r>
+        <w:rPr>
+          <w:b/>
+          <w:bCs/>
+        </w:rPr>
+        <w:t>server.ts:</w:t>
       </w:r>
       <w:r>
         <w:t xml:space="preserve"> Toma esa aplicación de Express y la levanta en un puerto. Además, inicializa </w:t>
@@ -147,31 +73,7 @@
         <w:t>Socket.io</w:t>
       </w:r>
       <w:r>
-        <w:t xml:space="preserve"> y lo inyecta dentro de la instancia de Express usando </w:t>
-      </w:r>
-      <w:proofErr w:type="spellStart"/>
-      <w:r>
-        <w:t>app.set</w:t>
-      </w:r>
-      <w:proofErr w:type="spellEnd"/>
-      <w:r>
-        <w:t>("</w:t>
-      </w:r>
-      <w:proofErr w:type="spellStart"/>
-      <w:r>
-        <w:t>io</w:t>
-      </w:r>
-      <w:proofErr w:type="spellEnd"/>
-      <w:r>
-        <w:t xml:space="preserve">", </w:t>
-      </w:r>
-      <w:proofErr w:type="spellStart"/>
-      <w:r>
-        <w:t>io</w:t>
-      </w:r>
-      <w:proofErr w:type="spellEnd"/>
-      <w:r>
-        <w:t>) para que la comunicación en tiempo real esté disponible en cualquier parte del sistema de forma limpia.</w:t>
+        <w:t xml:space="preserve"> y lo inyecta dentro de la instancia de Express usando app.set("io", io) para que la comunicación en tiempo real esté disponible en cualquier parte del sistema de forma limpia.</w:t>
       </w:r>
     </w:p>
     <w:p>
@@ -193,39 +95,7 @@
           <w:b/>
           <w:bCs/>
         </w:rPr>
-        <w:t>2. El Escudo Protector: Middlewares (</w:t>
-      </w:r>
-      <w:proofErr w:type="spellStart"/>
-      <w:r>
-        <w:rPr>
-          <w:b/>
-          <w:bCs/>
-        </w:rPr>
-        <w:t>auth.middleware.ts</w:t>
-      </w:r>
-      <w:proofErr w:type="spellEnd"/>
-      <w:r>
-        <w:rPr>
-          <w:b/>
-          <w:bCs/>
-        </w:rPr>
-        <w:t xml:space="preserve"> y </w:t>
-      </w:r>
-      <w:proofErr w:type="spellStart"/>
-      <w:r>
-        <w:rPr>
-          <w:b/>
-          <w:bCs/>
-        </w:rPr>
-        <w:t>requireSuperadmin.ts</w:t>
-      </w:r>
-      <w:proofErr w:type="spellEnd"/>
-      <w:r>
-        <w:rPr>
-          <w:b/>
-          <w:bCs/>
-        </w:rPr>
-        <w:t>)</w:t>
+        <w:t>2. El Escudo Protector: Middlewares (auth.middleware.ts y requireSuperadmin.ts)</w:t>
       </w:r>
     </w:p>
     <w:p>
@@ -240,32 +110,15 @@
           <w:numId w:val="2"/>
         </w:numPr>
       </w:pPr>
-      <w:proofErr w:type="spellStart"/>
-      <w:r>
-        <w:rPr>
-          <w:b/>
-          <w:bCs/>
-        </w:rPr>
-        <w:t>verifyToken</w:t>
-      </w:r>
-      <w:proofErr w:type="spellEnd"/>
-      <w:r>
-        <w:rPr>
-          <w:b/>
-          <w:bCs/>
-        </w:rPr>
-        <w:t>:</w:t>
-      </w:r>
-      <w:r>
-        <w:t xml:space="preserve"> Lee el token JWT enviado por el </w:t>
-      </w:r>
-      <w:proofErr w:type="spellStart"/>
-      <w:r>
-        <w:t>frontend</w:t>
-      </w:r>
-      <w:proofErr w:type="spellEnd"/>
-      <w:r>
-        <w:t>, valida que no esté expirado usando tu clave secreta segura (JWT_SECRET) y extrae los datos del usuario (como su ID y su rol).</w:t>
+      <w:r>
+        <w:rPr>
+          <w:b/>
+          <w:bCs/>
+        </w:rPr>
+        <w:t>verifyToken:</w:t>
+      </w:r>
+      <w:r>
+        <w:t xml:space="preserve"> Lee el token JWT enviado por el frontend, valida que no esté expirado usando tu clave secreta segura (JWT_SECRET) y extrae los datos del usuario (como su ID y su rol).</w:t>
       </w:r>
     </w:p>
     <w:p>
@@ -275,21 +128,12 @@
           <w:numId w:val="2"/>
         </w:numPr>
       </w:pPr>
-      <w:proofErr w:type="spellStart"/>
-      <w:r>
-        <w:rPr>
-          <w:b/>
-          <w:bCs/>
-        </w:rPr>
-        <w:t>requireSuperadmin</w:t>
-      </w:r>
-      <w:proofErr w:type="spellEnd"/>
-      <w:r>
-        <w:rPr>
-          <w:b/>
-          <w:bCs/>
-        </w:rPr>
-        <w:t>:</w:t>
+      <w:r>
+        <w:rPr>
+          <w:b/>
+          <w:bCs/>
+        </w:rPr>
+        <w:t>requireSuperadmin:</w:t>
       </w:r>
       <w:r>
         <w:t xml:space="preserve"> Actúa como una segunda barrera para rutas críticas, bloqueando la petición si el usuario que intenta acceder no tiene el rol máximo autorizado.</w:t>
@@ -314,23 +158,7 @@
           <w:b/>
           <w:bCs/>
         </w:rPr>
-        <w:t>3. El Mapa de Rutas (*.</w:t>
-      </w:r>
-      <w:proofErr w:type="spellStart"/>
-      <w:r>
-        <w:rPr>
-          <w:b/>
-          <w:bCs/>
-        </w:rPr>
-        <w:t>routes.ts</w:t>
-      </w:r>
-      <w:proofErr w:type="spellEnd"/>
-      <w:r>
-        <w:rPr>
-          <w:b/>
-          <w:bCs/>
-        </w:rPr>
-        <w:t>)</w:t>
+        <w:t>3. El Mapa de Rutas (*.routes.ts)</w:t>
       </w:r>
     </w:p>
     <w:p>
@@ -346,15 +174,7 @@
         </w:numPr>
       </w:pPr>
       <w:r>
-        <w:t xml:space="preserve">Cada módulo tiene su propio archivo de rutas (ej. </w:t>
-      </w:r>
-      <w:proofErr w:type="spellStart"/>
-      <w:r>
-        <w:t>tenant.routes.ts</w:t>
-      </w:r>
-      <w:proofErr w:type="spellEnd"/>
-      <w:r>
-        <w:t>). Este archivo mapea una URL específica y un método (GET, POST, PUT) hacia una función en particular dentro del controlador.</w:t>
+        <w:t>Cada módulo tiene su propio archivo de rutas (ej. tenant.routes.ts). Este archivo mapea una URL específica y un método (GET, POST, PUT) hacia una función en particular dentro del controlador.</w:t>
       </w:r>
     </w:p>
     <w:p>
@@ -376,45 +196,13 @@
           <w:b/>
           <w:bCs/>
         </w:rPr>
-        <w:t>4. El Director de Orquesta: Controladores (*.</w:t>
-      </w:r>
-      <w:proofErr w:type="spellStart"/>
-      <w:r>
-        <w:rPr>
-          <w:b/>
-          <w:bCs/>
-        </w:rPr>
-        <w:t>controller.ts</w:t>
-      </w:r>
-      <w:proofErr w:type="spellEnd"/>
-      <w:r>
-        <w:rPr>
-          <w:b/>
-          <w:bCs/>
-        </w:rPr>
-        <w:t>)</w:t>
+        <w:t>4. El Director de Orquesta: Controladores (*.controller.ts)</w:t>
       </w:r>
     </w:p>
     <w:p>
       <w:r>
         <w:lastRenderedPageBreak/>
-        <w:t xml:space="preserve">El controlador es el intermediario. Los controladores solo deben validar los datos de entrada (lo que viene en el </w:t>
-      </w:r>
-      <w:proofErr w:type="spellStart"/>
-      <w:r>
-        <w:t>req.body</w:t>
-      </w:r>
-      <w:proofErr w:type="spellEnd"/>
-      <w:r>
-        <w:t xml:space="preserve">) y manejar las respuestas HTTP (como devolver un </w:t>
-      </w:r>
-      <w:proofErr w:type="spellStart"/>
-      <w:r>
-        <w:t>res.status</w:t>
-      </w:r>
-      <w:proofErr w:type="spellEnd"/>
-      <w:r>
-        <w:t>(200) o un error 500).</w:t>
+        <w:t>El controlador es el intermediario. Los controladores solo deben validar los datos de entrada (lo que viene en el req.body) y manejar las respuestas HTTP (como devolver un res.status(200) o un error 500).</w:t>
       </w:r>
     </w:p>
     <w:p>
@@ -450,31 +238,7 @@
         <w:t>Tiempo Real:</w:t>
       </w:r>
       <w:r>
-        <w:t xml:space="preserve"> Una vez que el servicio termina con éxito, el controlador puede usar Socket.io (recuperándolo con </w:t>
-      </w:r>
-      <w:proofErr w:type="spellStart"/>
-      <w:r>
-        <w:t>req.app.get</w:t>
-      </w:r>
-      <w:proofErr w:type="spellEnd"/>
-      <w:r>
-        <w:t>("</w:t>
-      </w:r>
-      <w:proofErr w:type="spellStart"/>
-      <w:r>
-        <w:t>io</w:t>
-      </w:r>
-      <w:proofErr w:type="spellEnd"/>
-      <w:r>
-        <w:t xml:space="preserve">")) para emitir un evento y avisar al </w:t>
-      </w:r>
-      <w:proofErr w:type="spellStart"/>
-      <w:r>
-        <w:t>frontend</w:t>
-      </w:r>
-      <w:proofErr w:type="spellEnd"/>
-      <w:r>
-        <w:t xml:space="preserve"> que algo cambió, permitiendo que las pantallas se actualicen sin necesidad de recargar.</w:t>
+        <w:t xml:space="preserve"> Una vez que el servicio termina con éxito, el controlador puede usar Socket.io (recuperándolo con req.app.get("io")) para emitir un evento y avisar al frontend que algo cambió, permitiendo que las pantallas se actualicen sin necesidad de recargar.</w:t>
       </w:r>
     </w:p>
     <w:p>
@@ -496,23 +260,7 @@
           <w:b/>
           <w:bCs/>
         </w:rPr>
-        <w:t>5. El Cerebro y la Base de Datos: Servicios (*.</w:t>
-      </w:r>
-      <w:proofErr w:type="spellStart"/>
-      <w:r>
-        <w:rPr>
-          <w:b/>
-          <w:bCs/>
-        </w:rPr>
-        <w:t>service.ts</w:t>
-      </w:r>
-      <w:proofErr w:type="spellEnd"/>
-      <w:r>
-        <w:rPr>
-          <w:b/>
-          <w:bCs/>
-        </w:rPr>
-        <w:t>) y Prisma</w:t>
+        <w:t>5. El Cerebro y la Base de Datos: Servicios (*.service.ts) y Prisma</w:t>
       </w:r>
     </w:p>
     <w:p>
@@ -528,15 +276,7 @@
         </w:numPr>
       </w:pPr>
       <w:r>
-        <w:t xml:space="preserve">El archivo de servicio (ej. </w:t>
-      </w:r>
-      <w:proofErr w:type="spellStart"/>
-      <w:r>
-        <w:t>tenant.service.ts</w:t>
-      </w:r>
-      <w:proofErr w:type="spellEnd"/>
-      <w:r>
-        <w:t xml:space="preserve">) usa </w:t>
+        <w:t xml:space="preserve">El archivo de servicio (ej. tenant.service.ts) usa </w:t>
       </w:r>
       <w:r>
         <w:rPr>
@@ -546,15 +286,7 @@
         <w:t>Prisma</w:t>
       </w:r>
       <w:r>
-        <w:t xml:space="preserve"> para hablar con tu base de datos PostgreSQL de forma segura y </w:t>
-      </w:r>
-      <w:proofErr w:type="spellStart"/>
-      <w:r>
-        <w:t>tipada</w:t>
-      </w:r>
-      <w:proofErr w:type="spellEnd"/>
-      <w:r>
-        <w:t>.</w:t>
+        <w:t xml:space="preserve"> para hablar con tu base de datos PostgreSQL de forma segura y tipada.</w:t>
       </w:r>
     </w:p>
     <w:p>
@@ -572,23 +304,7 @@
         <w:t>Transacciones Seguras:</w:t>
       </w:r>
       <w:r>
-        <w:t xml:space="preserve"> Para procesos críticos (como cambiar un plan de suscripción), el servicio utiliza el patrón de Transacciones de Prisma (prisma.$</w:t>
-      </w:r>
-      <w:proofErr w:type="spellStart"/>
-      <w:r>
-        <w:t>transaction</w:t>
-      </w:r>
-      <w:proofErr w:type="spellEnd"/>
-      <w:r>
-        <w:t xml:space="preserve">). Esto asegura que si se actualiza la comunidad, obligatoriamente se crea el registro de auditoría en la tabla </w:t>
-      </w:r>
-      <w:proofErr w:type="spellStart"/>
-      <w:r>
-        <w:t>HistorialTenant</w:t>
-      </w:r>
-      <w:proofErr w:type="spellEnd"/>
-      <w:r>
-        <w:t>; si una de las dos falla, ninguna se guarda, manteniendo tu base de datos siempre consistente.</w:t>
+        <w:t xml:space="preserve"> Para procesos críticos (como cambiar un plan de suscripción), el servicio utiliza el patrón de Transacciones de Prisma (prisma.$transaction). Esto asegura que si se actualiza la comunidad, obligatoriamente se crea el registro de auditoría en la tabla HistorialTenant; si una de las dos falla, ninguna se guarda, manteniendo tu base de datos siempre consistente.</w:t>
       </w:r>
     </w:p>
     <w:p>
@@ -625,7 +341,6 @@
           <w:numId w:val="6"/>
         </w:numPr>
       </w:pPr>
-      <w:proofErr w:type="spellStart"/>
       <w:r>
         <w:rPr>
           <w:b/>
@@ -633,17 +348,8 @@
         </w:rPr>
         <w:t>Frontend</w:t>
       </w:r>
-      <w:proofErr w:type="spellEnd"/>
-      <w:r>
-        <w:t xml:space="preserve"> hace un PUT a /api/</w:t>
-      </w:r>
-      <w:proofErr w:type="spellStart"/>
-      <w:r>
-        <w:t>tenants</w:t>
-      </w:r>
-      <w:proofErr w:type="spellEnd"/>
-      <w:r>
-        <w:t>/1/plan.</w:t>
+      <w:r>
+        <w:t xml:space="preserve"> hace un PUT a /api/tenants/1/plan.</w:t>
       </w:r>
     </w:p>
     <w:p>
@@ -661,15 +367,7 @@
         <w:t>Middlewares</w:t>
       </w:r>
       <w:r>
-        <w:t xml:space="preserve"> revisan el JWT y confirman que es un </w:t>
-      </w:r>
-      <w:proofErr w:type="spellStart"/>
-      <w:r>
-        <w:t>Superadmin</w:t>
-      </w:r>
-      <w:proofErr w:type="spellEnd"/>
-      <w:r>
-        <w:t>.</w:t>
+        <w:t xml:space="preserve"> revisan el JWT y confirman que es un Superadmin.</w:t>
       </w:r>
     </w:p>
     <w:p>
@@ -687,15 +385,7 @@
         <w:t>Rutas</w:t>
       </w:r>
       <w:r>
-        <w:t xml:space="preserve"> lo envían a </w:t>
-      </w:r>
-      <w:proofErr w:type="spellStart"/>
-      <w:r>
-        <w:t>cambiarPlanTenant</w:t>
-      </w:r>
-      <w:proofErr w:type="spellEnd"/>
-      <w:r>
-        <w:t xml:space="preserve"> en el </w:t>
+        <w:t xml:space="preserve"> lo envían a cambiarPlanTenant en el </w:t>
       </w:r>
       <w:r>
         <w:rPr>
@@ -799,79 +489,37 @@
         <w:t>Socket.io</w:t>
       </w:r>
       <w:r>
-        <w:t xml:space="preserve"> y devuelve un 200 OK al </w:t>
-      </w:r>
-      <w:proofErr w:type="spellStart"/>
+        <w:t xml:space="preserve"> y devuelve un 200 OK al Frontend.</w:t>
+      </w:r>
+    </w:p>
+    <w:p/>
+    <w:p>
+      <w:pPr>
+        <w:pStyle w:val="Subttulo"/>
+      </w:pPr>
       <w:r>
         <w:t>Frontend</w:t>
       </w:r>
-      <w:proofErr w:type="spellEnd"/>
-      <w:r>
-        <w:t>.</w:t>
-      </w:r>
     </w:p>
     <w:p/>
     <w:p>
       <w:pPr>
-        <w:pStyle w:val="Subttulo"/>
-      </w:pPr>
-      <w:proofErr w:type="spellStart"/>
-      <w:r>
-        <w:t>Frontend</w:t>
-      </w:r>
-      <w:proofErr w:type="spellEnd"/>
-    </w:p>
-    <w:p/>
-    <w:p>
-      <w:pPr>
-        <w:rPr>
-          <w:b/>
-          <w:bCs/>
-        </w:rPr>
-      </w:pPr>
-      <w:r>
-        <w:rPr>
-          <w:b/>
-          <w:bCs/>
-        </w:rPr>
-        <w:t>1. El Motor y los Cimientos (</w:t>
-      </w:r>
-      <w:proofErr w:type="spellStart"/>
-      <w:r>
-        <w:rPr>
-          <w:b/>
-          <w:bCs/>
-        </w:rPr>
-        <w:t>package.json</w:t>
-      </w:r>
-      <w:proofErr w:type="spellEnd"/>
-      <w:r>
-        <w:rPr>
-          <w:b/>
-          <w:bCs/>
-        </w:rPr>
-        <w:t xml:space="preserve"> y Vite)</w:t>
-      </w:r>
-    </w:p>
-    <w:p>
-      <w:r>
-        <w:t xml:space="preserve">Tu proyecto utiliza un </w:t>
-      </w:r>
-      <w:proofErr w:type="spellStart"/>
-      <w:r>
-        <w:t>stack</w:t>
-      </w:r>
-      <w:proofErr w:type="spellEnd"/>
-      <w:r>
-        <w:t xml:space="preserve"> de última generación para el ecosistema </w:t>
-      </w:r>
-      <w:proofErr w:type="spellStart"/>
-      <w:r>
-        <w:t>React</w:t>
-      </w:r>
-      <w:proofErr w:type="spellEnd"/>
-      <w:r>
-        <w:t>:</w:t>
+        <w:rPr>
+          <w:b/>
+          <w:bCs/>
+        </w:rPr>
+      </w:pPr>
+      <w:r>
+        <w:rPr>
+          <w:b/>
+          <w:bCs/>
+        </w:rPr>
+        <w:t>1. El Motor y los Cimientos (package.json y Vite)</w:t>
+      </w:r>
+    </w:p>
+    <w:p>
+      <w:r>
+        <w:t>Tu proyecto utiliza un stack de última generación para el ecosistema React:</w:t>
       </w:r>
     </w:p>
     <w:p>
@@ -881,21 +529,12 @@
           <w:numId w:val="7"/>
         </w:numPr>
       </w:pPr>
-      <w:proofErr w:type="spellStart"/>
-      <w:r>
-        <w:rPr>
-          <w:b/>
-          <w:bCs/>
-        </w:rPr>
-        <w:t>React</w:t>
-      </w:r>
-      <w:proofErr w:type="spellEnd"/>
-      <w:r>
-        <w:rPr>
-          <w:b/>
-          <w:bCs/>
-        </w:rPr>
-        <w:t xml:space="preserve"> 19:</w:t>
+      <w:r>
+        <w:rPr>
+          <w:b/>
+          <w:bCs/>
+        </w:rPr>
+        <w:t>React 19:</w:t>
       </w:r>
       <w:r>
         <w:t xml:space="preserve"> Estás usando la versión más reciente, lo que te da acceso a las mejores optimizaciones de renderizado.</w:t>
@@ -916,23 +555,7 @@
         <w:t>Vite:</w:t>
       </w:r>
       <w:r>
-        <w:t xml:space="preserve"> Es tu empaquetador (</w:t>
-      </w:r>
-      <w:proofErr w:type="spellStart"/>
-      <w:r>
-        <w:t>bundler</w:t>
-      </w:r>
-      <w:proofErr w:type="spellEnd"/>
-      <w:r>
-        <w:t xml:space="preserve">). Reemplaza a herramientas antiguas como </w:t>
-      </w:r>
-      <w:proofErr w:type="spellStart"/>
-      <w:r>
-        <w:t>Webpack</w:t>
-      </w:r>
-      <w:proofErr w:type="spellEnd"/>
-      <w:r>
-        <w:t>, haciendo que tu entorno de desarrollo arranque en milisegundos y tus compilaciones para producción sean súper ligeras.</w:t>
+        <w:t xml:space="preserve"> Es tu empaquetador (bundler). Reemplaza a herramientas antiguas como Webpack, haciendo que tu entorno de desarrollo arranque en milisegundos y tus compilaciones para producción sean súper ligeras.</w:t>
       </w:r>
     </w:p>
     <w:p>
@@ -942,21 +565,12 @@
           <w:numId w:val="7"/>
         </w:numPr>
       </w:pPr>
-      <w:proofErr w:type="spellStart"/>
-      <w:r>
-        <w:rPr>
-          <w:b/>
-          <w:bCs/>
-        </w:rPr>
-        <w:t>Tailwind</w:t>
-      </w:r>
-      <w:proofErr w:type="spellEnd"/>
-      <w:r>
-        <w:rPr>
-          <w:b/>
-          <w:bCs/>
-        </w:rPr>
-        <w:t xml:space="preserve"> CSS:</w:t>
+      <w:r>
+        <w:rPr>
+          <w:b/>
+          <w:bCs/>
+        </w:rPr>
+        <w:t>Tailwind CSS:</w:t>
       </w:r>
       <w:r>
         <w:t xml:space="preserve"> Todo tu diseño visual (sombras, gradientes, bordes redondeados) se maneja a través de clases utilitarias directamente en el HTML/TSX, lo que permite un desarrollo muy ágil sin tener que saltar entre archivos CSS.</w:t>
@@ -974,23 +588,7 @@
           <w:b/>
           <w:bCs/>
         </w:rPr>
-        <w:t xml:space="preserve">2. El Punto de Entrada (index.html y </w:t>
-      </w:r>
-      <w:proofErr w:type="spellStart"/>
-      <w:r>
-        <w:rPr>
-          <w:b/>
-          <w:bCs/>
-        </w:rPr>
-        <w:t>App.tsx</w:t>
-      </w:r>
-      <w:proofErr w:type="spellEnd"/>
-      <w:r>
-        <w:rPr>
-          <w:b/>
-          <w:bCs/>
-        </w:rPr>
-        <w:t>)</w:t>
+        <w:t>2. El Punto de Entrada (index.html y App.tsx)</w:t>
       </w:r>
     </w:p>
     <w:p>
@@ -1006,31 +604,7 @@
         </w:numPr>
       </w:pPr>
       <w:r>
-        <w:t>Este archivo contiene un simple &lt;</w:t>
-      </w:r>
-      <w:proofErr w:type="spellStart"/>
-      <w:r>
-        <w:t>div</w:t>
-      </w:r>
-      <w:proofErr w:type="spellEnd"/>
-      <w:r>
-        <w:t xml:space="preserve"> id="</w:t>
-      </w:r>
-      <w:proofErr w:type="spellStart"/>
-      <w:r>
-        <w:t>root</w:t>
-      </w:r>
-      <w:proofErr w:type="spellEnd"/>
-      <w:r>
-        <w:t>"&gt;&lt;/</w:t>
-      </w:r>
-      <w:proofErr w:type="spellStart"/>
-      <w:r>
-        <w:t>div</w:t>
-      </w:r>
-      <w:proofErr w:type="spellEnd"/>
-      <w:r>
-        <w:t>&gt; y enlaza las fuentes de iconos (Material Symbols).</w:t>
+        <w:t>Este archivo contiene un simple &lt;div id="root"&gt;&lt;/div&gt; y enlaza las fuentes de iconos (Material Symbols).</w:t>
       </w:r>
     </w:p>
     <w:p>
@@ -1041,39 +615,7 @@
         </w:numPr>
       </w:pPr>
       <w:r>
-        <w:t xml:space="preserve">Inmediatamente después, ejecuta tu código </w:t>
-      </w:r>
-      <w:proofErr w:type="spellStart"/>
-      <w:r>
-        <w:t>TypeScript</w:t>
-      </w:r>
-      <w:proofErr w:type="spellEnd"/>
-      <w:r>
-        <w:t xml:space="preserve"> (a través de </w:t>
-      </w:r>
-      <w:proofErr w:type="spellStart"/>
-      <w:r>
-        <w:t>main.tsx</w:t>
-      </w:r>
-      <w:proofErr w:type="spellEnd"/>
-      <w:r>
-        <w:t xml:space="preserve">), que inyecta toda la aplicación </w:t>
-      </w:r>
-      <w:proofErr w:type="spellStart"/>
-      <w:r>
-        <w:t>React</w:t>
-      </w:r>
-      <w:proofErr w:type="spellEnd"/>
-      <w:r>
-        <w:t xml:space="preserve"> dentro de ese </w:t>
-      </w:r>
-      <w:proofErr w:type="spellStart"/>
-      <w:r>
-        <w:t>div</w:t>
-      </w:r>
-      <w:proofErr w:type="spellEnd"/>
-      <w:r>
-        <w:t xml:space="preserve"> vacío.</w:t>
+        <w:t>Inmediatamente después, ejecuta tu código TypeScript (a través de main.tsx), que inyecta toda la aplicación React dentro de ese div vacío.</w:t>
       </w:r>
     </w:p>
     <w:p>
@@ -1083,57 +625,28 @@
           <w:numId w:val="8"/>
         </w:numPr>
       </w:pPr>
-      <w:proofErr w:type="spellStart"/>
-      <w:r>
-        <w:t>App.tsx</w:t>
-      </w:r>
-      <w:proofErr w:type="spellEnd"/>
-      <w:r>
-        <w:t xml:space="preserve"> actúa como el contenedor principal que simplemente renderiza tu sistema de rutas.</w:t>
-      </w:r>
-    </w:p>
-    <w:p>
-      <w:pPr>
-        <w:rPr>
-          <w:b/>
-          <w:bCs/>
-        </w:rPr>
-      </w:pPr>
-      <w:r>
-        <w:rPr>
-          <w:b/>
-          <w:bCs/>
-        </w:rPr>
-        <w:t>3. El Corazón de la Seguridad: Estado Global (</w:t>
-      </w:r>
-      <w:proofErr w:type="spellStart"/>
-      <w:r>
-        <w:rPr>
-          <w:b/>
-          <w:bCs/>
-        </w:rPr>
-        <w:t>AuthContext.tsx</w:t>
-      </w:r>
-      <w:proofErr w:type="spellEnd"/>
-      <w:r>
-        <w:rPr>
-          <w:b/>
-          <w:bCs/>
-        </w:rPr>
-        <w:t>)</w:t>
-      </w:r>
-    </w:p>
-    <w:p>
-      <w:r>
-        <w:t xml:space="preserve">Este es uno de los archivos más importantes de tu </w:t>
-      </w:r>
-      <w:proofErr w:type="spellStart"/>
-      <w:r>
-        <w:t>frontend</w:t>
-      </w:r>
-      <w:proofErr w:type="spellEnd"/>
-      <w:r>
-        <w:t xml:space="preserve">. Funciona como la "memoria" global de tu aplicación respecto a quién está usando el sistema. * </w:t>
+      <w:r>
+        <w:t>App.tsx actúa como el contenedor principal que simplemente renderiza tu sistema de rutas.</w:t>
+      </w:r>
+    </w:p>
+    <w:p>
+      <w:pPr>
+        <w:rPr>
+          <w:b/>
+          <w:bCs/>
+        </w:rPr>
+      </w:pPr>
+      <w:r>
+        <w:rPr>
+          <w:b/>
+          <w:bCs/>
+        </w:rPr>
+        <w:t>3. El Corazón de la Seguridad: Estado Global (AuthContext.tsx)</w:t>
+      </w:r>
+    </w:p>
+    <w:p>
+      <w:r>
+        <w:t xml:space="preserve">Este es uno de los archivos más importantes de tu frontend. Funciona como la "memoria" global de tu aplicación respecto a quién está usando el sistema. * </w:t>
       </w:r>
       <w:r>
         <w:rPr>
@@ -1143,23 +656,7 @@
         <w:t>Persistencia:</w:t>
       </w:r>
       <w:r>
-        <w:t xml:space="preserve"> Cuando un usuario inicia sesión, guardas su token (el JWT que configuramos en el </w:t>
-      </w:r>
-      <w:proofErr w:type="spellStart"/>
-      <w:r>
-        <w:t>backend</w:t>
-      </w:r>
-      <w:proofErr w:type="spellEnd"/>
-      <w:r>
-        <w:t xml:space="preserve">) y sus datos en el </w:t>
-      </w:r>
-      <w:proofErr w:type="spellStart"/>
-      <w:r>
-        <w:t>localStorage</w:t>
-      </w:r>
-      <w:proofErr w:type="spellEnd"/>
-      <w:r>
-        <w:t xml:space="preserve"> del navegador. Esto asegura que si el usuario recarga la página, no pierda su sesión.</w:t>
+        <w:t xml:space="preserve"> Cuando un usuario inicia sesión, guardas su token (el JWT que configuramos en el backend) y sus datos en el localStorage del navegador. Esto asegura que si el usuario recarga la página, no pierda su sesión.</w:t>
       </w:r>
     </w:p>
     <w:p>
@@ -1178,436 +675,194 @@
         <w:t>Distribución:</w:t>
       </w:r>
       <w:r>
-        <w:t xml:space="preserve"> A través del </w:t>
-      </w:r>
-      <w:proofErr w:type="spellStart"/>
-      <w:r>
-        <w:t>hook</w:t>
-      </w:r>
-      <w:proofErr w:type="spellEnd"/>
-      <w:r>
-        <w:t xml:space="preserve"> </w:t>
-      </w:r>
-      <w:proofErr w:type="spellStart"/>
-      <w:r>
-        <w:t>useAuth</w:t>
-      </w:r>
-      <w:proofErr w:type="spellEnd"/>
-      <w:r>
-        <w:t xml:space="preserve">(), cualquier componente de tu aplicación (como el </w:t>
-      </w:r>
-      <w:proofErr w:type="spellStart"/>
-      <w:r>
-        <w:t>Navbar</w:t>
-      </w:r>
-      <w:proofErr w:type="spellEnd"/>
-      <w:r>
-        <w:t xml:space="preserve"> o el </w:t>
-      </w:r>
-      <w:proofErr w:type="spellStart"/>
-      <w:r>
-        <w:t>Dashboard</w:t>
-      </w:r>
-      <w:proofErr w:type="spellEnd"/>
-      <w:r>
-        <w:t xml:space="preserve">) puede preguntar instantáneamente: </w:t>
+        <w:t xml:space="preserve"> A través del hook useAuth(), cualquier componente de tu aplicación (como el Navbar o el Dashboard) puede preguntar instantáneamente: </w:t>
       </w:r>
       <w:r>
         <w:rPr>
           <w:i/>
           <w:iCs/>
         </w:rPr>
-        <w:t xml:space="preserve">"¿Hay alguien </w:t>
-      </w:r>
-      <w:proofErr w:type="spellStart"/>
+        <w:t>"¿Hay alguien logueado? ¿Quién es y cuál es su token?"</w:t>
+      </w:r>
+      <w:r>
+        <w:t>, sin tener que pasarse esa información manualmente de componente en componente.</w:t>
+      </w:r>
+    </w:p>
+    <w:p>
+      <w:pPr>
+        <w:rPr>
+          <w:b/>
+          <w:bCs/>
+        </w:rPr>
+      </w:pPr>
+      <w:r>
+        <w:rPr>
+          <w:b/>
+          <w:bCs/>
+        </w:rPr>
+        <w:t>4. El Controlador de Tráfico (AppRoutes.tsx)</w:t>
+      </w:r>
+    </w:p>
+    <w:p>
+      <w:r>
+        <w:t>Este archivo decide qué pantalla debe ver el usuario dependiendo de la URL en la que se encuentre.</w:t>
+      </w:r>
+    </w:p>
+    <w:p>
+      <w:pPr>
+        <w:numPr>
+          <w:ilvl w:val="0"/>
+          <w:numId w:val="10"/>
+        </w:numPr>
+      </w:pPr>
+      <w:r>
+        <w:rPr>
+          <w:b/>
+          <w:bCs/>
+        </w:rPr>
+        <w:t>Rutas Públicas:</w:t>
+      </w:r>
+      <w:r>
+        <w:t xml:space="preserve"> Cualquiera puede entrar a / (LandingPage) para ver tu propuesta comercial, o a /login (LoginPage) para intentar acceder.</w:t>
+      </w:r>
+    </w:p>
+    <w:p>
+      <w:pPr>
+        <w:numPr>
+          <w:ilvl w:val="0"/>
+          <w:numId w:val="10"/>
+        </w:numPr>
+      </w:pPr>
+      <w:r>
+        <w:rPr>
+          <w:b/>
+          <w:bCs/>
+        </w:rPr>
+        <w:t>Rutas Protegidas:</w:t>
+      </w:r>
+      <w:r>
+        <w:t xml:space="preserve"> Tienes una barrera inteligente (&lt;ProtectedRoute /&gt;). Si alguien intenta escribir /dashboard en la URL sin haber iniciado sesión, este componente lo detectará y lo expulsará (probablemente redirigiéndolo al login).</w:t>
+      </w:r>
+    </w:p>
+    <w:p>
+      <w:pPr>
+        <w:rPr>
+          <w:b/>
+          <w:bCs/>
+        </w:rPr>
+      </w:pPr>
+      <w:r>
+        <w:rPr>
+          <w:b/>
+          <w:bCs/>
+        </w:rPr>
+        <w:t>5. La Puerta de Enlace (LoginPage.tsx)</w:t>
+      </w:r>
+    </w:p>
+    <w:p>
+      <w:r>
+        <w:t>Cuando el usuario ingresa su correo y contraseña:</w:t>
+      </w:r>
+    </w:p>
+    <w:p>
+      <w:pPr>
+        <w:numPr>
+          <w:ilvl w:val="0"/>
+          <w:numId w:val="11"/>
+        </w:numPr>
+      </w:pPr>
+      <w:r>
+        <w:t>Interceptas el formulario (handleSubmit) y envías una petición POST a tu backend (/api/auth/login).</w:t>
+      </w:r>
+    </w:p>
+    <w:p>
+      <w:pPr>
+        <w:numPr>
+          <w:ilvl w:val="0"/>
+          <w:numId w:val="11"/>
+        </w:numPr>
+      </w:pPr>
+      <w:r>
+        <w:t>Si el backend responde que las credenciales son válidas y devuelve el JWT, ejecutas la función login() de tu AuthContext.</w:t>
+      </w:r>
+    </w:p>
+    <w:p>
+      <w:pPr>
+        <w:numPr>
+          <w:ilvl w:val="0"/>
+          <w:numId w:val="11"/>
+        </w:numPr>
+      </w:pPr>
+      <w:r>
+        <w:t>El contexto guarda el token y automáticamente te redirige a la vista privada.</w:t>
+      </w:r>
+    </w:p>
+    <w:p>
+      <w:pPr>
+        <w:rPr>
+          <w:b/>
+          <w:bCs/>
+        </w:rPr>
+      </w:pPr>
+      <w:r>
+        <w:rPr>
+          <w:b/>
+          <w:bCs/>
+        </w:rPr>
+        <w:t>6. El Centro de Operaciones (DashboardPage.tsx)</w:t>
+      </w:r>
+    </w:p>
+    <w:p>
+      <w:r>
+        <w:t>Esta es tu pantalla principal y donde ocurre la magia de la gestión de clientes.</w:t>
+      </w:r>
+    </w:p>
+    <w:p>
+      <w:pPr>
+        <w:numPr>
+          <w:ilvl w:val="0"/>
+          <w:numId w:val="12"/>
+        </w:numPr>
+      </w:pPr>
+      <w:r>
+        <w:rPr>
+          <w:b/>
+          <w:bCs/>
+        </w:rPr>
+        <w:t>Autenticación en cada petición:</w:t>
+      </w:r>
+      <w:r>
+        <w:t xml:space="preserve"> Fíjate cómo en cada llamada fetch (para traer los </w:t>
+      </w:r>
       <w:r>
         <w:rPr>
           <w:i/>
           <w:iCs/>
         </w:rPr>
-        <w:t>logueado</w:t>
-      </w:r>
-      <w:proofErr w:type="spellEnd"/>
+        <w:t>tenants</w:t>
+      </w:r>
+      <w:r>
+        <w:t xml:space="preserve">, los </w:t>
+      </w:r>
       <w:r>
         <w:rPr>
           <w:i/>
           <w:iCs/>
         </w:rPr>
-        <w:t>? ¿Quién es y cuál es su token?"</w:t>
-      </w:r>
-      <w:r>
-        <w:t>, sin tener que pasarse esa información manualmente de componente en componente.</w:t>
-      </w:r>
-    </w:p>
-    <w:p>
-      <w:pPr>
-        <w:rPr>
-          <w:b/>
-          <w:bCs/>
-        </w:rPr>
-      </w:pPr>
-      <w:r>
-        <w:rPr>
-          <w:b/>
-          <w:bCs/>
-        </w:rPr>
-        <w:t>4. El Controlador de Tráfico (</w:t>
-      </w:r>
-      <w:proofErr w:type="spellStart"/>
-      <w:r>
-        <w:rPr>
-          <w:b/>
-          <w:bCs/>
-        </w:rPr>
-        <w:t>AppRoutes.tsx</w:t>
-      </w:r>
-      <w:proofErr w:type="spellEnd"/>
-      <w:r>
-        <w:rPr>
-          <w:b/>
-          <w:bCs/>
-        </w:rPr>
-        <w:t>)</w:t>
-      </w:r>
-    </w:p>
-    <w:p>
-      <w:r>
-        <w:t>Este archivo decide qué pantalla debe ver el usuario dependiendo de la URL en la que se encuentre.</w:t>
-      </w:r>
-    </w:p>
-    <w:p>
-      <w:pPr>
-        <w:numPr>
-          <w:ilvl w:val="0"/>
-          <w:numId w:val="10"/>
-        </w:numPr>
-      </w:pPr>
-      <w:r>
-        <w:rPr>
-          <w:b/>
-          <w:bCs/>
-        </w:rPr>
-        <w:t>Rutas Públicas:</w:t>
-      </w:r>
-      <w:r>
-        <w:t xml:space="preserve"> Cualquiera puede entrar a / (</w:t>
-      </w:r>
-      <w:proofErr w:type="spellStart"/>
-      <w:r>
-        <w:t>LandingPage</w:t>
-      </w:r>
-      <w:proofErr w:type="spellEnd"/>
-      <w:r>
-        <w:t>) para ver tu propuesta comercial, o a /</w:t>
-      </w:r>
-      <w:proofErr w:type="spellStart"/>
-      <w:r>
-        <w:t>login</w:t>
-      </w:r>
-      <w:proofErr w:type="spellEnd"/>
-      <w:r>
-        <w:t xml:space="preserve"> (</w:t>
-      </w:r>
-      <w:proofErr w:type="spellStart"/>
-      <w:r>
-        <w:t>LoginPage</w:t>
-      </w:r>
-      <w:proofErr w:type="spellEnd"/>
-      <w:r>
-        <w:t>) para intentar acceder.</w:t>
-      </w:r>
-    </w:p>
-    <w:p>
-      <w:pPr>
-        <w:numPr>
-          <w:ilvl w:val="0"/>
-          <w:numId w:val="10"/>
-        </w:numPr>
-      </w:pPr>
-      <w:r>
-        <w:rPr>
-          <w:b/>
-          <w:bCs/>
-        </w:rPr>
-        <w:t>Rutas Protegidas:</w:t>
-      </w:r>
-      <w:r>
-        <w:t xml:space="preserve"> Tienes una barrera inteligente (&lt;</w:t>
-      </w:r>
-      <w:proofErr w:type="spellStart"/>
-      <w:r>
-        <w:t>ProtectedRoute</w:t>
-      </w:r>
-      <w:proofErr w:type="spellEnd"/>
-      <w:r>
-        <w:t xml:space="preserve"> /&gt;). Si alguien intenta escribir /</w:t>
-      </w:r>
-      <w:proofErr w:type="spellStart"/>
-      <w:r>
-        <w:t>dashboard</w:t>
-      </w:r>
-      <w:proofErr w:type="spellEnd"/>
-      <w:r>
-        <w:t xml:space="preserve"> en la URL sin haber iniciado sesión, este componente lo detectará y lo expulsará (probablemente redirigiéndolo al </w:t>
-      </w:r>
-      <w:proofErr w:type="spellStart"/>
-      <w:r>
-        <w:t>login</w:t>
-      </w:r>
-      <w:proofErr w:type="spellEnd"/>
-      <w:r>
-        <w:t>).</w:t>
-      </w:r>
-    </w:p>
-    <w:p>
-      <w:pPr>
-        <w:rPr>
-          <w:b/>
-          <w:bCs/>
-        </w:rPr>
-      </w:pPr>
-      <w:r>
-        <w:rPr>
-          <w:b/>
-          <w:bCs/>
-        </w:rPr>
-        <w:t>5. La Puerta de Enlace (</w:t>
-      </w:r>
-      <w:proofErr w:type="spellStart"/>
-      <w:r>
-        <w:rPr>
-          <w:b/>
-          <w:bCs/>
-        </w:rPr>
-        <w:t>LoginPage.tsx</w:t>
-      </w:r>
-      <w:proofErr w:type="spellEnd"/>
-      <w:r>
-        <w:rPr>
-          <w:b/>
-          <w:bCs/>
-        </w:rPr>
-        <w:t>)</w:t>
-      </w:r>
-    </w:p>
-    <w:p>
-      <w:r>
-        <w:t>Cuando el usuario ingresa su correo y contraseña:</w:t>
-      </w:r>
-    </w:p>
-    <w:p>
-      <w:pPr>
-        <w:numPr>
-          <w:ilvl w:val="0"/>
-          <w:numId w:val="11"/>
-        </w:numPr>
-      </w:pPr>
-      <w:r>
-        <w:t>Interceptas el formulario (</w:t>
-      </w:r>
-      <w:proofErr w:type="spellStart"/>
-      <w:r>
-        <w:t>handleSubmit</w:t>
-      </w:r>
-      <w:proofErr w:type="spellEnd"/>
-      <w:r>
-        <w:t xml:space="preserve">) y envías una petición POST a tu </w:t>
-      </w:r>
-      <w:proofErr w:type="spellStart"/>
-      <w:r>
-        <w:t>backend</w:t>
-      </w:r>
-      <w:proofErr w:type="spellEnd"/>
-      <w:r>
-        <w:t xml:space="preserve"> (/api/</w:t>
-      </w:r>
-      <w:proofErr w:type="spellStart"/>
-      <w:r>
-        <w:t>auth</w:t>
-      </w:r>
-      <w:proofErr w:type="spellEnd"/>
-      <w:r>
-        <w:t>/</w:t>
-      </w:r>
-      <w:proofErr w:type="spellStart"/>
-      <w:r>
-        <w:t>login</w:t>
-      </w:r>
-      <w:proofErr w:type="spellEnd"/>
-      <w:r>
-        <w:t>).</w:t>
-      </w:r>
-    </w:p>
-    <w:p>
-      <w:pPr>
-        <w:numPr>
-          <w:ilvl w:val="0"/>
-          <w:numId w:val="11"/>
-        </w:numPr>
-      </w:pPr>
-      <w:r>
-        <w:t xml:space="preserve">Si el </w:t>
-      </w:r>
-      <w:proofErr w:type="spellStart"/>
-      <w:r>
-        <w:t>backend</w:t>
-      </w:r>
-      <w:proofErr w:type="spellEnd"/>
-      <w:r>
-        <w:t xml:space="preserve"> responde que las credenciales son válidas y devuelve el JWT, ejecutas la función </w:t>
-      </w:r>
-      <w:proofErr w:type="spellStart"/>
-      <w:r>
-        <w:t>login</w:t>
-      </w:r>
-      <w:proofErr w:type="spellEnd"/>
-      <w:r>
-        <w:t xml:space="preserve">() de tu </w:t>
-      </w:r>
-      <w:proofErr w:type="spellStart"/>
-      <w:r>
-        <w:t>AuthContext</w:t>
-      </w:r>
-      <w:proofErr w:type="spellEnd"/>
-      <w:r>
-        <w:t>.</w:t>
-      </w:r>
-    </w:p>
-    <w:p>
-      <w:pPr>
-        <w:numPr>
-          <w:ilvl w:val="0"/>
-          <w:numId w:val="11"/>
-        </w:numPr>
-      </w:pPr>
-      <w:r>
-        <w:t>El contexto guarda el token y automáticamente te redirige a la vista privada.</w:t>
-      </w:r>
-    </w:p>
-    <w:p>
-      <w:pPr>
-        <w:rPr>
-          <w:b/>
-          <w:bCs/>
-        </w:rPr>
-      </w:pPr>
-      <w:r>
-        <w:rPr>
-          <w:b/>
-          <w:bCs/>
-        </w:rPr>
-        <w:t>6. El Centro de Operaciones (</w:t>
-      </w:r>
-      <w:proofErr w:type="spellStart"/>
-      <w:r>
-        <w:rPr>
-          <w:b/>
-          <w:bCs/>
-        </w:rPr>
-        <w:t>DashboardPage.tsx</w:t>
-      </w:r>
-      <w:proofErr w:type="spellEnd"/>
-      <w:r>
-        <w:rPr>
-          <w:b/>
-          <w:bCs/>
-        </w:rPr>
-        <w:t>)</w:t>
-      </w:r>
-    </w:p>
-    <w:p>
-      <w:r>
-        <w:t>Esta es tu pantalla principal y donde ocurre la magia de la gestión de clientes.</w:t>
-      </w:r>
-    </w:p>
-    <w:p>
-      <w:pPr>
-        <w:numPr>
-          <w:ilvl w:val="0"/>
-          <w:numId w:val="12"/>
-        </w:numPr>
-      </w:pPr>
-      <w:r>
-        <w:rPr>
-          <w:b/>
-          <w:bCs/>
-        </w:rPr>
-        <w:t>Autenticación en cada petición:</w:t>
-      </w:r>
-      <w:r>
-        <w:t xml:space="preserve"> Fíjate cómo en cada llamada </w:t>
-      </w:r>
-      <w:proofErr w:type="spellStart"/>
-      <w:r>
-        <w:t>fetch</w:t>
-      </w:r>
-      <w:proofErr w:type="spellEnd"/>
-      <w:r>
-        <w:t xml:space="preserve"> (para traer los </w:t>
-      </w:r>
-      <w:proofErr w:type="spellStart"/>
+        <w:t>planes</w:t>
+      </w:r>
+      <w:r>
+        <w:t xml:space="preserve"> o el </w:t>
+      </w:r>
       <w:r>
         <w:rPr>
           <w:i/>
           <w:iCs/>
         </w:rPr>
-        <w:t>tenants</w:t>
-      </w:r>
-      <w:proofErr w:type="spellEnd"/>
-      <w:r>
-        <w:t xml:space="preserve">, los </w:t>
-      </w:r>
-      <w:r>
-        <w:rPr>
-          <w:i/>
-          <w:iCs/>
-        </w:rPr>
-        <w:t>planes</w:t>
-      </w:r>
-      <w:r>
-        <w:t xml:space="preserve"> o el </w:t>
-      </w:r>
-      <w:r>
-        <w:rPr>
-          <w:i/>
-          <w:iCs/>
-        </w:rPr>
         <w:t>historial</w:t>
       </w:r>
       <w:r>
-        <w:t xml:space="preserve">), estás adjuntando el token en los encabezados: </w:t>
-      </w:r>
-      <w:proofErr w:type="spellStart"/>
-      <w:r>
-        <w:t>headers</w:t>
-      </w:r>
-      <w:proofErr w:type="spellEnd"/>
-      <w:r>
-        <w:t>: { "</w:t>
-      </w:r>
-      <w:proofErr w:type="spellStart"/>
-      <w:r>
-        <w:t>Authorization</w:t>
-      </w:r>
-      <w:proofErr w:type="spellEnd"/>
-      <w:r>
-        <w:t xml:space="preserve">": "Bearer ${token}" }. Esto es lo que permite que el middleware </w:t>
-      </w:r>
-      <w:proofErr w:type="spellStart"/>
-      <w:r>
-        <w:t>verifyToken</w:t>
-      </w:r>
-      <w:proofErr w:type="spellEnd"/>
-      <w:r>
-        <w:t xml:space="preserve"> de tu </w:t>
-      </w:r>
-      <w:proofErr w:type="spellStart"/>
-      <w:r>
-        <w:t>backend</w:t>
-      </w:r>
-      <w:proofErr w:type="spellEnd"/>
-      <w:r>
-        <w:t xml:space="preserve"> te deje pasar.</w:t>
+        <w:t>), estás adjuntando el token en los encabezados: headers: { "Authorization": "Bearer ${token}" }. Esto es lo que permite que el middleware verifyToken de tu backend te deje pasar.</w:t>
       </w:r>
     </w:p>
     <w:p>
@@ -1625,15 +880,7 @@
         <w:t>Gestión de Modales:</w:t>
       </w:r>
       <w:r>
-        <w:t xml:space="preserve"> En lugar de crear páginas distintas para editar, cambiar de plan o ver el historial, tienes ventanas emergentes (Modales). Tienes un estado (</w:t>
-      </w:r>
-      <w:proofErr w:type="spellStart"/>
-      <w:r>
-        <w:t>selectedTenant</w:t>
-      </w:r>
-      <w:proofErr w:type="spellEnd"/>
-      <w:r>
-        <w:t>) que "recuerda" a qué comunidad le hiciste clic, y se lo pasa al modal correspondiente para que sepa sobre qué datos operar.</w:t>
+        <w:t xml:space="preserve"> En lugar de crear páginas distintas para editar, cambiar de plan o ver el historial, tienes ventanas emergentes (Modales). Tienes un estado (selectedTenant) que "recuerda" a qué comunidad le hiciste clic, y se lo pasa al modal correspondiente para que sepa sobre qué datos operar.</w:t>
       </w:r>
     </w:p>
     <w:p>
@@ -1652,39 +899,7 @@
         <w:t>Actualización Reactiva:</w:t>
       </w:r>
       <w:r>
-        <w:t xml:space="preserve"> Cuando completas una acción en un modal (por ejemplo, </w:t>
-      </w:r>
-      <w:proofErr w:type="spellStart"/>
-      <w:r>
-        <w:t>handleConfirmStatus</w:t>
-      </w:r>
-      <w:proofErr w:type="spellEnd"/>
-      <w:r>
-        <w:t xml:space="preserve">), envías la petición al </w:t>
-      </w:r>
-      <w:proofErr w:type="spellStart"/>
-      <w:r>
-        <w:t>backend</w:t>
-      </w:r>
-      <w:proofErr w:type="spellEnd"/>
-      <w:r>
-        <w:t xml:space="preserve">. Si el </w:t>
-      </w:r>
-      <w:proofErr w:type="spellStart"/>
-      <w:r>
-        <w:t>backend</w:t>
-      </w:r>
-      <w:proofErr w:type="spellEnd"/>
-      <w:r>
-        <w:t xml:space="preserve"> dice "OK", cierras el modal y vuelves a ejecutar </w:t>
-      </w:r>
-      <w:proofErr w:type="spellStart"/>
-      <w:r>
-        <w:t>fetchTenants</w:t>
-      </w:r>
-      <w:proofErr w:type="spellEnd"/>
-      <w:r>
-        <w:t>(), lo que recarga la tabla instantáneamente para reflejar el cambio.</w:t>
+        <w:t xml:space="preserve"> Cuando completas una acción en un modal (por ejemplo, handleConfirmStatus), envías la petición al backend. Si el backend dice "OK", cierras el modal y vuelves a ejecutar fetchTenants(), lo que recarga la tabla instantáneamente para reflejar el cambio.</w:t>
       </w:r>
     </w:p>
     <w:p/>
@@ -1692,41 +907,23 @@
       <w:pPr>
         <w:pStyle w:val="Subttulo"/>
       </w:pPr>
-      <w:proofErr w:type="spellStart"/>
       <w:r>
         <w:t>Typescript</w:t>
       </w:r>
-      <w:proofErr w:type="spellEnd"/>
-    </w:p>
-    <w:p>
-      <w:pPr>
-        <w:rPr>
-          <w:b/>
-          <w:bCs/>
-        </w:rPr>
-      </w:pPr>
-      <w:r>
-        <w:rPr>
-          <w:b/>
-          <w:bCs/>
-        </w:rPr>
-        <w:t xml:space="preserve">1. La Configuración Base de </w:t>
-      </w:r>
-      <w:proofErr w:type="spellStart"/>
-      <w:r>
-        <w:rPr>
-          <w:b/>
-          <w:bCs/>
-        </w:rPr>
-        <w:t>TypeScript</w:t>
-      </w:r>
-      <w:proofErr w:type="spellEnd"/>
-      <w:r>
-        <w:rPr>
-          <w:b/>
-          <w:bCs/>
-        </w:rPr>
-        <w:t xml:space="preserve"> (El Guardián)</w:t>
+    </w:p>
+    <w:p>
+      <w:pPr>
+        <w:rPr>
+          <w:b/>
+          <w:bCs/>
+        </w:rPr>
+      </w:pPr>
+      <w:r>
+        <w:rPr>
+          <w:b/>
+          <w:bCs/>
+        </w:rPr>
+        <w:t>1. La Configuración Base de TypeScript (El Guardián)</w:t>
       </w:r>
     </w:p>
     <w:p>
@@ -1744,47 +941,7 @@
         <w:t>Archivos de configuración:</w:t>
       </w:r>
       <w:r>
-        <w:t xml:space="preserve"> Tienes un archivo </w:t>
-      </w:r>
-      <w:proofErr w:type="spellStart"/>
-      <w:r>
-        <w:t>tsconfig.json</w:t>
-      </w:r>
-      <w:proofErr w:type="spellEnd"/>
-      <w:r>
-        <w:t xml:space="preserve"> en tu </w:t>
-      </w:r>
-      <w:proofErr w:type="spellStart"/>
-      <w:r>
-        <w:t>backend</w:t>
-      </w:r>
-      <w:proofErr w:type="spellEnd"/>
-      <w:r>
-        <w:t xml:space="preserve"> (y probablemente otro en el </w:t>
-      </w:r>
-      <w:proofErr w:type="spellStart"/>
-      <w:r>
-        <w:t>frontend</w:t>
-      </w:r>
-      <w:proofErr w:type="spellEnd"/>
-      <w:r>
-        <w:t xml:space="preserve"> generado por Vite) que le dice al compilador cómo leer tu código. En el </w:t>
-      </w:r>
-      <w:proofErr w:type="spellStart"/>
-      <w:r>
-        <w:t>backend</w:t>
-      </w:r>
-      <w:proofErr w:type="spellEnd"/>
-      <w:r>
-        <w:t>, por ejemplo, le indicas que lea la carpeta completa mediante "</w:t>
-      </w:r>
-      <w:proofErr w:type="spellStart"/>
-      <w:r>
-        <w:t>src</w:t>
-      </w:r>
-      <w:proofErr w:type="spellEnd"/>
-      <w:r>
-        <w:t>//*".</w:t>
+        <w:t xml:space="preserve"> Tienes un archivo tsconfig.json en tu backend (y probablemente otro en el frontend generado por Vite) que le dice al compilador cómo leer tu código. En el backend, por ejemplo, le indicas que lea la carpeta completa mediante "src//*".</w:t>
       </w:r>
     </w:p>
     <w:p>
@@ -1799,82 +956,10 @@
           <w:b/>
           <w:bCs/>
         </w:rPr>
-        <w:t>Tipos Personalizados (</w:t>
-      </w:r>
-      <w:proofErr w:type="spellStart"/>
-      <w:r>
-        <w:rPr>
-          <w:b/>
-          <w:bCs/>
-        </w:rPr>
-        <w:t>src</w:t>
-      </w:r>
-      <w:proofErr w:type="spellEnd"/>
-      <w:r>
-        <w:rPr>
-          <w:b/>
-          <w:bCs/>
-        </w:rPr>
-        <w:t>/</w:t>
-      </w:r>
-      <w:proofErr w:type="spellStart"/>
-      <w:r>
-        <w:rPr>
-          <w:b/>
-          <w:bCs/>
-        </w:rPr>
-        <w:t>types</w:t>
-      </w:r>
-      <w:proofErr w:type="spellEnd"/>
-      <w:r>
-        <w:rPr>
-          <w:b/>
-          <w:bCs/>
-        </w:rPr>
-        <w:t>/</w:t>
-      </w:r>
-      <w:proofErr w:type="spellStart"/>
-      <w:r>
-        <w:rPr>
-          <w:b/>
-          <w:bCs/>
-        </w:rPr>
-        <w:t>express.d.ts</w:t>
-      </w:r>
-      <w:proofErr w:type="spellEnd"/>
-      <w:r>
-        <w:rPr>
-          <w:b/>
-          <w:bCs/>
-        </w:rPr>
-        <w:t>):</w:t>
-      </w:r>
-      <w:r>
-        <w:t xml:space="preserve"> Para evitar usar el peligroso y genérico </w:t>
-      </w:r>
-      <w:proofErr w:type="spellStart"/>
-      <w:r>
-        <w:t>any</w:t>
-      </w:r>
-      <w:proofErr w:type="spellEnd"/>
-      <w:r>
-        <w:t xml:space="preserve">, creamos declaraciones de tipos personalizadas. Esto le enseñó a </w:t>
-      </w:r>
-      <w:proofErr w:type="spellStart"/>
-      <w:r>
-        <w:t>TypeScript</w:t>
-      </w:r>
-      <w:proofErr w:type="spellEnd"/>
-      <w:r>
-        <w:t xml:space="preserve"> (y a tu editor de código) que cuando usas </w:t>
-      </w:r>
-      <w:proofErr w:type="spellStart"/>
-      <w:r>
-        <w:t>req.user</w:t>
-      </w:r>
-      <w:proofErr w:type="spellEnd"/>
-      <w:r>
-        <w:t xml:space="preserve"> dentro de Express, este contiene datos específicos como el ID y el rol, activando el autocompletado seguro.</w:t>
+        <w:t>Tipos Personalizados (src/types/express.d.ts):</w:t>
+      </w:r>
+      <w:r>
+        <w:t xml:space="preserve"> Para evitar usar el peligroso y genérico any, creamos declaraciones de tipos personalizadas. Esto le enseñó a TypeScript (y a tu editor de código) que cuando usas req.user dentro de Express, este contiene datos específicos como el ID y el rol, activando el autocompletado seguro.</w:t>
       </w:r>
     </w:p>
     <w:p>
@@ -1921,40 +1006,15 @@
           <w:numId w:val="14"/>
         </w:numPr>
       </w:pPr>
-      <w:proofErr w:type="spellStart"/>
-      <w:r>
-        <w:rPr>
-          <w:b/>
-          <w:bCs/>
-        </w:rPr>
-        <w:t>schema.prisma</w:t>
-      </w:r>
-      <w:proofErr w:type="spellEnd"/>
-      <w:r>
-        <w:rPr>
-          <w:b/>
-          <w:bCs/>
-        </w:rPr>
-        <w:t>:</w:t>
-      </w:r>
-      <w:r>
-        <w:t xml:space="preserve"> Este es el único archivo donde defines la estructura real de tus tablas (Modelos como Usuario, Tenant, Plan) y tus reglas estrictas (</w:t>
-      </w:r>
-      <w:proofErr w:type="spellStart"/>
-      <w:r>
-        <w:t>Enums</w:t>
-      </w:r>
-      <w:proofErr w:type="spellEnd"/>
-      <w:r>
-        <w:t xml:space="preserve"> como </w:t>
-      </w:r>
-      <w:proofErr w:type="spellStart"/>
-      <w:r>
-        <w:t>TipoPlan</w:t>
-      </w:r>
-      <w:proofErr w:type="spellEnd"/>
-      <w:r>
-        <w:t xml:space="preserve"> o Rol).</w:t>
+      <w:r>
+        <w:rPr>
+          <w:b/>
+          <w:bCs/>
+        </w:rPr>
+        <w:t>schema.prisma:</w:t>
+      </w:r>
+      <w:r>
+        <w:t xml:space="preserve"> Este es el único archivo donde defines la estructura real de tus tablas (Modelos como Usuario, Tenant, Plan) y tus reglas estrictas (Enums como TipoPlan o Rol).</w:t>
       </w:r>
     </w:p>
     <w:p>
@@ -1972,23 +1032,7 @@
         <w:t>El cliente tipado:</w:t>
       </w:r>
       <w:r>
-        <w:t xml:space="preserve"> A partir de ese archivo, Prisma genera automáticamente tipos de </w:t>
-      </w:r>
-      <w:proofErr w:type="spellStart"/>
-      <w:r>
-        <w:t>TypeScript</w:t>
-      </w:r>
-      <w:proofErr w:type="spellEnd"/>
-      <w:r>
-        <w:t xml:space="preserve">. Si intentas guardar un plan llamado "Premium" pero tu base de datos solo acepta "BASICO", "PROFESIONAL" o "EMPRESARIAL", </w:t>
-      </w:r>
-      <w:proofErr w:type="spellStart"/>
-      <w:r>
-        <w:t>TypeScript</w:t>
-      </w:r>
-      <w:proofErr w:type="spellEnd"/>
-      <w:r>
-        <w:t xml:space="preserve"> te mostrará un error antes de que siquiera ejecutes el código.</w:t>
+        <w:t xml:space="preserve"> A partir de ese archivo, Prisma genera automáticamente tipos de TypeScript. Si intentas guardar un plan llamado "Premium" pero tu base de datos solo acepta "BASICO", "PROFESIONAL" o "EMPRESARIAL", TypeScript te mostrará un error antes de que siquiera ejecutes el código.</w:t>
       </w:r>
     </w:p>
     <w:p>
@@ -2010,23 +1054,7 @@
           <w:b/>
           <w:bCs/>
         </w:rPr>
-        <w:t xml:space="preserve">3. </w:t>
-      </w:r>
-      <w:proofErr w:type="spellStart"/>
-      <w:r>
-        <w:rPr>
-          <w:b/>
-          <w:bCs/>
-        </w:rPr>
-        <w:t>Backend</w:t>
-      </w:r>
-      <w:proofErr w:type="spellEnd"/>
-      <w:r>
-        <w:rPr>
-          <w:b/>
-          <w:bCs/>
-        </w:rPr>
-        <w:t xml:space="preserve"> (Arquitectura en Capas)</w:t>
+        <w:t>3. Backend (Arquitectura en Capas)</w:t>
       </w:r>
     </w:p>
     <w:p>
@@ -2047,34 +1075,10 @@
           <w:bCs/>
         </w:rPr>
         <w:lastRenderedPageBreak/>
-        <w:t>Rutas (*.</w:t>
-      </w:r>
-      <w:proofErr w:type="spellStart"/>
-      <w:r>
-        <w:rPr>
-          <w:b/>
-          <w:bCs/>
-        </w:rPr>
-        <w:t>routes.ts</w:t>
-      </w:r>
-      <w:proofErr w:type="spellEnd"/>
-      <w:r>
-        <w:rPr>
-          <w:b/>
-          <w:bCs/>
-        </w:rPr>
-        <w:t>):</w:t>
-      </w:r>
-      <w:r>
-        <w:t xml:space="preserve"> Son los semáforos. Reciben la petición web (ej. POST /api/usuarios/</w:t>
-      </w:r>
-      <w:proofErr w:type="spellStart"/>
-      <w:r>
-        <w:t>admin</w:t>
-      </w:r>
-      <w:proofErr w:type="spellEnd"/>
-      <w:r>
-        <w:t>) y deciden qué funciones deben ejecutarse, aplicando barreras de seguridad (Middlewares) en el proceso.</w:t>
+        <w:t>Rutas (*.routes.ts):</w:t>
+      </w:r>
+      <w:r>
+        <w:t xml:space="preserve"> Son los semáforos. Reciben la petición web (ej. POST /api/usuarios/admin) y deciden qué funciones deben ejecutarse, aplicando barreras de seguridad (Middlewares) en el proceso.</w:t>
       </w:r>
     </w:p>
     <w:p>
@@ -2089,23 +1093,7 @@
           <w:b/>
           <w:bCs/>
         </w:rPr>
-        <w:t>Controladores (*.</w:t>
-      </w:r>
-      <w:proofErr w:type="spellStart"/>
-      <w:r>
-        <w:rPr>
-          <w:b/>
-          <w:bCs/>
-        </w:rPr>
-        <w:t>controller.ts</w:t>
-      </w:r>
-      <w:proofErr w:type="spellEnd"/>
-      <w:r>
-        <w:rPr>
-          <w:b/>
-          <w:bCs/>
-        </w:rPr>
-        <w:t>):</w:t>
+        <w:t>Controladores (*.controller.ts):</w:t>
       </w:r>
       <w:r>
         <w:t xml:space="preserve"> Son los directores de orquesta. </w:t>
@@ -2118,23 +1106,7 @@
         <w:t>No tocan la base de datos.</w:t>
       </w:r>
       <w:r>
-        <w:t xml:space="preserve"> Solo se encargan de validar que los datos de entrada (</w:t>
-      </w:r>
-      <w:proofErr w:type="spellStart"/>
-      <w:r>
-        <w:t>req.body</w:t>
-      </w:r>
-      <w:proofErr w:type="spellEnd"/>
-      <w:r>
-        <w:t xml:space="preserve">) estén completos, y luego emiten respuestas HTTP (ej. 200 OK o 500 Error) o eventos en tiempo real hacia el </w:t>
-      </w:r>
-      <w:proofErr w:type="spellStart"/>
-      <w:r>
-        <w:t>frontend</w:t>
-      </w:r>
-      <w:proofErr w:type="spellEnd"/>
-      <w:r>
-        <w:t xml:space="preserve"> mediante Socket.io.</w:t>
+        <w:t xml:space="preserve"> Solo se encargan de validar que los datos de entrada (req.body) estén completos, y luego emiten respuestas HTTP (ej. 200 OK o 500 Error) o eventos en tiempo real hacia el frontend mediante Socket.io.</w:t>
       </w:r>
     </w:p>
     <w:p>
@@ -2149,23 +1121,7 @@
           <w:b/>
           <w:bCs/>
         </w:rPr>
-        <w:t>Servicios (*.</w:t>
-      </w:r>
-      <w:proofErr w:type="spellStart"/>
-      <w:r>
-        <w:rPr>
-          <w:b/>
-          <w:bCs/>
-        </w:rPr>
-        <w:t>service.ts</w:t>
-      </w:r>
-      <w:proofErr w:type="spellEnd"/>
-      <w:r>
-        <w:rPr>
-          <w:b/>
-          <w:bCs/>
-        </w:rPr>
-        <w:t>):</w:t>
+        <w:t>Servicios (*.service.ts):</w:t>
       </w:r>
       <w:r>
         <w:t xml:space="preserve"> Aquí vive la verdadera </w:t>
@@ -2188,23 +1144,7 @@
         <w:t>únicos</w:t>
       </w:r>
       <w:r>
-        <w:t xml:space="preserve"> que hablan directamente con Prisma (la base de datos) para hacer operaciones o transacciones seguras (ej. </w:t>
-      </w:r>
-      <w:proofErr w:type="spellStart"/>
-      <w:r>
-        <w:t>tenant.service.ts</w:t>
-      </w:r>
-      <w:proofErr w:type="spellEnd"/>
-      <w:r>
-        <w:t xml:space="preserve"> o </w:t>
-      </w:r>
-      <w:proofErr w:type="spellStart"/>
-      <w:r>
-        <w:t>user.service.ts</w:t>
-      </w:r>
-      <w:proofErr w:type="spellEnd"/>
-      <w:r>
-        <w:t>).</w:t>
+        <w:t xml:space="preserve"> que hablan directamente con Prisma (la base de datos) para hacer operaciones o transacciones seguras (ej. tenant.service.ts o user.service.ts).</w:t>
       </w:r>
     </w:p>
     <w:p>
@@ -2226,52 +1166,12 @@
           <w:b/>
           <w:bCs/>
         </w:rPr>
-        <w:t xml:space="preserve">4. </w:t>
-      </w:r>
-      <w:proofErr w:type="spellStart"/>
-      <w:r>
-        <w:rPr>
-          <w:b/>
-          <w:bCs/>
-        </w:rPr>
-        <w:t>Frontend</w:t>
-      </w:r>
-      <w:proofErr w:type="spellEnd"/>
-      <w:r>
-        <w:rPr>
-          <w:b/>
-          <w:bCs/>
-        </w:rPr>
-        <w:t xml:space="preserve"> (Arquitectura Limpia con </w:t>
-      </w:r>
-      <w:proofErr w:type="spellStart"/>
-      <w:r>
-        <w:rPr>
-          <w:b/>
-          <w:bCs/>
-        </w:rPr>
-        <w:t>React</w:t>
-      </w:r>
-      <w:proofErr w:type="spellEnd"/>
-      <w:r>
-        <w:rPr>
-          <w:b/>
-          <w:bCs/>
-        </w:rPr>
-        <w:t>)</w:t>
-      </w:r>
-    </w:p>
-    <w:p>
-      <w:r>
-        <w:t xml:space="preserve">Tu interfaz de usuario (Single Page </w:t>
-      </w:r>
-      <w:proofErr w:type="spellStart"/>
-      <w:r>
-        <w:t>Application</w:t>
-      </w:r>
-      <w:proofErr w:type="spellEnd"/>
-      <w:r>
-        <w:t>) también separa la inteligencia gráfica de la inteligencia de datos:</w:t>
+        <w:t>4. Frontend (Arquitectura Limpia con React)</w:t>
+      </w:r>
+    </w:p>
+    <w:p>
+      <w:r>
+        <w:t>Tu interfaz de usuario (Single Page Application) también separa la inteligencia gráfica de la inteligencia de datos:</w:t>
       </w:r>
     </w:p>
     <w:p>
@@ -2286,58 +1186,10 @@
           <w:b/>
           <w:bCs/>
         </w:rPr>
-        <w:t>Componentes Visuales (*.</w:t>
-      </w:r>
-      <w:proofErr w:type="spellStart"/>
-      <w:r>
-        <w:rPr>
-          <w:b/>
-          <w:bCs/>
-        </w:rPr>
-        <w:t>tsx</w:t>
-      </w:r>
-      <w:proofErr w:type="spellEnd"/>
-      <w:r>
-        <w:rPr>
-          <w:b/>
-          <w:bCs/>
-        </w:rPr>
-        <w:t>):</w:t>
-      </w:r>
-      <w:r>
-        <w:t xml:space="preserve"> Archivos como </w:t>
-      </w:r>
-      <w:proofErr w:type="spellStart"/>
-      <w:r>
-        <w:t>DashboardPage.tsx</w:t>
-      </w:r>
-      <w:proofErr w:type="spellEnd"/>
-      <w:r>
-        <w:t xml:space="preserve"> o </w:t>
-      </w:r>
-      <w:proofErr w:type="spellStart"/>
-      <w:r>
-        <w:t>PlanFormModal.tsx</w:t>
-      </w:r>
-      <w:proofErr w:type="spellEnd"/>
-      <w:r>
-        <w:t xml:space="preserve"> se dedican casi en un 100% a "pintar" la interfaz utilizando </w:t>
-      </w:r>
-      <w:proofErr w:type="spellStart"/>
-      <w:r>
-        <w:t>React</w:t>
-      </w:r>
-      <w:proofErr w:type="spellEnd"/>
-      <w:r>
-        <w:t xml:space="preserve"> y </w:t>
-      </w:r>
-      <w:proofErr w:type="spellStart"/>
-      <w:r>
-        <w:t>Tailwind</w:t>
-      </w:r>
-      <w:proofErr w:type="spellEnd"/>
-      <w:r>
-        <w:t xml:space="preserve"> CSS. Se consideran componentes "tontos" porque no hacen peticiones complejas directamente.</w:t>
+        <w:t>Componentes Visuales (*.tsx):</w:t>
+      </w:r>
+      <w:r>
+        <w:t xml:space="preserve"> Archivos como DashboardPage.tsx o PlanFormModal.tsx se dedican casi en un 100% a "pintar" la interfaz utilizando React y Tailwind CSS. Se consideran componentes "tontos" porque no hacen peticiones complejas directamente.</w:t>
       </w:r>
     </w:p>
     <w:p>
@@ -2352,564 +1204,201 @@
           <w:b/>
           <w:bCs/>
         </w:rPr>
-        <w:t>Capa de Estado y Negocio (</w:t>
-      </w:r>
-      <w:proofErr w:type="spellStart"/>
-      <w:r>
-        <w:rPr>
-          <w:b/>
-          <w:bCs/>
-        </w:rPr>
-        <w:t>src</w:t>
-      </w:r>
-      <w:proofErr w:type="spellEnd"/>
-      <w:r>
-        <w:rPr>
-          <w:b/>
-          <w:bCs/>
-        </w:rPr>
-        <w:t>/</w:t>
-      </w:r>
-      <w:proofErr w:type="spellStart"/>
-      <w:r>
-        <w:rPr>
-          <w:b/>
-          <w:bCs/>
-        </w:rPr>
-        <w:t>hooks</w:t>
-      </w:r>
-      <w:proofErr w:type="spellEnd"/>
-      <w:r>
-        <w:rPr>
-          <w:b/>
-          <w:bCs/>
-        </w:rPr>
-        <w:t>/*.</w:t>
-      </w:r>
-      <w:proofErr w:type="spellStart"/>
-      <w:r>
-        <w:rPr>
-          <w:b/>
-          <w:bCs/>
-        </w:rPr>
-        <w:t>ts</w:t>
-      </w:r>
-      <w:proofErr w:type="spellEnd"/>
-      <w:r>
-        <w:rPr>
-          <w:b/>
-          <w:bCs/>
-        </w:rPr>
-        <w:t>):</w:t>
+        <w:t>Capa de Estado y Negocio (src/hooks/*.ts):</w:t>
       </w:r>
       <w:r>
         <w:t xml:space="preserve"> Extraemos toda la lógica compleja (variables de estado, recolección de datos, y funciones ejecutables) hacia </w:t>
       </w:r>
-      <w:proofErr w:type="spellStart"/>
       <w:r>
         <w:rPr>
           <w:i/>
           <w:iCs/>
         </w:rPr>
-        <w:t>Custom</w:t>
-      </w:r>
-      <w:proofErr w:type="spellEnd"/>
+        <w:t>Custom Hooks</w:t>
+      </w:r>
+      <w:r>
+        <w:t>, como useTenants.ts. Esto mantiene los archivos visuales increíblemente limpios.</w:t>
+      </w:r>
+    </w:p>
+    <w:p>
+      <w:pPr>
+        <w:numPr>
+          <w:ilvl w:val="0"/>
+          <w:numId w:val="16"/>
+        </w:numPr>
+      </w:pPr>
+      <w:r>
+        <w:rPr>
+          <w:b/>
+          <w:bCs/>
+        </w:rPr>
+        <w:t>Capa de Servicios de API (src/services/api.ts):</w:t>
+      </w:r>
+      <w:r>
+        <w:t xml:space="preserve"> Un archivo único centralizado que funciona como "cliente HTTP". Es el único lugar de todo tu frontend que se comunica con tu backend, inyectando los tokens de seguridad automáticamente sin repetir código por todas partes.</w:t>
+      </w:r>
+    </w:p>
+    <w:p>
+      <w:pPr>
+        <w:numPr>
+          <w:ilvl w:val="0"/>
+          <w:numId w:val="16"/>
+        </w:numPr>
+      </w:pPr>
+      <w:r>
+        <w:rPr>
+          <w:b/>
+          <w:bCs/>
+        </w:rPr>
+        <w:t>Estado Global (AuthContext.tsx):</w:t>
+      </w:r>
+      <w:r>
+        <w:t xml:space="preserve"> Mantiene la memoria global de quién inició sesión (rol, ID, token) para que cualquier parte de la aplicación sepa qué mostrar o bloquear.</w:t>
+      </w:r>
+    </w:p>
+    <w:p/>
+    <w:p/>
+    <w:p>
+      <w:pPr>
+        <w:pStyle w:val="Subttulo"/>
+      </w:pPr>
+      <w:r>
+        <w:lastRenderedPageBreak/>
+        <w:t>AppRoutes.jsx</w:t>
+      </w:r>
+    </w:p>
+    <w:p>
+      <w:r>
+        <w:rPr>
+          <w:b/>
+          <w:bCs/>
+        </w:rPr>
+        <w:t>1. El orden de las capas (&lt;BrowserRouter&gt; y &lt;AuthProvider&gt;)</w:t>
+      </w:r>
+    </w:p>
+    <w:p>
+      <w:pPr>
+        <w:numPr>
+          <w:ilvl w:val="0"/>
+          <w:numId w:val="17"/>
+        </w:numPr>
+      </w:pPr>
+      <w:r>
+        <w:t>BrowserRouter es el motor que lee las URLs de tu navegador. Debe ir siempre afuera para que todo lo que esté adentro sepa en qué página estás.</w:t>
+      </w:r>
+    </w:p>
+    <w:p>
+      <w:pPr>
+        <w:numPr>
+          <w:ilvl w:val="0"/>
+          <w:numId w:val="17"/>
+        </w:numPr>
+      </w:pPr>
+      <w:r>
+        <w:t xml:space="preserve">AuthProvider es la "memoria" global de tu aplicación que sabe quién inició sesión y cuál es su token. Al ponerlo </w:t>
+      </w:r>
       <w:r>
         <w:rPr>
           <w:i/>
           <w:iCs/>
         </w:rPr>
-        <w:t xml:space="preserve"> Hooks</w:t>
-      </w:r>
-      <w:r>
-        <w:t xml:space="preserve">, como </w:t>
-      </w:r>
-      <w:proofErr w:type="spellStart"/>
-      <w:r>
-        <w:t>useTenants.ts</w:t>
-      </w:r>
-      <w:proofErr w:type="spellEnd"/>
-      <w:r>
-        <w:t>. Esto mantiene los archivos visuales increíblemente limpios.</w:t>
-      </w:r>
-    </w:p>
-    <w:p>
-      <w:pPr>
-        <w:numPr>
-          <w:ilvl w:val="0"/>
-          <w:numId w:val="16"/>
-        </w:numPr>
-      </w:pPr>
-      <w:r>
-        <w:rPr>
-          <w:b/>
-          <w:bCs/>
-        </w:rPr>
-        <w:t>Capa de Servicios de API (</w:t>
-      </w:r>
-      <w:proofErr w:type="spellStart"/>
-      <w:r>
-        <w:rPr>
-          <w:b/>
-          <w:bCs/>
-        </w:rPr>
-        <w:t>src</w:t>
-      </w:r>
-      <w:proofErr w:type="spellEnd"/>
-      <w:r>
-        <w:rPr>
-          <w:b/>
-          <w:bCs/>
-        </w:rPr>
-        <w:t>/</w:t>
-      </w:r>
-      <w:proofErr w:type="spellStart"/>
-      <w:r>
-        <w:rPr>
-          <w:b/>
-          <w:bCs/>
-        </w:rPr>
-        <w:t>services</w:t>
-      </w:r>
-      <w:proofErr w:type="spellEnd"/>
-      <w:r>
-        <w:rPr>
-          <w:b/>
-          <w:bCs/>
-        </w:rPr>
-        <w:t>/</w:t>
-      </w:r>
-      <w:proofErr w:type="spellStart"/>
-      <w:r>
-        <w:rPr>
-          <w:b/>
-          <w:bCs/>
-        </w:rPr>
-        <w:t>api.ts</w:t>
-      </w:r>
-      <w:proofErr w:type="spellEnd"/>
-      <w:r>
-        <w:rPr>
-          <w:b/>
-          <w:bCs/>
-        </w:rPr>
-        <w:t>):</w:t>
-      </w:r>
-      <w:r>
-        <w:t xml:space="preserve"> Un archivo único centralizado que funciona como "cliente HTTP". Es el único lugar de todo tu </w:t>
-      </w:r>
-      <w:proofErr w:type="spellStart"/>
-      <w:r>
-        <w:t>frontend</w:t>
-      </w:r>
-      <w:proofErr w:type="spellEnd"/>
-      <w:r>
-        <w:t xml:space="preserve"> que se comunica con tu </w:t>
-      </w:r>
-      <w:proofErr w:type="spellStart"/>
-      <w:r>
-        <w:t>backend</w:t>
-      </w:r>
-      <w:proofErr w:type="spellEnd"/>
-      <w:r>
-        <w:t>, inyectando los tokens de seguridad automáticamente sin repetir código por todas partes.</w:t>
-      </w:r>
-    </w:p>
-    <w:p>
-      <w:pPr>
-        <w:numPr>
-          <w:ilvl w:val="0"/>
-          <w:numId w:val="16"/>
-        </w:numPr>
-      </w:pPr>
-      <w:r>
-        <w:rPr>
-          <w:b/>
-          <w:bCs/>
-        </w:rPr>
-        <w:t>Estado Global (</w:t>
-      </w:r>
-      <w:proofErr w:type="spellStart"/>
-      <w:r>
-        <w:rPr>
-          <w:b/>
-          <w:bCs/>
-        </w:rPr>
-        <w:t>AuthContext.tsx</w:t>
-      </w:r>
-      <w:proofErr w:type="spellEnd"/>
-      <w:r>
-        <w:rPr>
-          <w:b/>
-          <w:bCs/>
-        </w:rPr>
-        <w:t>):</w:t>
-      </w:r>
-      <w:r>
-        <w:t xml:space="preserve"> Mantiene la memoria global de quién inició sesión (rol, ID, token) para que cualquier parte de la aplicación sepa qué mostrar o bloquear.</w:t>
+        <w:t>inmediatamente adentro</w:t>
+      </w:r>
+      <w:r>
+        <w:t xml:space="preserve"> del router, garantizas que cualquier pantalla pueda preguntar "¿quién está logueado?" y que tu propio sistema de autenticación pueda redirigir al usuario si es necesario.</w:t>
+      </w:r>
+    </w:p>
+    <w:p>
+      <w:r>
+        <w:rPr>
+          <w:b/>
+          <w:bCs/>
+        </w:rPr>
+        <w:t>2. El "Embudo Infranqueable" de la ruta Privada (/dashboard)</w:t>
+      </w:r>
+      <w:r>
+        <w:t xml:space="preserve"> En tu código anterior, tenías rutas explícitas separadas (como /admin-dashboard o /dashboard para el SuperAdmin). El problema de eso es el riesgo de navegación manual: un usuario con menos privilegios podría escribir localhost:5173/dashboard en la URL de su navegador para intentar forzar la entrada a un panel que no le corresponde.</w:t>
+      </w:r>
+    </w:p>
+    <w:p>
+      <w:r>
+        <w:t xml:space="preserve">Al usar una única ruta /dashboard que apunta al componente &lt;RoleBasedDashboard /&gt;, creamos un escudo hermético. Todos los usuarios autenticados van a la misma URL (/dashboard), pero es React quien decide y dibuja una pantalla totalmente distinta dependiendo de quién sea el usuario. </w:t>
+      </w:r>
+      <w:r>
+        <w:rPr>
+          <w:b/>
+          <w:bCs/>
+        </w:rPr>
+        <w:t>Es físicamente imposible que un usuario haga trampa escribiendo otra URL</w:t>
+      </w:r>
+      <w:r>
+        <w:t>, porque las otras URLs privadas ya ni siquiera existen en el enrutador.</w:t>
+      </w:r>
+    </w:p>
+    <w:p>
+      <w:r>
+        <w:rPr>
+          <w:b/>
+          <w:bCs/>
+        </w:rPr>
+        <w:t>3. Las Rutas Públicas Independientes</w:t>
+      </w:r>
+      <w:r>
+        <w:t xml:space="preserve"> La LandingPage (tu propuesta comercial) y el LoginPage están sueltas y expuestas porque son públicas. No necesitan verificaciones de token ni de roles.</w:t>
+      </w:r>
+    </w:p>
+    <w:p>
+      <w:r>
+        <w:rPr>
+          <w:b/>
+          <w:bCs/>
+        </w:rPr>
+        <w:t>4. La Red de Seguridad (*)</w:t>
+      </w:r>
+      <w:r>
+        <w:t xml:space="preserve"> La última línea &lt;Route path="*" element={&lt;Navigate to="/" replace /&gt;} /&gt; es tu "seguro contra accidentes". Si un usuario (o un cliente curioso) inventa una URL que no existe (por ejemplo, localhost:5173/inventado), en lugar de que tu aplicación se rompa o muestre una pantalla en blanco, el enrutador lo atrapa y lo expulsa silenciosamente de regreso a la página de inicio (/).</w:t>
+      </w:r>
+    </w:p>
+    <w:p>
+      <w:r>
+        <w:t xml:space="preserve">En resumen: Esta estructura convierte a tu aplicación de una simple casa con muchas puertas (que tendrías que proteger una por una) a una </w:t>
+      </w:r>
+      <w:r>
+        <w:rPr>
+          <w:b/>
+          <w:bCs/>
+        </w:rPr>
+        <w:t>fortaleza con una sola puerta de entrada principal</w:t>
+      </w:r>
+      <w:r>
+        <w:t>, donde tu &lt;RoleBasedDashboard /&gt; es el guardia de seguridad que revisa la identificación y decide a qué cuarto te deja pasar.</w:t>
       </w:r>
     </w:p>
     <w:p/>
-    <w:p/>
     <w:p>
       <w:pPr>
         <w:pStyle w:val="Subttulo"/>
-      </w:pPr>
-      <w:proofErr w:type="spellStart"/>
-      <w:r>
+        <w:rPr>
+          <w:lang w:val="en-US"/>
+        </w:rPr>
+      </w:pPr>
+      <w:r>
+        <w:rPr>
+          <w:lang w:val="en-US"/>
+        </w:rPr>
         <w:lastRenderedPageBreak/>
-        <w:t>AppRoutes.jsx</w:t>
-      </w:r>
-      <w:proofErr w:type="spellEnd"/>
-    </w:p>
-    <w:p>
-      <w:r>
-        <w:rPr>
-          <w:b/>
-          <w:bCs/>
-        </w:rPr>
-        <w:t>1. El orden de las capas (&lt;</w:t>
-      </w:r>
-      <w:proofErr w:type="spellStart"/>
-      <w:r>
-        <w:rPr>
-          <w:b/>
-          <w:bCs/>
-        </w:rPr>
-        <w:t>BrowserRouter</w:t>
-      </w:r>
-      <w:proofErr w:type="spellEnd"/>
-      <w:r>
-        <w:rPr>
-          <w:b/>
-          <w:bCs/>
-        </w:rPr>
-        <w:t>&gt; y &lt;</w:t>
-      </w:r>
-      <w:proofErr w:type="spellStart"/>
-      <w:r>
-        <w:rPr>
-          <w:b/>
-          <w:bCs/>
-        </w:rPr>
-        <w:t>AuthProvider</w:t>
-      </w:r>
-      <w:proofErr w:type="spellEnd"/>
-      <w:r>
-        <w:rPr>
-          <w:b/>
-          <w:bCs/>
-        </w:rPr>
-        <w:t>&gt;)</w:t>
-      </w:r>
-    </w:p>
-    <w:p>
-      <w:pPr>
-        <w:numPr>
-          <w:ilvl w:val="0"/>
-          <w:numId w:val="17"/>
-        </w:numPr>
-      </w:pPr>
-      <w:proofErr w:type="spellStart"/>
-      <w:r>
-        <w:t>BrowserRouter</w:t>
-      </w:r>
-      <w:proofErr w:type="spellEnd"/>
-      <w:r>
-        <w:t xml:space="preserve"> es el motor que lee las </w:t>
-      </w:r>
-      <w:proofErr w:type="spellStart"/>
-      <w:r>
-        <w:t>URLs</w:t>
-      </w:r>
-      <w:proofErr w:type="spellEnd"/>
-      <w:r>
-        <w:t xml:space="preserve"> de tu navegador. Debe ir siempre afuera para que todo lo que esté adentro sepa en qué página estás.</w:t>
-      </w:r>
-    </w:p>
-    <w:p>
-      <w:pPr>
-        <w:numPr>
-          <w:ilvl w:val="0"/>
-          <w:numId w:val="17"/>
-        </w:numPr>
-      </w:pPr>
-      <w:proofErr w:type="spellStart"/>
-      <w:r>
-        <w:t>AuthProvider</w:t>
-      </w:r>
-      <w:proofErr w:type="spellEnd"/>
-      <w:r>
-        <w:t xml:space="preserve"> es la "memoria" global de tu aplicación que sabe quién inició sesión y cuál es su token. Al ponerlo </w:t>
-      </w:r>
-      <w:r>
-        <w:rPr>
-          <w:i/>
-          <w:iCs/>
-        </w:rPr>
-        <w:t>inmediatamente adentro</w:t>
-      </w:r>
-      <w:r>
-        <w:t xml:space="preserve"> del </w:t>
-      </w:r>
-      <w:proofErr w:type="spellStart"/>
-      <w:r>
-        <w:t>router</w:t>
-      </w:r>
-      <w:proofErr w:type="spellEnd"/>
-      <w:r>
-        <w:t xml:space="preserve">, garantizas que cualquier pantalla pueda preguntar "¿quién está </w:t>
-      </w:r>
-      <w:proofErr w:type="spellStart"/>
-      <w:r>
-        <w:t>logueado</w:t>
-      </w:r>
-      <w:proofErr w:type="spellEnd"/>
-      <w:r>
-        <w:t>?" y que tu propio sistema de autenticación pueda redirigir al usuario si es necesario.</w:t>
-      </w:r>
-    </w:p>
-    <w:p>
-      <w:r>
-        <w:rPr>
-          <w:b/>
-          <w:bCs/>
-        </w:rPr>
-        <w:t>2. El "Embudo Infranqueable" de la ruta Privada (/</w:t>
-      </w:r>
-      <w:proofErr w:type="spellStart"/>
-      <w:r>
-        <w:rPr>
-          <w:b/>
-          <w:bCs/>
-        </w:rPr>
-        <w:t>dashboard</w:t>
-      </w:r>
-      <w:proofErr w:type="spellEnd"/>
-      <w:r>
-        <w:rPr>
-          <w:b/>
-          <w:bCs/>
-        </w:rPr>
-        <w:t>)</w:t>
-      </w:r>
-      <w:r>
-        <w:t xml:space="preserve"> En tu código anterior, tenías rutas explícitas separadas (como /</w:t>
-      </w:r>
-      <w:proofErr w:type="spellStart"/>
-      <w:r>
-        <w:t>admin-dashboard</w:t>
-      </w:r>
-      <w:proofErr w:type="spellEnd"/>
-      <w:r>
-        <w:t xml:space="preserve"> o /</w:t>
-      </w:r>
-      <w:proofErr w:type="spellStart"/>
-      <w:r>
-        <w:t>dashboard</w:t>
-      </w:r>
-      <w:proofErr w:type="spellEnd"/>
-      <w:r>
-        <w:t xml:space="preserve"> para el </w:t>
-      </w:r>
-      <w:proofErr w:type="spellStart"/>
-      <w:r>
-        <w:t>SuperAdmin</w:t>
-      </w:r>
-      <w:proofErr w:type="spellEnd"/>
-      <w:r>
-        <w:t>). El problema de eso es el riesgo de navegación manual: un usuario con menos privilegios podría escribir localhost:5173/</w:t>
-      </w:r>
-      <w:proofErr w:type="spellStart"/>
-      <w:r>
-        <w:t>dashboard</w:t>
-      </w:r>
-      <w:proofErr w:type="spellEnd"/>
-      <w:r>
-        <w:t xml:space="preserve"> en la URL de su navegador para intentar forzar la entrada a un panel que no le corresponde.</w:t>
-      </w:r>
-    </w:p>
-    <w:p>
-      <w:r>
-        <w:t>Al usar una única ruta /</w:t>
-      </w:r>
-      <w:proofErr w:type="spellStart"/>
-      <w:r>
-        <w:t>dashboard</w:t>
-      </w:r>
-      <w:proofErr w:type="spellEnd"/>
-      <w:r>
-        <w:t xml:space="preserve"> que apunta al componente &lt;</w:t>
-      </w:r>
-      <w:proofErr w:type="spellStart"/>
-      <w:r>
-        <w:t>RoleBasedDashboard</w:t>
-      </w:r>
-      <w:proofErr w:type="spellEnd"/>
-      <w:r>
-        <w:t xml:space="preserve"> /&gt;, creamos un escudo hermético. Todos los usuarios autenticados van a la misma URL (/</w:t>
-      </w:r>
-      <w:proofErr w:type="spellStart"/>
-      <w:r>
-        <w:t>dashboard</w:t>
-      </w:r>
-      <w:proofErr w:type="spellEnd"/>
-      <w:r>
-        <w:t xml:space="preserve">), pero es </w:t>
-      </w:r>
-      <w:proofErr w:type="spellStart"/>
-      <w:r>
-        <w:t>React</w:t>
-      </w:r>
-      <w:proofErr w:type="spellEnd"/>
-      <w:r>
-        <w:t xml:space="preserve"> quien decide y dibuja una pantalla totalmente distinta dependiendo de quién sea el usuario. </w:t>
-      </w:r>
-      <w:r>
-        <w:rPr>
-          <w:b/>
-          <w:bCs/>
-        </w:rPr>
-        <w:t>Es físicamente imposible que un usuario haga trampa escribiendo otra URL</w:t>
-      </w:r>
-      <w:r>
-        <w:t xml:space="preserve">, porque las otras </w:t>
-      </w:r>
-      <w:proofErr w:type="spellStart"/>
-      <w:r>
-        <w:t>URLs</w:t>
-      </w:r>
-      <w:proofErr w:type="spellEnd"/>
-      <w:r>
-        <w:t xml:space="preserve"> privadas ya ni siquiera existen en el enrutador.</w:t>
-      </w:r>
-    </w:p>
-    <w:p>
-      <w:r>
-        <w:rPr>
-          <w:b/>
-          <w:bCs/>
-        </w:rPr>
-        <w:t>3. Las Rutas Públicas Independientes</w:t>
-      </w:r>
-      <w:r>
-        <w:t xml:space="preserve"> La </w:t>
-      </w:r>
-      <w:proofErr w:type="spellStart"/>
-      <w:r>
-        <w:t>LandingPage</w:t>
-      </w:r>
-      <w:proofErr w:type="spellEnd"/>
-      <w:r>
-        <w:t xml:space="preserve"> (tu propuesta comercial) y el </w:t>
-      </w:r>
-      <w:proofErr w:type="spellStart"/>
-      <w:r>
-        <w:t>LoginPage</w:t>
-      </w:r>
-      <w:proofErr w:type="spellEnd"/>
-      <w:r>
-        <w:t xml:space="preserve"> están sueltas y expuestas porque son públicas. No necesitan verificaciones de token ni de roles.</w:t>
-      </w:r>
-    </w:p>
-    <w:p>
-      <w:r>
-        <w:rPr>
-          <w:b/>
-          <w:bCs/>
-        </w:rPr>
-        <w:t>4. La Red de Seguridad (*)</w:t>
-      </w:r>
-      <w:r>
-        <w:t xml:space="preserve"> La última línea &lt;Route </w:t>
-      </w:r>
-      <w:proofErr w:type="spellStart"/>
-      <w:r>
-        <w:t>path</w:t>
-      </w:r>
-      <w:proofErr w:type="spellEnd"/>
-      <w:r>
-        <w:t xml:space="preserve">="*" </w:t>
-      </w:r>
-      <w:proofErr w:type="spellStart"/>
-      <w:r>
-        <w:t>element</w:t>
-      </w:r>
-      <w:proofErr w:type="spellEnd"/>
-      <w:r>
-        <w:t>={&lt;</w:t>
-      </w:r>
-      <w:proofErr w:type="spellStart"/>
-      <w:r>
-        <w:t>Navigate</w:t>
-      </w:r>
-      <w:proofErr w:type="spellEnd"/>
-      <w:r>
-        <w:t xml:space="preserve"> </w:t>
-      </w:r>
-      <w:proofErr w:type="spellStart"/>
-      <w:r>
-        <w:t>to</w:t>
-      </w:r>
-      <w:proofErr w:type="spellEnd"/>
-      <w:r>
-        <w:t xml:space="preserve">="/" </w:t>
-      </w:r>
-      <w:proofErr w:type="spellStart"/>
-      <w:r>
-        <w:t>replace</w:t>
-      </w:r>
-      <w:proofErr w:type="spellEnd"/>
-      <w:r>
-        <w:t xml:space="preserve"> /&gt;} /&gt; es tu "seguro contra accidentes". Si un usuario (o un cliente curioso) inventa una URL que no existe (por ejemplo, localhost:5173/inventado), en lugar de que tu aplicación se rompa o muestre una pantalla en blanco, el enrutador lo atrapa y lo expulsa silenciosamente de regreso a la página de inicio (/).</w:t>
-      </w:r>
-    </w:p>
-    <w:p>
-      <w:r>
-        <w:t xml:space="preserve">En resumen: Esta estructura convierte a tu aplicación de una simple casa con muchas puertas (que tendrías que proteger una por una) a una </w:t>
-      </w:r>
-      <w:r>
-        <w:rPr>
-          <w:b/>
-          <w:bCs/>
-        </w:rPr>
-        <w:t>fortaleza con una sola puerta de entrada principal</w:t>
-      </w:r>
-      <w:r>
-        <w:t>, donde tu &lt;</w:t>
-      </w:r>
-      <w:proofErr w:type="spellStart"/>
-      <w:r>
-        <w:t>RoleBasedDashboard</w:t>
-      </w:r>
-      <w:proofErr w:type="spellEnd"/>
-      <w:r>
-        <w:t xml:space="preserve"> /&gt; es el guardia de seguridad que revisa la identificación y decide a qué cuarto te deja pasar.</w:t>
-      </w:r>
-    </w:p>
-    <w:p/>
-    <w:p>
-      <w:pPr>
-        <w:pStyle w:val="Subttulo"/>
-      </w:pPr>
-      <w:proofErr w:type="spellStart"/>
-      <w:r>
-        <w:lastRenderedPageBreak/>
-        <w:t>React</w:t>
-      </w:r>
-      <w:proofErr w:type="spellEnd"/>
-      <w:r>
-        <w:t xml:space="preserve"> Native Expo </w:t>
-      </w:r>
-      <w:proofErr w:type="spellStart"/>
-      <w:r>
-        <w:t>Go</w:t>
-      </w:r>
-      <w:proofErr w:type="spellEnd"/>
-    </w:p>
-    <w:p>
-      <w:r>
-        <w:t>¡Hola, Aqua! Qué gusto ver el progreso que has hecho. He revisado a fondo la captura de pantalla de VS Code y el código de los archivos que me enviaste. Has logrado una migración impecable de la arquitectura web al entorno móvil nativo usando Expo.</w:t>
+        <w:t>React Native Expo Go</w:t>
+      </w:r>
+    </w:p>
+    <w:p>
+      <w:r>
+        <w:rPr>
+          <w:lang w:val="en-US"/>
+        </w:rPr>
+        <w:t xml:space="preserve">¡Hola, Aqua! </w:t>
+      </w:r>
+      <w:r>
+        <w:t>Qué gusto ver el progreso que has hecho. He revisado a fondo la captura de pantalla de VS Code y el código de los archivos que me enviaste. Has logrado una migración impecable de la arquitectura web al entorno móvil nativo usando Expo.</w:t>
       </w:r>
     </w:p>
     <w:p>
@@ -2945,39 +1434,7 @@
         </w:numPr>
       </w:pPr>
       <w:r>
-        <w:t xml:space="preserve">El archivo </w:t>
-      </w:r>
-      <w:proofErr w:type="spellStart"/>
-      <w:r>
-        <w:t>AuthContext.tsx</w:t>
-      </w:r>
-      <w:proofErr w:type="spellEnd"/>
-      <w:r>
-        <w:t xml:space="preserve"> maneja el estado de la sesión leyendo el token, la información del </w:t>
-      </w:r>
-      <w:proofErr w:type="spellStart"/>
-      <w:r>
-        <w:t>user</w:t>
-      </w:r>
-      <w:proofErr w:type="spellEnd"/>
-      <w:r>
-        <w:t xml:space="preserve"> y la bandera </w:t>
-      </w:r>
-      <w:proofErr w:type="spellStart"/>
-      <w:r>
-        <w:t>requirePasswordChange</w:t>
-      </w:r>
-      <w:proofErr w:type="spellEnd"/>
-      <w:r>
-        <w:t xml:space="preserve"> desde la memoria física del dispositivo usando </w:t>
-      </w:r>
-      <w:proofErr w:type="spellStart"/>
-      <w:r>
-        <w:t>AsyncStorage</w:t>
-      </w:r>
-      <w:proofErr w:type="spellEnd"/>
-      <w:r>
-        <w:t>.</w:t>
+        <w:t>El archivo AuthContext.tsx maneja el estado de la sesión leyendo el token, la información del user y la bandera requirePasswordChange desde la memoria física del dispositivo usando AsyncStorage.</w:t>
       </w:r>
     </w:p>
     <w:p>
@@ -2988,15 +1445,7 @@
         </w:numPr>
       </w:pPr>
       <w:r>
-        <w:t xml:space="preserve">El contexto incluye un estado </w:t>
-      </w:r>
-      <w:proofErr w:type="spellStart"/>
-      <w:r>
-        <w:t>isLoading</w:t>
-      </w:r>
-      <w:proofErr w:type="spellEnd"/>
-      <w:r>
-        <w:t xml:space="preserve"> que mantiene la aplicación en pausa hasta que termina de verificar si existe una sesión guardada previamente.</w:t>
+        <w:t>El contexto incluye un estado isLoading que mantiene la aplicación en pausa hasta que termina de verificar si existe una sesión guardada previamente.</w:t>
       </w:r>
     </w:p>
     <w:p>
@@ -3007,39 +1456,7 @@
         </w:numPr>
       </w:pPr>
       <w:r>
-        <w:t xml:space="preserve">Las funciones </w:t>
-      </w:r>
-      <w:proofErr w:type="spellStart"/>
-      <w:r>
-        <w:t>login</w:t>
-      </w:r>
-      <w:proofErr w:type="spellEnd"/>
-      <w:r>
-        <w:t xml:space="preserve"> y </w:t>
-      </w:r>
-      <w:proofErr w:type="spellStart"/>
-      <w:r>
-        <w:t>logout</w:t>
-      </w:r>
-      <w:proofErr w:type="spellEnd"/>
-      <w:r>
-        <w:t xml:space="preserve"> sincronizan simultáneamente los estados de </w:t>
-      </w:r>
-      <w:proofErr w:type="spellStart"/>
-      <w:r>
-        <w:t>React</w:t>
-      </w:r>
-      <w:proofErr w:type="spellEnd"/>
-      <w:r>
-        <w:t xml:space="preserve"> y la base de datos de </w:t>
-      </w:r>
-      <w:proofErr w:type="spellStart"/>
-      <w:r>
-        <w:t>AsyncStorage</w:t>
-      </w:r>
-      <w:proofErr w:type="spellEnd"/>
-      <w:r>
-        <w:t xml:space="preserve"> para evitar inconsistencias.</w:t>
+        <w:t>Las funciones login y logout sincronizan simultáneamente los estados de React y la base de datos de AsyncStorage para evitar inconsistencias.</w:t>
       </w:r>
     </w:p>
     <w:p>
@@ -3050,23 +1467,7 @@
         </w:numPr>
       </w:pPr>
       <w:r>
-        <w:t xml:space="preserve">El </w:t>
-      </w:r>
-      <w:proofErr w:type="spellStart"/>
-      <w:r>
-        <w:t>ThemeContext.tsx</w:t>
-      </w:r>
-      <w:proofErr w:type="spellEnd"/>
-      <w:r>
-        <w:t xml:space="preserve"> utiliza </w:t>
-      </w:r>
-      <w:proofErr w:type="spellStart"/>
-      <w:r>
-        <w:t>Appearance.getColorScheme</w:t>
-      </w:r>
-      <w:proofErr w:type="spellEnd"/>
-      <w:r>
-        <w:t>() para detectar nativamente si el teléfono del usuario está en modo claro u oscuro.</w:t>
+        <w:t>El ThemeContext.tsx utiliza Appearance.getColorScheme() para detectar nativamente si el teléfono del usuario está en modo claro u oscuro.</w:t>
       </w:r>
     </w:p>
     <w:p>
@@ -3077,23 +1478,7 @@
         </w:numPr>
       </w:pPr>
       <w:r>
-        <w:t xml:space="preserve">Este contexto de tema también guarda la preferencia manual del usuario en </w:t>
-      </w:r>
-      <w:proofErr w:type="spellStart"/>
-      <w:r>
-        <w:t>AsyncStorage</w:t>
-      </w:r>
-      <w:proofErr w:type="spellEnd"/>
-      <w:r>
-        <w:t xml:space="preserve"> bajo la llave </w:t>
-      </w:r>
-      <w:proofErr w:type="spellStart"/>
-      <w:r>
-        <w:t>aqua-ui-theme</w:t>
-      </w:r>
-      <w:proofErr w:type="spellEnd"/>
-      <w:r>
-        <w:t>.</w:t>
+        <w:t>Este contexto de tema también guarda la preferencia manual del usuario en AsyncStorage bajo la llave aqua-ui-theme.</w:t>
       </w:r>
     </w:p>
     <w:p>
@@ -3124,23 +1509,7 @@
         </w:numPr>
       </w:pPr>
       <w:r>
-        <w:t xml:space="preserve">El archivo </w:t>
-      </w:r>
-      <w:proofErr w:type="spellStart"/>
-      <w:r>
-        <w:t>api.ts</w:t>
-      </w:r>
-      <w:proofErr w:type="spellEnd"/>
-      <w:r>
-        <w:t xml:space="preserve"> actúa como un interceptor global que busca el token de forma asíncrona en el teléfono y lo inyecta en los encabezados </w:t>
-      </w:r>
-      <w:proofErr w:type="spellStart"/>
-      <w:r>
-        <w:t>Authorization</w:t>
-      </w:r>
-      <w:proofErr w:type="spellEnd"/>
-      <w:r>
-        <w:t xml:space="preserve"> de cada solicitud.</w:t>
+        <w:t>El archivo api.ts actúa como un interceptor global que busca el token de forma asíncrona en el teléfono y lo inyecta en los encabezados Authorization de cada solicitud.</w:t>
       </w:r>
     </w:p>
     <w:p>
@@ -3151,15 +1520,7 @@
         </w:numPr>
       </w:pPr>
       <w:r>
-        <w:t xml:space="preserve">Utiliza la variable de entorno EXPO_PUBLIC_API_BASE_URL o un respaldo estático (como la IP local 192.168.1.165) para encontrar el </w:t>
-      </w:r>
-      <w:proofErr w:type="spellStart"/>
-      <w:r>
-        <w:t>backend</w:t>
-      </w:r>
-      <w:proofErr w:type="spellEnd"/>
-      <w:r>
-        <w:t>.</w:t>
+        <w:t>Utiliza la variable de entorno EXPO_PUBLIC_API_BASE_URL o un respaldo estático (como la IP local 192.168.1.165) para encontrar el backend.</w:t>
       </w:r>
     </w:p>
     <w:p>
@@ -3170,15 +1531,7 @@
         </w:numPr>
       </w:pPr>
       <w:r>
-        <w:t xml:space="preserve">Implementa una barrera de seguridad: si el servidor responde con error 401 o 403, el servicio limpia automáticamente el </w:t>
-      </w:r>
-      <w:proofErr w:type="spellStart"/>
-      <w:r>
-        <w:t>AsyncStorage</w:t>
-      </w:r>
-      <w:proofErr w:type="spellEnd"/>
-      <w:r>
-        <w:t>, destruyendo la sesión inválida.</w:t>
+        <w:t>Implementa una barrera de seguridad: si el servidor responde con error 401 o 403, el servicio limpia automáticamente el AsyncStorage, destruyendo la sesión inválida.</w:t>
       </w:r>
     </w:p>
     <w:p>
@@ -3210,31 +1563,7 @@
         </w:numPr>
       </w:pPr>
       <w:r>
-        <w:t>El _</w:t>
-      </w:r>
-      <w:proofErr w:type="spellStart"/>
-      <w:r>
-        <w:t>layout.tsx</w:t>
-      </w:r>
-      <w:proofErr w:type="spellEnd"/>
-      <w:r>
-        <w:t xml:space="preserve"> envuelve todo tu proyecto con </w:t>
-      </w:r>
-      <w:proofErr w:type="spellStart"/>
-      <w:r>
-        <w:t>ThemeProvider</w:t>
-      </w:r>
-      <w:proofErr w:type="spellEnd"/>
-      <w:r>
-        <w:t xml:space="preserve"> y </w:t>
-      </w:r>
-      <w:proofErr w:type="spellStart"/>
-      <w:r>
-        <w:t>AuthProvider</w:t>
-      </w:r>
-      <w:proofErr w:type="spellEnd"/>
-      <w:r>
-        <w:t xml:space="preserve"> para que cualquier pantalla tenga acceso a esos datos.</w:t>
+        <w:t>El _layout.tsx envuelve todo tu proyecto con ThemeProvider y AuthProvider para que cualquier pantalla tenga acceso a esos datos.</w:t>
       </w:r>
     </w:p>
     <w:p>
@@ -3245,39 +1574,7 @@
         </w:numPr>
       </w:pPr>
       <w:r>
-        <w:t xml:space="preserve">El componente </w:t>
-      </w:r>
-      <w:proofErr w:type="spellStart"/>
-      <w:r>
-        <w:t>RootNavigation</w:t>
-      </w:r>
-      <w:proofErr w:type="spellEnd"/>
-      <w:r>
-        <w:t xml:space="preserve"> escucha los cambios del </w:t>
-      </w:r>
-      <w:proofErr w:type="spellStart"/>
-      <w:r>
-        <w:t>AuthContext</w:t>
-      </w:r>
-      <w:proofErr w:type="spellEnd"/>
-      <w:r>
-        <w:t xml:space="preserve"> y utiliza </w:t>
-      </w:r>
-      <w:proofErr w:type="spellStart"/>
-      <w:r>
-        <w:t>useSegments</w:t>
-      </w:r>
-      <w:proofErr w:type="spellEnd"/>
-      <w:r>
-        <w:t xml:space="preserve"> de Expo </w:t>
-      </w:r>
-      <w:proofErr w:type="spellStart"/>
-      <w:r>
-        <w:t>Router</w:t>
-      </w:r>
-      <w:proofErr w:type="spellEnd"/>
-      <w:r>
-        <w:t xml:space="preserve"> para saber en qué carpeta se encuentra el usuario.</w:t>
+        <w:t>El componente RootNavigation escucha los cambios del AuthContext y utiliza useSegments de Expo Router para saber en qué carpeta se encuentra el usuario.</w:t>
       </w:r>
     </w:p>
     <w:p>
@@ -3288,31 +1585,7 @@
         </w:numPr>
       </w:pPr>
       <w:r>
-        <w:t>Si no hay token y el usuario no está en el grupo (</w:t>
-      </w:r>
-      <w:proofErr w:type="spellStart"/>
-      <w:r>
-        <w:t>auth</w:t>
-      </w:r>
-      <w:proofErr w:type="spellEnd"/>
-      <w:r>
-        <w:t xml:space="preserve">), utiliza </w:t>
-      </w:r>
-      <w:proofErr w:type="spellStart"/>
-      <w:r>
-        <w:t>router.replace</w:t>
-      </w:r>
-      <w:proofErr w:type="spellEnd"/>
-      <w:r>
-        <w:t xml:space="preserve"> para expulsarlo obligatoriamente a la pantalla de </w:t>
-      </w:r>
-      <w:proofErr w:type="spellStart"/>
-      <w:r>
-        <w:t>login</w:t>
-      </w:r>
-      <w:proofErr w:type="spellEnd"/>
-      <w:r>
-        <w:t>.</w:t>
+        <w:t>Si no hay token y el usuario no está en el grupo (auth), utiliza router.replace para expulsarlo obligatoriamente a la pantalla de login.</w:t>
       </w:r>
     </w:p>
     <w:p>
@@ -3323,15 +1596,7 @@
         </w:numPr>
       </w:pPr>
       <w:r>
-        <w:t>Si hay token y el usuario intenta ir a una pantalla pública, el sistema lo redirige inmediatamente a /(</w:t>
-      </w:r>
-      <w:proofErr w:type="spellStart"/>
-      <w:r>
-        <w:t>dashboard</w:t>
-      </w:r>
-      <w:proofErr w:type="spellEnd"/>
-      <w:r>
-        <w:t>)/home.</w:t>
+        <w:t>Si hay token y el usuario intenta ir a una pantalla pública, el sistema lo redirige inmediatamente a /(dashboard)/home.</w:t>
       </w:r>
     </w:p>
     <w:p>
@@ -3342,31 +1607,7 @@
         </w:numPr>
       </w:pPr>
       <w:r>
-        <w:t xml:space="preserve">El archivo </w:t>
-      </w:r>
-      <w:proofErr w:type="spellStart"/>
-      <w:r>
-        <w:t>index.tsx</w:t>
-      </w:r>
-      <w:proofErr w:type="spellEnd"/>
-      <w:r>
-        <w:t xml:space="preserve"> de la raíz funciona como una pantalla de paso temporal, mostrando un </w:t>
-      </w:r>
-      <w:proofErr w:type="spellStart"/>
-      <w:r>
-        <w:t>ActivityIndicator</w:t>
-      </w:r>
-      <w:proofErr w:type="spellEnd"/>
-      <w:r>
-        <w:t xml:space="preserve"> mientras el _</w:t>
-      </w:r>
-      <w:proofErr w:type="spellStart"/>
-      <w:r>
-        <w:t>layout.tsx</w:t>
-      </w:r>
-      <w:proofErr w:type="spellEnd"/>
-      <w:r>
-        <w:t xml:space="preserve"> decide el destino final del tráfico.</w:t>
+        <w:t>El archivo index.tsx de la raíz funciona como una pantalla de paso temporal, mostrando un ActivityIndicator mientras el _layout.tsx decide el destino final del tráfico.</w:t>
       </w:r>
     </w:p>
     <w:p>
@@ -3397,31 +1638,7 @@
         </w:numPr>
       </w:pPr>
       <w:r>
-        <w:t xml:space="preserve">En </w:t>
-      </w:r>
-      <w:proofErr w:type="spellStart"/>
-      <w:r>
-        <w:t>login.tsx</w:t>
-      </w:r>
-      <w:proofErr w:type="spellEnd"/>
-      <w:r>
-        <w:t xml:space="preserve">, utilizas </w:t>
-      </w:r>
-      <w:proofErr w:type="spellStart"/>
-      <w:r>
-        <w:t>KeyboardAvoidingView</w:t>
-      </w:r>
-      <w:proofErr w:type="spellEnd"/>
-      <w:r>
-        <w:t xml:space="preserve"> y </w:t>
-      </w:r>
-      <w:proofErr w:type="spellStart"/>
-      <w:r>
-        <w:t>ScrollView</w:t>
-      </w:r>
-      <w:proofErr w:type="spellEnd"/>
-      <w:r>
-        <w:t xml:space="preserve"> para asegurar que el teclado virtual del teléfono no oculte los campos de correo o contraseña al escribir.</w:t>
+        <w:t>En login.tsx, utilizas KeyboardAvoidingView y ScrollView para asegurar que el teclado virtual del teléfono no oculte los campos de correo o contraseña al escribir.</w:t>
       </w:r>
     </w:p>
     <w:p>
@@ -3432,15 +1649,7 @@
         </w:numPr>
       </w:pPr>
       <w:r>
-        <w:t xml:space="preserve">El botón de inicio de sesión desactiva su función y muestra un indicador de carga nativo cuando el estado </w:t>
-      </w:r>
-      <w:proofErr w:type="spellStart"/>
-      <w:r>
-        <w:t>isSubmitting</w:t>
-      </w:r>
-      <w:proofErr w:type="spellEnd"/>
-      <w:r>
-        <w:t xml:space="preserve"> es verdadero.</w:t>
+        <w:t>El botón de inicio de sesión desactiva su función y muestra un indicador de carga nativo cuando el estado isSubmitting es verdadero.</w:t>
       </w:r>
     </w:p>
     <w:p>
@@ -3451,31 +1660,7 @@
         </w:numPr>
       </w:pPr>
       <w:r>
-        <w:t xml:space="preserve">El </w:t>
-      </w:r>
-      <w:proofErr w:type="spellStart"/>
-      <w:r>
-        <w:t>home.tsx</w:t>
-      </w:r>
-      <w:proofErr w:type="spellEnd"/>
-      <w:r>
-        <w:t xml:space="preserve"> emplea un </w:t>
-      </w:r>
-      <w:proofErr w:type="spellStart"/>
-      <w:r>
-        <w:t>SafeAreaView</w:t>
-      </w:r>
-      <w:proofErr w:type="spellEnd"/>
-      <w:r>
-        <w:t xml:space="preserve"> para asegurar que el contenido del </w:t>
-      </w:r>
-      <w:proofErr w:type="spellStart"/>
-      <w:r>
-        <w:t>Dashboard</w:t>
-      </w:r>
-      <w:proofErr w:type="spellEnd"/>
-      <w:r>
-        <w:t xml:space="preserve"> no se superponga con la barra de estado superior o la muesca de la cámara del dispositivo.</w:t>
+        <w:t>El home.tsx emplea un SafeAreaView para asegurar que el contenido del Dashboard no se superponga con la barra de estado superior o la muesca de la cámara del dispositivo.</w:t>
       </w:r>
     </w:p>
     <w:p>
@@ -3486,29 +1671,13 @@
         </w:numPr>
       </w:pPr>
       <w:r>
-        <w:t xml:space="preserve">El </w:t>
-      </w:r>
-      <w:proofErr w:type="spellStart"/>
-      <w:r>
-        <w:t>Dashboard</w:t>
-      </w:r>
-      <w:proofErr w:type="spellEnd"/>
-      <w:r>
-        <w:t xml:space="preserve"> personaliza dinámicamente el saludo extrayendo el primer nombre del usuario y el nombre del </w:t>
-      </w:r>
-      <w:proofErr w:type="spellStart"/>
-      <w:r>
-        <w:t>tenant</w:t>
-      </w:r>
-      <w:proofErr w:type="spellEnd"/>
-      <w:r>
-        <w:t xml:space="preserve"> directamente desde el contexto de autenticación.</w:t>
+        <w:t>El Dashboard personaliza dinámicamente el saludo extrayendo el primer nombre del usuario y el nombre del tenant directamente desde el contexto de autenticación.</w:t>
       </w:r>
     </w:p>
     <w:p>
       <w:r>
         <w:pict w14:anchorId="7E52D267">
-          <v:rect id="_x0000_i1039" style="width:0;height:1.5pt" o:hralign="center" o:hrstd="t" o:hr="t" fillcolor="#a0a0a0" stroked="f"/>
+          <v:rect id="_x0000_i1033" style="width:0;height:1.5pt" o:hralign="center" o:hrstd="t" o:hr="t" fillcolor="#a0a0a0" stroked="f"/>
         </w:pict>
       </w:r>
     </w:p>
@@ -3519,6 +1688,281 @@
       </w:r>
     </w:p>
     <w:p/>
+    <w:p>
+      <w:r>
+        <w:t>¡Hola, Aqua! Este fragmento de código es el corazón de la puerta de entrada a tu aplicación móvil. Aunque parece sencillo, concentra toda la arquitectura de seguridad, la experiencia de usuario y la navegación reactiva que construimos para tu sistema.</w:t>
+      </w:r>
+    </w:p>
+    <w:p>
+      <w:pPr>
+        <w:rPr>
+          <w:lang w:val="en-US"/>
+        </w:rPr>
+      </w:pPr>
+      <w:r>
+        <w:rPr>
+          <w:lang w:val="en-US"/>
+        </w:rPr>
+        <w:t>aqua-mobile\app\(auth)\login.tsx</w:t>
+      </w:r>
+    </w:p>
+    <w:p>
+      <w:r>
+        <w:t>Aquí te desgloso paso a paso exactamente qué hace cada pieza de este bloque:</w:t>
+      </w:r>
+    </w:p>
+    <w:p>
+      <w:pPr>
+        <w:rPr>
+          <w:b/>
+          <w:bCs/>
+        </w:rPr>
+      </w:pPr>
+      <w:r>
+        <w:rPr>
+          <w:b/>
+          <w:bCs/>
+        </w:rPr>
+        <w:t>1. El Semáforo Interno (isSubmitting)</w:t>
+      </w:r>
+    </w:p>
+    <w:p>
+      <w:r>
+        <w:t>Justo arriba, inicializas estados para el email y password, pero el más importante para la interfaz es isSubmitting.</w:t>
+      </w:r>
+    </w:p>
+    <w:p>
+      <w:pPr>
+        <w:numPr>
+          <w:ilvl w:val="0"/>
+          <w:numId w:val="22"/>
+        </w:numPr>
+      </w:pPr>
+      <w:r>
+        <w:t>Es un detalle pequeño en el código, pero es absolutamente fundamental para la experiencia de usuario (UX) y la estabilidad de tu aplicación.</w:t>
+      </w:r>
+    </w:p>
+    <w:p>
+      <w:pPr>
+        <w:numPr>
+          <w:ilvl w:val="0"/>
+          <w:numId w:val="22"/>
+        </w:numPr>
+      </w:pPr>
+      <w:r>
+        <w:t>Ese estado funciona como un semáforo interno para tu formulario de inicio de sesión.</w:t>
+      </w:r>
+    </w:p>
+    <w:p>
+      <w:pPr>
+        <w:numPr>
+          <w:ilvl w:val="0"/>
+          <w:numId w:val="22"/>
+        </w:numPr>
+      </w:pPr>
+      <w:r>
+        <w:rPr>
+          <w:b/>
+          <w:bCs/>
+        </w:rPr>
+        <w:t>Retroalimentación Visual:</w:t>
+      </w:r>
+      <w:r>
+        <w:t xml:space="preserve"> El botón de inicio de sesión desactiva su función y muestra un indicador de carga nativo cuando el estado isSubmitting es verdadero. Esto le avisa visualmente al usuario que la solicitud se está procesando, evitando que piense que la aplicación se quedó congelada.</w:t>
+      </w:r>
+    </w:p>
+    <w:p>
+      <w:pPr>
+        <w:numPr>
+          <w:ilvl w:val="0"/>
+          <w:numId w:val="22"/>
+        </w:numPr>
+      </w:pPr>
+      <w:r>
+        <w:rPr>
+          <w:b/>
+          <w:bCs/>
+        </w:rPr>
+        <w:t>Prevención de duplicados:</w:t>
+      </w:r>
+      <w:r>
+        <w:t xml:space="preserve"> Si no tuvieras este estado, un usuario impaciente podría tocar el botón varias veces seguidas, disparando peticiones simultáneas ineficientes que pueden causar errores de red. Al usar isSubmitting, bloqueas el botón tras el primer toque.</w:t>
+      </w:r>
+    </w:p>
+    <w:p>
+      <w:pPr>
+        <w:rPr>
+          <w:b/>
+          <w:bCs/>
+        </w:rPr>
+      </w:pPr>
+      <w:r>
+        <w:rPr>
+          <w:b/>
+          <w:bCs/>
+        </w:rPr>
+        <w:t>2. La Llamada Segura (apiFetch)</w:t>
+      </w:r>
+    </w:p>
+    <w:p>
+      <w:r>
+        <w:t>Cuando el usuario pasa la validación básica (que no haya campos vacíos), el código enciende el "semáforo" (setIsSubmitting(true)) y hace la llamada a tu API.</w:t>
+      </w:r>
+    </w:p>
+    <w:p>
+      <w:pPr>
+        <w:numPr>
+          <w:ilvl w:val="0"/>
+          <w:numId w:val="23"/>
+        </w:numPr>
+      </w:pPr>
+      <w:r>
+        <w:t>En lugar de usar un fetch tradicional, usas tu cliente centralizado apiFetch.</w:t>
+      </w:r>
+    </w:p>
+    <w:p>
+      <w:pPr>
+        <w:numPr>
+          <w:ilvl w:val="0"/>
+          <w:numId w:val="23"/>
+        </w:numPr>
+      </w:pPr>
+      <w:r>
+        <w:t>Esto garantiza que la aplicación móvil apunte a la IP correcta de tu servidor local (o a la nube en producción) adaptada al entorno del teléfono.</w:t>
+      </w:r>
+    </w:p>
+    <w:p>
+      <w:pPr>
+        <w:rPr>
+          <w:b/>
+          <w:bCs/>
+        </w:rPr>
+      </w:pPr>
+      <w:r>
+        <w:rPr>
+          <w:b/>
+          <w:bCs/>
+        </w:rPr>
+        <w:lastRenderedPageBreak/>
+        <w:t>3. El Cerebro Global (useAuth y login)</w:t>
+      </w:r>
+    </w:p>
+    <w:p>
+      <w:r>
+        <w:t>Una vez que el backend responde con éxito (entregando el token y los datos del usuario), entra en acción tu contexto global.</w:t>
+      </w:r>
+    </w:p>
+    <w:p>
+      <w:pPr>
+        <w:numPr>
+          <w:ilvl w:val="0"/>
+          <w:numId w:val="24"/>
+        </w:numPr>
+      </w:pPr>
+      <w:r>
+        <w:t>La función await login(...) toma esos datos y los guarda de forma segura en la memoria interna del teléfono usando AsyncStorage (el equivalente móvil del localStorage web).</w:t>
+      </w:r>
+    </w:p>
+    <w:p>
+      <w:pPr>
+        <w:numPr>
+          <w:ilvl w:val="0"/>
+          <w:numId w:val="24"/>
+        </w:numPr>
+      </w:pPr>
+      <w:r>
+        <w:t>Fíjate que también pasas response.requirePasswordChange. Esto es vital para tu sistema SaaS, ya que levanta una bandera en el estado global si el usuario entró con una contraseña genérica y necesita ser encerrado en la pantalla de cambio de clave.</w:t>
+      </w:r>
+    </w:p>
+    <w:p>
+      <w:pPr>
+        <w:rPr>
+          <w:b/>
+          <w:bCs/>
+        </w:rPr>
+      </w:pPr>
+      <w:r>
+        <w:rPr>
+          <w:b/>
+          <w:bCs/>
+        </w:rPr>
+        <w:t>4. La "Magia" de la Navegación Móvil</w:t>
+      </w:r>
+    </w:p>
+    <w:p>
+      <w:r>
+        <w:t xml:space="preserve">Notarás que después de llamar a login(), </w:t>
+      </w:r>
+      <w:r>
+        <w:rPr>
+          <w:b/>
+          <w:bCs/>
+        </w:rPr>
+        <w:t>no hay ninguna línea de código que diga "ir a la pantalla Home"</w:t>
+      </w:r>
+      <w:r>
+        <w:t>. Esto no es un error, es la mejor práctica en aplicaciones móviles modernas:</w:t>
+      </w:r>
+    </w:p>
+    <w:p>
+      <w:pPr>
+        <w:numPr>
+          <w:ilvl w:val="0"/>
+          <w:numId w:val="25"/>
+        </w:numPr>
+      </w:pPr>
+      <w:r>
+        <w:t>En móviles, la navegación se maneja reaccionando al estado: si hay token, el enrutador muestra el Dashboard; si no hay, muestra el Login.</w:t>
+      </w:r>
+    </w:p>
+    <w:p>
+      <w:pPr>
+        <w:numPr>
+          <w:ilvl w:val="0"/>
+          <w:numId w:val="25"/>
+        </w:numPr>
+      </w:pPr>
+      <w:r>
+        <w:t>Tu archivo raíz _layout.tsx (el "semáforo inteligente") está escuchando constantemente el AuthContext. Al guardar el token, el layout lo detecta al instante y expulsa al usuario de la pantalla pública hacia la zona protegida.</w:t>
+      </w:r>
+    </w:p>
+    <w:p>
+      <w:pPr>
+        <w:rPr>
+          <w:b/>
+          <w:bCs/>
+        </w:rPr>
+      </w:pPr>
+      <w:r>
+        <w:rPr>
+          <w:b/>
+          <w:bCs/>
+        </w:rPr>
+        <w:t>5. El Apagado Seguro (finally)</w:t>
+      </w:r>
+    </w:p>
+    <w:p>
+      <w:pPr>
+        <w:numPr>
+          <w:ilvl w:val="0"/>
+          <w:numId w:val="26"/>
+        </w:numPr>
+      </w:pPr>
+      <w:r>
+        <w:t>Al final tienes un bloque finally. Esto es mágico porque, sin importar si el usuario entró con éxito (bloque try) o si se equivocó de contraseña y saltó un error (bloque catch), el código siempre pasará por el finally.</w:t>
+      </w:r>
+    </w:p>
+    <w:p>
+      <w:pPr>
+        <w:numPr>
+          <w:ilvl w:val="0"/>
+          <w:numId w:val="26"/>
+        </w:numPr>
+      </w:pPr>
+      <w:r>
+        <w:t>Esto asegura que el botón vuelva a la normalidad (setIsSubmitting(false)) para que pueda volver a intentarlo si falló.</w:t>
+      </w:r>
+    </w:p>
     <w:p/>
     <w:sectPr>
       <w:pgSz w:w="12240" w:h="15840"/>
@@ -3533,6 +1977,155 @@
 <file path=word/numbering.xml><?xml version="1.0" encoding="utf-8"?>
 <w:numbering xmlns:wpc="http://schemas.microsoft.com/office/word/2010/wordprocessingCanvas" xmlns:cx="http://schemas.microsoft.com/office/drawing/2014/chartex" xmlns:cx1="http://schemas.microsoft.com/office/drawing/2015/9/8/chartex" xmlns:cx2="http://schemas.microsoft.com/office/drawing/2015/10/21/chartex" xmlns:cx3="http://schemas.microsoft.com/office/drawing/2016/5/9/chartex" xmlns:cx4="http://schemas.microsoft.com/office/drawing/2016/5/10/chartex" xmlns:cx5="http://schemas.microsoft.com/office/drawing/2016/5/11/chartex" xmlns:cx6="http://schemas.microsoft.com/office/drawing/2016/5/12/chartex" xmlns:cx7="http://schemas.microsoft.com/office/drawing/2016/5/13/chartex" xmlns:cx8="http://schemas.microsoft.com/office/drawing/2016/5/14/chartex" xmlns:mc="http://schemas.openxmlformats.org/markup-compatibility/2006" xmlns:aink="http://schemas.microsoft.com/office/drawing/2016/ink" xmlns:am3d="http://schemas.microsoft.com/office/drawing/2017/model3d" xmlns:o="urn:schemas-microsoft-com:office:office" xmlns:oel="http://schemas.microsoft.com/office/2019/extlst" xmlns:r="http://schemas.openxmlformats.org/officeDocument/2006/relationships" xmlns:m="http://schemas.openxmlformats.org/officeDocument/2006/math" xmlns:v="urn:schemas-microsoft-com:vml" xmlns:wp14="http://schemas.microsoft.com/office/word/2010/wordprocessingDrawing" xmlns:wp="http://schemas.openxmlformats.org/drawingml/2006/wordprocessingDrawing" xmlns:w10="urn:schemas-microsoft-com:office:word" xmlns:w="http://schemas.openxmlformats.org/wordprocessingml/2006/main" xmlns:w14="http://schemas.microsoft.com/office/word/2010/wordml" xmlns:w15="http://schemas.microsoft.com/office/word/2012/wordml" xmlns:w16cex="http://schemas.microsoft.com/office/word/2018/wordml/cex" xmlns:w16cid="http://schemas.microsoft.com/office/word/2016/wordml/cid" xmlns:w16="http://schemas.microsoft.com/office/word/2018/wordml" xmlns:w16du="http://schemas.microsoft.com/office/word/2023/wordml/word16du" xmlns:w16sdtdh="http://schemas.microsoft.com/office/word/2020/wordml/sdtdatahash" xmlns:w16sdtfl="http://schemas.microsoft.com/office/word/2024/wordml/sdtformatlock" xmlns:w16se="http://schemas.microsoft.com/office/word/2015/wordml/symex" xmlns:wpg="http://schemas.microsoft.com/office/word/2010/wordprocessingGroup" xmlns:wpi="http://schemas.microsoft.com/office/word/2010/wordprocessingInk" xmlns:wne="http://schemas.microsoft.com/office/word/2006/wordml" xmlns:wps="http://schemas.microsoft.com/office/word/2010/wordprocessingShape" mc:Ignorable="w14 w15 w16se w16cid w16 w16cex w16sdtdh w16sdtfl w16du wp14">
   <w:abstractNum w:abstractNumId="0" w15:restartNumberingAfterBreak="0">
+    <w:nsid w:val="0E103959"/>
+    <w:multiLevelType w:val="multilevel"/>
+    <w:tmpl w:val="8B12BDE8"/>
+    <w:lvl w:ilvl="0">
+      <w:start w:val="1"/>
+      <w:numFmt w:val="bullet"/>
+      <w:lvlText w:val=""/>
+      <w:lvlJc w:val="left"/>
+      <w:pPr>
+        <w:tabs>
+          <w:tab w:val="num" w:pos="720"/>
+        </w:tabs>
+        <w:ind w:left="720" w:hanging="360"/>
+      </w:pPr>
+      <w:rPr>
+        <w:rFonts w:ascii="Symbol" w:hAnsi="Symbol" w:hint="default"/>
+        <w:sz w:val="20"/>
+      </w:rPr>
+    </w:lvl>
+    <w:lvl w:ilvl="1" w:tentative="1">
+      <w:start w:val="1"/>
+      <w:numFmt w:val="bullet"/>
+      <w:lvlText w:val="o"/>
+      <w:lvlJc w:val="left"/>
+      <w:pPr>
+        <w:tabs>
+          <w:tab w:val="num" w:pos="1440"/>
+        </w:tabs>
+        <w:ind w:left="1440" w:hanging="360"/>
+      </w:pPr>
+      <w:rPr>
+        <w:rFonts w:ascii="Courier New" w:hAnsi="Courier New" w:hint="default"/>
+        <w:sz w:val="20"/>
+      </w:rPr>
+    </w:lvl>
+    <w:lvl w:ilvl="2" w:tentative="1">
+      <w:start w:val="1"/>
+      <w:numFmt w:val="bullet"/>
+      <w:lvlText w:val=""/>
+      <w:lvlJc w:val="left"/>
+      <w:pPr>
+        <w:tabs>
+          <w:tab w:val="num" w:pos="2160"/>
+        </w:tabs>
+        <w:ind w:left="2160" w:hanging="360"/>
+      </w:pPr>
+      <w:rPr>
+        <w:rFonts w:ascii="Wingdings" w:hAnsi="Wingdings" w:hint="default"/>
+        <w:sz w:val="20"/>
+      </w:rPr>
+    </w:lvl>
+    <w:lvl w:ilvl="3" w:tentative="1">
+      <w:start w:val="1"/>
+      <w:numFmt w:val="bullet"/>
+      <w:lvlText w:val=""/>
+      <w:lvlJc w:val="left"/>
+      <w:pPr>
+        <w:tabs>
+          <w:tab w:val="num" w:pos="2880"/>
+        </w:tabs>
+        <w:ind w:left="2880" w:hanging="360"/>
+      </w:pPr>
+      <w:rPr>
+        <w:rFonts w:ascii="Wingdings" w:hAnsi="Wingdings" w:hint="default"/>
+        <w:sz w:val="20"/>
+      </w:rPr>
+    </w:lvl>
+    <w:lvl w:ilvl="4" w:tentative="1">
+      <w:start w:val="1"/>
+      <w:numFmt w:val="bullet"/>
+      <w:lvlText w:val=""/>
+      <w:lvlJc w:val="left"/>
+      <w:pPr>
+        <w:tabs>
+          <w:tab w:val="num" w:pos="3600"/>
+        </w:tabs>
+        <w:ind w:left="3600" w:hanging="360"/>
+      </w:pPr>
+      <w:rPr>
+        <w:rFonts w:ascii="Wingdings" w:hAnsi="Wingdings" w:hint="default"/>
+        <w:sz w:val="20"/>
+      </w:rPr>
+    </w:lvl>
+    <w:lvl w:ilvl="5" w:tentative="1">
+      <w:start w:val="1"/>
+      <w:numFmt w:val="bullet"/>
+      <w:lvlText w:val=""/>
+      <w:lvlJc w:val="left"/>
+      <w:pPr>
+        <w:tabs>
+          <w:tab w:val="num" w:pos="4320"/>
+        </w:tabs>
+        <w:ind w:left="4320" w:hanging="360"/>
+      </w:pPr>
+      <w:rPr>
+        <w:rFonts w:ascii="Wingdings" w:hAnsi="Wingdings" w:hint="default"/>
+        <w:sz w:val="20"/>
+      </w:rPr>
+    </w:lvl>
+    <w:lvl w:ilvl="6" w:tentative="1">
+      <w:start w:val="1"/>
+      <w:numFmt w:val="bullet"/>
+      <w:lvlText w:val=""/>
+      <w:lvlJc w:val="left"/>
+      <w:pPr>
+        <w:tabs>
+          <w:tab w:val="num" w:pos="5040"/>
+        </w:tabs>
+        <w:ind w:left="5040" w:hanging="360"/>
+      </w:pPr>
+      <w:rPr>
+        <w:rFonts w:ascii="Wingdings" w:hAnsi="Wingdings" w:hint="default"/>
+        <w:sz w:val="20"/>
+      </w:rPr>
+    </w:lvl>
+    <w:lvl w:ilvl="7" w:tentative="1">
+      <w:start w:val="1"/>
+      <w:numFmt w:val="bullet"/>
+      <w:lvlText w:val=""/>
+      <w:lvlJc w:val="left"/>
+      <w:pPr>
+        <w:tabs>
+          <w:tab w:val="num" w:pos="5760"/>
+        </w:tabs>
+        <w:ind w:left="5760" w:hanging="360"/>
+      </w:pPr>
+      <w:rPr>
+        <w:rFonts w:ascii="Wingdings" w:hAnsi="Wingdings" w:hint="default"/>
+        <w:sz w:val="20"/>
+      </w:rPr>
+    </w:lvl>
+    <w:lvl w:ilvl="8" w:tentative="1">
+      <w:start w:val="1"/>
+      <w:numFmt w:val="bullet"/>
+      <w:lvlText w:val=""/>
+      <w:lvlJc w:val="left"/>
+      <w:pPr>
+        <w:tabs>
+          <w:tab w:val="num" w:pos="6480"/>
+        </w:tabs>
+        <w:ind w:left="6480" w:hanging="360"/>
+      </w:pPr>
+      <w:rPr>
+        <w:rFonts w:ascii="Wingdings" w:hAnsi="Wingdings" w:hint="default"/>
+        <w:sz w:val="20"/>
+      </w:rPr>
+    </w:lvl>
+  </w:abstractNum>
+  <w:abstractNum w:abstractNumId="1" w15:restartNumberingAfterBreak="0">
     <w:nsid w:val="15825025"/>
     <w:multiLevelType w:val="multilevel"/>
     <w:tmpl w:val="DF86B558"/>
@@ -3681,7 +2274,7 @@
       </w:rPr>
     </w:lvl>
   </w:abstractNum>
-  <w:abstractNum w:abstractNumId="1" w15:restartNumberingAfterBreak="0">
+  <w:abstractNum w:abstractNumId="2" w15:restartNumberingAfterBreak="0">
     <w:nsid w:val="22F264B4"/>
     <w:multiLevelType w:val="multilevel"/>
     <w:tmpl w:val="54C8DD08"/>
@@ -3830,7 +2423,7 @@
       </w:rPr>
     </w:lvl>
   </w:abstractNum>
-  <w:abstractNum w:abstractNumId="2" w15:restartNumberingAfterBreak="0">
+  <w:abstractNum w:abstractNumId="3" w15:restartNumberingAfterBreak="0">
     <w:nsid w:val="26FA7ADA"/>
     <w:multiLevelType w:val="multilevel"/>
     <w:tmpl w:val="AA12DEAA"/>
@@ -3979,7 +2572,156 @@
       </w:rPr>
     </w:lvl>
   </w:abstractNum>
-  <w:abstractNum w:abstractNumId="3" w15:restartNumberingAfterBreak="0">
+  <w:abstractNum w:abstractNumId="4" w15:restartNumberingAfterBreak="0">
+    <w:nsid w:val="2AAF316B"/>
+    <w:multiLevelType w:val="multilevel"/>
+    <w:tmpl w:val="2EFA8B42"/>
+    <w:lvl w:ilvl="0">
+      <w:start w:val="1"/>
+      <w:numFmt w:val="bullet"/>
+      <w:lvlText w:val=""/>
+      <w:lvlJc w:val="left"/>
+      <w:pPr>
+        <w:tabs>
+          <w:tab w:val="num" w:pos="720"/>
+        </w:tabs>
+        <w:ind w:left="720" w:hanging="360"/>
+      </w:pPr>
+      <w:rPr>
+        <w:rFonts w:ascii="Symbol" w:hAnsi="Symbol" w:hint="default"/>
+        <w:sz w:val="20"/>
+      </w:rPr>
+    </w:lvl>
+    <w:lvl w:ilvl="1" w:tentative="1">
+      <w:start w:val="1"/>
+      <w:numFmt w:val="bullet"/>
+      <w:lvlText w:val="o"/>
+      <w:lvlJc w:val="left"/>
+      <w:pPr>
+        <w:tabs>
+          <w:tab w:val="num" w:pos="1440"/>
+        </w:tabs>
+        <w:ind w:left="1440" w:hanging="360"/>
+      </w:pPr>
+      <w:rPr>
+        <w:rFonts w:ascii="Courier New" w:hAnsi="Courier New" w:hint="default"/>
+        <w:sz w:val="20"/>
+      </w:rPr>
+    </w:lvl>
+    <w:lvl w:ilvl="2" w:tentative="1">
+      <w:start w:val="1"/>
+      <w:numFmt w:val="bullet"/>
+      <w:lvlText w:val=""/>
+      <w:lvlJc w:val="left"/>
+      <w:pPr>
+        <w:tabs>
+          <w:tab w:val="num" w:pos="2160"/>
+        </w:tabs>
+        <w:ind w:left="2160" w:hanging="360"/>
+      </w:pPr>
+      <w:rPr>
+        <w:rFonts w:ascii="Wingdings" w:hAnsi="Wingdings" w:hint="default"/>
+        <w:sz w:val="20"/>
+      </w:rPr>
+    </w:lvl>
+    <w:lvl w:ilvl="3" w:tentative="1">
+      <w:start w:val="1"/>
+      <w:numFmt w:val="bullet"/>
+      <w:lvlText w:val=""/>
+      <w:lvlJc w:val="left"/>
+      <w:pPr>
+        <w:tabs>
+          <w:tab w:val="num" w:pos="2880"/>
+        </w:tabs>
+        <w:ind w:left="2880" w:hanging="360"/>
+      </w:pPr>
+      <w:rPr>
+        <w:rFonts w:ascii="Wingdings" w:hAnsi="Wingdings" w:hint="default"/>
+        <w:sz w:val="20"/>
+      </w:rPr>
+    </w:lvl>
+    <w:lvl w:ilvl="4" w:tentative="1">
+      <w:start w:val="1"/>
+      <w:numFmt w:val="bullet"/>
+      <w:lvlText w:val=""/>
+      <w:lvlJc w:val="left"/>
+      <w:pPr>
+        <w:tabs>
+          <w:tab w:val="num" w:pos="3600"/>
+        </w:tabs>
+        <w:ind w:left="3600" w:hanging="360"/>
+      </w:pPr>
+      <w:rPr>
+        <w:rFonts w:ascii="Wingdings" w:hAnsi="Wingdings" w:hint="default"/>
+        <w:sz w:val="20"/>
+      </w:rPr>
+    </w:lvl>
+    <w:lvl w:ilvl="5" w:tentative="1">
+      <w:start w:val="1"/>
+      <w:numFmt w:val="bullet"/>
+      <w:lvlText w:val=""/>
+      <w:lvlJc w:val="left"/>
+      <w:pPr>
+        <w:tabs>
+          <w:tab w:val="num" w:pos="4320"/>
+        </w:tabs>
+        <w:ind w:left="4320" w:hanging="360"/>
+      </w:pPr>
+      <w:rPr>
+        <w:rFonts w:ascii="Wingdings" w:hAnsi="Wingdings" w:hint="default"/>
+        <w:sz w:val="20"/>
+      </w:rPr>
+    </w:lvl>
+    <w:lvl w:ilvl="6" w:tentative="1">
+      <w:start w:val="1"/>
+      <w:numFmt w:val="bullet"/>
+      <w:lvlText w:val=""/>
+      <w:lvlJc w:val="left"/>
+      <w:pPr>
+        <w:tabs>
+          <w:tab w:val="num" w:pos="5040"/>
+        </w:tabs>
+        <w:ind w:left="5040" w:hanging="360"/>
+      </w:pPr>
+      <w:rPr>
+        <w:rFonts w:ascii="Wingdings" w:hAnsi="Wingdings" w:hint="default"/>
+        <w:sz w:val="20"/>
+      </w:rPr>
+    </w:lvl>
+    <w:lvl w:ilvl="7" w:tentative="1">
+      <w:start w:val="1"/>
+      <w:numFmt w:val="bullet"/>
+      <w:lvlText w:val=""/>
+      <w:lvlJc w:val="left"/>
+      <w:pPr>
+        <w:tabs>
+          <w:tab w:val="num" w:pos="5760"/>
+        </w:tabs>
+        <w:ind w:left="5760" w:hanging="360"/>
+      </w:pPr>
+      <w:rPr>
+        <w:rFonts w:ascii="Wingdings" w:hAnsi="Wingdings" w:hint="default"/>
+        <w:sz w:val="20"/>
+      </w:rPr>
+    </w:lvl>
+    <w:lvl w:ilvl="8" w:tentative="1">
+      <w:start w:val="1"/>
+      <w:numFmt w:val="bullet"/>
+      <w:lvlText w:val=""/>
+      <w:lvlJc w:val="left"/>
+      <w:pPr>
+        <w:tabs>
+          <w:tab w:val="num" w:pos="6480"/>
+        </w:tabs>
+        <w:ind w:left="6480" w:hanging="360"/>
+      </w:pPr>
+      <w:rPr>
+        <w:rFonts w:ascii="Wingdings" w:hAnsi="Wingdings" w:hint="default"/>
+        <w:sz w:val="20"/>
+      </w:rPr>
+    </w:lvl>
+  </w:abstractNum>
+  <w:abstractNum w:abstractNumId="5" w15:restartNumberingAfterBreak="0">
     <w:nsid w:val="2DB7777F"/>
     <w:multiLevelType w:val="multilevel"/>
     <w:tmpl w:val="11D22D08"/>
@@ -4128,7 +2870,7 @@
       </w:rPr>
     </w:lvl>
   </w:abstractNum>
-  <w:abstractNum w:abstractNumId="4" w15:restartNumberingAfterBreak="0">
+  <w:abstractNum w:abstractNumId="6" w15:restartNumberingAfterBreak="0">
     <w:nsid w:val="301E2FAD"/>
     <w:multiLevelType w:val="multilevel"/>
     <w:tmpl w:val="73502F30"/>
@@ -4277,7 +3019,7 @@
       </w:rPr>
     </w:lvl>
   </w:abstractNum>
-  <w:abstractNum w:abstractNumId="5" w15:restartNumberingAfterBreak="0">
+  <w:abstractNum w:abstractNumId="7" w15:restartNumberingAfterBreak="0">
     <w:nsid w:val="3AB27B83"/>
     <w:multiLevelType w:val="multilevel"/>
     <w:tmpl w:val="4748EA76"/>
@@ -4426,7 +3168,7 @@
       </w:rPr>
     </w:lvl>
   </w:abstractNum>
-  <w:abstractNum w:abstractNumId="6" w15:restartNumberingAfterBreak="0">
+  <w:abstractNum w:abstractNumId="8" w15:restartNumberingAfterBreak="0">
     <w:nsid w:val="3C821053"/>
     <w:multiLevelType w:val="multilevel"/>
     <w:tmpl w:val="C850357A"/>
@@ -4575,7 +3317,156 @@
       </w:rPr>
     </w:lvl>
   </w:abstractNum>
-  <w:abstractNum w:abstractNumId="7" w15:restartNumberingAfterBreak="0">
+  <w:abstractNum w:abstractNumId="9" w15:restartNumberingAfterBreak="0">
+    <w:nsid w:val="3CA9614E"/>
+    <w:multiLevelType w:val="multilevel"/>
+    <w:tmpl w:val="85DE0762"/>
+    <w:lvl w:ilvl="0">
+      <w:start w:val="1"/>
+      <w:numFmt w:val="bullet"/>
+      <w:lvlText w:val=""/>
+      <w:lvlJc w:val="left"/>
+      <w:pPr>
+        <w:tabs>
+          <w:tab w:val="num" w:pos="720"/>
+        </w:tabs>
+        <w:ind w:left="720" w:hanging="360"/>
+      </w:pPr>
+      <w:rPr>
+        <w:rFonts w:ascii="Symbol" w:hAnsi="Symbol" w:hint="default"/>
+        <w:sz w:val="20"/>
+      </w:rPr>
+    </w:lvl>
+    <w:lvl w:ilvl="1" w:tentative="1">
+      <w:start w:val="1"/>
+      <w:numFmt w:val="bullet"/>
+      <w:lvlText w:val="o"/>
+      <w:lvlJc w:val="left"/>
+      <w:pPr>
+        <w:tabs>
+          <w:tab w:val="num" w:pos="1440"/>
+        </w:tabs>
+        <w:ind w:left="1440" w:hanging="360"/>
+      </w:pPr>
+      <w:rPr>
+        <w:rFonts w:ascii="Courier New" w:hAnsi="Courier New" w:hint="default"/>
+        <w:sz w:val="20"/>
+      </w:rPr>
+    </w:lvl>
+    <w:lvl w:ilvl="2" w:tentative="1">
+      <w:start w:val="1"/>
+      <w:numFmt w:val="bullet"/>
+      <w:lvlText w:val=""/>
+      <w:lvlJc w:val="left"/>
+      <w:pPr>
+        <w:tabs>
+          <w:tab w:val="num" w:pos="2160"/>
+        </w:tabs>
+        <w:ind w:left="2160" w:hanging="360"/>
+      </w:pPr>
+      <w:rPr>
+        <w:rFonts w:ascii="Wingdings" w:hAnsi="Wingdings" w:hint="default"/>
+        <w:sz w:val="20"/>
+      </w:rPr>
+    </w:lvl>
+    <w:lvl w:ilvl="3" w:tentative="1">
+      <w:start w:val="1"/>
+      <w:numFmt w:val="bullet"/>
+      <w:lvlText w:val=""/>
+      <w:lvlJc w:val="left"/>
+      <w:pPr>
+        <w:tabs>
+          <w:tab w:val="num" w:pos="2880"/>
+        </w:tabs>
+        <w:ind w:left="2880" w:hanging="360"/>
+      </w:pPr>
+      <w:rPr>
+        <w:rFonts w:ascii="Wingdings" w:hAnsi="Wingdings" w:hint="default"/>
+        <w:sz w:val="20"/>
+      </w:rPr>
+    </w:lvl>
+    <w:lvl w:ilvl="4" w:tentative="1">
+      <w:start w:val="1"/>
+      <w:numFmt w:val="bullet"/>
+      <w:lvlText w:val=""/>
+      <w:lvlJc w:val="left"/>
+      <w:pPr>
+        <w:tabs>
+          <w:tab w:val="num" w:pos="3600"/>
+        </w:tabs>
+        <w:ind w:left="3600" w:hanging="360"/>
+      </w:pPr>
+      <w:rPr>
+        <w:rFonts w:ascii="Wingdings" w:hAnsi="Wingdings" w:hint="default"/>
+        <w:sz w:val="20"/>
+      </w:rPr>
+    </w:lvl>
+    <w:lvl w:ilvl="5" w:tentative="1">
+      <w:start w:val="1"/>
+      <w:numFmt w:val="bullet"/>
+      <w:lvlText w:val=""/>
+      <w:lvlJc w:val="left"/>
+      <w:pPr>
+        <w:tabs>
+          <w:tab w:val="num" w:pos="4320"/>
+        </w:tabs>
+        <w:ind w:left="4320" w:hanging="360"/>
+      </w:pPr>
+      <w:rPr>
+        <w:rFonts w:ascii="Wingdings" w:hAnsi="Wingdings" w:hint="default"/>
+        <w:sz w:val="20"/>
+      </w:rPr>
+    </w:lvl>
+    <w:lvl w:ilvl="6" w:tentative="1">
+      <w:start w:val="1"/>
+      <w:numFmt w:val="bullet"/>
+      <w:lvlText w:val=""/>
+      <w:lvlJc w:val="left"/>
+      <w:pPr>
+        <w:tabs>
+          <w:tab w:val="num" w:pos="5040"/>
+        </w:tabs>
+        <w:ind w:left="5040" w:hanging="360"/>
+      </w:pPr>
+      <w:rPr>
+        <w:rFonts w:ascii="Wingdings" w:hAnsi="Wingdings" w:hint="default"/>
+        <w:sz w:val="20"/>
+      </w:rPr>
+    </w:lvl>
+    <w:lvl w:ilvl="7" w:tentative="1">
+      <w:start w:val="1"/>
+      <w:numFmt w:val="bullet"/>
+      <w:lvlText w:val=""/>
+      <w:lvlJc w:val="left"/>
+      <w:pPr>
+        <w:tabs>
+          <w:tab w:val="num" w:pos="5760"/>
+        </w:tabs>
+        <w:ind w:left="5760" w:hanging="360"/>
+      </w:pPr>
+      <w:rPr>
+        <w:rFonts w:ascii="Wingdings" w:hAnsi="Wingdings" w:hint="default"/>
+        <w:sz w:val="20"/>
+      </w:rPr>
+    </w:lvl>
+    <w:lvl w:ilvl="8" w:tentative="1">
+      <w:start w:val="1"/>
+      <w:numFmt w:val="bullet"/>
+      <w:lvlText w:val=""/>
+      <w:lvlJc w:val="left"/>
+      <w:pPr>
+        <w:tabs>
+          <w:tab w:val="num" w:pos="6480"/>
+        </w:tabs>
+        <w:ind w:left="6480" w:hanging="360"/>
+      </w:pPr>
+      <w:rPr>
+        <w:rFonts w:ascii="Wingdings" w:hAnsi="Wingdings" w:hint="default"/>
+        <w:sz w:val="20"/>
+      </w:rPr>
+    </w:lvl>
+  </w:abstractNum>
+  <w:abstractNum w:abstractNumId="10" w15:restartNumberingAfterBreak="0">
     <w:nsid w:val="44DA1705"/>
     <w:multiLevelType w:val="multilevel"/>
     <w:tmpl w:val="90C45654"/>
@@ -4724,7 +3615,7 @@
       </w:rPr>
     </w:lvl>
   </w:abstractNum>
-  <w:abstractNum w:abstractNumId="8" w15:restartNumberingAfterBreak="0">
+  <w:abstractNum w:abstractNumId="11" w15:restartNumberingAfterBreak="0">
     <w:nsid w:val="46BB3644"/>
     <w:multiLevelType w:val="multilevel"/>
     <w:tmpl w:val="1E8C2F32"/>
@@ -4873,7 +3764,7 @@
       </w:rPr>
     </w:lvl>
   </w:abstractNum>
-  <w:abstractNum w:abstractNumId="9" w15:restartNumberingAfterBreak="0">
+  <w:abstractNum w:abstractNumId="12" w15:restartNumberingAfterBreak="0">
     <w:nsid w:val="504B0431"/>
     <w:multiLevelType w:val="multilevel"/>
     <w:tmpl w:val="E58E17B0"/>
@@ -5022,7 +3913,7 @@
       </w:rPr>
     </w:lvl>
   </w:abstractNum>
-  <w:abstractNum w:abstractNumId="10" w15:restartNumberingAfterBreak="0">
+  <w:abstractNum w:abstractNumId="13" w15:restartNumberingAfterBreak="0">
     <w:nsid w:val="55794DD6"/>
     <w:multiLevelType w:val="multilevel"/>
     <w:tmpl w:val="AEB4B5C4"/>
@@ -5171,7 +4062,7 @@
       </w:rPr>
     </w:lvl>
   </w:abstractNum>
-  <w:abstractNum w:abstractNumId="11" w15:restartNumberingAfterBreak="0">
+  <w:abstractNum w:abstractNumId="14" w15:restartNumberingAfterBreak="0">
     <w:nsid w:val="59666CA0"/>
     <w:multiLevelType w:val="multilevel"/>
     <w:tmpl w:val="16783740"/>
@@ -5320,7 +4211,7 @@
       </w:rPr>
     </w:lvl>
   </w:abstractNum>
-  <w:abstractNum w:abstractNumId="12" w15:restartNumberingAfterBreak="0">
+  <w:abstractNum w:abstractNumId="15" w15:restartNumberingAfterBreak="0">
     <w:nsid w:val="5FB91384"/>
     <w:multiLevelType w:val="multilevel"/>
     <w:tmpl w:val="BE86C038"/>
@@ -5469,7 +4360,156 @@
       </w:rPr>
     </w:lvl>
   </w:abstractNum>
-  <w:abstractNum w:abstractNumId="13" w15:restartNumberingAfterBreak="0">
+  <w:abstractNum w:abstractNumId="16" w15:restartNumberingAfterBreak="0">
+    <w:nsid w:val="62872CC3"/>
+    <w:multiLevelType w:val="multilevel"/>
+    <w:tmpl w:val="03CCE366"/>
+    <w:lvl w:ilvl="0">
+      <w:start w:val="1"/>
+      <w:numFmt w:val="bullet"/>
+      <w:lvlText w:val=""/>
+      <w:lvlJc w:val="left"/>
+      <w:pPr>
+        <w:tabs>
+          <w:tab w:val="num" w:pos="720"/>
+        </w:tabs>
+        <w:ind w:left="720" w:hanging="360"/>
+      </w:pPr>
+      <w:rPr>
+        <w:rFonts w:ascii="Symbol" w:hAnsi="Symbol" w:hint="default"/>
+        <w:sz w:val="20"/>
+      </w:rPr>
+    </w:lvl>
+    <w:lvl w:ilvl="1" w:tentative="1">
+      <w:start w:val="1"/>
+      <w:numFmt w:val="bullet"/>
+      <w:lvlText w:val="o"/>
+      <w:lvlJc w:val="left"/>
+      <w:pPr>
+        <w:tabs>
+          <w:tab w:val="num" w:pos="1440"/>
+        </w:tabs>
+        <w:ind w:left="1440" w:hanging="360"/>
+      </w:pPr>
+      <w:rPr>
+        <w:rFonts w:ascii="Courier New" w:hAnsi="Courier New" w:hint="default"/>
+        <w:sz w:val="20"/>
+      </w:rPr>
+    </w:lvl>
+    <w:lvl w:ilvl="2" w:tentative="1">
+      <w:start w:val="1"/>
+      <w:numFmt w:val="bullet"/>
+      <w:lvlText w:val=""/>
+      <w:lvlJc w:val="left"/>
+      <w:pPr>
+        <w:tabs>
+          <w:tab w:val="num" w:pos="2160"/>
+        </w:tabs>
+        <w:ind w:left="2160" w:hanging="360"/>
+      </w:pPr>
+      <w:rPr>
+        <w:rFonts w:ascii="Wingdings" w:hAnsi="Wingdings" w:hint="default"/>
+        <w:sz w:val="20"/>
+      </w:rPr>
+    </w:lvl>
+    <w:lvl w:ilvl="3" w:tentative="1">
+      <w:start w:val="1"/>
+      <w:numFmt w:val="bullet"/>
+      <w:lvlText w:val=""/>
+      <w:lvlJc w:val="left"/>
+      <w:pPr>
+        <w:tabs>
+          <w:tab w:val="num" w:pos="2880"/>
+        </w:tabs>
+        <w:ind w:left="2880" w:hanging="360"/>
+      </w:pPr>
+      <w:rPr>
+        <w:rFonts w:ascii="Wingdings" w:hAnsi="Wingdings" w:hint="default"/>
+        <w:sz w:val="20"/>
+      </w:rPr>
+    </w:lvl>
+    <w:lvl w:ilvl="4" w:tentative="1">
+      <w:start w:val="1"/>
+      <w:numFmt w:val="bullet"/>
+      <w:lvlText w:val=""/>
+      <w:lvlJc w:val="left"/>
+      <w:pPr>
+        <w:tabs>
+          <w:tab w:val="num" w:pos="3600"/>
+        </w:tabs>
+        <w:ind w:left="3600" w:hanging="360"/>
+      </w:pPr>
+      <w:rPr>
+        <w:rFonts w:ascii="Wingdings" w:hAnsi="Wingdings" w:hint="default"/>
+        <w:sz w:val="20"/>
+      </w:rPr>
+    </w:lvl>
+    <w:lvl w:ilvl="5" w:tentative="1">
+      <w:start w:val="1"/>
+      <w:numFmt w:val="bullet"/>
+      <w:lvlText w:val=""/>
+      <w:lvlJc w:val="left"/>
+      <w:pPr>
+        <w:tabs>
+          <w:tab w:val="num" w:pos="4320"/>
+        </w:tabs>
+        <w:ind w:left="4320" w:hanging="360"/>
+      </w:pPr>
+      <w:rPr>
+        <w:rFonts w:ascii="Wingdings" w:hAnsi="Wingdings" w:hint="default"/>
+        <w:sz w:val="20"/>
+      </w:rPr>
+    </w:lvl>
+    <w:lvl w:ilvl="6" w:tentative="1">
+      <w:start w:val="1"/>
+      <w:numFmt w:val="bullet"/>
+      <w:lvlText w:val=""/>
+      <w:lvlJc w:val="left"/>
+      <w:pPr>
+        <w:tabs>
+          <w:tab w:val="num" w:pos="5040"/>
+        </w:tabs>
+        <w:ind w:left="5040" w:hanging="360"/>
+      </w:pPr>
+      <w:rPr>
+        <w:rFonts w:ascii="Wingdings" w:hAnsi="Wingdings" w:hint="default"/>
+        <w:sz w:val="20"/>
+      </w:rPr>
+    </w:lvl>
+    <w:lvl w:ilvl="7" w:tentative="1">
+      <w:start w:val="1"/>
+      <w:numFmt w:val="bullet"/>
+      <w:lvlText w:val=""/>
+      <w:lvlJc w:val="left"/>
+      <w:pPr>
+        <w:tabs>
+          <w:tab w:val="num" w:pos="5760"/>
+        </w:tabs>
+        <w:ind w:left="5760" w:hanging="360"/>
+      </w:pPr>
+      <w:rPr>
+        <w:rFonts w:ascii="Wingdings" w:hAnsi="Wingdings" w:hint="default"/>
+        <w:sz w:val="20"/>
+      </w:rPr>
+    </w:lvl>
+    <w:lvl w:ilvl="8" w:tentative="1">
+      <w:start w:val="1"/>
+      <w:numFmt w:val="bullet"/>
+      <w:lvlText w:val=""/>
+      <w:lvlJc w:val="left"/>
+      <w:pPr>
+        <w:tabs>
+          <w:tab w:val="num" w:pos="6480"/>
+        </w:tabs>
+        <w:ind w:left="6480" w:hanging="360"/>
+      </w:pPr>
+      <w:rPr>
+        <w:rFonts w:ascii="Wingdings" w:hAnsi="Wingdings" w:hint="default"/>
+        <w:sz w:val="20"/>
+      </w:rPr>
+    </w:lvl>
+  </w:abstractNum>
+  <w:abstractNum w:abstractNumId="17" w15:restartNumberingAfterBreak="0">
     <w:nsid w:val="6AAC0655"/>
     <w:multiLevelType w:val="multilevel"/>
     <w:tmpl w:val="3BE2C5A6"/>
@@ -5618,7 +4658,7 @@
       </w:rPr>
     </w:lvl>
   </w:abstractNum>
-  <w:abstractNum w:abstractNumId="14" w15:restartNumberingAfterBreak="0">
+  <w:abstractNum w:abstractNumId="18" w15:restartNumberingAfterBreak="0">
     <w:nsid w:val="6D714C61"/>
     <w:multiLevelType w:val="multilevel"/>
     <w:tmpl w:val="F842A196"/>
@@ -5767,7 +4807,7 @@
       </w:rPr>
     </w:lvl>
   </w:abstractNum>
-  <w:abstractNum w:abstractNumId="15" w15:restartNumberingAfterBreak="0">
+  <w:abstractNum w:abstractNumId="19" w15:restartNumberingAfterBreak="0">
     <w:nsid w:val="6F711484"/>
     <w:multiLevelType w:val="multilevel"/>
     <w:tmpl w:val="5CFC99EA"/>
@@ -5916,7 +4956,7 @@
       </w:rPr>
     </w:lvl>
   </w:abstractNum>
-  <w:abstractNum w:abstractNumId="16" w15:restartNumberingAfterBreak="0">
+  <w:abstractNum w:abstractNumId="20" w15:restartNumberingAfterBreak="0">
     <w:nsid w:val="73BE21D9"/>
     <w:multiLevelType w:val="multilevel"/>
     <w:tmpl w:val="86644E40"/>
@@ -6065,7 +5105,156 @@
       </w:rPr>
     </w:lvl>
   </w:abstractNum>
-  <w:abstractNum w:abstractNumId="17" w15:restartNumberingAfterBreak="0">
+  <w:abstractNum w:abstractNumId="21" w15:restartNumberingAfterBreak="0">
+    <w:nsid w:val="76DF2D0D"/>
+    <w:multiLevelType w:val="multilevel"/>
+    <w:tmpl w:val="1152E5B6"/>
+    <w:lvl w:ilvl="0">
+      <w:start w:val="1"/>
+      <w:numFmt w:val="bullet"/>
+      <w:lvlText w:val=""/>
+      <w:lvlJc w:val="left"/>
+      <w:pPr>
+        <w:tabs>
+          <w:tab w:val="num" w:pos="720"/>
+        </w:tabs>
+        <w:ind w:left="720" w:hanging="360"/>
+      </w:pPr>
+      <w:rPr>
+        <w:rFonts w:ascii="Symbol" w:hAnsi="Symbol" w:hint="default"/>
+        <w:sz w:val="20"/>
+      </w:rPr>
+    </w:lvl>
+    <w:lvl w:ilvl="1" w:tentative="1">
+      <w:start w:val="1"/>
+      <w:numFmt w:val="bullet"/>
+      <w:lvlText w:val="o"/>
+      <w:lvlJc w:val="left"/>
+      <w:pPr>
+        <w:tabs>
+          <w:tab w:val="num" w:pos="1440"/>
+        </w:tabs>
+        <w:ind w:left="1440" w:hanging="360"/>
+      </w:pPr>
+      <w:rPr>
+        <w:rFonts w:ascii="Courier New" w:hAnsi="Courier New" w:hint="default"/>
+        <w:sz w:val="20"/>
+      </w:rPr>
+    </w:lvl>
+    <w:lvl w:ilvl="2" w:tentative="1">
+      <w:start w:val="1"/>
+      <w:numFmt w:val="bullet"/>
+      <w:lvlText w:val=""/>
+      <w:lvlJc w:val="left"/>
+      <w:pPr>
+        <w:tabs>
+          <w:tab w:val="num" w:pos="2160"/>
+        </w:tabs>
+        <w:ind w:left="2160" w:hanging="360"/>
+      </w:pPr>
+      <w:rPr>
+        <w:rFonts w:ascii="Wingdings" w:hAnsi="Wingdings" w:hint="default"/>
+        <w:sz w:val="20"/>
+      </w:rPr>
+    </w:lvl>
+    <w:lvl w:ilvl="3" w:tentative="1">
+      <w:start w:val="1"/>
+      <w:numFmt w:val="bullet"/>
+      <w:lvlText w:val=""/>
+      <w:lvlJc w:val="left"/>
+      <w:pPr>
+        <w:tabs>
+          <w:tab w:val="num" w:pos="2880"/>
+        </w:tabs>
+        <w:ind w:left="2880" w:hanging="360"/>
+      </w:pPr>
+      <w:rPr>
+        <w:rFonts w:ascii="Wingdings" w:hAnsi="Wingdings" w:hint="default"/>
+        <w:sz w:val="20"/>
+      </w:rPr>
+    </w:lvl>
+    <w:lvl w:ilvl="4" w:tentative="1">
+      <w:start w:val="1"/>
+      <w:numFmt w:val="bullet"/>
+      <w:lvlText w:val=""/>
+      <w:lvlJc w:val="left"/>
+      <w:pPr>
+        <w:tabs>
+          <w:tab w:val="num" w:pos="3600"/>
+        </w:tabs>
+        <w:ind w:left="3600" w:hanging="360"/>
+      </w:pPr>
+      <w:rPr>
+        <w:rFonts w:ascii="Wingdings" w:hAnsi="Wingdings" w:hint="default"/>
+        <w:sz w:val="20"/>
+      </w:rPr>
+    </w:lvl>
+    <w:lvl w:ilvl="5" w:tentative="1">
+      <w:start w:val="1"/>
+      <w:numFmt w:val="bullet"/>
+      <w:lvlText w:val=""/>
+      <w:lvlJc w:val="left"/>
+      <w:pPr>
+        <w:tabs>
+          <w:tab w:val="num" w:pos="4320"/>
+        </w:tabs>
+        <w:ind w:left="4320" w:hanging="360"/>
+      </w:pPr>
+      <w:rPr>
+        <w:rFonts w:ascii="Wingdings" w:hAnsi="Wingdings" w:hint="default"/>
+        <w:sz w:val="20"/>
+      </w:rPr>
+    </w:lvl>
+    <w:lvl w:ilvl="6" w:tentative="1">
+      <w:start w:val="1"/>
+      <w:numFmt w:val="bullet"/>
+      <w:lvlText w:val=""/>
+      <w:lvlJc w:val="left"/>
+      <w:pPr>
+        <w:tabs>
+          <w:tab w:val="num" w:pos="5040"/>
+        </w:tabs>
+        <w:ind w:left="5040" w:hanging="360"/>
+      </w:pPr>
+      <w:rPr>
+        <w:rFonts w:ascii="Wingdings" w:hAnsi="Wingdings" w:hint="default"/>
+        <w:sz w:val="20"/>
+      </w:rPr>
+    </w:lvl>
+    <w:lvl w:ilvl="7" w:tentative="1">
+      <w:start w:val="1"/>
+      <w:numFmt w:val="bullet"/>
+      <w:lvlText w:val=""/>
+      <w:lvlJc w:val="left"/>
+      <w:pPr>
+        <w:tabs>
+          <w:tab w:val="num" w:pos="5760"/>
+        </w:tabs>
+        <w:ind w:left="5760" w:hanging="360"/>
+      </w:pPr>
+      <w:rPr>
+        <w:rFonts w:ascii="Wingdings" w:hAnsi="Wingdings" w:hint="default"/>
+        <w:sz w:val="20"/>
+      </w:rPr>
+    </w:lvl>
+    <w:lvl w:ilvl="8" w:tentative="1">
+      <w:start w:val="1"/>
+      <w:numFmt w:val="bullet"/>
+      <w:lvlText w:val=""/>
+      <w:lvlJc w:val="left"/>
+      <w:pPr>
+        <w:tabs>
+          <w:tab w:val="num" w:pos="6480"/>
+        </w:tabs>
+        <w:ind w:left="6480" w:hanging="360"/>
+      </w:pPr>
+      <w:rPr>
+        <w:rFonts w:ascii="Wingdings" w:hAnsi="Wingdings" w:hint="default"/>
+        <w:sz w:val="20"/>
+      </w:rPr>
+    </w:lvl>
+  </w:abstractNum>
+  <w:abstractNum w:abstractNumId="22" w15:restartNumberingAfterBreak="0">
     <w:nsid w:val="7B397AF2"/>
     <w:multiLevelType w:val="multilevel"/>
     <w:tmpl w:val="E548BD7E"/>
@@ -6214,7 +5403,7 @@
       </w:rPr>
     </w:lvl>
   </w:abstractNum>
-  <w:abstractNum w:abstractNumId="18" w15:restartNumberingAfterBreak="0">
+  <w:abstractNum w:abstractNumId="23" w15:restartNumberingAfterBreak="0">
     <w:nsid w:val="7DEF14AF"/>
     <w:multiLevelType w:val="multilevel"/>
     <w:tmpl w:val="5C6E4EAA"/>
@@ -6363,7 +5552,7 @@
       </w:rPr>
     </w:lvl>
   </w:abstractNum>
-  <w:abstractNum w:abstractNumId="19" w15:restartNumberingAfterBreak="0">
+  <w:abstractNum w:abstractNumId="24" w15:restartNumberingAfterBreak="0">
     <w:nsid w:val="7E2E0E7E"/>
     <w:multiLevelType w:val="multilevel"/>
     <w:tmpl w:val="56E88AB0"/>
@@ -6476,7 +5665,7 @@
       </w:pPr>
     </w:lvl>
   </w:abstractNum>
-  <w:abstractNum w:abstractNumId="20" w15:restartNumberingAfterBreak="0">
+  <w:abstractNum w:abstractNumId="25" w15:restartNumberingAfterBreak="0">
     <w:nsid w:val="7F972423"/>
     <w:multiLevelType w:val="multilevel"/>
     <w:tmpl w:val="0B1C78C0"/>
@@ -6590,67 +5779,82 @@
     </w:lvl>
   </w:abstractNum>
   <w:num w:numId="1" w16cid:durableId="1676029529">
+    <w:abstractNumId w:val="13"/>
+  </w:num>
+  <w:num w:numId="2" w16cid:durableId="1750498978">
+    <w:abstractNumId w:val="8"/>
+  </w:num>
+  <w:num w:numId="3" w16cid:durableId="1314990887">
+    <w:abstractNumId w:val="15"/>
+  </w:num>
+  <w:num w:numId="4" w16cid:durableId="1607300712">
+    <w:abstractNumId w:val="3"/>
+  </w:num>
+  <w:num w:numId="5" w16cid:durableId="1998222103">
+    <w:abstractNumId w:val="11"/>
+  </w:num>
+  <w:num w:numId="6" w16cid:durableId="1824663458">
+    <w:abstractNumId w:val="25"/>
+  </w:num>
+  <w:num w:numId="7" w16cid:durableId="79907861">
+    <w:abstractNumId w:val="14"/>
+  </w:num>
+  <w:num w:numId="8" w16cid:durableId="306588739">
+    <w:abstractNumId w:val="22"/>
+  </w:num>
+  <w:num w:numId="9" w16cid:durableId="315954786">
     <w:abstractNumId w:val="10"/>
   </w:num>
-  <w:num w:numId="2" w16cid:durableId="1750498978">
+  <w:num w:numId="10" w16cid:durableId="220140427">
+    <w:abstractNumId w:val="12"/>
+  </w:num>
+  <w:num w:numId="11" w16cid:durableId="272130988">
+    <w:abstractNumId w:val="24"/>
+  </w:num>
+  <w:num w:numId="12" w16cid:durableId="656231512">
+    <w:abstractNumId w:val="23"/>
+  </w:num>
+  <w:num w:numId="13" w16cid:durableId="1789156210">
     <w:abstractNumId w:val="6"/>
   </w:num>
-  <w:num w:numId="3" w16cid:durableId="1314990887">
-    <w:abstractNumId w:val="12"/>
+  <w:num w:numId="14" w16cid:durableId="473761800">
+    <w:abstractNumId w:val="19"/>
   </w:num>
-  <w:num w:numId="4" w16cid:durableId="1607300712">
+  <w:num w:numId="15" w16cid:durableId="943421026">
+    <w:abstractNumId w:val="7"/>
+  </w:num>
+  <w:num w:numId="16" w16cid:durableId="254246183">
+    <w:abstractNumId w:val="17"/>
+  </w:num>
+  <w:num w:numId="17" w16cid:durableId="2072119589">
+    <w:abstractNumId w:val="5"/>
+  </w:num>
+  <w:num w:numId="18" w16cid:durableId="669989420">
+    <w:abstractNumId w:val="20"/>
+  </w:num>
+  <w:num w:numId="19" w16cid:durableId="1400595853">
+    <w:abstractNumId w:val="18"/>
+  </w:num>
+  <w:num w:numId="20" w16cid:durableId="428743925">
     <w:abstractNumId w:val="2"/>
   </w:num>
-  <w:num w:numId="5" w16cid:durableId="1998222103">
-    <w:abstractNumId w:val="8"/>
+  <w:num w:numId="21" w16cid:durableId="1029718341">
+    <w:abstractNumId w:val="1"/>
   </w:num>
-  <w:num w:numId="6" w16cid:durableId="1824663458">
-    <w:abstractNumId w:val="20"/>
+  <w:num w:numId="22" w16cid:durableId="932007827">
+    <w:abstractNumId w:val="16"/>
   </w:num>
-  <w:num w:numId="7" w16cid:durableId="79907861">
-    <w:abstractNumId w:val="11"/>
+  <w:num w:numId="23" w16cid:durableId="178468888">
+    <w:abstractNumId w:val="0"/>
   </w:num>
-  <w:num w:numId="8" w16cid:durableId="306588739">
-    <w:abstractNumId w:val="17"/>
-  </w:num>
-  <w:num w:numId="9" w16cid:durableId="315954786">
-    <w:abstractNumId w:val="7"/>
-  </w:num>
-  <w:num w:numId="10" w16cid:durableId="220140427">
-    <w:abstractNumId w:val="9"/>
-  </w:num>
-  <w:num w:numId="11" w16cid:durableId="272130988">
-    <w:abstractNumId w:val="19"/>
-  </w:num>
-  <w:num w:numId="12" w16cid:durableId="656231512">
-    <w:abstractNumId w:val="18"/>
-  </w:num>
-  <w:num w:numId="13" w16cid:durableId="1789156210">
+  <w:num w:numId="24" w16cid:durableId="1817405576">
     <w:abstractNumId w:val="4"/>
   </w:num>
-  <w:num w:numId="14" w16cid:durableId="473761800">
-    <w:abstractNumId w:val="15"/>
+  <w:num w:numId="25" w16cid:durableId="158428488">
+    <w:abstractNumId w:val="21"/>
   </w:num>
-  <w:num w:numId="15" w16cid:durableId="943421026">
-    <w:abstractNumId w:val="5"/>
-  </w:num>
-  <w:num w:numId="16" w16cid:durableId="254246183">
-    <w:abstractNumId w:val="13"/>
-  </w:num>
-  <w:num w:numId="17" w16cid:durableId="2072119589">
-    <w:abstractNumId w:val="3"/>
-  </w:num>
-  <w:num w:numId="18" w16cid:durableId="669989420">
-    <w:abstractNumId w:val="16"/>
-  </w:num>
-  <w:num w:numId="19" w16cid:durableId="1400595853">
-    <w:abstractNumId w:val="14"/>
-  </w:num>
-  <w:num w:numId="20" w16cid:durableId="428743925">
-    <w:abstractNumId w:val="1"/>
-  </w:num>
-  <w:num w:numId="21" w16cid:durableId="1029718341">
-    <w:abstractNumId w:val="0"/>
+  <w:num w:numId="26" w16cid:durableId="1382090745">
+    <w:abstractNumId w:val="9"/>
   </w:num>
 </w:numbering>
 </file>

</xml_diff>

<commit_message>
feat: se implementa CRUD usuarios y comunidades (tenants) en vista SuperAdminView.tsx
</commit_message>
<xml_diff>
--- a/dctos/Aqua Code Bases.docx
+++ b/dctos/Aqua Code Bases.docx
@@ -22,7 +22,39 @@
           <w:b/>
           <w:bCs/>
         </w:rPr>
-        <w:t>1. La Puerta de Entrada: Servidor y Configuración (server.ts y app.ts)</w:t>
+        <w:t>1. La Puerta de Entrada: Servidor y Configuración (</w:t>
+      </w:r>
+      <w:proofErr w:type="spellStart"/>
+      <w:r>
+        <w:rPr>
+          <w:b/>
+          <w:bCs/>
+        </w:rPr>
+        <w:t>server.ts</w:t>
+      </w:r>
+      <w:proofErr w:type="spellEnd"/>
+      <w:r>
+        <w:rPr>
+          <w:b/>
+          <w:bCs/>
+        </w:rPr>
+        <w:t xml:space="preserve"> y </w:t>
+      </w:r>
+      <w:proofErr w:type="spellStart"/>
+      <w:r>
+        <w:rPr>
+          <w:b/>
+          <w:bCs/>
+        </w:rPr>
+        <w:t>app.ts</w:t>
+      </w:r>
+      <w:proofErr w:type="spellEnd"/>
+      <w:r>
+        <w:rPr>
+          <w:b/>
+          <w:bCs/>
+        </w:rPr>
+        <w:t>)</w:t>
       </w:r>
     </w:p>
     <w:p>
@@ -37,15 +69,48 @@
           <w:numId w:val="1"/>
         </w:numPr>
       </w:pPr>
-      <w:r>
-        <w:rPr>
-          <w:b/>
-          <w:bCs/>
-        </w:rPr>
-        <w:t>app.ts:</w:t>
-      </w:r>
-      <w:r>
-        <w:t xml:space="preserve"> Es el núcleo de tu aplicación Express. Aquí configuras las reglas básicas (como CORS para permitir peticiones desde el frontend) y declaras tus módulos principales (ej. /api/auth y /api/tenants).</w:t>
+      <w:proofErr w:type="spellStart"/>
+      <w:r>
+        <w:rPr>
+          <w:b/>
+          <w:bCs/>
+        </w:rPr>
+        <w:t>app.ts</w:t>
+      </w:r>
+      <w:proofErr w:type="spellEnd"/>
+      <w:r>
+        <w:rPr>
+          <w:b/>
+          <w:bCs/>
+        </w:rPr>
+        <w:t>:</w:t>
+      </w:r>
+      <w:r>
+        <w:t xml:space="preserve"> Es el núcleo de tu aplicación Express. Aquí configuras las reglas básicas (como CORS para permitir peticiones desde el </w:t>
+      </w:r>
+      <w:proofErr w:type="spellStart"/>
+      <w:r>
+        <w:t>frontend</w:t>
+      </w:r>
+      <w:proofErr w:type="spellEnd"/>
+      <w:r>
+        <w:t>) y declaras tus módulos principales (ej. /api/</w:t>
+      </w:r>
+      <w:proofErr w:type="spellStart"/>
+      <w:r>
+        <w:t>auth</w:t>
+      </w:r>
+      <w:proofErr w:type="spellEnd"/>
+      <w:r>
+        <w:t xml:space="preserve"> y /api/</w:t>
+      </w:r>
+      <w:proofErr w:type="spellStart"/>
+      <w:r>
+        <w:t>tenants</w:t>
+      </w:r>
+      <w:proofErr w:type="spellEnd"/>
+      <w:r>
+        <w:t>).</w:t>
       </w:r>
     </w:p>
     <w:p>
@@ -55,12 +120,21 @@
           <w:numId w:val="1"/>
         </w:numPr>
       </w:pPr>
-      <w:r>
-        <w:rPr>
-          <w:b/>
-          <w:bCs/>
-        </w:rPr>
-        <w:t>server.ts:</w:t>
+      <w:proofErr w:type="spellStart"/>
+      <w:r>
+        <w:rPr>
+          <w:b/>
+          <w:bCs/>
+        </w:rPr>
+        <w:t>server.ts</w:t>
+      </w:r>
+      <w:proofErr w:type="spellEnd"/>
+      <w:r>
+        <w:rPr>
+          <w:b/>
+          <w:bCs/>
+        </w:rPr>
+        <w:t>:</w:t>
       </w:r>
       <w:r>
         <w:t xml:space="preserve"> Toma esa aplicación de Express y la levanta en un puerto. Además, inicializa </w:t>
@@ -73,7 +147,31 @@
         <w:t>Socket.io</w:t>
       </w:r>
       <w:r>
-        <w:t xml:space="preserve"> y lo inyecta dentro de la instancia de Express usando app.set("io", io) para que la comunicación en tiempo real esté disponible en cualquier parte del sistema de forma limpia.</w:t>
+        <w:t xml:space="preserve"> y lo inyecta dentro de la instancia de Express usando </w:t>
+      </w:r>
+      <w:proofErr w:type="spellStart"/>
+      <w:r>
+        <w:t>app.set</w:t>
+      </w:r>
+      <w:proofErr w:type="spellEnd"/>
+      <w:r>
+        <w:t>("</w:t>
+      </w:r>
+      <w:proofErr w:type="spellStart"/>
+      <w:r>
+        <w:t>io</w:t>
+      </w:r>
+      <w:proofErr w:type="spellEnd"/>
+      <w:r>
+        <w:t xml:space="preserve">", </w:t>
+      </w:r>
+      <w:proofErr w:type="spellStart"/>
+      <w:r>
+        <w:t>io</w:t>
+      </w:r>
+      <w:proofErr w:type="spellEnd"/>
+      <w:r>
+        <w:t>) para que la comunicación en tiempo real esté disponible en cualquier parte del sistema de forma limpia.</w:t>
       </w:r>
     </w:p>
     <w:p>
@@ -95,7 +193,39 @@
           <w:b/>
           <w:bCs/>
         </w:rPr>
-        <w:t>2. El Escudo Protector: Middlewares (auth.middleware.ts y requireSuperadmin.ts)</w:t>
+        <w:t>2. El Escudo Protector: Middlewares (</w:t>
+      </w:r>
+      <w:proofErr w:type="spellStart"/>
+      <w:r>
+        <w:rPr>
+          <w:b/>
+          <w:bCs/>
+        </w:rPr>
+        <w:t>auth.middleware.ts</w:t>
+      </w:r>
+      <w:proofErr w:type="spellEnd"/>
+      <w:r>
+        <w:rPr>
+          <w:b/>
+          <w:bCs/>
+        </w:rPr>
+        <w:t xml:space="preserve"> y </w:t>
+      </w:r>
+      <w:proofErr w:type="spellStart"/>
+      <w:r>
+        <w:rPr>
+          <w:b/>
+          <w:bCs/>
+        </w:rPr>
+        <w:t>requireSuperadmin.ts</w:t>
+      </w:r>
+      <w:proofErr w:type="spellEnd"/>
+      <w:r>
+        <w:rPr>
+          <w:b/>
+          <w:bCs/>
+        </w:rPr>
+        <w:t>)</w:t>
       </w:r>
     </w:p>
     <w:p>
@@ -110,15 +240,32 @@
           <w:numId w:val="2"/>
         </w:numPr>
       </w:pPr>
-      <w:r>
-        <w:rPr>
-          <w:b/>
-          <w:bCs/>
-        </w:rPr>
-        <w:t>verifyToken:</w:t>
-      </w:r>
-      <w:r>
-        <w:t xml:space="preserve"> Lee el token JWT enviado por el frontend, valida que no esté expirado usando tu clave secreta segura (JWT_SECRET) y extrae los datos del usuario (como su ID y su rol).</w:t>
+      <w:proofErr w:type="spellStart"/>
+      <w:r>
+        <w:rPr>
+          <w:b/>
+          <w:bCs/>
+        </w:rPr>
+        <w:t>verifyToken</w:t>
+      </w:r>
+      <w:proofErr w:type="spellEnd"/>
+      <w:r>
+        <w:rPr>
+          <w:b/>
+          <w:bCs/>
+        </w:rPr>
+        <w:t>:</w:t>
+      </w:r>
+      <w:r>
+        <w:t xml:space="preserve"> Lee el token JWT enviado por el </w:t>
+      </w:r>
+      <w:proofErr w:type="spellStart"/>
+      <w:r>
+        <w:t>frontend</w:t>
+      </w:r>
+      <w:proofErr w:type="spellEnd"/>
+      <w:r>
+        <w:t>, valida que no esté expirado usando tu clave secreta segura (JWT_SECRET) y extrae los datos del usuario (como su ID y su rol).</w:t>
       </w:r>
     </w:p>
     <w:p>
@@ -128,12 +275,21 @@
           <w:numId w:val="2"/>
         </w:numPr>
       </w:pPr>
-      <w:r>
-        <w:rPr>
-          <w:b/>
-          <w:bCs/>
-        </w:rPr>
-        <w:t>requireSuperadmin:</w:t>
+      <w:proofErr w:type="spellStart"/>
+      <w:r>
+        <w:rPr>
+          <w:b/>
+          <w:bCs/>
+        </w:rPr>
+        <w:t>requireSuperadmin</w:t>
+      </w:r>
+      <w:proofErr w:type="spellEnd"/>
+      <w:r>
+        <w:rPr>
+          <w:b/>
+          <w:bCs/>
+        </w:rPr>
+        <w:t>:</w:t>
       </w:r>
       <w:r>
         <w:t xml:space="preserve"> Actúa como una segunda barrera para rutas críticas, bloqueando la petición si el usuario que intenta acceder no tiene el rol máximo autorizado.</w:t>
@@ -158,7 +314,23 @@
           <w:b/>
           <w:bCs/>
         </w:rPr>
-        <w:t>3. El Mapa de Rutas (*.routes.ts)</w:t>
+        <w:t>3. El Mapa de Rutas (*.</w:t>
+      </w:r>
+      <w:proofErr w:type="spellStart"/>
+      <w:r>
+        <w:rPr>
+          <w:b/>
+          <w:bCs/>
+        </w:rPr>
+        <w:t>routes.ts</w:t>
+      </w:r>
+      <w:proofErr w:type="spellEnd"/>
+      <w:r>
+        <w:rPr>
+          <w:b/>
+          <w:bCs/>
+        </w:rPr>
+        <w:t>)</w:t>
       </w:r>
     </w:p>
     <w:p>
@@ -174,7 +346,15 @@
         </w:numPr>
       </w:pPr>
       <w:r>
-        <w:t>Cada módulo tiene su propio archivo de rutas (ej. tenant.routes.ts). Este archivo mapea una URL específica y un método (GET, POST, PUT) hacia una función en particular dentro del controlador.</w:t>
+        <w:t xml:space="preserve">Cada módulo tiene su propio archivo de rutas (ej. </w:t>
+      </w:r>
+      <w:proofErr w:type="spellStart"/>
+      <w:r>
+        <w:t>tenant.routes.ts</w:t>
+      </w:r>
+      <w:proofErr w:type="spellEnd"/>
+      <w:r>
+        <w:t>). Este archivo mapea una URL específica y un método (GET, POST, PUT) hacia una función en particular dentro del controlador.</w:t>
       </w:r>
     </w:p>
     <w:p>
@@ -196,13 +376,45 @@
           <w:b/>
           <w:bCs/>
         </w:rPr>
-        <w:t>4. El Director de Orquesta: Controladores (*.controller.ts)</w:t>
+        <w:t>4. El Director de Orquesta: Controladores (*.</w:t>
+      </w:r>
+      <w:proofErr w:type="spellStart"/>
+      <w:r>
+        <w:rPr>
+          <w:b/>
+          <w:bCs/>
+        </w:rPr>
+        <w:t>controller.ts</w:t>
+      </w:r>
+      <w:proofErr w:type="spellEnd"/>
+      <w:r>
+        <w:rPr>
+          <w:b/>
+          <w:bCs/>
+        </w:rPr>
+        <w:t>)</w:t>
       </w:r>
     </w:p>
     <w:p>
       <w:r>
         <w:lastRenderedPageBreak/>
-        <w:t>El controlador es el intermediario. Los controladores solo deben validar los datos de entrada (lo que viene en el req.body) y manejar las respuestas HTTP (como devolver un res.status(200) o un error 500).</w:t>
+        <w:t xml:space="preserve">El controlador es el intermediario. Los controladores solo deben validar los datos de entrada (lo que viene en el </w:t>
+      </w:r>
+      <w:proofErr w:type="spellStart"/>
+      <w:r>
+        <w:t>req.body</w:t>
+      </w:r>
+      <w:proofErr w:type="spellEnd"/>
+      <w:r>
+        <w:t xml:space="preserve">) y manejar las respuestas HTTP (como devolver un </w:t>
+      </w:r>
+      <w:proofErr w:type="spellStart"/>
+      <w:r>
+        <w:t>res.status</w:t>
+      </w:r>
+      <w:proofErr w:type="spellEnd"/>
+      <w:r>
+        <w:t>(200) o un error 500).</w:t>
       </w:r>
     </w:p>
     <w:p>
@@ -238,7 +450,31 @@
         <w:t>Tiempo Real:</w:t>
       </w:r>
       <w:r>
-        <w:t xml:space="preserve"> Una vez que el servicio termina con éxito, el controlador puede usar Socket.io (recuperándolo con req.app.get("io")) para emitir un evento y avisar al frontend que algo cambió, permitiendo que las pantallas se actualicen sin necesidad de recargar.</w:t>
+        <w:t xml:space="preserve"> Una vez que el servicio termina con éxito, el controlador puede usar Socket.io (recuperándolo con </w:t>
+      </w:r>
+      <w:proofErr w:type="spellStart"/>
+      <w:r>
+        <w:t>req.app.get</w:t>
+      </w:r>
+      <w:proofErr w:type="spellEnd"/>
+      <w:r>
+        <w:t>("</w:t>
+      </w:r>
+      <w:proofErr w:type="spellStart"/>
+      <w:r>
+        <w:t>io</w:t>
+      </w:r>
+      <w:proofErr w:type="spellEnd"/>
+      <w:r>
+        <w:t xml:space="preserve">")) para emitir un evento y avisar al </w:t>
+      </w:r>
+      <w:proofErr w:type="spellStart"/>
+      <w:r>
+        <w:t>frontend</w:t>
+      </w:r>
+      <w:proofErr w:type="spellEnd"/>
+      <w:r>
+        <w:t xml:space="preserve"> que algo cambió, permitiendo que las pantallas se actualicen sin necesidad de recargar.</w:t>
       </w:r>
     </w:p>
     <w:p>
@@ -260,7 +496,23 @@
           <w:b/>
           <w:bCs/>
         </w:rPr>
-        <w:t>5. El Cerebro y la Base de Datos: Servicios (*.service.ts) y Prisma</w:t>
+        <w:t>5. El Cerebro y la Base de Datos: Servicios (*.</w:t>
+      </w:r>
+      <w:proofErr w:type="spellStart"/>
+      <w:r>
+        <w:rPr>
+          <w:b/>
+          <w:bCs/>
+        </w:rPr>
+        <w:t>service.ts</w:t>
+      </w:r>
+      <w:proofErr w:type="spellEnd"/>
+      <w:r>
+        <w:rPr>
+          <w:b/>
+          <w:bCs/>
+        </w:rPr>
+        <w:t>) y Prisma</w:t>
       </w:r>
     </w:p>
     <w:p>
@@ -276,7 +528,15 @@
         </w:numPr>
       </w:pPr>
       <w:r>
-        <w:t xml:space="preserve">El archivo de servicio (ej. tenant.service.ts) usa </w:t>
+        <w:t xml:space="preserve">El archivo de servicio (ej. </w:t>
+      </w:r>
+      <w:proofErr w:type="spellStart"/>
+      <w:r>
+        <w:t>tenant.service.ts</w:t>
+      </w:r>
+      <w:proofErr w:type="spellEnd"/>
+      <w:r>
+        <w:t xml:space="preserve">) usa </w:t>
       </w:r>
       <w:r>
         <w:rPr>
@@ -286,7 +546,15 @@
         <w:t>Prisma</w:t>
       </w:r>
       <w:r>
-        <w:t xml:space="preserve"> para hablar con tu base de datos PostgreSQL de forma segura y tipada.</w:t>
+        <w:t xml:space="preserve"> para hablar con tu base de datos PostgreSQL de forma segura y </w:t>
+      </w:r>
+      <w:proofErr w:type="spellStart"/>
+      <w:r>
+        <w:t>tipada</w:t>
+      </w:r>
+      <w:proofErr w:type="spellEnd"/>
+      <w:r>
+        <w:t>.</w:t>
       </w:r>
     </w:p>
     <w:p>
@@ -304,7 +572,23 @@
         <w:t>Transacciones Seguras:</w:t>
       </w:r>
       <w:r>
-        <w:t xml:space="preserve"> Para procesos críticos (como cambiar un plan de suscripción), el servicio utiliza el patrón de Transacciones de Prisma (prisma.$transaction). Esto asegura que si se actualiza la comunidad, obligatoriamente se crea el registro de auditoría en la tabla HistorialTenant; si una de las dos falla, ninguna se guarda, manteniendo tu base de datos siempre consistente.</w:t>
+        <w:t xml:space="preserve"> Para procesos críticos (como cambiar un plan de suscripción), el servicio utiliza el patrón de Transacciones de Prisma (prisma.$</w:t>
+      </w:r>
+      <w:proofErr w:type="spellStart"/>
+      <w:r>
+        <w:t>transaction</w:t>
+      </w:r>
+      <w:proofErr w:type="spellEnd"/>
+      <w:r>
+        <w:t xml:space="preserve">). Esto asegura que si se actualiza la comunidad, obligatoriamente se crea el registro de auditoría en la tabla </w:t>
+      </w:r>
+      <w:proofErr w:type="spellStart"/>
+      <w:r>
+        <w:t>HistorialTenant</w:t>
+      </w:r>
+      <w:proofErr w:type="spellEnd"/>
+      <w:r>
+        <w:t>; si una de las dos falla, ninguna se guarda, manteniendo tu base de datos siempre consistente.</w:t>
       </w:r>
     </w:p>
     <w:p>
@@ -341,6 +625,7 @@
           <w:numId w:val="6"/>
         </w:numPr>
       </w:pPr>
+      <w:proofErr w:type="spellStart"/>
       <w:r>
         <w:rPr>
           <w:b/>
@@ -348,8 +633,17 @@
         </w:rPr>
         <w:t>Frontend</w:t>
       </w:r>
-      <w:r>
-        <w:t xml:space="preserve"> hace un PUT a /api/tenants/1/plan.</w:t>
+      <w:proofErr w:type="spellEnd"/>
+      <w:r>
+        <w:t xml:space="preserve"> hace un PUT a /api/</w:t>
+      </w:r>
+      <w:proofErr w:type="spellStart"/>
+      <w:r>
+        <w:t>tenants</w:t>
+      </w:r>
+      <w:proofErr w:type="spellEnd"/>
+      <w:r>
+        <w:t>/1/plan.</w:t>
       </w:r>
     </w:p>
     <w:p>
@@ -367,7 +661,15 @@
         <w:t>Middlewares</w:t>
       </w:r>
       <w:r>
-        <w:t xml:space="preserve"> revisan el JWT y confirman que es un Superadmin.</w:t>
+        <w:t xml:space="preserve"> revisan el JWT y confirman que es un </w:t>
+      </w:r>
+      <w:proofErr w:type="spellStart"/>
+      <w:r>
+        <w:t>Superadmin</w:t>
+      </w:r>
+      <w:proofErr w:type="spellEnd"/>
+      <w:r>
+        <w:t>.</w:t>
       </w:r>
     </w:p>
     <w:p>
@@ -385,7 +687,15 @@
         <w:t>Rutas</w:t>
       </w:r>
       <w:r>
-        <w:t xml:space="preserve"> lo envían a cambiarPlanTenant en el </w:t>
+        <w:t xml:space="preserve"> lo envían a </w:t>
+      </w:r>
+      <w:proofErr w:type="spellStart"/>
+      <w:r>
+        <w:t>cambiarPlanTenant</w:t>
+      </w:r>
+      <w:proofErr w:type="spellEnd"/>
+      <w:r>
+        <w:t xml:space="preserve"> en el </w:t>
       </w:r>
       <w:r>
         <w:rPr>
@@ -489,7 +799,15 @@
         <w:t>Socket.io</w:t>
       </w:r>
       <w:r>
-        <w:t xml:space="preserve"> y devuelve un 200 OK al Frontend.</w:t>
+        <w:t xml:space="preserve"> y devuelve un 200 OK al </w:t>
+      </w:r>
+      <w:proofErr w:type="spellStart"/>
+      <w:r>
+        <w:t>Frontend</w:t>
+      </w:r>
+      <w:proofErr w:type="spellEnd"/>
+      <w:r>
+        <w:t>.</w:t>
       </w:r>
     </w:p>
     <w:p/>
@@ -497,9 +815,11 @@
       <w:pPr>
         <w:pStyle w:val="Subttulo"/>
       </w:pPr>
+      <w:proofErr w:type="spellStart"/>
       <w:r>
         <w:t>Frontend</w:t>
       </w:r>
+      <w:proofErr w:type="spellEnd"/>
     </w:p>
     <w:p/>
     <w:p>
@@ -514,12 +834,44 @@
           <w:b/>
           <w:bCs/>
         </w:rPr>
-        <w:t>1. El Motor y los Cimientos (package.json y Vite)</w:t>
-      </w:r>
-    </w:p>
-    <w:p>
-      <w:r>
-        <w:t>Tu proyecto utiliza un stack de última generación para el ecosistema React:</w:t>
+        <w:t>1. El Motor y los Cimientos (</w:t>
+      </w:r>
+      <w:proofErr w:type="spellStart"/>
+      <w:r>
+        <w:rPr>
+          <w:b/>
+          <w:bCs/>
+        </w:rPr>
+        <w:t>package.json</w:t>
+      </w:r>
+      <w:proofErr w:type="spellEnd"/>
+      <w:r>
+        <w:rPr>
+          <w:b/>
+          <w:bCs/>
+        </w:rPr>
+        <w:t xml:space="preserve"> y Vite)</w:t>
+      </w:r>
+    </w:p>
+    <w:p>
+      <w:r>
+        <w:t xml:space="preserve">Tu proyecto utiliza un </w:t>
+      </w:r>
+      <w:proofErr w:type="spellStart"/>
+      <w:r>
+        <w:t>stack</w:t>
+      </w:r>
+      <w:proofErr w:type="spellEnd"/>
+      <w:r>
+        <w:t xml:space="preserve"> de última generación para el ecosistema </w:t>
+      </w:r>
+      <w:proofErr w:type="spellStart"/>
+      <w:r>
+        <w:t>React</w:t>
+      </w:r>
+      <w:proofErr w:type="spellEnd"/>
+      <w:r>
+        <w:t>:</w:t>
       </w:r>
     </w:p>
     <w:p>
@@ -529,12 +881,21 @@
           <w:numId w:val="7"/>
         </w:numPr>
       </w:pPr>
-      <w:r>
-        <w:rPr>
-          <w:b/>
-          <w:bCs/>
-        </w:rPr>
-        <w:t>React 19:</w:t>
+      <w:proofErr w:type="spellStart"/>
+      <w:r>
+        <w:rPr>
+          <w:b/>
+          <w:bCs/>
+        </w:rPr>
+        <w:t>React</w:t>
+      </w:r>
+      <w:proofErr w:type="spellEnd"/>
+      <w:r>
+        <w:rPr>
+          <w:b/>
+          <w:bCs/>
+        </w:rPr>
+        <w:t xml:space="preserve"> 19:</w:t>
       </w:r>
       <w:r>
         <w:t xml:space="preserve"> Estás usando la versión más reciente, lo que te da acceso a las mejores optimizaciones de renderizado.</w:t>
@@ -555,7 +916,23 @@
         <w:t>Vite:</w:t>
       </w:r>
       <w:r>
-        <w:t xml:space="preserve"> Es tu empaquetador (bundler). Reemplaza a herramientas antiguas como Webpack, haciendo que tu entorno de desarrollo arranque en milisegundos y tus compilaciones para producción sean súper ligeras.</w:t>
+        <w:t xml:space="preserve"> Es tu empaquetador (</w:t>
+      </w:r>
+      <w:proofErr w:type="spellStart"/>
+      <w:r>
+        <w:t>bundler</w:t>
+      </w:r>
+      <w:proofErr w:type="spellEnd"/>
+      <w:r>
+        <w:t xml:space="preserve">). Reemplaza a herramientas antiguas como </w:t>
+      </w:r>
+      <w:proofErr w:type="spellStart"/>
+      <w:r>
+        <w:t>Webpack</w:t>
+      </w:r>
+      <w:proofErr w:type="spellEnd"/>
+      <w:r>
+        <w:t>, haciendo que tu entorno de desarrollo arranque en milisegundos y tus compilaciones para producción sean súper ligeras.</w:t>
       </w:r>
     </w:p>
     <w:p>
@@ -565,12 +942,21 @@
           <w:numId w:val="7"/>
         </w:numPr>
       </w:pPr>
-      <w:r>
-        <w:rPr>
-          <w:b/>
-          <w:bCs/>
-        </w:rPr>
-        <w:t>Tailwind CSS:</w:t>
+      <w:proofErr w:type="spellStart"/>
+      <w:r>
+        <w:rPr>
+          <w:b/>
+          <w:bCs/>
+        </w:rPr>
+        <w:t>Tailwind</w:t>
+      </w:r>
+      <w:proofErr w:type="spellEnd"/>
+      <w:r>
+        <w:rPr>
+          <w:b/>
+          <w:bCs/>
+        </w:rPr>
+        <w:t xml:space="preserve"> CSS:</w:t>
       </w:r>
       <w:r>
         <w:t xml:space="preserve"> Todo tu diseño visual (sombras, gradientes, bordes redondeados) se maneja a través de clases utilitarias directamente en el HTML/TSX, lo que permite un desarrollo muy ágil sin tener que saltar entre archivos CSS.</w:t>
@@ -588,7 +974,23 @@
           <w:b/>
           <w:bCs/>
         </w:rPr>
-        <w:t>2. El Punto de Entrada (index.html y App.tsx)</w:t>
+        <w:t xml:space="preserve">2. El Punto de Entrada (index.html y </w:t>
+      </w:r>
+      <w:proofErr w:type="spellStart"/>
+      <w:r>
+        <w:rPr>
+          <w:b/>
+          <w:bCs/>
+        </w:rPr>
+        <w:t>App.tsx</w:t>
+      </w:r>
+      <w:proofErr w:type="spellEnd"/>
+      <w:r>
+        <w:rPr>
+          <w:b/>
+          <w:bCs/>
+        </w:rPr>
+        <w:t>)</w:t>
       </w:r>
     </w:p>
     <w:p>
@@ -604,7 +1006,31 @@
         </w:numPr>
       </w:pPr>
       <w:r>
-        <w:t>Este archivo contiene un simple &lt;div id="root"&gt;&lt;/div&gt; y enlaza las fuentes de iconos (Material Symbols).</w:t>
+        <w:t>Este archivo contiene un simple &lt;</w:t>
+      </w:r>
+      <w:proofErr w:type="spellStart"/>
+      <w:r>
+        <w:t>div</w:t>
+      </w:r>
+      <w:proofErr w:type="spellEnd"/>
+      <w:r>
+        <w:t xml:space="preserve"> id="</w:t>
+      </w:r>
+      <w:proofErr w:type="spellStart"/>
+      <w:r>
+        <w:t>root</w:t>
+      </w:r>
+      <w:proofErr w:type="spellEnd"/>
+      <w:r>
+        <w:t>"&gt;&lt;/</w:t>
+      </w:r>
+      <w:proofErr w:type="spellStart"/>
+      <w:r>
+        <w:t>div</w:t>
+      </w:r>
+      <w:proofErr w:type="spellEnd"/>
+      <w:r>
+        <w:t>&gt; y enlaza las fuentes de iconos (Material Symbols).</w:t>
       </w:r>
     </w:p>
     <w:p>
@@ -615,7 +1041,39 @@
         </w:numPr>
       </w:pPr>
       <w:r>
-        <w:t>Inmediatamente después, ejecuta tu código TypeScript (a través de main.tsx), que inyecta toda la aplicación React dentro de ese div vacío.</w:t>
+        <w:t xml:space="preserve">Inmediatamente después, ejecuta tu código </w:t>
+      </w:r>
+      <w:proofErr w:type="spellStart"/>
+      <w:r>
+        <w:t>TypeScript</w:t>
+      </w:r>
+      <w:proofErr w:type="spellEnd"/>
+      <w:r>
+        <w:t xml:space="preserve"> (a través de </w:t>
+      </w:r>
+      <w:proofErr w:type="spellStart"/>
+      <w:r>
+        <w:t>main.tsx</w:t>
+      </w:r>
+      <w:proofErr w:type="spellEnd"/>
+      <w:r>
+        <w:t xml:space="preserve">), que inyecta toda la aplicación </w:t>
+      </w:r>
+      <w:proofErr w:type="spellStart"/>
+      <w:r>
+        <w:t>React</w:t>
+      </w:r>
+      <w:proofErr w:type="spellEnd"/>
+      <w:r>
+        <w:t xml:space="preserve"> dentro de ese </w:t>
+      </w:r>
+      <w:proofErr w:type="spellStart"/>
+      <w:r>
+        <w:t>div</w:t>
+      </w:r>
+      <w:proofErr w:type="spellEnd"/>
+      <w:r>
+        <w:t xml:space="preserve"> vacío.</w:t>
       </w:r>
     </w:p>
     <w:p>
@@ -625,28 +1083,57 @@
           <w:numId w:val="8"/>
         </w:numPr>
       </w:pPr>
-      <w:r>
-        <w:t>App.tsx actúa como el contenedor principal que simplemente renderiza tu sistema de rutas.</w:t>
-      </w:r>
-    </w:p>
-    <w:p>
-      <w:pPr>
-        <w:rPr>
-          <w:b/>
-          <w:bCs/>
-        </w:rPr>
-      </w:pPr>
-      <w:r>
-        <w:rPr>
-          <w:b/>
-          <w:bCs/>
-        </w:rPr>
-        <w:t>3. El Corazón de la Seguridad: Estado Global (AuthContext.tsx)</w:t>
-      </w:r>
-    </w:p>
-    <w:p>
-      <w:r>
-        <w:t xml:space="preserve">Este es uno de los archivos más importantes de tu frontend. Funciona como la "memoria" global de tu aplicación respecto a quién está usando el sistema. * </w:t>
+      <w:proofErr w:type="spellStart"/>
+      <w:r>
+        <w:t>App.tsx</w:t>
+      </w:r>
+      <w:proofErr w:type="spellEnd"/>
+      <w:r>
+        <w:t xml:space="preserve"> actúa como el contenedor principal que simplemente renderiza tu sistema de rutas.</w:t>
+      </w:r>
+    </w:p>
+    <w:p>
+      <w:pPr>
+        <w:rPr>
+          <w:b/>
+          <w:bCs/>
+        </w:rPr>
+      </w:pPr>
+      <w:r>
+        <w:rPr>
+          <w:b/>
+          <w:bCs/>
+        </w:rPr>
+        <w:t>3. El Corazón de la Seguridad: Estado Global (</w:t>
+      </w:r>
+      <w:proofErr w:type="spellStart"/>
+      <w:r>
+        <w:rPr>
+          <w:b/>
+          <w:bCs/>
+        </w:rPr>
+        <w:t>AuthContext.tsx</w:t>
+      </w:r>
+      <w:proofErr w:type="spellEnd"/>
+      <w:r>
+        <w:rPr>
+          <w:b/>
+          <w:bCs/>
+        </w:rPr>
+        <w:t>)</w:t>
+      </w:r>
+    </w:p>
+    <w:p>
+      <w:r>
+        <w:t xml:space="preserve">Este es uno de los archivos más importantes de tu </w:t>
+      </w:r>
+      <w:proofErr w:type="spellStart"/>
+      <w:r>
+        <w:t>frontend</w:t>
+      </w:r>
+      <w:proofErr w:type="spellEnd"/>
+      <w:r>
+        <w:t xml:space="preserve">. Funciona como la "memoria" global de tu aplicación respecto a quién está usando el sistema. * </w:t>
       </w:r>
       <w:r>
         <w:rPr>
@@ -656,7 +1143,23 @@
         <w:t>Persistencia:</w:t>
       </w:r>
       <w:r>
-        <w:t xml:space="preserve"> Cuando un usuario inicia sesión, guardas su token (el JWT que configuramos en el backend) y sus datos en el localStorage del navegador. Esto asegura que si el usuario recarga la página, no pierda su sesión.</w:t>
+        <w:t xml:space="preserve"> Cuando un usuario inicia sesión, guardas su token (el JWT que configuramos en el </w:t>
+      </w:r>
+      <w:proofErr w:type="spellStart"/>
+      <w:r>
+        <w:t>backend</w:t>
+      </w:r>
+      <w:proofErr w:type="spellEnd"/>
+      <w:r>
+        <w:t xml:space="preserve">) y sus datos en el </w:t>
+      </w:r>
+      <w:proofErr w:type="spellStart"/>
+      <w:r>
+        <w:t>localStorage</w:t>
+      </w:r>
+      <w:proofErr w:type="spellEnd"/>
+      <w:r>
+        <w:t xml:space="preserve"> del navegador. Esto asegura que si el usuario recarga la página, no pierda su sesión.</w:t>
       </w:r>
     </w:p>
     <w:p>
@@ -675,14 +1178,62 @@
         <w:t>Distribución:</w:t>
       </w:r>
       <w:r>
-        <w:t xml:space="preserve"> A través del hook useAuth(), cualquier componente de tu aplicación (como el Navbar o el Dashboard) puede preguntar instantáneamente: </w:t>
+        <w:t xml:space="preserve"> A través del </w:t>
+      </w:r>
+      <w:proofErr w:type="spellStart"/>
+      <w:r>
+        <w:t>hook</w:t>
+      </w:r>
+      <w:proofErr w:type="spellEnd"/>
+      <w:r>
+        <w:t xml:space="preserve"> </w:t>
+      </w:r>
+      <w:proofErr w:type="spellStart"/>
+      <w:r>
+        <w:t>useAuth</w:t>
+      </w:r>
+      <w:proofErr w:type="spellEnd"/>
+      <w:r>
+        <w:t xml:space="preserve">(), cualquier componente de tu aplicación (como el </w:t>
+      </w:r>
+      <w:proofErr w:type="spellStart"/>
+      <w:r>
+        <w:t>Navbar</w:t>
+      </w:r>
+      <w:proofErr w:type="spellEnd"/>
+      <w:r>
+        <w:t xml:space="preserve"> o el </w:t>
+      </w:r>
+      <w:proofErr w:type="spellStart"/>
+      <w:r>
+        <w:t>Dashboard</w:t>
+      </w:r>
+      <w:proofErr w:type="spellEnd"/>
+      <w:r>
+        <w:t xml:space="preserve">) puede preguntar instantáneamente: </w:t>
       </w:r>
       <w:r>
         <w:rPr>
           <w:i/>
           <w:iCs/>
         </w:rPr>
-        <w:t>"¿Hay alguien logueado? ¿Quién es y cuál es su token?"</w:t>
+        <w:t xml:space="preserve">"¿Hay alguien </w:t>
+      </w:r>
+      <w:proofErr w:type="spellStart"/>
+      <w:r>
+        <w:rPr>
+          <w:i/>
+          <w:iCs/>
+        </w:rPr>
+        <w:t>logueado</w:t>
+      </w:r>
+      <w:proofErr w:type="spellEnd"/>
+      <w:r>
+        <w:rPr>
+          <w:i/>
+          <w:iCs/>
+        </w:rPr>
+        <w:t>? ¿Quién es y cuál es su token?"</w:t>
       </w:r>
       <w:r>
         <w:t>, sin tener que pasarse esa información manualmente de componente en componente.</w:t>
@@ -700,7 +1251,23 @@
           <w:b/>
           <w:bCs/>
         </w:rPr>
-        <w:t>4. El Controlador de Tráfico (AppRoutes.tsx)</w:t>
+        <w:t>4. El Controlador de Tráfico (</w:t>
+      </w:r>
+      <w:proofErr w:type="spellStart"/>
+      <w:r>
+        <w:rPr>
+          <w:b/>
+          <w:bCs/>
+        </w:rPr>
+        <w:t>AppRoutes.tsx</w:t>
+      </w:r>
+      <w:proofErr w:type="spellEnd"/>
+      <w:r>
+        <w:rPr>
+          <w:b/>
+          <w:bCs/>
+        </w:rPr>
+        <w:t>)</w:t>
       </w:r>
     </w:p>
     <w:p>
@@ -723,7 +1290,31 @@
         <w:t>Rutas Públicas:</w:t>
       </w:r>
       <w:r>
-        <w:t xml:space="preserve"> Cualquiera puede entrar a / (LandingPage) para ver tu propuesta comercial, o a /login (LoginPage) para intentar acceder.</w:t>
+        <w:t xml:space="preserve"> Cualquiera puede entrar a / (</w:t>
+      </w:r>
+      <w:proofErr w:type="spellStart"/>
+      <w:r>
+        <w:t>LandingPage</w:t>
+      </w:r>
+      <w:proofErr w:type="spellEnd"/>
+      <w:r>
+        <w:t>) para ver tu propuesta comercial, o a /</w:t>
+      </w:r>
+      <w:proofErr w:type="spellStart"/>
+      <w:r>
+        <w:t>login</w:t>
+      </w:r>
+      <w:proofErr w:type="spellEnd"/>
+      <w:r>
+        <w:t xml:space="preserve"> (</w:t>
+      </w:r>
+      <w:proofErr w:type="spellStart"/>
+      <w:r>
+        <w:t>LoginPage</w:t>
+      </w:r>
+      <w:proofErr w:type="spellEnd"/>
+      <w:r>
+        <w:t>) para intentar acceder.</w:t>
       </w:r>
     </w:p>
     <w:p>
@@ -741,22 +1332,62 @@
         <w:t>Rutas Protegidas:</w:t>
       </w:r>
       <w:r>
-        <w:t xml:space="preserve"> Tienes una barrera inteligente (&lt;ProtectedRoute /&gt;). Si alguien intenta escribir /dashboard en la URL sin haber iniciado sesión, este componente lo detectará y lo expulsará (probablemente redirigiéndolo al login).</w:t>
-      </w:r>
-    </w:p>
-    <w:p>
-      <w:pPr>
-        <w:rPr>
-          <w:b/>
-          <w:bCs/>
-        </w:rPr>
-      </w:pPr>
-      <w:r>
-        <w:rPr>
-          <w:b/>
-          <w:bCs/>
-        </w:rPr>
-        <w:t>5. La Puerta de Enlace (LoginPage.tsx)</w:t>
+        <w:t xml:space="preserve"> Tienes una barrera inteligente (&lt;</w:t>
+      </w:r>
+      <w:proofErr w:type="spellStart"/>
+      <w:r>
+        <w:t>ProtectedRoute</w:t>
+      </w:r>
+      <w:proofErr w:type="spellEnd"/>
+      <w:r>
+        <w:t xml:space="preserve"> /&gt;). Si alguien intenta escribir /</w:t>
+      </w:r>
+      <w:proofErr w:type="spellStart"/>
+      <w:r>
+        <w:t>dashboard</w:t>
+      </w:r>
+      <w:proofErr w:type="spellEnd"/>
+      <w:r>
+        <w:t xml:space="preserve"> en la URL sin haber iniciado sesión, este componente lo detectará y lo expulsará (probablemente redirigiéndolo al </w:t>
+      </w:r>
+      <w:proofErr w:type="spellStart"/>
+      <w:r>
+        <w:t>login</w:t>
+      </w:r>
+      <w:proofErr w:type="spellEnd"/>
+      <w:r>
+        <w:t>).</w:t>
+      </w:r>
+    </w:p>
+    <w:p>
+      <w:pPr>
+        <w:rPr>
+          <w:b/>
+          <w:bCs/>
+        </w:rPr>
+      </w:pPr>
+      <w:r>
+        <w:rPr>
+          <w:b/>
+          <w:bCs/>
+        </w:rPr>
+        <w:t>5. La Puerta de Enlace (</w:t>
+      </w:r>
+      <w:proofErr w:type="spellStart"/>
+      <w:r>
+        <w:rPr>
+          <w:b/>
+          <w:bCs/>
+        </w:rPr>
+        <w:t>LoginPage.tsx</w:t>
+      </w:r>
+      <w:proofErr w:type="spellEnd"/>
+      <w:r>
+        <w:rPr>
+          <w:b/>
+          <w:bCs/>
+        </w:rPr>
+        <w:t>)</w:t>
       </w:r>
     </w:p>
     <w:p>
@@ -772,7 +1403,39 @@
         </w:numPr>
       </w:pPr>
       <w:r>
-        <w:t>Interceptas el formulario (handleSubmit) y envías una petición POST a tu backend (/api/auth/login).</w:t>
+        <w:t>Interceptas el formulario (</w:t>
+      </w:r>
+      <w:proofErr w:type="spellStart"/>
+      <w:r>
+        <w:t>handleSubmit</w:t>
+      </w:r>
+      <w:proofErr w:type="spellEnd"/>
+      <w:r>
+        <w:t xml:space="preserve">) y envías una petición POST a tu </w:t>
+      </w:r>
+      <w:proofErr w:type="spellStart"/>
+      <w:r>
+        <w:t>backend</w:t>
+      </w:r>
+      <w:proofErr w:type="spellEnd"/>
+      <w:r>
+        <w:t xml:space="preserve"> (/api/</w:t>
+      </w:r>
+      <w:proofErr w:type="spellStart"/>
+      <w:r>
+        <w:t>auth</w:t>
+      </w:r>
+      <w:proofErr w:type="spellEnd"/>
+      <w:r>
+        <w:t>/</w:t>
+      </w:r>
+      <w:proofErr w:type="spellStart"/>
+      <w:r>
+        <w:t>login</w:t>
+      </w:r>
+      <w:proofErr w:type="spellEnd"/>
+      <w:r>
+        <w:t>).</w:t>
       </w:r>
     </w:p>
     <w:p>
@@ -783,7 +1446,31 @@
         </w:numPr>
       </w:pPr>
       <w:r>
-        <w:t>Si el backend responde que las credenciales son válidas y devuelve el JWT, ejecutas la función login() de tu AuthContext.</w:t>
+        <w:t xml:space="preserve">Si el </w:t>
+      </w:r>
+      <w:proofErr w:type="spellStart"/>
+      <w:r>
+        <w:t>backend</w:t>
+      </w:r>
+      <w:proofErr w:type="spellEnd"/>
+      <w:r>
+        <w:t xml:space="preserve"> responde que las credenciales son válidas y devuelve el JWT, ejecutas la función </w:t>
+      </w:r>
+      <w:proofErr w:type="spellStart"/>
+      <w:r>
+        <w:t>login</w:t>
+      </w:r>
+      <w:proofErr w:type="spellEnd"/>
+      <w:r>
+        <w:t xml:space="preserve">() de tu </w:t>
+      </w:r>
+      <w:proofErr w:type="spellStart"/>
+      <w:r>
+        <w:t>AuthContext</w:t>
+      </w:r>
+      <w:proofErr w:type="spellEnd"/>
+      <w:r>
+        <w:t>.</w:t>
       </w:r>
     </w:p>
     <w:p>
@@ -809,7 +1496,23 @@
           <w:b/>
           <w:bCs/>
         </w:rPr>
-        <w:t>6. El Centro de Operaciones (DashboardPage.tsx)</w:t>
+        <w:t>6. El Centro de Operaciones (</w:t>
+      </w:r>
+      <w:proofErr w:type="spellStart"/>
+      <w:r>
+        <w:rPr>
+          <w:b/>
+          <w:bCs/>
+        </w:rPr>
+        <w:t>DashboardPage.tsx</w:t>
+      </w:r>
+      <w:proofErr w:type="spellEnd"/>
+      <w:r>
+        <w:rPr>
+          <w:b/>
+          <w:bCs/>
+        </w:rPr>
+        <w:t>)</w:t>
       </w:r>
     </w:p>
     <w:p>
@@ -832,8 +1535,17 @@
         <w:t>Autenticación en cada petición:</w:t>
       </w:r>
       <w:r>
-        <w:t xml:space="preserve"> Fíjate cómo en cada llamada fetch (para traer los </w:t>
-      </w:r>
+        <w:t xml:space="preserve"> Fíjate cómo en cada llamada </w:t>
+      </w:r>
+      <w:proofErr w:type="spellStart"/>
+      <w:r>
+        <w:t>fetch</w:t>
+      </w:r>
+      <w:proofErr w:type="spellEnd"/>
+      <w:r>
+        <w:t xml:space="preserve"> (para traer los </w:t>
+      </w:r>
+      <w:proofErr w:type="spellStart"/>
       <w:r>
         <w:rPr>
           <w:i/>
@@ -841,6 +1553,7 @@
         </w:rPr>
         <w:t>tenants</w:t>
       </w:r>
+      <w:proofErr w:type="spellEnd"/>
       <w:r>
         <w:t xml:space="preserve">, los </w:t>
       </w:r>
@@ -862,7 +1575,39 @@
         <w:t>historial</w:t>
       </w:r>
       <w:r>
-        <w:t>), estás adjuntando el token en los encabezados: headers: { "Authorization": "Bearer ${token}" }. Esto es lo que permite que el middleware verifyToken de tu backend te deje pasar.</w:t>
+        <w:t xml:space="preserve">), estás adjuntando el token en los encabezados: </w:t>
+      </w:r>
+      <w:proofErr w:type="spellStart"/>
+      <w:r>
+        <w:t>headers</w:t>
+      </w:r>
+      <w:proofErr w:type="spellEnd"/>
+      <w:r>
+        <w:t>: { "</w:t>
+      </w:r>
+      <w:proofErr w:type="spellStart"/>
+      <w:r>
+        <w:t>Authorization</w:t>
+      </w:r>
+      <w:proofErr w:type="spellEnd"/>
+      <w:r>
+        <w:t xml:space="preserve">": "Bearer ${token}" }. Esto es lo que permite que el middleware </w:t>
+      </w:r>
+      <w:proofErr w:type="spellStart"/>
+      <w:r>
+        <w:t>verifyToken</w:t>
+      </w:r>
+      <w:proofErr w:type="spellEnd"/>
+      <w:r>
+        <w:t xml:space="preserve"> de tu </w:t>
+      </w:r>
+      <w:proofErr w:type="spellStart"/>
+      <w:r>
+        <w:t>backend</w:t>
+      </w:r>
+      <w:proofErr w:type="spellEnd"/>
+      <w:r>
+        <w:t xml:space="preserve"> te deje pasar.</w:t>
       </w:r>
     </w:p>
     <w:p>
@@ -880,7 +1625,15 @@
         <w:t>Gestión de Modales:</w:t>
       </w:r>
       <w:r>
-        <w:t xml:space="preserve"> En lugar de crear páginas distintas para editar, cambiar de plan o ver el historial, tienes ventanas emergentes (Modales). Tienes un estado (selectedTenant) que "recuerda" a qué comunidad le hiciste clic, y se lo pasa al modal correspondiente para que sepa sobre qué datos operar.</w:t>
+        <w:t xml:space="preserve"> En lugar de crear páginas distintas para editar, cambiar de plan o ver el historial, tienes ventanas emergentes (Modales). Tienes un estado (</w:t>
+      </w:r>
+      <w:proofErr w:type="spellStart"/>
+      <w:r>
+        <w:t>selectedTenant</w:t>
+      </w:r>
+      <w:proofErr w:type="spellEnd"/>
+      <w:r>
+        <w:t>) que "recuerda" a qué comunidad le hiciste clic, y se lo pasa al modal correspondiente para que sepa sobre qué datos operar.</w:t>
       </w:r>
     </w:p>
     <w:p>
@@ -899,7 +1652,39 @@
         <w:t>Actualización Reactiva:</w:t>
       </w:r>
       <w:r>
-        <w:t xml:space="preserve"> Cuando completas una acción en un modal (por ejemplo, handleConfirmStatus), envías la petición al backend. Si el backend dice "OK", cierras el modal y vuelves a ejecutar fetchTenants(), lo que recarga la tabla instantáneamente para reflejar el cambio.</w:t>
+        <w:t xml:space="preserve"> Cuando completas una acción en un modal (por ejemplo, </w:t>
+      </w:r>
+      <w:proofErr w:type="spellStart"/>
+      <w:r>
+        <w:t>handleConfirmStatus</w:t>
+      </w:r>
+      <w:proofErr w:type="spellEnd"/>
+      <w:r>
+        <w:t xml:space="preserve">), envías la petición al </w:t>
+      </w:r>
+      <w:proofErr w:type="spellStart"/>
+      <w:r>
+        <w:t>backend</w:t>
+      </w:r>
+      <w:proofErr w:type="spellEnd"/>
+      <w:r>
+        <w:t xml:space="preserve">. Si el </w:t>
+      </w:r>
+      <w:proofErr w:type="spellStart"/>
+      <w:r>
+        <w:t>backend</w:t>
+      </w:r>
+      <w:proofErr w:type="spellEnd"/>
+      <w:r>
+        <w:t xml:space="preserve"> dice "OK", cierras el modal y vuelves a ejecutar </w:t>
+      </w:r>
+      <w:proofErr w:type="spellStart"/>
+      <w:r>
+        <w:t>fetchTenants</w:t>
+      </w:r>
+      <w:proofErr w:type="spellEnd"/>
+      <w:r>
+        <w:t>(), lo que recarga la tabla instantáneamente para reflejar el cambio.</w:t>
       </w:r>
     </w:p>
     <w:p/>
@@ -907,23 +1692,41 @@
       <w:pPr>
         <w:pStyle w:val="Subttulo"/>
       </w:pPr>
+      <w:proofErr w:type="spellStart"/>
       <w:r>
         <w:t>Typescript</w:t>
       </w:r>
-    </w:p>
-    <w:p>
-      <w:pPr>
-        <w:rPr>
-          <w:b/>
-          <w:bCs/>
-        </w:rPr>
-      </w:pPr>
-      <w:r>
-        <w:rPr>
-          <w:b/>
-          <w:bCs/>
-        </w:rPr>
-        <w:t>1. La Configuración Base de TypeScript (El Guardián)</w:t>
+      <w:proofErr w:type="spellEnd"/>
+    </w:p>
+    <w:p>
+      <w:pPr>
+        <w:rPr>
+          <w:b/>
+          <w:bCs/>
+        </w:rPr>
+      </w:pPr>
+      <w:r>
+        <w:rPr>
+          <w:b/>
+          <w:bCs/>
+        </w:rPr>
+        <w:t xml:space="preserve">1. La Configuración Base de </w:t>
+      </w:r>
+      <w:proofErr w:type="spellStart"/>
+      <w:r>
+        <w:rPr>
+          <w:b/>
+          <w:bCs/>
+        </w:rPr>
+        <w:t>TypeScript</w:t>
+      </w:r>
+      <w:proofErr w:type="spellEnd"/>
+      <w:r>
+        <w:rPr>
+          <w:b/>
+          <w:bCs/>
+        </w:rPr>
+        <w:t xml:space="preserve"> (El Guardián)</w:t>
       </w:r>
     </w:p>
     <w:p>
@@ -941,7 +1744,47 @@
         <w:t>Archivos de configuración:</w:t>
       </w:r>
       <w:r>
-        <w:t xml:space="preserve"> Tienes un archivo tsconfig.json en tu backend (y probablemente otro en el frontend generado por Vite) que le dice al compilador cómo leer tu código. En el backend, por ejemplo, le indicas que lea la carpeta completa mediante "src//*".</w:t>
+        <w:t xml:space="preserve"> Tienes un archivo </w:t>
+      </w:r>
+      <w:proofErr w:type="spellStart"/>
+      <w:r>
+        <w:t>tsconfig.json</w:t>
+      </w:r>
+      <w:proofErr w:type="spellEnd"/>
+      <w:r>
+        <w:t xml:space="preserve"> en tu </w:t>
+      </w:r>
+      <w:proofErr w:type="spellStart"/>
+      <w:r>
+        <w:t>backend</w:t>
+      </w:r>
+      <w:proofErr w:type="spellEnd"/>
+      <w:r>
+        <w:t xml:space="preserve"> (y probablemente otro en el </w:t>
+      </w:r>
+      <w:proofErr w:type="spellStart"/>
+      <w:r>
+        <w:t>frontend</w:t>
+      </w:r>
+      <w:proofErr w:type="spellEnd"/>
+      <w:r>
+        <w:t xml:space="preserve"> generado por Vite) que le dice al compilador cómo leer tu código. En el </w:t>
+      </w:r>
+      <w:proofErr w:type="spellStart"/>
+      <w:r>
+        <w:t>backend</w:t>
+      </w:r>
+      <w:proofErr w:type="spellEnd"/>
+      <w:r>
+        <w:t>, por ejemplo, le indicas que lea la carpeta completa mediante "</w:t>
+      </w:r>
+      <w:proofErr w:type="spellStart"/>
+      <w:r>
+        <w:t>src</w:t>
+      </w:r>
+      <w:proofErr w:type="spellEnd"/>
+      <w:r>
+        <w:t>//*".</w:t>
       </w:r>
     </w:p>
     <w:p>
@@ -956,10 +1799,82 @@
           <w:b/>
           <w:bCs/>
         </w:rPr>
-        <w:t>Tipos Personalizados (src/types/express.d.ts):</w:t>
-      </w:r>
-      <w:r>
-        <w:t xml:space="preserve"> Para evitar usar el peligroso y genérico any, creamos declaraciones de tipos personalizadas. Esto le enseñó a TypeScript (y a tu editor de código) que cuando usas req.user dentro de Express, este contiene datos específicos como el ID y el rol, activando el autocompletado seguro.</w:t>
+        <w:t>Tipos Personalizados (</w:t>
+      </w:r>
+      <w:proofErr w:type="spellStart"/>
+      <w:r>
+        <w:rPr>
+          <w:b/>
+          <w:bCs/>
+        </w:rPr>
+        <w:t>src</w:t>
+      </w:r>
+      <w:proofErr w:type="spellEnd"/>
+      <w:r>
+        <w:rPr>
+          <w:b/>
+          <w:bCs/>
+        </w:rPr>
+        <w:t>/</w:t>
+      </w:r>
+      <w:proofErr w:type="spellStart"/>
+      <w:r>
+        <w:rPr>
+          <w:b/>
+          <w:bCs/>
+        </w:rPr>
+        <w:t>types</w:t>
+      </w:r>
+      <w:proofErr w:type="spellEnd"/>
+      <w:r>
+        <w:rPr>
+          <w:b/>
+          <w:bCs/>
+        </w:rPr>
+        <w:t>/</w:t>
+      </w:r>
+      <w:proofErr w:type="spellStart"/>
+      <w:r>
+        <w:rPr>
+          <w:b/>
+          <w:bCs/>
+        </w:rPr>
+        <w:t>express.d.ts</w:t>
+      </w:r>
+      <w:proofErr w:type="spellEnd"/>
+      <w:r>
+        <w:rPr>
+          <w:b/>
+          <w:bCs/>
+        </w:rPr>
+        <w:t>):</w:t>
+      </w:r>
+      <w:r>
+        <w:t xml:space="preserve"> Para evitar usar el peligroso y genérico </w:t>
+      </w:r>
+      <w:proofErr w:type="spellStart"/>
+      <w:r>
+        <w:t>any</w:t>
+      </w:r>
+      <w:proofErr w:type="spellEnd"/>
+      <w:r>
+        <w:t xml:space="preserve">, creamos declaraciones de tipos personalizadas. Esto le enseñó a </w:t>
+      </w:r>
+      <w:proofErr w:type="spellStart"/>
+      <w:r>
+        <w:t>TypeScript</w:t>
+      </w:r>
+      <w:proofErr w:type="spellEnd"/>
+      <w:r>
+        <w:t xml:space="preserve"> (y a tu editor de código) que cuando usas </w:t>
+      </w:r>
+      <w:proofErr w:type="spellStart"/>
+      <w:r>
+        <w:t>req.user</w:t>
+      </w:r>
+      <w:proofErr w:type="spellEnd"/>
+      <w:r>
+        <w:t xml:space="preserve"> dentro de Express, este contiene datos específicos como el ID y el rol, activando el autocompletado seguro.</w:t>
       </w:r>
     </w:p>
     <w:p>
@@ -1006,15 +1921,40 @@
           <w:numId w:val="14"/>
         </w:numPr>
       </w:pPr>
-      <w:r>
-        <w:rPr>
-          <w:b/>
-          <w:bCs/>
-        </w:rPr>
-        <w:t>schema.prisma:</w:t>
-      </w:r>
-      <w:r>
-        <w:t xml:space="preserve"> Este es el único archivo donde defines la estructura real de tus tablas (Modelos como Usuario, Tenant, Plan) y tus reglas estrictas (Enums como TipoPlan o Rol).</w:t>
+      <w:proofErr w:type="spellStart"/>
+      <w:r>
+        <w:rPr>
+          <w:b/>
+          <w:bCs/>
+        </w:rPr>
+        <w:t>schema.prisma</w:t>
+      </w:r>
+      <w:proofErr w:type="spellEnd"/>
+      <w:r>
+        <w:rPr>
+          <w:b/>
+          <w:bCs/>
+        </w:rPr>
+        <w:t>:</w:t>
+      </w:r>
+      <w:r>
+        <w:t xml:space="preserve"> Este es el único archivo donde defines la estructura real de tus tablas (Modelos como Usuario, Tenant, Plan) y tus reglas estrictas (</w:t>
+      </w:r>
+      <w:proofErr w:type="spellStart"/>
+      <w:r>
+        <w:t>Enums</w:t>
+      </w:r>
+      <w:proofErr w:type="spellEnd"/>
+      <w:r>
+        <w:t xml:space="preserve"> como </w:t>
+      </w:r>
+      <w:proofErr w:type="spellStart"/>
+      <w:r>
+        <w:t>TipoPlan</w:t>
+      </w:r>
+      <w:proofErr w:type="spellEnd"/>
+      <w:r>
+        <w:t xml:space="preserve"> o Rol).</w:t>
       </w:r>
     </w:p>
     <w:p>
@@ -1032,7 +1972,23 @@
         <w:t>El cliente tipado:</w:t>
       </w:r>
       <w:r>
-        <w:t xml:space="preserve"> A partir de ese archivo, Prisma genera automáticamente tipos de TypeScript. Si intentas guardar un plan llamado "Premium" pero tu base de datos solo acepta "BASICO", "PROFESIONAL" o "EMPRESARIAL", TypeScript te mostrará un error antes de que siquiera ejecutes el código.</w:t>
+        <w:t xml:space="preserve"> A partir de ese archivo, Prisma genera automáticamente tipos de </w:t>
+      </w:r>
+      <w:proofErr w:type="spellStart"/>
+      <w:r>
+        <w:t>TypeScript</w:t>
+      </w:r>
+      <w:proofErr w:type="spellEnd"/>
+      <w:r>
+        <w:t xml:space="preserve">. Si intentas guardar un plan llamado "Premium" pero tu base de datos solo acepta "BASICO", "PROFESIONAL" o "EMPRESARIAL", </w:t>
+      </w:r>
+      <w:proofErr w:type="spellStart"/>
+      <w:r>
+        <w:t>TypeScript</w:t>
+      </w:r>
+      <w:proofErr w:type="spellEnd"/>
+      <w:r>
+        <w:t xml:space="preserve"> te mostrará un error antes de que siquiera ejecutes el código.</w:t>
       </w:r>
     </w:p>
     <w:p>
@@ -1054,7 +2010,23 @@
           <w:b/>
           <w:bCs/>
         </w:rPr>
-        <w:t>3. Backend (Arquitectura en Capas)</w:t>
+        <w:t xml:space="preserve">3. </w:t>
+      </w:r>
+      <w:proofErr w:type="spellStart"/>
+      <w:r>
+        <w:rPr>
+          <w:b/>
+          <w:bCs/>
+        </w:rPr>
+        <w:t>Backend</w:t>
+      </w:r>
+      <w:proofErr w:type="spellEnd"/>
+      <w:r>
+        <w:rPr>
+          <w:b/>
+          <w:bCs/>
+        </w:rPr>
+        <w:t xml:space="preserve"> (Arquitectura en Capas)</w:t>
       </w:r>
     </w:p>
     <w:p>
@@ -1075,10 +2047,34 @@
           <w:bCs/>
         </w:rPr>
         <w:lastRenderedPageBreak/>
-        <w:t>Rutas (*.routes.ts):</w:t>
-      </w:r>
-      <w:r>
-        <w:t xml:space="preserve"> Son los semáforos. Reciben la petición web (ej. POST /api/usuarios/admin) y deciden qué funciones deben ejecutarse, aplicando barreras de seguridad (Middlewares) en el proceso.</w:t>
+        <w:t>Rutas (*.</w:t>
+      </w:r>
+      <w:proofErr w:type="spellStart"/>
+      <w:r>
+        <w:rPr>
+          <w:b/>
+          <w:bCs/>
+        </w:rPr>
+        <w:t>routes.ts</w:t>
+      </w:r>
+      <w:proofErr w:type="spellEnd"/>
+      <w:r>
+        <w:rPr>
+          <w:b/>
+          <w:bCs/>
+        </w:rPr>
+        <w:t>):</w:t>
+      </w:r>
+      <w:r>
+        <w:t xml:space="preserve"> Son los semáforos. Reciben la petición web (ej. POST /api/usuarios/</w:t>
+      </w:r>
+      <w:proofErr w:type="spellStart"/>
+      <w:r>
+        <w:t>admin</w:t>
+      </w:r>
+      <w:proofErr w:type="spellEnd"/>
+      <w:r>
+        <w:t>) y deciden qué funciones deben ejecutarse, aplicando barreras de seguridad (Middlewares) en el proceso.</w:t>
       </w:r>
     </w:p>
     <w:p>
@@ -1093,7 +2089,23 @@
           <w:b/>
           <w:bCs/>
         </w:rPr>
-        <w:t>Controladores (*.controller.ts):</w:t>
+        <w:t>Controladores (*.</w:t>
+      </w:r>
+      <w:proofErr w:type="spellStart"/>
+      <w:r>
+        <w:rPr>
+          <w:b/>
+          <w:bCs/>
+        </w:rPr>
+        <w:t>controller.ts</w:t>
+      </w:r>
+      <w:proofErr w:type="spellEnd"/>
+      <w:r>
+        <w:rPr>
+          <w:b/>
+          <w:bCs/>
+        </w:rPr>
+        <w:t>):</w:t>
       </w:r>
       <w:r>
         <w:t xml:space="preserve"> Son los directores de orquesta. </w:t>
@@ -1106,7 +2118,23 @@
         <w:t>No tocan la base de datos.</w:t>
       </w:r>
       <w:r>
-        <w:t xml:space="preserve"> Solo se encargan de validar que los datos de entrada (req.body) estén completos, y luego emiten respuestas HTTP (ej. 200 OK o 500 Error) o eventos en tiempo real hacia el frontend mediante Socket.io.</w:t>
+        <w:t xml:space="preserve"> Solo se encargan de validar que los datos de entrada (</w:t>
+      </w:r>
+      <w:proofErr w:type="spellStart"/>
+      <w:r>
+        <w:t>req.body</w:t>
+      </w:r>
+      <w:proofErr w:type="spellEnd"/>
+      <w:r>
+        <w:t xml:space="preserve">) estén completos, y luego emiten respuestas HTTP (ej. 200 OK o 500 Error) o eventos en tiempo real hacia el </w:t>
+      </w:r>
+      <w:proofErr w:type="spellStart"/>
+      <w:r>
+        <w:t>frontend</w:t>
+      </w:r>
+      <w:proofErr w:type="spellEnd"/>
+      <w:r>
+        <w:t xml:space="preserve"> mediante Socket.io.</w:t>
       </w:r>
     </w:p>
     <w:p>
@@ -1121,7 +2149,23 @@
           <w:b/>
           <w:bCs/>
         </w:rPr>
-        <w:t>Servicios (*.service.ts):</w:t>
+        <w:t>Servicios (*.</w:t>
+      </w:r>
+      <w:proofErr w:type="spellStart"/>
+      <w:r>
+        <w:rPr>
+          <w:b/>
+          <w:bCs/>
+        </w:rPr>
+        <w:t>service.ts</w:t>
+      </w:r>
+      <w:proofErr w:type="spellEnd"/>
+      <w:r>
+        <w:rPr>
+          <w:b/>
+          <w:bCs/>
+        </w:rPr>
+        <w:t>):</w:t>
       </w:r>
       <w:r>
         <w:t xml:space="preserve"> Aquí vive la verdadera </w:t>
@@ -1144,7 +2188,23 @@
         <w:t>únicos</w:t>
       </w:r>
       <w:r>
-        <w:t xml:space="preserve"> que hablan directamente con Prisma (la base de datos) para hacer operaciones o transacciones seguras (ej. tenant.service.ts o user.service.ts).</w:t>
+        <w:t xml:space="preserve"> que hablan directamente con Prisma (la base de datos) para hacer operaciones o transacciones seguras (ej. </w:t>
+      </w:r>
+      <w:proofErr w:type="spellStart"/>
+      <w:r>
+        <w:t>tenant.service.ts</w:t>
+      </w:r>
+      <w:proofErr w:type="spellEnd"/>
+      <w:r>
+        <w:t xml:space="preserve"> o </w:t>
+      </w:r>
+      <w:proofErr w:type="spellStart"/>
+      <w:r>
+        <w:t>user.service.ts</w:t>
+      </w:r>
+      <w:proofErr w:type="spellEnd"/>
+      <w:r>
+        <w:t>).</w:t>
       </w:r>
     </w:p>
     <w:p>
@@ -1166,12 +2226,52 @@
           <w:b/>
           <w:bCs/>
         </w:rPr>
-        <w:t>4. Frontend (Arquitectura Limpia con React)</w:t>
-      </w:r>
-    </w:p>
-    <w:p>
-      <w:r>
-        <w:t>Tu interfaz de usuario (Single Page Application) también separa la inteligencia gráfica de la inteligencia de datos:</w:t>
+        <w:t xml:space="preserve">4. </w:t>
+      </w:r>
+      <w:proofErr w:type="spellStart"/>
+      <w:r>
+        <w:rPr>
+          <w:b/>
+          <w:bCs/>
+        </w:rPr>
+        <w:t>Frontend</w:t>
+      </w:r>
+      <w:proofErr w:type="spellEnd"/>
+      <w:r>
+        <w:rPr>
+          <w:b/>
+          <w:bCs/>
+        </w:rPr>
+        <w:t xml:space="preserve"> (Arquitectura Limpia con </w:t>
+      </w:r>
+      <w:proofErr w:type="spellStart"/>
+      <w:r>
+        <w:rPr>
+          <w:b/>
+          <w:bCs/>
+        </w:rPr>
+        <w:t>React</w:t>
+      </w:r>
+      <w:proofErr w:type="spellEnd"/>
+      <w:r>
+        <w:rPr>
+          <w:b/>
+          <w:bCs/>
+        </w:rPr>
+        <w:t>)</w:t>
+      </w:r>
+    </w:p>
+    <w:p>
+      <w:r>
+        <w:t xml:space="preserve">Tu interfaz de usuario (Single Page </w:t>
+      </w:r>
+      <w:proofErr w:type="spellStart"/>
+      <w:r>
+        <w:t>Application</w:t>
+      </w:r>
+      <w:proofErr w:type="spellEnd"/>
+      <w:r>
+        <w:t>) también separa la inteligencia gráfica de la inteligencia de datos:</w:t>
       </w:r>
     </w:p>
     <w:p>
@@ -1186,10 +2286,58 @@
           <w:b/>
           <w:bCs/>
         </w:rPr>
-        <w:t>Componentes Visuales (*.tsx):</w:t>
-      </w:r>
-      <w:r>
-        <w:t xml:space="preserve"> Archivos como DashboardPage.tsx o PlanFormModal.tsx se dedican casi en un 100% a "pintar" la interfaz utilizando React y Tailwind CSS. Se consideran componentes "tontos" porque no hacen peticiones complejas directamente.</w:t>
+        <w:t>Componentes Visuales (*.</w:t>
+      </w:r>
+      <w:proofErr w:type="spellStart"/>
+      <w:r>
+        <w:rPr>
+          <w:b/>
+          <w:bCs/>
+        </w:rPr>
+        <w:t>tsx</w:t>
+      </w:r>
+      <w:proofErr w:type="spellEnd"/>
+      <w:r>
+        <w:rPr>
+          <w:b/>
+          <w:bCs/>
+        </w:rPr>
+        <w:t>):</w:t>
+      </w:r>
+      <w:r>
+        <w:t xml:space="preserve"> Archivos como </w:t>
+      </w:r>
+      <w:proofErr w:type="spellStart"/>
+      <w:r>
+        <w:t>DashboardPage.tsx</w:t>
+      </w:r>
+      <w:proofErr w:type="spellEnd"/>
+      <w:r>
+        <w:t xml:space="preserve"> o </w:t>
+      </w:r>
+      <w:proofErr w:type="spellStart"/>
+      <w:r>
+        <w:t>PlanFormModal.tsx</w:t>
+      </w:r>
+      <w:proofErr w:type="spellEnd"/>
+      <w:r>
+        <w:t xml:space="preserve"> se dedican casi en un 100% a "pintar" la interfaz utilizando </w:t>
+      </w:r>
+      <w:proofErr w:type="spellStart"/>
+      <w:r>
+        <w:t>React</w:t>
+      </w:r>
+      <w:proofErr w:type="spellEnd"/>
+      <w:r>
+        <w:t xml:space="preserve"> y </w:t>
+      </w:r>
+      <w:proofErr w:type="spellStart"/>
+      <w:r>
+        <w:t>Tailwind</w:t>
+      </w:r>
+      <w:proofErr w:type="spellEnd"/>
+      <w:r>
+        <w:t xml:space="preserve"> CSS. Se consideran componentes "tontos" porque no hacen peticiones complejas directamente.</w:t>
       </w:r>
     </w:p>
     <w:p>
@@ -1204,20 +2352,85 @@
           <w:b/>
           <w:bCs/>
         </w:rPr>
-        <w:t>Capa de Estado y Negocio (src/hooks/*.ts):</w:t>
+        <w:t>Capa de Estado y Negocio (</w:t>
+      </w:r>
+      <w:proofErr w:type="spellStart"/>
+      <w:r>
+        <w:rPr>
+          <w:b/>
+          <w:bCs/>
+        </w:rPr>
+        <w:t>src</w:t>
+      </w:r>
+      <w:proofErr w:type="spellEnd"/>
+      <w:r>
+        <w:rPr>
+          <w:b/>
+          <w:bCs/>
+        </w:rPr>
+        <w:t>/</w:t>
+      </w:r>
+      <w:proofErr w:type="spellStart"/>
+      <w:r>
+        <w:rPr>
+          <w:b/>
+          <w:bCs/>
+        </w:rPr>
+        <w:t>hooks</w:t>
+      </w:r>
+      <w:proofErr w:type="spellEnd"/>
+      <w:r>
+        <w:rPr>
+          <w:b/>
+          <w:bCs/>
+        </w:rPr>
+        <w:t>/*.</w:t>
+      </w:r>
+      <w:proofErr w:type="spellStart"/>
+      <w:r>
+        <w:rPr>
+          <w:b/>
+          <w:bCs/>
+        </w:rPr>
+        <w:t>ts</w:t>
+      </w:r>
+      <w:proofErr w:type="spellEnd"/>
+      <w:r>
+        <w:rPr>
+          <w:b/>
+          <w:bCs/>
+        </w:rPr>
+        <w:t>):</w:t>
       </w:r>
       <w:r>
         <w:t xml:space="preserve"> Extraemos toda la lógica compleja (variables de estado, recolección de datos, y funciones ejecutables) hacia </w:t>
       </w:r>
+      <w:proofErr w:type="spellStart"/>
       <w:r>
         <w:rPr>
           <w:i/>
           <w:iCs/>
         </w:rPr>
-        <w:t>Custom Hooks</w:t>
-      </w:r>
-      <w:r>
-        <w:t>, como useTenants.ts. Esto mantiene los archivos visuales increíblemente limpios.</w:t>
+        <w:t>Custom</w:t>
+      </w:r>
+      <w:proofErr w:type="spellEnd"/>
+      <w:r>
+        <w:rPr>
+          <w:i/>
+          <w:iCs/>
+        </w:rPr>
+        <w:t xml:space="preserve"> Hooks</w:t>
+      </w:r>
+      <w:r>
+        <w:t xml:space="preserve">, como </w:t>
+      </w:r>
+      <w:proofErr w:type="spellStart"/>
+      <w:r>
+        <w:t>useTenants.ts</w:t>
+      </w:r>
+      <w:proofErr w:type="spellEnd"/>
+      <w:r>
+        <w:t>. Esto mantiene los archivos visuales increíblemente limpios.</w:t>
       </w:r>
     </w:p>
     <w:p>
@@ -1232,10 +2445,74 @@
           <w:b/>
           <w:bCs/>
         </w:rPr>
-        <w:t>Capa de Servicios de API (src/services/api.ts):</w:t>
-      </w:r>
-      <w:r>
-        <w:t xml:space="preserve"> Un archivo único centralizado que funciona como "cliente HTTP". Es el único lugar de todo tu frontend que se comunica con tu backend, inyectando los tokens de seguridad automáticamente sin repetir código por todas partes.</w:t>
+        <w:t>Capa de Servicios de API (</w:t>
+      </w:r>
+      <w:proofErr w:type="spellStart"/>
+      <w:r>
+        <w:rPr>
+          <w:b/>
+          <w:bCs/>
+        </w:rPr>
+        <w:t>src</w:t>
+      </w:r>
+      <w:proofErr w:type="spellEnd"/>
+      <w:r>
+        <w:rPr>
+          <w:b/>
+          <w:bCs/>
+        </w:rPr>
+        <w:t>/</w:t>
+      </w:r>
+      <w:proofErr w:type="spellStart"/>
+      <w:r>
+        <w:rPr>
+          <w:b/>
+          <w:bCs/>
+        </w:rPr>
+        <w:t>services</w:t>
+      </w:r>
+      <w:proofErr w:type="spellEnd"/>
+      <w:r>
+        <w:rPr>
+          <w:b/>
+          <w:bCs/>
+        </w:rPr>
+        <w:t>/</w:t>
+      </w:r>
+      <w:proofErr w:type="spellStart"/>
+      <w:r>
+        <w:rPr>
+          <w:b/>
+          <w:bCs/>
+        </w:rPr>
+        <w:t>api.ts</w:t>
+      </w:r>
+      <w:proofErr w:type="spellEnd"/>
+      <w:r>
+        <w:rPr>
+          <w:b/>
+          <w:bCs/>
+        </w:rPr>
+        <w:t>):</w:t>
+      </w:r>
+      <w:r>
+        <w:t xml:space="preserve"> Un archivo único centralizado que funciona como "cliente HTTP". Es el único lugar de todo tu </w:t>
+      </w:r>
+      <w:proofErr w:type="spellStart"/>
+      <w:r>
+        <w:t>frontend</w:t>
+      </w:r>
+      <w:proofErr w:type="spellEnd"/>
+      <w:r>
+        <w:t xml:space="preserve"> que se comunica con tu </w:t>
+      </w:r>
+      <w:proofErr w:type="spellStart"/>
+      <w:r>
+        <w:t>backend</w:t>
+      </w:r>
+      <w:proofErr w:type="spellEnd"/>
+      <w:r>
+        <w:t>, inyectando los tokens de seguridad automáticamente sin repetir código por todas partes.</w:t>
       </w:r>
     </w:p>
     <w:p>
@@ -1250,7 +2527,23 @@
           <w:b/>
           <w:bCs/>
         </w:rPr>
-        <w:t>Estado Global (AuthContext.tsx):</w:t>
+        <w:t>Estado Global (</w:t>
+      </w:r>
+      <w:proofErr w:type="spellStart"/>
+      <w:r>
+        <w:rPr>
+          <w:b/>
+          <w:bCs/>
+        </w:rPr>
+        <w:t>AuthContext.tsx</w:t>
+      </w:r>
+      <w:proofErr w:type="spellEnd"/>
+      <w:r>
+        <w:rPr>
+          <w:b/>
+          <w:bCs/>
+        </w:rPr>
+        <w:t>):</w:t>
       </w:r>
       <w:r>
         <w:t xml:space="preserve"> Mantiene la memoria global de quién inició sesión (rol, ID, token) para que cualquier parte de la aplicación sepa qué mostrar o bloquear.</w:t>
@@ -1262,18 +2555,52 @@
       <w:pPr>
         <w:pStyle w:val="Subttulo"/>
       </w:pPr>
+      <w:proofErr w:type="spellStart"/>
       <w:r>
         <w:lastRenderedPageBreak/>
         <w:t>AppRoutes.jsx</w:t>
       </w:r>
-    </w:p>
-    <w:p>
-      <w:r>
-        <w:rPr>
-          <w:b/>
-          <w:bCs/>
-        </w:rPr>
-        <w:t>1. El orden de las capas (&lt;BrowserRouter&gt; y &lt;AuthProvider&gt;)</w:t>
+      <w:proofErr w:type="spellEnd"/>
+    </w:p>
+    <w:p>
+      <w:r>
+        <w:rPr>
+          <w:b/>
+          <w:bCs/>
+        </w:rPr>
+        <w:t>1. El orden de las capas (&lt;</w:t>
+      </w:r>
+      <w:proofErr w:type="spellStart"/>
+      <w:r>
+        <w:rPr>
+          <w:b/>
+          <w:bCs/>
+        </w:rPr>
+        <w:t>BrowserRouter</w:t>
+      </w:r>
+      <w:proofErr w:type="spellEnd"/>
+      <w:r>
+        <w:rPr>
+          <w:b/>
+          <w:bCs/>
+        </w:rPr>
+        <w:t>&gt; y &lt;</w:t>
+      </w:r>
+      <w:proofErr w:type="spellStart"/>
+      <w:r>
+        <w:rPr>
+          <w:b/>
+          <w:bCs/>
+        </w:rPr>
+        <w:t>AuthProvider</w:t>
+      </w:r>
+      <w:proofErr w:type="spellEnd"/>
+      <w:r>
+        <w:rPr>
+          <w:b/>
+          <w:bCs/>
+        </w:rPr>
+        <w:t>&gt;)</w:t>
       </w:r>
     </w:p>
     <w:p>
@@ -1283,8 +2610,21 @@
           <w:numId w:val="17"/>
         </w:numPr>
       </w:pPr>
-      <w:r>
-        <w:t>BrowserRouter es el motor que lee las URLs de tu navegador. Debe ir siempre afuera para que todo lo que esté adentro sepa en qué página estás.</w:t>
+      <w:proofErr w:type="spellStart"/>
+      <w:r>
+        <w:t>BrowserRouter</w:t>
+      </w:r>
+      <w:proofErr w:type="spellEnd"/>
+      <w:r>
+        <w:t xml:space="preserve"> es el motor que lee las </w:t>
+      </w:r>
+      <w:proofErr w:type="spellStart"/>
+      <w:r>
+        <w:t>URLs</w:t>
+      </w:r>
+      <w:proofErr w:type="spellEnd"/>
+      <w:r>
+        <w:t xml:space="preserve"> de tu navegador. Debe ir siempre afuera para que todo lo que esté adentro sepa en qué página estás.</w:t>
       </w:r>
     </w:p>
     <w:p>
@@ -1294,8 +2634,13 @@
           <w:numId w:val="17"/>
         </w:numPr>
       </w:pPr>
-      <w:r>
-        <w:t xml:space="preserve">AuthProvider es la "memoria" global de tu aplicación que sabe quién inició sesión y cuál es su token. Al ponerlo </w:t>
+      <w:proofErr w:type="spellStart"/>
+      <w:r>
+        <w:t>AuthProvider</w:t>
+      </w:r>
+      <w:proofErr w:type="spellEnd"/>
+      <w:r>
+        <w:t xml:space="preserve"> es la "memoria" global de tu aplicación que sabe quién inició sesión y cuál es su token. Al ponerlo </w:t>
       </w:r>
       <w:r>
         <w:rPr>
@@ -1305,24 +2650,120 @@
         <w:t>inmediatamente adentro</w:t>
       </w:r>
       <w:r>
-        <w:t xml:space="preserve"> del router, garantizas que cualquier pantalla pueda preguntar "¿quién está logueado?" y que tu propio sistema de autenticación pueda redirigir al usuario si es necesario.</w:t>
-      </w:r>
-    </w:p>
-    <w:p>
-      <w:r>
-        <w:rPr>
-          <w:b/>
-          <w:bCs/>
-        </w:rPr>
-        <w:t>2. El "Embudo Infranqueable" de la ruta Privada (/dashboard)</w:t>
-      </w:r>
-      <w:r>
-        <w:t xml:space="preserve"> En tu código anterior, tenías rutas explícitas separadas (como /admin-dashboard o /dashboard para el SuperAdmin). El problema de eso es el riesgo de navegación manual: un usuario con menos privilegios podría escribir localhost:5173/dashboard en la URL de su navegador para intentar forzar la entrada a un panel que no le corresponde.</w:t>
-      </w:r>
-    </w:p>
-    <w:p>
-      <w:r>
-        <w:t xml:space="preserve">Al usar una única ruta /dashboard que apunta al componente &lt;RoleBasedDashboard /&gt;, creamos un escudo hermético. Todos los usuarios autenticados van a la misma URL (/dashboard), pero es React quien decide y dibuja una pantalla totalmente distinta dependiendo de quién sea el usuario. </w:t>
+        <w:t xml:space="preserve"> del </w:t>
+      </w:r>
+      <w:proofErr w:type="spellStart"/>
+      <w:r>
+        <w:t>router</w:t>
+      </w:r>
+      <w:proofErr w:type="spellEnd"/>
+      <w:r>
+        <w:t xml:space="preserve">, garantizas que cualquier pantalla pueda preguntar "¿quién está </w:t>
+      </w:r>
+      <w:proofErr w:type="spellStart"/>
+      <w:r>
+        <w:t>logueado</w:t>
+      </w:r>
+      <w:proofErr w:type="spellEnd"/>
+      <w:r>
+        <w:t>?" y que tu propio sistema de autenticación pueda redirigir al usuario si es necesario.</w:t>
+      </w:r>
+    </w:p>
+    <w:p>
+      <w:r>
+        <w:rPr>
+          <w:b/>
+          <w:bCs/>
+        </w:rPr>
+        <w:t>2. El "Embudo Infranqueable" de la ruta Privada (/</w:t>
+      </w:r>
+      <w:proofErr w:type="spellStart"/>
+      <w:r>
+        <w:rPr>
+          <w:b/>
+          <w:bCs/>
+        </w:rPr>
+        <w:t>dashboard</w:t>
+      </w:r>
+      <w:proofErr w:type="spellEnd"/>
+      <w:r>
+        <w:rPr>
+          <w:b/>
+          <w:bCs/>
+        </w:rPr>
+        <w:t>)</w:t>
+      </w:r>
+      <w:r>
+        <w:t xml:space="preserve"> En tu código anterior, tenías rutas explícitas separadas (como /</w:t>
+      </w:r>
+      <w:proofErr w:type="spellStart"/>
+      <w:r>
+        <w:t>admin-dashboard</w:t>
+      </w:r>
+      <w:proofErr w:type="spellEnd"/>
+      <w:r>
+        <w:t xml:space="preserve"> o /</w:t>
+      </w:r>
+      <w:proofErr w:type="spellStart"/>
+      <w:r>
+        <w:t>dashboard</w:t>
+      </w:r>
+      <w:proofErr w:type="spellEnd"/>
+      <w:r>
+        <w:t xml:space="preserve"> para el </w:t>
+      </w:r>
+      <w:proofErr w:type="spellStart"/>
+      <w:r>
+        <w:t>SuperAdmin</w:t>
+      </w:r>
+      <w:proofErr w:type="spellEnd"/>
+      <w:r>
+        <w:t>). El problema de eso es el riesgo de navegación manual: un usuario con menos privilegios podría escribir localhost:5173/</w:t>
+      </w:r>
+      <w:proofErr w:type="spellStart"/>
+      <w:r>
+        <w:t>dashboard</w:t>
+      </w:r>
+      <w:proofErr w:type="spellEnd"/>
+      <w:r>
+        <w:t xml:space="preserve"> en la URL de su navegador para intentar forzar la entrada a un panel que no le corresponde.</w:t>
+      </w:r>
+    </w:p>
+    <w:p>
+      <w:r>
+        <w:t>Al usar una única ruta /</w:t>
+      </w:r>
+      <w:proofErr w:type="spellStart"/>
+      <w:r>
+        <w:t>dashboard</w:t>
+      </w:r>
+      <w:proofErr w:type="spellEnd"/>
+      <w:r>
+        <w:t xml:space="preserve"> que apunta al componente &lt;</w:t>
+      </w:r>
+      <w:proofErr w:type="spellStart"/>
+      <w:r>
+        <w:t>RoleBasedDashboard</w:t>
+      </w:r>
+      <w:proofErr w:type="spellEnd"/>
+      <w:r>
+        <w:t xml:space="preserve"> /&gt;, creamos un escudo hermético. Todos los usuarios autenticados van a la misma URL (/</w:t>
+      </w:r>
+      <w:proofErr w:type="spellStart"/>
+      <w:r>
+        <w:t>dashboard</w:t>
+      </w:r>
+      <w:proofErr w:type="spellEnd"/>
+      <w:r>
+        <w:t xml:space="preserve">), pero es </w:t>
+      </w:r>
+      <w:proofErr w:type="spellStart"/>
+      <w:r>
+        <w:t>React</w:t>
+      </w:r>
+      <w:proofErr w:type="spellEnd"/>
+      <w:r>
+        <w:t xml:space="preserve"> quien decide y dibuja una pantalla totalmente distinta dependiendo de quién sea el usuario. </w:t>
       </w:r>
       <w:r>
         <w:rPr>
@@ -1332,7 +2773,15 @@
         <w:t>Es físicamente imposible que un usuario haga trampa escribiendo otra URL</w:t>
       </w:r>
       <w:r>
-        <w:t>, porque las otras URLs privadas ya ni siquiera existen en el enrutador.</w:t>
+        <w:t xml:space="preserve">, porque las otras </w:t>
+      </w:r>
+      <w:proofErr w:type="spellStart"/>
+      <w:r>
+        <w:t>URLs</w:t>
+      </w:r>
+      <w:proofErr w:type="spellEnd"/>
+      <w:r>
+        <w:t xml:space="preserve"> privadas ya ni siquiera existen en el enrutador.</w:t>
       </w:r>
     </w:p>
     <w:p>
@@ -1344,7 +2793,23 @@
         <w:t>3. Las Rutas Públicas Independientes</w:t>
       </w:r>
       <w:r>
-        <w:t xml:space="preserve"> La LandingPage (tu propuesta comercial) y el LoginPage están sueltas y expuestas porque son públicas. No necesitan verificaciones de token ni de roles.</w:t>
+        <w:t xml:space="preserve"> La </w:t>
+      </w:r>
+      <w:proofErr w:type="spellStart"/>
+      <w:r>
+        <w:t>LandingPage</w:t>
+      </w:r>
+      <w:proofErr w:type="spellEnd"/>
+      <w:r>
+        <w:t xml:space="preserve"> (tu propuesta comercial) y el </w:t>
+      </w:r>
+      <w:proofErr w:type="spellStart"/>
+      <w:r>
+        <w:t>LoginPage</w:t>
+      </w:r>
+      <w:proofErr w:type="spellEnd"/>
+      <w:r>
+        <w:t xml:space="preserve"> están sueltas y expuestas porque son públicas. No necesitan verificaciones de token ni de roles.</w:t>
       </w:r>
     </w:p>
     <w:p>
@@ -1356,7 +2821,47 @@
         <w:t>4. La Red de Seguridad (*)</w:t>
       </w:r>
       <w:r>
-        <w:t xml:space="preserve"> La última línea &lt;Route path="*" element={&lt;Navigate to="/" replace /&gt;} /&gt; es tu "seguro contra accidentes". Si un usuario (o un cliente curioso) inventa una URL que no existe (por ejemplo, localhost:5173/inventado), en lugar de que tu aplicación se rompa o muestre una pantalla en blanco, el enrutador lo atrapa y lo expulsa silenciosamente de regreso a la página de inicio (/).</w:t>
+        <w:t xml:space="preserve"> La última línea &lt;Route </w:t>
+      </w:r>
+      <w:proofErr w:type="spellStart"/>
+      <w:r>
+        <w:t>path</w:t>
+      </w:r>
+      <w:proofErr w:type="spellEnd"/>
+      <w:r>
+        <w:t xml:space="preserve">="*" </w:t>
+      </w:r>
+      <w:proofErr w:type="spellStart"/>
+      <w:r>
+        <w:t>element</w:t>
+      </w:r>
+      <w:proofErr w:type="spellEnd"/>
+      <w:r>
+        <w:t>={&lt;</w:t>
+      </w:r>
+      <w:proofErr w:type="spellStart"/>
+      <w:r>
+        <w:t>Navigate</w:t>
+      </w:r>
+      <w:proofErr w:type="spellEnd"/>
+      <w:r>
+        <w:t xml:space="preserve"> </w:t>
+      </w:r>
+      <w:proofErr w:type="spellStart"/>
+      <w:r>
+        <w:t>to</w:t>
+      </w:r>
+      <w:proofErr w:type="spellEnd"/>
+      <w:r>
+        <w:t xml:space="preserve">="/" </w:t>
+      </w:r>
+      <w:proofErr w:type="spellStart"/>
+      <w:r>
+        <w:t>replace</w:t>
+      </w:r>
+      <w:proofErr w:type="spellEnd"/>
+      <w:r>
+        <w:t xml:space="preserve"> /&gt;} /&gt; es tu "seguro contra accidentes". Si un usuario (o un cliente curioso) inventa una URL que no existe (por ejemplo, localhost:5173/inventado), en lugar de que tu aplicación se rompa o muestre una pantalla en blanco, el enrutador lo atrapa y lo expulsa silenciosamente de regreso a la página de inicio (/).</w:t>
       </w:r>
     </w:p>
     <w:p>
@@ -1371,7 +2876,15 @@
         <w:t>fortaleza con una sola puerta de entrada principal</w:t>
       </w:r>
       <w:r>
-        <w:t>, donde tu &lt;RoleBasedDashboard /&gt; es el guardia de seguridad que revisa la identificación y decide a qué cuarto te deja pasar.</w:t>
+        <w:t>, donde tu &lt;</w:t>
+      </w:r>
+      <w:proofErr w:type="spellStart"/>
+      <w:r>
+        <w:t>RoleBasedDashboard</w:t>
+      </w:r>
+      <w:proofErr w:type="spellEnd"/>
+      <w:r>
+        <w:t xml:space="preserve"> /&gt; es el guardia de seguridad que revisa la identificación y decide a qué cuarto te deja pasar.</w:t>
       </w:r>
     </w:p>
     <w:p/>
@@ -1434,7 +2947,39 @@
         </w:numPr>
       </w:pPr>
       <w:r>
-        <w:t>El archivo AuthContext.tsx maneja el estado de la sesión leyendo el token, la información del user y la bandera requirePasswordChange desde la memoria física del dispositivo usando AsyncStorage.</w:t>
+        <w:t xml:space="preserve">El archivo </w:t>
+      </w:r>
+      <w:proofErr w:type="spellStart"/>
+      <w:r>
+        <w:t>AuthContext.tsx</w:t>
+      </w:r>
+      <w:proofErr w:type="spellEnd"/>
+      <w:r>
+        <w:t xml:space="preserve"> maneja el estado de la sesión leyendo el token, la información del </w:t>
+      </w:r>
+      <w:proofErr w:type="spellStart"/>
+      <w:r>
+        <w:t>user</w:t>
+      </w:r>
+      <w:proofErr w:type="spellEnd"/>
+      <w:r>
+        <w:t xml:space="preserve"> y la bandera </w:t>
+      </w:r>
+      <w:proofErr w:type="spellStart"/>
+      <w:r>
+        <w:t>requirePasswordChange</w:t>
+      </w:r>
+      <w:proofErr w:type="spellEnd"/>
+      <w:r>
+        <w:t xml:space="preserve"> desde la memoria física del dispositivo usando </w:t>
+      </w:r>
+      <w:proofErr w:type="spellStart"/>
+      <w:r>
+        <w:t>AsyncStorage</w:t>
+      </w:r>
+      <w:proofErr w:type="spellEnd"/>
+      <w:r>
+        <w:t>.</w:t>
       </w:r>
     </w:p>
     <w:p>
@@ -1445,7 +2990,15 @@
         </w:numPr>
       </w:pPr>
       <w:r>
-        <w:t>El contexto incluye un estado isLoading que mantiene la aplicación en pausa hasta que termina de verificar si existe una sesión guardada previamente.</w:t>
+        <w:t xml:space="preserve">El contexto incluye un estado </w:t>
+      </w:r>
+      <w:proofErr w:type="spellStart"/>
+      <w:r>
+        <w:t>isLoading</w:t>
+      </w:r>
+      <w:proofErr w:type="spellEnd"/>
+      <w:r>
+        <w:t xml:space="preserve"> que mantiene la aplicación en pausa hasta que termina de verificar si existe una sesión guardada previamente.</w:t>
       </w:r>
     </w:p>
     <w:p>
@@ -1456,7 +3009,39 @@
         </w:numPr>
       </w:pPr>
       <w:r>
-        <w:t>Las funciones login y logout sincronizan simultáneamente los estados de React y la base de datos de AsyncStorage para evitar inconsistencias.</w:t>
+        <w:t xml:space="preserve">Las funciones </w:t>
+      </w:r>
+      <w:proofErr w:type="spellStart"/>
+      <w:r>
+        <w:t>login</w:t>
+      </w:r>
+      <w:proofErr w:type="spellEnd"/>
+      <w:r>
+        <w:t xml:space="preserve"> y </w:t>
+      </w:r>
+      <w:proofErr w:type="spellStart"/>
+      <w:r>
+        <w:t>logout</w:t>
+      </w:r>
+      <w:proofErr w:type="spellEnd"/>
+      <w:r>
+        <w:t xml:space="preserve"> sincronizan simultáneamente los estados de </w:t>
+      </w:r>
+      <w:proofErr w:type="spellStart"/>
+      <w:r>
+        <w:t>React</w:t>
+      </w:r>
+      <w:proofErr w:type="spellEnd"/>
+      <w:r>
+        <w:t xml:space="preserve"> y la base de datos de </w:t>
+      </w:r>
+      <w:proofErr w:type="spellStart"/>
+      <w:r>
+        <w:t>AsyncStorage</w:t>
+      </w:r>
+      <w:proofErr w:type="spellEnd"/>
+      <w:r>
+        <w:t xml:space="preserve"> para evitar inconsistencias.</w:t>
       </w:r>
     </w:p>
     <w:p>
@@ -1467,7 +3052,23 @@
         </w:numPr>
       </w:pPr>
       <w:r>
-        <w:t>El ThemeContext.tsx utiliza Appearance.getColorScheme() para detectar nativamente si el teléfono del usuario está en modo claro u oscuro.</w:t>
+        <w:t xml:space="preserve">El </w:t>
+      </w:r>
+      <w:proofErr w:type="spellStart"/>
+      <w:r>
+        <w:t>ThemeContext.tsx</w:t>
+      </w:r>
+      <w:proofErr w:type="spellEnd"/>
+      <w:r>
+        <w:t xml:space="preserve"> utiliza </w:t>
+      </w:r>
+      <w:proofErr w:type="spellStart"/>
+      <w:r>
+        <w:t>Appearance.getColorScheme</w:t>
+      </w:r>
+      <w:proofErr w:type="spellEnd"/>
+      <w:r>
+        <w:t>() para detectar nativamente si el teléfono del usuario está en modo claro u oscuro.</w:t>
       </w:r>
     </w:p>
     <w:p>
@@ -1478,7 +3079,23 @@
         </w:numPr>
       </w:pPr>
       <w:r>
-        <w:t>Este contexto de tema también guarda la preferencia manual del usuario en AsyncStorage bajo la llave aqua-ui-theme.</w:t>
+        <w:t xml:space="preserve">Este contexto de tema también guarda la preferencia manual del usuario en </w:t>
+      </w:r>
+      <w:proofErr w:type="spellStart"/>
+      <w:r>
+        <w:t>AsyncStorage</w:t>
+      </w:r>
+      <w:proofErr w:type="spellEnd"/>
+      <w:r>
+        <w:t xml:space="preserve"> bajo la llave </w:t>
+      </w:r>
+      <w:proofErr w:type="spellStart"/>
+      <w:r>
+        <w:t>aqua-ui-theme</w:t>
+      </w:r>
+      <w:proofErr w:type="spellEnd"/>
+      <w:r>
+        <w:t>.</w:t>
       </w:r>
     </w:p>
     <w:p>
@@ -1509,7 +3126,23 @@
         </w:numPr>
       </w:pPr>
       <w:r>
-        <w:t>El archivo api.ts actúa como un interceptor global que busca el token de forma asíncrona en el teléfono y lo inyecta en los encabezados Authorization de cada solicitud.</w:t>
+        <w:t xml:space="preserve">El archivo </w:t>
+      </w:r>
+      <w:proofErr w:type="spellStart"/>
+      <w:r>
+        <w:t>api.ts</w:t>
+      </w:r>
+      <w:proofErr w:type="spellEnd"/>
+      <w:r>
+        <w:t xml:space="preserve"> actúa como un interceptor global que busca el token de forma asíncrona en el teléfono y lo inyecta en los encabezados </w:t>
+      </w:r>
+      <w:proofErr w:type="spellStart"/>
+      <w:r>
+        <w:t>Authorization</w:t>
+      </w:r>
+      <w:proofErr w:type="spellEnd"/>
+      <w:r>
+        <w:t xml:space="preserve"> de cada solicitud.</w:t>
       </w:r>
     </w:p>
     <w:p>
@@ -1520,7 +3153,15 @@
         </w:numPr>
       </w:pPr>
       <w:r>
-        <w:t>Utiliza la variable de entorno EXPO_PUBLIC_API_BASE_URL o un respaldo estático (como la IP local 192.168.1.165) para encontrar el backend.</w:t>
+        <w:t xml:space="preserve">Utiliza la variable de entorno EXPO_PUBLIC_API_BASE_URL o un respaldo estático (como la IP local 192.168.1.165) para encontrar el </w:t>
+      </w:r>
+      <w:proofErr w:type="spellStart"/>
+      <w:r>
+        <w:t>backend</w:t>
+      </w:r>
+      <w:proofErr w:type="spellEnd"/>
+      <w:r>
+        <w:t>.</w:t>
       </w:r>
     </w:p>
     <w:p>
@@ -1531,7 +3172,15 @@
         </w:numPr>
       </w:pPr>
       <w:r>
-        <w:t>Implementa una barrera de seguridad: si el servidor responde con error 401 o 403, el servicio limpia automáticamente el AsyncStorage, destruyendo la sesión inválida.</w:t>
+        <w:t xml:space="preserve">Implementa una barrera de seguridad: si el servidor responde con error 401 o 403, el servicio limpia automáticamente el </w:t>
+      </w:r>
+      <w:proofErr w:type="spellStart"/>
+      <w:r>
+        <w:t>AsyncStorage</w:t>
+      </w:r>
+      <w:proofErr w:type="spellEnd"/>
+      <w:r>
+        <w:t>, destruyendo la sesión inválida.</w:t>
       </w:r>
     </w:p>
     <w:p>
@@ -1563,7 +3212,31 @@
         </w:numPr>
       </w:pPr>
       <w:r>
-        <w:t>El _layout.tsx envuelve todo tu proyecto con ThemeProvider y AuthProvider para que cualquier pantalla tenga acceso a esos datos.</w:t>
+        <w:t>El _</w:t>
+      </w:r>
+      <w:proofErr w:type="spellStart"/>
+      <w:r>
+        <w:t>layout.tsx</w:t>
+      </w:r>
+      <w:proofErr w:type="spellEnd"/>
+      <w:r>
+        <w:t xml:space="preserve"> envuelve todo tu proyecto con </w:t>
+      </w:r>
+      <w:proofErr w:type="spellStart"/>
+      <w:r>
+        <w:t>ThemeProvider</w:t>
+      </w:r>
+      <w:proofErr w:type="spellEnd"/>
+      <w:r>
+        <w:t xml:space="preserve"> y </w:t>
+      </w:r>
+      <w:proofErr w:type="spellStart"/>
+      <w:r>
+        <w:t>AuthProvider</w:t>
+      </w:r>
+      <w:proofErr w:type="spellEnd"/>
+      <w:r>
+        <w:t xml:space="preserve"> para que cualquier pantalla tenga acceso a esos datos.</w:t>
       </w:r>
     </w:p>
     <w:p>
@@ -1574,7 +3247,39 @@
         </w:numPr>
       </w:pPr>
       <w:r>
-        <w:t>El componente RootNavigation escucha los cambios del AuthContext y utiliza useSegments de Expo Router para saber en qué carpeta se encuentra el usuario.</w:t>
+        <w:t xml:space="preserve">El componente </w:t>
+      </w:r>
+      <w:proofErr w:type="spellStart"/>
+      <w:r>
+        <w:t>RootNavigation</w:t>
+      </w:r>
+      <w:proofErr w:type="spellEnd"/>
+      <w:r>
+        <w:t xml:space="preserve"> escucha los cambios del </w:t>
+      </w:r>
+      <w:proofErr w:type="spellStart"/>
+      <w:r>
+        <w:t>AuthContext</w:t>
+      </w:r>
+      <w:proofErr w:type="spellEnd"/>
+      <w:r>
+        <w:t xml:space="preserve"> y utiliza </w:t>
+      </w:r>
+      <w:proofErr w:type="spellStart"/>
+      <w:r>
+        <w:t>useSegments</w:t>
+      </w:r>
+      <w:proofErr w:type="spellEnd"/>
+      <w:r>
+        <w:t xml:space="preserve"> de Expo </w:t>
+      </w:r>
+      <w:proofErr w:type="spellStart"/>
+      <w:r>
+        <w:t>Router</w:t>
+      </w:r>
+      <w:proofErr w:type="spellEnd"/>
+      <w:r>
+        <w:t xml:space="preserve"> para saber en qué carpeta se encuentra el usuario.</w:t>
       </w:r>
     </w:p>
     <w:p>
@@ -1585,7 +3290,31 @@
         </w:numPr>
       </w:pPr>
       <w:r>
-        <w:t>Si no hay token y el usuario no está en el grupo (auth), utiliza router.replace para expulsarlo obligatoriamente a la pantalla de login.</w:t>
+        <w:t>Si no hay token y el usuario no está en el grupo (</w:t>
+      </w:r>
+      <w:proofErr w:type="spellStart"/>
+      <w:r>
+        <w:t>auth</w:t>
+      </w:r>
+      <w:proofErr w:type="spellEnd"/>
+      <w:r>
+        <w:t xml:space="preserve">), utiliza </w:t>
+      </w:r>
+      <w:proofErr w:type="spellStart"/>
+      <w:r>
+        <w:t>router.replace</w:t>
+      </w:r>
+      <w:proofErr w:type="spellEnd"/>
+      <w:r>
+        <w:t xml:space="preserve"> para expulsarlo obligatoriamente a la pantalla de </w:t>
+      </w:r>
+      <w:proofErr w:type="spellStart"/>
+      <w:r>
+        <w:t>login</w:t>
+      </w:r>
+      <w:proofErr w:type="spellEnd"/>
+      <w:r>
+        <w:t>.</w:t>
       </w:r>
     </w:p>
     <w:p>
@@ -1596,7 +3325,15 @@
         </w:numPr>
       </w:pPr>
       <w:r>
-        <w:t>Si hay token y el usuario intenta ir a una pantalla pública, el sistema lo redirige inmediatamente a /(dashboard)/home.</w:t>
+        <w:t>Si hay token y el usuario intenta ir a una pantalla pública, el sistema lo redirige inmediatamente a /(</w:t>
+      </w:r>
+      <w:proofErr w:type="spellStart"/>
+      <w:r>
+        <w:t>dashboard</w:t>
+      </w:r>
+      <w:proofErr w:type="spellEnd"/>
+      <w:r>
+        <w:t>)/home.</w:t>
       </w:r>
     </w:p>
     <w:p>
@@ -1607,7 +3344,31 @@
         </w:numPr>
       </w:pPr>
       <w:r>
-        <w:t>El archivo index.tsx de la raíz funciona como una pantalla de paso temporal, mostrando un ActivityIndicator mientras el _layout.tsx decide el destino final del tráfico.</w:t>
+        <w:t xml:space="preserve">El archivo </w:t>
+      </w:r>
+      <w:proofErr w:type="spellStart"/>
+      <w:r>
+        <w:t>index.tsx</w:t>
+      </w:r>
+      <w:proofErr w:type="spellEnd"/>
+      <w:r>
+        <w:t xml:space="preserve"> de la raíz funciona como una pantalla de paso temporal, mostrando un </w:t>
+      </w:r>
+      <w:proofErr w:type="spellStart"/>
+      <w:r>
+        <w:t>ActivityIndicator</w:t>
+      </w:r>
+      <w:proofErr w:type="spellEnd"/>
+      <w:r>
+        <w:t xml:space="preserve"> mientras el _</w:t>
+      </w:r>
+      <w:proofErr w:type="spellStart"/>
+      <w:r>
+        <w:t>layout.tsx</w:t>
+      </w:r>
+      <w:proofErr w:type="spellEnd"/>
+      <w:r>
+        <w:t xml:space="preserve"> decide el destino final del tráfico.</w:t>
       </w:r>
     </w:p>
     <w:p>
@@ -1638,7 +3399,31 @@
         </w:numPr>
       </w:pPr>
       <w:r>
-        <w:t>En login.tsx, utilizas KeyboardAvoidingView y ScrollView para asegurar que el teclado virtual del teléfono no oculte los campos de correo o contraseña al escribir.</w:t>
+        <w:t xml:space="preserve">En </w:t>
+      </w:r>
+      <w:proofErr w:type="spellStart"/>
+      <w:r>
+        <w:t>login.tsx</w:t>
+      </w:r>
+      <w:proofErr w:type="spellEnd"/>
+      <w:r>
+        <w:t xml:space="preserve">, utilizas </w:t>
+      </w:r>
+      <w:proofErr w:type="spellStart"/>
+      <w:r>
+        <w:t>KeyboardAvoidingView</w:t>
+      </w:r>
+      <w:proofErr w:type="spellEnd"/>
+      <w:r>
+        <w:t xml:space="preserve"> y </w:t>
+      </w:r>
+      <w:proofErr w:type="spellStart"/>
+      <w:r>
+        <w:t>ScrollView</w:t>
+      </w:r>
+      <w:proofErr w:type="spellEnd"/>
+      <w:r>
+        <w:t xml:space="preserve"> para asegurar que el teclado virtual del teléfono no oculte los campos de correo o contraseña al escribir.</w:t>
       </w:r>
     </w:p>
     <w:p>
@@ -1649,7 +3434,15 @@
         </w:numPr>
       </w:pPr>
       <w:r>
-        <w:t>El botón de inicio de sesión desactiva su función y muestra un indicador de carga nativo cuando el estado isSubmitting es verdadero.</w:t>
+        <w:t xml:space="preserve">El botón de inicio de sesión desactiva su función y muestra un indicador de carga nativo cuando el estado </w:t>
+      </w:r>
+      <w:proofErr w:type="spellStart"/>
+      <w:r>
+        <w:t>isSubmitting</w:t>
+      </w:r>
+      <w:proofErr w:type="spellEnd"/>
+      <w:r>
+        <w:t xml:space="preserve"> es verdadero.</w:t>
       </w:r>
     </w:p>
     <w:p>
@@ -1660,7 +3453,31 @@
         </w:numPr>
       </w:pPr>
       <w:r>
-        <w:t>El home.tsx emplea un SafeAreaView para asegurar que el contenido del Dashboard no se superponga con la barra de estado superior o la muesca de la cámara del dispositivo.</w:t>
+        <w:t xml:space="preserve">El </w:t>
+      </w:r>
+      <w:proofErr w:type="spellStart"/>
+      <w:r>
+        <w:t>home.tsx</w:t>
+      </w:r>
+      <w:proofErr w:type="spellEnd"/>
+      <w:r>
+        <w:t xml:space="preserve"> emplea un </w:t>
+      </w:r>
+      <w:proofErr w:type="spellStart"/>
+      <w:r>
+        <w:t>SafeAreaView</w:t>
+      </w:r>
+      <w:proofErr w:type="spellEnd"/>
+      <w:r>
+        <w:t xml:space="preserve"> para asegurar que el contenido del </w:t>
+      </w:r>
+      <w:proofErr w:type="spellStart"/>
+      <w:r>
+        <w:t>Dashboard</w:t>
+      </w:r>
+      <w:proofErr w:type="spellEnd"/>
+      <w:r>
+        <w:t xml:space="preserve"> no se superponga con la barra de estado superior o la muesca de la cámara del dispositivo.</w:t>
       </w:r>
     </w:p>
     <w:p>
@@ -1671,7 +3488,23 @@
         </w:numPr>
       </w:pPr>
       <w:r>
-        <w:t>El Dashboard personaliza dinámicamente el saludo extrayendo el primer nombre del usuario y el nombre del tenant directamente desde el contexto de autenticación.</w:t>
+        <w:t xml:space="preserve">El </w:t>
+      </w:r>
+      <w:proofErr w:type="spellStart"/>
+      <w:r>
+        <w:t>Dashboard</w:t>
+      </w:r>
+      <w:proofErr w:type="spellEnd"/>
+      <w:r>
+        <w:t xml:space="preserve"> personaliza dinámicamente el saludo extrayendo el primer nombre del usuario y el nombre del </w:t>
+      </w:r>
+      <w:proofErr w:type="spellStart"/>
+      <w:r>
+        <w:t>tenant</w:t>
+      </w:r>
+      <w:proofErr w:type="spellEnd"/>
+      <w:r>
+        <w:t xml:space="preserve"> directamente desde el contexto de autenticación.</w:t>
       </w:r>
     </w:p>
     <w:p>
@@ -1703,8 +3536,16 @@
         <w:rPr>
           <w:lang w:val="en-US"/>
         </w:rPr>
-        <w:t>aqua-mobile\app\(auth)\login.tsx</w:t>
-      </w:r>
+        <w:t>aqua-mobile\app\(auth)\</w:t>
+      </w:r>
+      <w:proofErr w:type="spellStart"/>
+      <w:r>
+        <w:rPr>
+          <w:lang w:val="en-US"/>
+        </w:rPr>
+        <w:t>login.tsx</w:t>
+      </w:r>
+      <w:proofErr w:type="spellEnd"/>
     </w:p>
     <w:p>
       <w:r>
@@ -1723,12 +3564,44 @@
           <w:b/>
           <w:bCs/>
         </w:rPr>
-        <w:t>1. El Semáforo Interno (isSubmitting)</w:t>
-      </w:r>
-    </w:p>
-    <w:p>
-      <w:r>
-        <w:t>Justo arriba, inicializas estados para el email y password, pero el más importante para la interfaz es isSubmitting.</w:t>
+        <w:t>1. El Semáforo Interno (</w:t>
+      </w:r>
+      <w:proofErr w:type="spellStart"/>
+      <w:r>
+        <w:rPr>
+          <w:b/>
+          <w:bCs/>
+        </w:rPr>
+        <w:t>isSubmitting</w:t>
+      </w:r>
+      <w:proofErr w:type="spellEnd"/>
+      <w:r>
+        <w:rPr>
+          <w:b/>
+          <w:bCs/>
+        </w:rPr>
+        <w:t>)</w:t>
+      </w:r>
+    </w:p>
+    <w:p>
+      <w:r>
+        <w:t xml:space="preserve">Justo arriba, inicializas estados para el email y </w:t>
+      </w:r>
+      <w:proofErr w:type="spellStart"/>
+      <w:r>
+        <w:t>password</w:t>
+      </w:r>
+      <w:proofErr w:type="spellEnd"/>
+      <w:r>
+        <w:t xml:space="preserve">, pero el más importante para la interfaz es </w:t>
+      </w:r>
+      <w:proofErr w:type="spellStart"/>
+      <w:r>
+        <w:t>isSubmitting</w:t>
+      </w:r>
+      <w:proofErr w:type="spellEnd"/>
+      <w:r>
+        <w:t>.</w:t>
       </w:r>
     </w:p>
     <w:p>
@@ -1768,7 +3641,15 @@
         <w:t>Retroalimentación Visual:</w:t>
       </w:r>
       <w:r>
-        <w:t xml:space="preserve"> El botón de inicio de sesión desactiva su función y muestra un indicador de carga nativo cuando el estado isSubmitting es verdadero. Esto le avisa visualmente al usuario que la solicitud se está procesando, evitando que piense que la aplicación se quedó congelada.</w:t>
+        <w:t xml:space="preserve"> El botón de inicio de sesión desactiva su función y muestra un indicador de carga nativo cuando el estado </w:t>
+      </w:r>
+      <w:proofErr w:type="spellStart"/>
+      <w:r>
+        <w:t>isSubmitting</w:t>
+      </w:r>
+      <w:proofErr w:type="spellEnd"/>
+      <w:r>
+        <w:t xml:space="preserve"> es verdadero. Esto le avisa visualmente al usuario que la solicitud se está procesando, evitando que piense que la aplicación se quedó congelada.</w:t>
       </w:r>
     </w:p>
     <w:p>
@@ -1786,27 +3667,59 @@
         <w:t>Prevención de duplicados:</w:t>
       </w:r>
       <w:r>
-        <w:t xml:space="preserve"> Si no tuvieras este estado, un usuario impaciente podría tocar el botón varias veces seguidas, disparando peticiones simultáneas ineficientes que pueden causar errores de red. Al usar isSubmitting, bloqueas el botón tras el primer toque.</w:t>
-      </w:r>
-    </w:p>
-    <w:p>
-      <w:pPr>
-        <w:rPr>
-          <w:b/>
-          <w:bCs/>
-        </w:rPr>
-      </w:pPr>
-      <w:r>
-        <w:rPr>
-          <w:b/>
-          <w:bCs/>
-        </w:rPr>
-        <w:t>2. La Llamada Segura (apiFetch)</w:t>
-      </w:r>
-    </w:p>
-    <w:p>
-      <w:r>
-        <w:t>Cuando el usuario pasa la validación básica (que no haya campos vacíos), el código enciende el "semáforo" (setIsSubmitting(true)) y hace la llamada a tu API.</w:t>
+        <w:t xml:space="preserve"> Si no tuvieras este estado, un usuario impaciente podría tocar el botón varias veces seguidas, disparando peticiones simultáneas ineficientes que pueden causar errores de red. Al usar </w:t>
+      </w:r>
+      <w:proofErr w:type="spellStart"/>
+      <w:r>
+        <w:t>isSubmitting</w:t>
+      </w:r>
+      <w:proofErr w:type="spellEnd"/>
+      <w:r>
+        <w:t>, bloqueas el botón tras el primer toque.</w:t>
+      </w:r>
+    </w:p>
+    <w:p>
+      <w:pPr>
+        <w:rPr>
+          <w:b/>
+          <w:bCs/>
+        </w:rPr>
+      </w:pPr>
+      <w:r>
+        <w:rPr>
+          <w:b/>
+          <w:bCs/>
+        </w:rPr>
+        <w:t>2. La Llamada Segura (</w:t>
+      </w:r>
+      <w:proofErr w:type="spellStart"/>
+      <w:r>
+        <w:rPr>
+          <w:b/>
+          <w:bCs/>
+        </w:rPr>
+        <w:t>apiFetch</w:t>
+      </w:r>
+      <w:proofErr w:type="spellEnd"/>
+      <w:r>
+        <w:rPr>
+          <w:b/>
+          <w:bCs/>
+        </w:rPr>
+        <w:t>)</w:t>
+      </w:r>
+    </w:p>
+    <w:p>
+      <w:r>
+        <w:t>Cuando el usuario pasa la validación básica (que no haya campos vacíos), el código enciende el "semáforo" (</w:t>
+      </w:r>
+      <w:proofErr w:type="spellStart"/>
+      <w:r>
+        <w:t>setIsSubmitting</w:t>
+      </w:r>
+      <w:proofErr w:type="spellEnd"/>
+      <w:r>
+        <w:t>(true)) y hace la llamada a tu API.</w:t>
       </w:r>
     </w:p>
     <w:p>
@@ -1817,7 +3730,23 @@
         </w:numPr>
       </w:pPr>
       <w:r>
-        <w:t>En lugar de usar un fetch tradicional, usas tu cliente centralizado apiFetch.</w:t>
+        <w:t xml:space="preserve">En lugar de usar un </w:t>
+      </w:r>
+      <w:proofErr w:type="spellStart"/>
+      <w:r>
+        <w:t>fetch</w:t>
+      </w:r>
+      <w:proofErr w:type="spellEnd"/>
+      <w:r>
+        <w:t xml:space="preserve"> tradicional, usas tu cliente centralizado </w:t>
+      </w:r>
+      <w:proofErr w:type="spellStart"/>
+      <w:r>
+        <w:t>apiFetch</w:t>
+      </w:r>
+      <w:proofErr w:type="spellEnd"/>
+      <w:r>
+        <w:t>.</w:t>
       </w:r>
     </w:p>
     <w:p>
@@ -1844,12 +3773,52 @@
           <w:bCs/>
         </w:rPr>
         <w:lastRenderedPageBreak/>
-        <w:t>3. El Cerebro Global (useAuth y login)</w:t>
-      </w:r>
-    </w:p>
-    <w:p>
-      <w:r>
-        <w:t>Una vez que el backend responde con éxito (entregando el token y los datos del usuario), entra en acción tu contexto global.</w:t>
+        <w:t>3. El Cerebro Global (</w:t>
+      </w:r>
+      <w:proofErr w:type="spellStart"/>
+      <w:r>
+        <w:rPr>
+          <w:b/>
+          <w:bCs/>
+        </w:rPr>
+        <w:t>useAuth</w:t>
+      </w:r>
+      <w:proofErr w:type="spellEnd"/>
+      <w:r>
+        <w:rPr>
+          <w:b/>
+          <w:bCs/>
+        </w:rPr>
+        <w:t xml:space="preserve"> y </w:t>
+      </w:r>
+      <w:proofErr w:type="spellStart"/>
+      <w:r>
+        <w:rPr>
+          <w:b/>
+          <w:bCs/>
+        </w:rPr>
+        <w:t>login</w:t>
+      </w:r>
+      <w:proofErr w:type="spellEnd"/>
+      <w:r>
+        <w:rPr>
+          <w:b/>
+          <w:bCs/>
+        </w:rPr>
+        <w:t>)</w:t>
+      </w:r>
+    </w:p>
+    <w:p>
+      <w:r>
+        <w:t xml:space="preserve">Una vez que el </w:t>
+      </w:r>
+      <w:proofErr w:type="spellStart"/>
+      <w:r>
+        <w:t>backend</w:t>
+      </w:r>
+      <w:proofErr w:type="spellEnd"/>
+      <w:r>
+        <w:t xml:space="preserve"> responde con éxito (entregando el token y los datos del usuario), entra en acción tu contexto global.</w:t>
       </w:r>
     </w:p>
     <w:p>
@@ -1860,7 +3829,39 @@
         </w:numPr>
       </w:pPr>
       <w:r>
-        <w:t>La función await login(...) toma esos datos y los guarda de forma segura en la memoria interna del teléfono usando AsyncStorage (el equivalente móvil del localStorage web).</w:t>
+        <w:t xml:space="preserve">La función </w:t>
+      </w:r>
+      <w:proofErr w:type="spellStart"/>
+      <w:r>
+        <w:t>await</w:t>
+      </w:r>
+      <w:proofErr w:type="spellEnd"/>
+      <w:r>
+        <w:t xml:space="preserve"> </w:t>
+      </w:r>
+      <w:proofErr w:type="spellStart"/>
+      <w:r>
+        <w:t>login</w:t>
+      </w:r>
+      <w:proofErr w:type="spellEnd"/>
+      <w:r>
+        <w:t xml:space="preserve">(...) toma esos datos y los guarda de forma segura en la memoria interna del teléfono usando </w:t>
+      </w:r>
+      <w:proofErr w:type="spellStart"/>
+      <w:r>
+        <w:t>AsyncStorage</w:t>
+      </w:r>
+      <w:proofErr w:type="spellEnd"/>
+      <w:r>
+        <w:t xml:space="preserve"> (el equivalente móvil del </w:t>
+      </w:r>
+      <w:proofErr w:type="spellStart"/>
+      <w:r>
+        <w:t>localStorage</w:t>
+      </w:r>
+      <w:proofErr w:type="spellEnd"/>
+      <w:r>
+        <w:t xml:space="preserve"> web).</w:t>
       </w:r>
     </w:p>
     <w:p>
@@ -1871,7 +3872,15 @@
         </w:numPr>
       </w:pPr>
       <w:r>
-        <w:t>Fíjate que también pasas response.requirePasswordChange. Esto es vital para tu sistema SaaS, ya que levanta una bandera en el estado global si el usuario entró con una contraseña genérica y necesita ser encerrado en la pantalla de cambio de clave.</w:t>
+        <w:t xml:space="preserve">Fíjate que también pasas </w:t>
+      </w:r>
+      <w:proofErr w:type="spellStart"/>
+      <w:r>
+        <w:t>response.requirePasswordChange</w:t>
+      </w:r>
+      <w:proofErr w:type="spellEnd"/>
+      <w:r>
+        <w:t>. Esto es vital para tu sistema SaaS, ya que levanta una bandera en el estado global si el usuario entró con una contraseña genérica y necesita ser encerrado en la pantalla de cambio de clave.</w:t>
       </w:r>
     </w:p>
     <w:p>
@@ -1891,7 +3900,15 @@
     </w:p>
     <w:p>
       <w:r>
-        <w:t xml:space="preserve">Notarás que después de llamar a login(), </w:t>
+        <w:t xml:space="preserve">Notarás que después de llamar a </w:t>
+      </w:r>
+      <w:proofErr w:type="spellStart"/>
+      <w:r>
+        <w:t>login</w:t>
+      </w:r>
+      <w:proofErr w:type="spellEnd"/>
+      <w:r>
+        <w:t xml:space="preserve">(), </w:t>
       </w:r>
       <w:r>
         <w:rPr>
@@ -1912,7 +3929,15 @@
         </w:numPr>
       </w:pPr>
       <w:r>
-        <w:t>En móviles, la navegación se maneja reaccionando al estado: si hay token, el enrutador muestra el Dashboard; si no hay, muestra el Login.</w:t>
+        <w:t xml:space="preserve">En móviles, la navegación se maneja reaccionando al estado: si hay token, el enrutador muestra el </w:t>
+      </w:r>
+      <w:proofErr w:type="spellStart"/>
+      <w:r>
+        <w:t>Dashboard</w:t>
+      </w:r>
+      <w:proofErr w:type="spellEnd"/>
+      <w:r>
+        <w:t>; si no hay, muestra el Login.</w:t>
       </w:r>
     </w:p>
     <w:p>
@@ -1923,22 +3948,62 @@
         </w:numPr>
       </w:pPr>
       <w:r>
-        <w:t>Tu archivo raíz _layout.tsx (el "semáforo inteligente") está escuchando constantemente el AuthContext. Al guardar el token, el layout lo detecta al instante y expulsa al usuario de la pantalla pública hacia la zona protegida.</w:t>
-      </w:r>
-    </w:p>
-    <w:p>
-      <w:pPr>
-        <w:rPr>
-          <w:b/>
-          <w:bCs/>
-        </w:rPr>
-      </w:pPr>
-      <w:r>
-        <w:rPr>
-          <w:b/>
-          <w:bCs/>
-        </w:rPr>
-        <w:t>5. El Apagado Seguro (finally)</w:t>
+        <w:t>Tu archivo raíz _</w:t>
+      </w:r>
+      <w:proofErr w:type="spellStart"/>
+      <w:r>
+        <w:t>layout.tsx</w:t>
+      </w:r>
+      <w:proofErr w:type="spellEnd"/>
+      <w:r>
+        <w:t xml:space="preserve"> (el "semáforo inteligente") está escuchando constantemente el </w:t>
+      </w:r>
+      <w:proofErr w:type="spellStart"/>
+      <w:r>
+        <w:t>AuthContext</w:t>
+      </w:r>
+      <w:proofErr w:type="spellEnd"/>
+      <w:r>
+        <w:t xml:space="preserve">. Al guardar el token, el </w:t>
+      </w:r>
+      <w:proofErr w:type="spellStart"/>
+      <w:r>
+        <w:t>layout</w:t>
+      </w:r>
+      <w:proofErr w:type="spellEnd"/>
+      <w:r>
+        <w:t xml:space="preserve"> lo detecta al instante y expulsa al usuario de la pantalla pública hacia la zona protegida.</w:t>
+      </w:r>
+    </w:p>
+    <w:p>
+      <w:pPr>
+        <w:rPr>
+          <w:b/>
+          <w:bCs/>
+        </w:rPr>
+      </w:pPr>
+      <w:r>
+        <w:rPr>
+          <w:b/>
+          <w:bCs/>
+        </w:rPr>
+        <w:t>5. El Apagado Seguro (</w:t>
+      </w:r>
+      <w:proofErr w:type="spellStart"/>
+      <w:r>
+        <w:rPr>
+          <w:b/>
+          <w:bCs/>
+        </w:rPr>
+        <w:t>finally</w:t>
+      </w:r>
+      <w:proofErr w:type="spellEnd"/>
+      <w:r>
+        <w:rPr>
+          <w:b/>
+          <w:bCs/>
+        </w:rPr>
+        <w:t>)</w:t>
       </w:r>
     </w:p>
     <w:p>
@@ -1949,7 +4014,23 @@
         </w:numPr>
       </w:pPr>
       <w:r>
-        <w:t>Al final tienes un bloque finally. Esto es mágico porque, sin importar si el usuario entró con éxito (bloque try) o si se equivocó de contraseña y saltó un error (bloque catch), el código siempre pasará por el finally.</w:t>
+        <w:t xml:space="preserve">Al final tienes un bloque </w:t>
+      </w:r>
+      <w:proofErr w:type="spellStart"/>
+      <w:r>
+        <w:t>finally</w:t>
+      </w:r>
+      <w:proofErr w:type="spellEnd"/>
+      <w:r>
+        <w:t xml:space="preserve">. Esto es mágico porque, sin importar si el usuario entró con éxito (bloque try) o si se equivocó de contraseña y saltó un error (bloque catch), el código siempre pasará por el </w:t>
+      </w:r>
+      <w:proofErr w:type="spellStart"/>
+      <w:r>
+        <w:t>finally</w:t>
+      </w:r>
+      <w:proofErr w:type="spellEnd"/>
+      <w:r>
+        <w:t>.</w:t>
       </w:r>
     </w:p>
     <w:p>
@@ -1960,10 +4041,689 @@
         </w:numPr>
       </w:pPr>
       <w:r>
-        <w:t>Esto asegura que el botón vuelva a la normalidad (setIsSubmitting(false)) para que pueda volver a intentarlo si falló.</w:t>
+        <w:t>Esto asegura que el botón vuelva a la normalidad (</w:t>
+      </w:r>
+      <w:proofErr w:type="spellStart"/>
+      <w:r>
+        <w:t>setIsSubmitting</w:t>
+      </w:r>
+      <w:proofErr w:type="spellEnd"/>
+      <w:r>
+        <w:t>(false)) para que pueda volver a intentarlo si falló.</w:t>
       </w:r>
     </w:p>
     <w:p/>
+    <w:p>
+      <w:proofErr w:type="spellStart"/>
+      <w:r>
+        <w:t>Viewed</w:t>
+      </w:r>
+      <w:proofErr w:type="spellEnd"/>
+      <w:r>
+        <w:t xml:space="preserve"> SuperAdminView.tsx:1-232</w:t>
+      </w:r>
+    </w:p>
+    <w:p/>
+    <w:p>
+      <w:r>
+        <w:t>El archivo `</w:t>
+      </w:r>
+      <w:proofErr w:type="spellStart"/>
+      <w:r>
+        <w:t>aqua-mobile</w:t>
+      </w:r>
+      <w:proofErr w:type="spellEnd"/>
+      <w:r>
+        <w:t>\</w:t>
+      </w:r>
+      <w:proofErr w:type="spellStart"/>
+      <w:r>
+        <w:t>components</w:t>
+      </w:r>
+      <w:proofErr w:type="spellEnd"/>
+      <w:r>
+        <w:t>\</w:t>
+      </w:r>
+      <w:proofErr w:type="spellStart"/>
+      <w:r>
+        <w:t>dashboards</w:t>
+      </w:r>
+      <w:proofErr w:type="spellEnd"/>
+      <w:r>
+        <w:t>\</w:t>
+      </w:r>
+      <w:proofErr w:type="spellStart"/>
+      <w:r>
+        <w:t>SuperAdminView.tsx</w:t>
+      </w:r>
+      <w:proofErr w:type="spellEnd"/>
+      <w:r>
+        <w:t>` implementa una interfaz de **CRUD (Crear, Leer, Actualizar, Borrar)** completa para la gestión de **Comunidades (</w:t>
+      </w:r>
+      <w:proofErr w:type="spellStart"/>
+      <w:r>
+        <w:t>Tenants</w:t>
+      </w:r>
+      <w:proofErr w:type="spellEnd"/>
+      <w:r>
+        <w:t>)** desde la aplicación móvil.</w:t>
+      </w:r>
+    </w:p>
+    <w:p/>
+    <w:p>
+      <w:r>
+        <w:t>Aquí tienes el desglose detallado de qué hace y cómo lo hace:</w:t>
+      </w:r>
+    </w:p>
+    <w:p/>
+    <w:p>
+      <w:r>
+        <w:t>### 1. Funcionalidad Principal (Qué hace)</w:t>
+      </w:r>
+    </w:p>
+    <w:p>
+      <w:r>
+        <w:t>El componente permite a un Super Administrador realizar las siguientes acciones:</w:t>
+      </w:r>
+    </w:p>
+    <w:p>
+      <w:r>
+        <w:t>- **Visualizar:** Ver una lista de todas las comunidades registradas con su estado (Activo/Inactivo).</w:t>
+      </w:r>
+    </w:p>
+    <w:p>
+      <w:r>
+        <w:t>- **Crear:** Añadir nuevas comunidades mediante un formulario emergente (Modal).</w:t>
+      </w:r>
+    </w:p>
+    <w:p>
+      <w:r>
+        <w:t>- **Editar:** Modificar el nombre de comunidades existentes.</w:t>
+      </w:r>
+    </w:p>
+    <w:p>
+      <w:r>
+        <w:t>- **Eliminar:** Borrar comunidades con una confirmación nativa para evitar errores.</w:t>
+      </w:r>
+    </w:p>
+    <w:p>
+      <w:r>
+        <w:t>- **</w:t>
+      </w:r>
+      <w:proofErr w:type="spellStart"/>
+      <w:r>
+        <w:t>Feedback</w:t>
+      </w:r>
+      <w:proofErr w:type="spellEnd"/>
+      <w:r>
+        <w:t xml:space="preserve"> Visual:** Muestra indicadores de carga (</w:t>
+      </w:r>
+      <w:proofErr w:type="spellStart"/>
+      <w:r>
+        <w:t>spinners</w:t>
+      </w:r>
+      <w:proofErr w:type="spellEnd"/>
+      <w:r>
+        <w:t>) y alertas de éxito o error.</w:t>
+      </w:r>
+    </w:p>
+    <w:p/>
+    <w:p>
+      <w:r>
+        <w:t>---</w:t>
+      </w:r>
+    </w:p>
+    <w:p/>
+    <w:p>
+      <w:r>
+        <w:t>### 2. Arquitectura y Lógica (Cómo lo hace)</w:t>
+      </w:r>
+    </w:p>
+    <w:p/>
+    <w:p>
+      <w:r>
+        <w:t>#### A. Gestión de Estado (`</w:t>
+      </w:r>
+      <w:proofErr w:type="spellStart"/>
+      <w:r>
+        <w:t>useState</w:t>
+      </w:r>
+      <w:proofErr w:type="spellEnd"/>
+      <w:r>
+        <w:t>`)</w:t>
+      </w:r>
+    </w:p>
+    <w:p>
+      <w:r>
+        <w:t xml:space="preserve">Utiliza varios estados de </w:t>
+      </w:r>
+      <w:proofErr w:type="spellStart"/>
+      <w:r>
+        <w:t>React</w:t>
+      </w:r>
+      <w:proofErr w:type="spellEnd"/>
+      <w:r>
+        <w:t xml:space="preserve"> para controlar la interfaz:</w:t>
+      </w:r>
+    </w:p>
+    <w:p>
+      <w:r>
+        <w:t>- `</w:t>
+      </w:r>
+      <w:proofErr w:type="spellStart"/>
+      <w:r>
+        <w:t>tenants</w:t>
+      </w:r>
+      <w:proofErr w:type="spellEnd"/>
+      <w:r>
+        <w:t>`: Almacena el array de comunidades traído del servidor.</w:t>
+      </w:r>
+    </w:p>
+    <w:p>
+      <w:r>
+        <w:t>- `</w:t>
+      </w:r>
+      <w:proofErr w:type="spellStart"/>
+      <w:r>
+        <w:t>isLoading</w:t>
+      </w:r>
+      <w:proofErr w:type="spellEnd"/>
+      <w:r>
+        <w:t xml:space="preserve">`: Controla si se muestra el </w:t>
+      </w:r>
+      <w:proofErr w:type="spellStart"/>
+      <w:r>
+        <w:t>spinner</w:t>
+      </w:r>
+      <w:proofErr w:type="spellEnd"/>
+      <w:r>
+        <w:t xml:space="preserve"> principal al cargar la lista.</w:t>
+      </w:r>
+    </w:p>
+    <w:p>
+      <w:r>
+        <w:t>- `</w:t>
+      </w:r>
+      <w:proofErr w:type="spellStart"/>
+      <w:r>
+        <w:t>modalVisible</w:t>
+      </w:r>
+      <w:proofErr w:type="spellEnd"/>
+      <w:r>
+        <w:t>`: Define si el formulario de creación/edición está abierto.</w:t>
+      </w:r>
+    </w:p>
+    <w:p>
+      <w:r>
+        <w:t>- `</w:t>
+      </w:r>
+      <w:proofErr w:type="spellStart"/>
+      <w:r>
+        <w:t>editingId</w:t>
+      </w:r>
+      <w:proofErr w:type="spellEnd"/>
+      <w:r>
+        <w:t>`: **Clave para la dualidad del formulario.** Si tiene un ID, el formulario funciona como "Editar"; si es `</w:t>
+      </w:r>
+      <w:proofErr w:type="spellStart"/>
+      <w:r>
+        <w:t>null</w:t>
+      </w:r>
+      <w:proofErr w:type="spellEnd"/>
+      <w:r>
+        <w:t>`, funciona como "Crear".</w:t>
+      </w:r>
+    </w:p>
+    <w:p>
+      <w:r>
+        <w:t>- `nombre`: Guarda el texto que el usuario escribe en el input.</w:t>
+      </w:r>
+    </w:p>
+    <w:p/>
+    <w:p>
+      <w:r>
+        <w:t>#### B. Comunicación con la API (`</w:t>
+      </w:r>
+      <w:proofErr w:type="spellStart"/>
+      <w:r>
+        <w:t>apiFetch</w:t>
+      </w:r>
+      <w:proofErr w:type="spellEnd"/>
+      <w:r>
+        <w:t>`)</w:t>
+      </w:r>
+    </w:p>
+    <w:p>
+      <w:r>
+        <w:lastRenderedPageBreak/>
+        <w:t>Usa un servicio centralizado (`../../</w:t>
+      </w:r>
+      <w:proofErr w:type="spellStart"/>
+      <w:r>
+        <w:t>src</w:t>
+      </w:r>
+      <w:proofErr w:type="spellEnd"/>
+      <w:r>
+        <w:t>/</w:t>
+      </w:r>
+      <w:proofErr w:type="spellStart"/>
+      <w:r>
+        <w:t>services</w:t>
+      </w:r>
+      <w:proofErr w:type="spellEnd"/>
+      <w:r>
+        <w:t>/api`) para las peticiones HTTP:</w:t>
+      </w:r>
+    </w:p>
+    <w:p>
+      <w:r>
+        <w:t>- **GET (`/</w:t>
+      </w:r>
+      <w:proofErr w:type="spellStart"/>
+      <w:r>
+        <w:t>tenants</w:t>
+      </w:r>
+      <w:proofErr w:type="spellEnd"/>
+      <w:r>
+        <w:t>`):** Se ejecuta al montar el componente (`</w:t>
+      </w:r>
+      <w:proofErr w:type="spellStart"/>
+      <w:r>
+        <w:t>useEffect</w:t>
+      </w:r>
+      <w:proofErr w:type="spellEnd"/>
+      <w:r>
+        <w:t>`) para llenar la lista.</w:t>
+      </w:r>
+    </w:p>
+    <w:p>
+      <w:r>
+        <w:t>- **POST (`/</w:t>
+      </w:r>
+      <w:proofErr w:type="spellStart"/>
+      <w:r>
+        <w:t>tenants</w:t>
+      </w:r>
+      <w:proofErr w:type="spellEnd"/>
+      <w:r>
+        <w:t>`):** Para crear una nueva comunidad.</w:t>
+      </w:r>
+    </w:p>
+    <w:p>
+      <w:r>
+        <w:t>- **PUT (`/</w:t>
+      </w:r>
+      <w:proofErr w:type="spellStart"/>
+      <w:r>
+        <w:t>tenants</w:t>
+      </w:r>
+      <w:proofErr w:type="spellEnd"/>
+      <w:r>
+        <w:t>/${id}`):** Para actualizar una existente.</w:t>
+      </w:r>
+    </w:p>
+    <w:p>
+      <w:r>
+        <w:t>- **DELETE (`/</w:t>
+      </w:r>
+      <w:proofErr w:type="spellStart"/>
+      <w:r>
+        <w:t>tenants</w:t>
+      </w:r>
+      <w:proofErr w:type="spellEnd"/>
+      <w:r>
+        <w:t>/${id}`):** Para eliminar.</w:t>
+      </w:r>
+    </w:p>
+    <w:p/>
+    <w:p>
+      <w:r>
+        <w:t>#### C. Lógica del Formulario Dinámico (`</w:t>
+      </w:r>
+      <w:proofErr w:type="spellStart"/>
+      <w:r>
+        <w:t>handleSave</w:t>
+      </w:r>
+      <w:proofErr w:type="spellEnd"/>
+      <w:r>
+        <w:t>`)</w:t>
+      </w:r>
+    </w:p>
+    <w:p>
+      <w:r>
+        <w:t>En lugar de tener dos formularios, usa una sola función inteligente:</w:t>
+      </w:r>
+    </w:p>
+    <w:p>
+      <w:pPr>
+        <w:rPr>
+          <w:lang w:val="en-US"/>
+        </w:rPr>
+      </w:pPr>
+      <w:r>
+        <w:rPr>
+          <w:lang w:val="en-US"/>
+        </w:rPr>
+        <w:t>```typescript</w:t>
+      </w:r>
+    </w:p>
+    <w:p>
+      <w:pPr>
+        <w:rPr>
+          <w:lang w:val="en-US"/>
+        </w:rPr>
+      </w:pPr>
+      <w:r>
+        <w:rPr>
+          <w:lang w:val="en-US"/>
+        </w:rPr>
+        <w:t>const handleSave = async () =&gt; {</w:t>
+      </w:r>
+    </w:p>
+    <w:p>
+      <w:pPr>
+        <w:rPr>
+          <w:lang w:val="en-US"/>
+        </w:rPr>
+      </w:pPr>
+      <w:r>
+        <w:rPr>
+          <w:lang w:val="en-US"/>
+        </w:rPr>
+        <w:t xml:space="preserve">    // ... validación ...</w:t>
+      </w:r>
+    </w:p>
+    <w:p>
+      <w:r>
+        <w:rPr>
+          <w:lang w:val="en-US"/>
+        </w:rPr>
+        <w:t xml:space="preserve">    </w:t>
+      </w:r>
+      <w:proofErr w:type="spellStart"/>
+      <w:r>
+        <w:t>if</w:t>
+      </w:r>
+      <w:proofErr w:type="spellEnd"/>
+      <w:r>
+        <w:t xml:space="preserve"> (</w:t>
+      </w:r>
+      <w:proofErr w:type="spellStart"/>
+      <w:r>
+        <w:t>editingId</w:t>
+      </w:r>
+      <w:proofErr w:type="spellEnd"/>
+      <w:r>
+        <w:t>) {</w:t>
+      </w:r>
+    </w:p>
+    <w:p>
+      <w:r>
+        <w:t xml:space="preserve">        // Ejecuta PUT si estamos editando</w:t>
+      </w:r>
+    </w:p>
+    <w:p>
+      <w:pPr>
+        <w:rPr>
+          <w:lang w:val="en-US"/>
+        </w:rPr>
+      </w:pPr>
+      <w:r>
+        <w:t xml:space="preserve">        </w:t>
+      </w:r>
+      <w:r>
+        <w:rPr>
+          <w:lang w:val="en-US"/>
+        </w:rPr>
+        <w:t>await apiFetch(`/tenants/${editingId}`, { method: 'PUT', ... });</w:t>
+      </w:r>
+    </w:p>
+    <w:p>
+      <w:r>
+        <w:rPr>
+          <w:lang w:val="en-US"/>
+        </w:rPr>
+        <w:t xml:space="preserve">    </w:t>
+      </w:r>
+      <w:r>
+        <w:t xml:space="preserve">} </w:t>
+      </w:r>
+      <w:proofErr w:type="spellStart"/>
+      <w:r>
+        <w:t>else</w:t>
+      </w:r>
+      <w:proofErr w:type="spellEnd"/>
+      <w:r>
+        <w:t xml:space="preserve"> {</w:t>
+      </w:r>
+    </w:p>
+    <w:p>
+      <w:r>
+        <w:t xml:space="preserve">        // Ejecuta POST si es nuevo</w:t>
+      </w:r>
+    </w:p>
+    <w:p>
+      <w:pPr>
+        <w:rPr>
+          <w:lang w:val="en-US"/>
+        </w:rPr>
+      </w:pPr>
+      <w:r>
+        <w:t xml:space="preserve">        </w:t>
+      </w:r>
+      <w:r>
+        <w:rPr>
+          <w:lang w:val="en-US"/>
+        </w:rPr>
+        <w:t>await apiFetch('/tenants', { method: 'POST', ... });</w:t>
+      </w:r>
+    </w:p>
+    <w:p>
+      <w:r>
+        <w:rPr>
+          <w:lang w:val="en-US"/>
+        </w:rPr>
+        <w:t xml:space="preserve">    </w:t>
+      </w:r>
+      <w:r>
+        <w:t>}</w:t>
+      </w:r>
+    </w:p>
+    <w:p>
+      <w:r>
+        <w:t xml:space="preserve">    // ... refresca la lista y cierra el modal ...</w:t>
+      </w:r>
+    </w:p>
+    <w:p>
+      <w:r>
+        <w:t>};</w:t>
+      </w:r>
+    </w:p>
+    <w:p>
+      <w:r>
+        <w:t>```</w:t>
+      </w:r>
+    </w:p>
+    <w:p/>
+    <w:p>
+      <w:r>
+        <w:t>#### D. Interfaz de Usuario (UI)</w:t>
+      </w:r>
+    </w:p>
+    <w:p>
+      <w:r>
+        <w:t>- **</w:t>
+      </w:r>
+      <w:proofErr w:type="spellStart"/>
+      <w:r>
+        <w:t>FlatList</w:t>
+      </w:r>
+      <w:proofErr w:type="spellEnd"/>
+      <w:r>
+        <w:t>:** Se usa para renderizar la lista de forma eficiente.</w:t>
+      </w:r>
+    </w:p>
+    <w:p>
+      <w:r>
+        <w:t>- **Modal:** Proporciona una experiencia de "capa superior" para el formulario sin cambiar de pantalla.</w:t>
+      </w:r>
+    </w:p>
+    <w:p>
+      <w:r>
+        <w:lastRenderedPageBreak/>
+        <w:t>- **Estética "Premium":**</w:t>
+      </w:r>
+    </w:p>
+    <w:p>
+      <w:r>
+        <w:t xml:space="preserve">    - Paleta de colores oscura (`#0f172a`, `#1e293b`).</w:t>
+      </w:r>
+    </w:p>
+    <w:p>
+      <w:r>
+        <w:t xml:space="preserve">    - Bordes redondeados y sombras suaves.</w:t>
+      </w:r>
+    </w:p>
+    <w:p>
+      <w:r>
+        <w:t xml:space="preserve">    - Iconos de `</w:t>
+      </w:r>
+      <w:proofErr w:type="spellStart"/>
+      <w:r>
+        <w:t>Ionicons</w:t>
+      </w:r>
+      <w:proofErr w:type="spellEnd"/>
+      <w:r>
+        <w:t>` para acciones rápidas.</w:t>
+      </w:r>
+    </w:p>
+    <w:p>
+      <w:r>
+        <w:t xml:space="preserve">    - **</w:t>
+      </w:r>
+      <w:proofErr w:type="spellStart"/>
+      <w:r>
+        <w:t>Badges</w:t>
+      </w:r>
+      <w:proofErr w:type="spellEnd"/>
+      <w:r>
+        <w:t xml:space="preserve"> de Estado:** Cambian de color según si la comunidad está activa o no (líneas 111-118).</w:t>
+      </w:r>
+    </w:p>
+    <w:p/>
+    <w:p>
+      <w:r>
+        <w:t>#### E. Seguridad y UX</w:t>
+      </w:r>
+    </w:p>
+    <w:p>
+      <w:r>
+        <w:t>- **Confirmación de Borrado:** Usa `</w:t>
+      </w:r>
+      <w:proofErr w:type="spellStart"/>
+      <w:r>
+        <w:t>Alert.alert</w:t>
+      </w:r>
+      <w:proofErr w:type="spellEnd"/>
+      <w:r>
+        <w:t>` con estilo `destructive` para pedir confirmación antes de borrar (línea 84).</w:t>
+      </w:r>
+    </w:p>
+    <w:p>
+      <w:r>
+        <w:t>- **Validación:** Verifica que el nombre no esté vacío antes de enviar (`</w:t>
+      </w:r>
+      <w:proofErr w:type="spellStart"/>
+      <w:r>
+        <w:t>nombre.trim</w:t>
+      </w:r>
+      <w:proofErr w:type="spellEnd"/>
+      <w:r>
+        <w:t>()`).</w:t>
+      </w:r>
+    </w:p>
+    <w:p>
+      <w:r>
+        <w:t xml:space="preserve">- **Bloqueo de </w:t>
+      </w:r>
+      <w:proofErr w:type="spellStart"/>
+      <w:r>
+        <w:t>Re-envío</w:t>
+      </w:r>
+      <w:proofErr w:type="spellEnd"/>
+      <w:r>
+        <w:t>:** El estado `</w:t>
+      </w:r>
+      <w:proofErr w:type="spellStart"/>
+      <w:r>
+        <w:t>isSubmitting</w:t>
+      </w:r>
+      <w:proofErr w:type="spellEnd"/>
+      <w:r>
+        <w:t>` deshabilita los botones mientras la API responde para evitar duplicados.</w:t>
+      </w:r>
+    </w:p>
+    <w:p/>
+    <w:p>
+      <w:r>
+        <w:t>### Resumen de Componentes Clave:</w:t>
+      </w:r>
+    </w:p>
+    <w:p>
+      <w:r>
+        <w:t>- **`</w:t>
+      </w:r>
+      <w:proofErr w:type="spellStart"/>
+      <w:r>
+        <w:t>SafeAreaView</w:t>
+      </w:r>
+      <w:proofErr w:type="spellEnd"/>
+      <w:r>
+        <w:t>`**: Asegura que el contenido no choque con el "</w:t>
+      </w:r>
+      <w:proofErr w:type="spellStart"/>
+      <w:r>
+        <w:t>notch</w:t>
+      </w:r>
+      <w:proofErr w:type="spellEnd"/>
+      <w:r>
+        <w:t>" o la barra de estado del teléfono.</w:t>
+      </w:r>
+    </w:p>
+    <w:p>
+      <w:r>
+        <w:t>- **`</w:t>
+      </w:r>
+      <w:proofErr w:type="spellStart"/>
+      <w:r>
+        <w:t>TouchableOpacity</w:t>
+      </w:r>
+      <w:proofErr w:type="spellEnd"/>
+      <w:r>
+        <w:t xml:space="preserve">`**: Usado para todos los botones para dar </w:t>
+      </w:r>
+      <w:proofErr w:type="spellStart"/>
+      <w:r>
+        <w:t>feedback</w:t>
+      </w:r>
+      <w:proofErr w:type="spellEnd"/>
+      <w:r>
+        <w:t xml:space="preserve"> táctil.</w:t>
+      </w:r>
+    </w:p>
+    <w:p>
+      <w:r>
+        <w:t>- **`</w:t>
+      </w:r>
+      <w:proofErr w:type="spellStart"/>
+      <w:r>
+        <w:t>TextInput</w:t>
+      </w:r>
+      <w:proofErr w:type="spellEnd"/>
+      <w:r>
+        <w:t>`**: Captura el nombre de la comunidad con estilos personalizados.</w:t>
+      </w:r>
+    </w:p>
     <w:sectPr>
       <w:pgSz w:w="12240" w:h="15840"/>
       <w:pgMar w:top="1417" w:right="1701" w:bottom="1417" w:left="1701" w:header="708" w:footer="708" w:gutter="0"/>
@@ -6462,6 +9222,7 @@
   <w:style w:type="character" w:default="1" w:styleId="Fuentedeprrafopredeter">
     <w:name w:val="Default Paragraph Font"/>
     <w:uiPriority w:val="1"/>
+    <w:semiHidden/>
     <w:unhideWhenUsed/>
   </w:style>
   <w:style w:type="table" w:default="1" w:styleId="Tablanormal">

</xml_diff>